<commit_message>
Revise assignment answers based on course materials
Co-Authored-By: Claude Opus 5.5 <noreply@anthropic.com>
Claude-Session: https://claude.ai/code/session_01BVH1n3fvCDz4inkznfhZC9
</commit_message>
<xml_diff>
--- a/output/עבודה_היבטים_משפטיים.docx
+++ b/output/עבודה_היבטים_משפטיים.docx
@@ -16,7 +16,7 @@
           <w:szCs w:val="28"/>
           <w:bCs/>
         </w:rPr>
-        <w:t>חלק א' – מעמדה של "קבוצת עובדי NeuroTech" ופעולות הנהלת החברה</w:t>
+        <w:t>חלק א': מעמדה של "קבוצת עובדי NeuroTech" ופעולות הנהלת החברה</w:t>
       </w:r>
     </w:p>
     <w:p>
@@ -33,7 +33,7 @@
           <w:szCs w:val="24"/>
           <w:bCs/>
         </w:rPr>
-        <w:t>1. המסגרת הנורמטיבית: מהו "ארגון עובדים"</w:t>
+        <w:t>1. חופש ההתארגנות ומהו "ארגון עובדים"</w:t>
       </w:r>
     </w:p>
     <w:p>
@@ -48,7 +48,7 @@
           <w:rtl/>
           <w:szCs w:val="24"/>
         </w:rPr>
-        <w:t>חופש ההתאגדות מוכר במשפט הישראלי כזכות יסוד הנגזרת מ</w:t>
+        <w:t>לחופש ההתארגנות שני פנים: הזכות של עובד להתארגן ולפעול בארגון עובדים, והזכות שלא להתארגן (</w:t>
       </w:r>
       <w:r>
         <w:rPr>
@@ -58,7 +58,7 @@
           <w:szCs w:val="24"/>
           <w:bCs/>
         </w:rPr>
-        <w:t>חוק יסוד: כבוד האדם וחירותו</w:t>
+        <w:t>חופש מהתארגנות</w:t>
       </w:r>
       <w:r>
         <w:rPr>
@@ -66,7 +66,7 @@
           <w:rtl/>
           <w:szCs w:val="24"/>
         </w:rPr>
-        <w:t xml:space="preserve">, ומעוגן גם באמנות </w:t>
+        <w:t>). שתיהן מוכרות במשפט העבודה הקיבוצי בישראל (בן-ישראל, 2002; הילדסהימר, 2026ג). הזכות הראשונה מעוגנת ב</w:t>
       </w:r>
       <w:r>
         <w:rPr>
@@ -76,7 +76,7 @@
           <w:szCs w:val="24"/>
           <w:bCs/>
         </w:rPr>
-        <w:t>ארגון העבודה הבינלאומי מס' 87 ומס' 98</w:t>
+        <w:t>סעיף 33ח לחוק הסכמים קיבוציים, התשי"ז-1957</w:t>
       </w:r>
       <w:r>
         <w:rPr>
@@ -84,7 +84,7 @@
           <w:rtl/>
           <w:szCs w:val="24"/>
         </w:rPr>
-        <w:t xml:space="preserve"> שישראל אשררה. </w:t>
+        <w:t>, ו</w:t>
       </w:r>
       <w:r>
         <w:rPr>
@@ -94,7 +94,7 @@
           <w:szCs w:val="24"/>
           <w:bCs/>
         </w:rPr>
-        <w:t>חוק הסכמים קיבוציים, התשי"ז-1957</w:t>
+        <w:t>סעיף 33י(א)</w:t>
       </w:r>
       <w:r>
         <w:rPr>
@@ -102,7 +102,22 @@
           <w:rtl/>
           <w:szCs w:val="24"/>
         </w:rPr>
-        <w:t xml:space="preserve"> מעניק לארגון העובדים מעמד מרכזי: רק ארגון עובדים רשאי להיות צד להסכם קיבוצי, ורק ארגון עובדים שמאורגנים בו המספר הגדול ביותר של העובדים, ובלבד שאינו פחות משליש מהם, ייחשב </w:t>
+        <w:t xml:space="preserve"> אוסר על מעסיק לפגוע בעובד בשל חברותו בארגון עובדים, בשל פעילותו להקמתו, וגם בשל הימנעותו מלהיות חבר בו.</w:t>
+      </w:r>
+    </w:p>
+    <w:p>
+      <w:pPr>
+        <w:bidi/>
+        <w:spacing w:before="0" w:after="0"/>
+        <w:jc w:val="both"/>
+      </w:pPr>
+      <w:r>
+        <w:rPr>
+          <w:sz w:val="24"/>
+          <w:rtl/>
+          <w:szCs w:val="24"/>
+        </w:rPr>
+        <w:t xml:space="preserve">ההכרה בגוף כ"ארגון עובדים" היא תנאי סף. רק ארגון עובדים יכול להיות </w:t>
       </w:r>
       <w:r>
         <w:rPr>
@@ -120,7 +135,7 @@
           <w:rtl/>
           <w:szCs w:val="24"/>
         </w:rPr>
-        <w:t xml:space="preserve"> (</w:t>
+        <w:t xml:space="preserve"> (סעיף 3 לחוק), ורק הארגון היציג רשאי לחתום על </w:t>
       </w:r>
       <w:r>
         <w:rPr>
@@ -130,7 +145,7 @@
           <w:szCs w:val="24"/>
           <w:bCs/>
         </w:rPr>
-        <w:t>סעיף 3 לחוק</w:t>
+        <w:t>הסכם קיבוצי מיוחד</w:t>
       </w:r>
       <w:r>
         <w:rPr>
@@ -138,7 +153,7 @@
           <w:rtl/>
           <w:szCs w:val="24"/>
         </w:rPr>
-        <w:t xml:space="preserve">). עם זאת, החוק אינו מגדיר מהו "ארגון עובדים", ולכן נקבעו המבחנים בפסיקת בית הדין הארצי לעבודה (בין היתר בפרשת </w:t>
+        <w:t xml:space="preserve"> במפעל (סעיף 2(1) לחוק). החוק אינו מגדיר "ארגון עובדים", והמבחנים נקבעו ב</w:t>
       </w:r>
       <w:r>
         <w:rPr>
@@ -148,7 +163,7 @@
           <w:szCs w:val="24"/>
           <w:bCs/>
         </w:rPr>
-        <w:t>ההסתדרות הלאומית</w:t>
+        <w:t>בג"ץ 7029/95 הסתדרות העובדים הכללית החדשה נ' בית הדין הארצי לעבודה (עניין עמית, 1997)</w:t>
       </w:r>
       <w:r>
         <w:rPr>
@@ -156,7 +171,7 @@
           <w:rtl/>
           <w:szCs w:val="24"/>
         </w:rPr>
-        <w:t xml:space="preserve"> ובפרשת </w:t>
+        <w:t xml:space="preserve">. ארבעה מבחנים נקבעו שם. </w:t>
       </w:r>
       <w:r>
         <w:rPr>
@@ -166,7 +181,7 @@
           <w:szCs w:val="24"/>
           <w:bCs/>
         </w:rPr>
-        <w:t>כוח לעובדים</w:t>
+        <w:t>מבחן החברות</w:t>
       </w:r>
       <w:r>
         <w:rPr>
@@ -174,22 +189,7 @@
           <w:rtl/>
           <w:szCs w:val="24"/>
         </w:rPr>
-        <w:t>).</w:t>
-      </w:r>
-    </w:p>
-    <w:p>
-      <w:pPr>
-        <w:bidi/>
-        <w:spacing w:before="0" w:after="0"/>
-        <w:jc w:val="both"/>
-      </w:pPr>
-      <w:r>
-        <w:rPr>
-          <w:sz w:val="24"/>
-          <w:rtl/>
-          <w:szCs w:val="24"/>
-        </w:rPr>
-        <w:t xml:space="preserve">לפי מבחנים אלה, גוף ייחשב ארגון עובדים אם מתקיימים בו, בין היתר: </w:t>
+        <w:t xml:space="preserve">: מרבית החברים הם עובדים שכירים והחברות רצונית. </w:t>
       </w:r>
       <w:r>
         <w:rPr>
@@ -199,7 +199,7 @@
           <w:szCs w:val="24"/>
           <w:bCs/>
         </w:rPr>
-        <w:t>(א) מטרה עיקרית</w:t>
+        <w:t>מבחן התקנון</w:t>
       </w:r>
       <w:r>
         <w:rPr>
@@ -207,7 +207,7 @@
           <w:rtl/>
           <w:szCs w:val="24"/>
         </w:rPr>
-        <w:t xml:space="preserve"> של קידום ענייניהם של העובדים כעובדים, ובראש ובעונה אחת ניהול משא ומתן קיבוצי על תנאי עבודתם; </w:t>
+        <w:t xml:space="preserve">: לארגון תקנון המסדיר את מוסדותיו ומטרותיו. </w:t>
       </w:r>
       <w:r>
         <w:rPr>
@@ -217,7 +217,7 @@
           <w:szCs w:val="24"/>
           <w:bCs/>
         </w:rPr>
-        <w:t>(ב) קביעות</w:t>
+        <w:t>מבחן המטרה</w:t>
       </w:r>
       <w:r>
         <w:rPr>
@@ -225,7 +225,7 @@
           <w:rtl/>
           <w:szCs w:val="24"/>
         </w:rPr>
-        <w:t xml:space="preserve"> ומבנה ארגוני שאינו אד-הוק; </w:t>
+        <w:t xml:space="preserve">: מטרתו המרכזית היא קידום זכויותיהם התעסוקתיות של העובדים מול המעסיק. </w:t>
       </w:r>
       <w:r>
         <w:rPr>
@@ -235,7 +235,7 @@
           <w:szCs w:val="24"/>
           <w:bCs/>
         </w:rPr>
-        <w:t>(ג) וולונטריות</w:t>
+        <w:t>מבחן ההתארגנות</w:t>
       </w:r>
       <w:r>
         <w:rPr>
@@ -243,7 +243,7 @@
           <w:rtl/>
           <w:szCs w:val="24"/>
         </w:rPr>
-        <w:t xml:space="preserve">, כלומר חברות מרצון; </w:t>
+        <w:t xml:space="preserve">: התארגנות יציבה המהווה </w:t>
       </w:r>
       <w:r>
         <w:rPr>
@@ -253,7 +253,7 @@
           <w:szCs w:val="24"/>
           <w:bCs/>
         </w:rPr>
-        <w:t>(ד) דמוקרטיה פנימית</w:t>
+        <w:t>קול נגדי למעסיק</w:t>
       </w:r>
       <w:r>
         <w:rPr>
@@ -261,43 +261,7 @@
           <w:rtl/>
           <w:szCs w:val="24"/>
         </w:rPr>
-        <w:t>; ו-</w:t>
-      </w:r>
-      <w:r>
-        <w:rPr>
-          <w:b/>
-          <w:sz w:val="24"/>
-          <w:rtl/>
-          <w:szCs w:val="24"/>
-          <w:bCs/>
-        </w:rPr>
-        <w:t>(ה) עצמאות ואי-תלות במעסיק</w:t>
-      </w:r>
-      <w:r>
-        <w:rPr>
-          <w:sz w:val="24"/>
-          <w:rtl/>
-          <w:szCs w:val="24"/>
-        </w:rPr>
-        <w:t xml:space="preserve">. הדרישה האחרונה נובעת מן ההיגיון של המשפט הקיבוצי כולו: ארגון העובדים נועד לאזן את פערי הכוחות המובנים ביחסי העבודה, ולכן גוף הנשען על המעסיק או משרת את ענייניו אינו יכול למלא תפקיד זה. </w:t>
-      </w:r>
-      <w:r>
-        <w:rPr>
-          <w:b/>
-          <w:sz w:val="24"/>
-          <w:rtl/>
-          <w:szCs w:val="24"/>
-          <w:bCs/>
-        </w:rPr>
-        <w:t>סעיף 2 לאמנה 98</w:t>
-      </w:r>
-      <w:r>
-        <w:rPr>
-          <w:sz w:val="24"/>
-          <w:rtl/>
-          <w:szCs w:val="24"/>
-        </w:rPr>
-        <w:t xml:space="preserve"> אף אוסר במפורש על מעסיק לתמוך בארגון עובדים או לשלוט בו, תופעה המכונה בספרות "ועד מטעם" (company union).</w:t>
+        <w:t>.</w:t>
       </w:r>
     </w:p>
     <w:p>
@@ -329,7 +293,7 @@
           <w:rtl/>
           <w:szCs w:val="24"/>
         </w:rPr>
-        <w:t>בחינה מהותית של הקבוצה, ולא רק של לשון תקנונה, מובילה למסקנה שהיא אינה עומדת במבחני הפסיקה.</w:t>
+        <w:t>שני המבחנים הראשונים מתקיימים. חברי הקבוצה הם עובדי החברה שהצטרפו מרצונם, ולקבוצה תקנון הקובע מטרות וסמכויות. הקושי מתעורר בשני המבחנים האחרים, ובית הדין בוחן אותם לפי המהות ולא לפי הכותרות שבתקנון.</w:t>
       </w:r>
     </w:p>
     <w:p>
@@ -346,7 +310,7 @@
           <w:szCs w:val="24"/>
           <w:bCs/>
         </w:rPr>
-        <w:t>ראשית, מבחן המטרה העיקרית.</w:t>
+        <w:t>מבחן המטרה.</w:t>
       </w:r>
       <w:r>
         <w:rPr>
@@ -354,7 +318,7 @@
           <w:rtl/>
           <w:szCs w:val="24"/>
         </w:rPr>
-        <w:t xml:space="preserve"> אמנם בסעיף הסמכויות בתקנון נקבע כי הקבוצה מוסמכת לנהל משא ומתן, לחתום על הסכמים קיבוציים ולהכריז על סכסוך עבודה, אך סעיף המטרות מלמד על כוונה הפוכה. </w:t>
+        <w:t xml:space="preserve"> סעיף הסמכויות מקנה לקבוצה סמכות לנהל משא ומתן, לאשר הסכמים קיבוציים ולהכריז על סכסוך עבודה. אולם סעיף המטרות, ובפרט </w:t>
       </w:r>
       <w:r>
         <w:rPr>
@@ -372,7 +336,7 @@
           <w:rtl/>
           <w:szCs w:val="24"/>
         </w:rPr>
-        <w:t xml:space="preserve">, שמירת יכולתו של כל עובד לנהל באופן אישי את שכרו, הבונוסים והאופציות, מוציאה מתחום הפעולה הקיבוצית את ליבת תנאי העבודה. ארגון שמראש מוותר על ייצוג קיבוצי בענייני שכר אינו מבקש לתקן את פערי הכוחות בין העובד היחיד למעסיק, אלא לשמר אותם. גם </w:t>
+        <w:t xml:space="preserve">, מוציא מראש מתחום הפעולה הקיבוצית את השכר, הבונוסים והאופציות, שהם ליבת תנאי העבודה בחברת טכנולוגיה. גוף כזה אינו מקדם את זכויות העובדים מול המעסיק. גם </w:t>
       </w:r>
       <w:r>
         <w:rPr>
@@ -390,7 +354,25 @@
           <w:rtl/>
           <w:szCs w:val="24"/>
         </w:rPr>
-        <w:t>, שמירה על יציבות החברה ועל פעילותה בישראל, היא אינטרס מובהק של המעסיק, וההודעה לעובדים מדגישה "שיתוף פעולה" עם ההנהלה יותר מאשר ייצוג אינטרסים מנוגדים.</w:t>
+        <w:t xml:space="preserve">, יציבות החברה והמשך פעילותה בישראל, היא אינטרס של המעסיק. הנימוק שבהודעת הקבוצה אינו מחזיק משפטית: לפי </w:t>
+      </w:r>
+      <w:r>
+        <w:rPr>
+          <w:b/>
+          <w:sz w:val="24"/>
+          <w:rtl/>
+          <w:szCs w:val="24"/>
+          <w:bCs/>
+        </w:rPr>
+        <w:t>סעיף 22 לחוק</w:t>
+      </w:r>
+      <w:r>
+        <w:rPr>
+          <w:sz w:val="24"/>
+          <w:rtl/>
+          <w:szCs w:val="24"/>
+        </w:rPr>
+        <w:t>, הוראה בחוזה אישי שהיא לטובת העובד גוברת על ההסכם הקיבוצי, אלא אם ההסכם מונע זאת במפורש. הסכם קיבוצי קובע רצפה ואינו שולל תנאים אישיים טובים יותר. מכאן שמטרה ד' אינה משקפת חשש אמיתי, אלא התנגדות עקרונית לייצוג קיבוצי בתנאים המהותיים.</w:t>
       </w:r>
     </w:p>
     <w:p>
@@ -407,7 +389,7 @@
           <w:szCs w:val="24"/>
           <w:bCs/>
         </w:rPr>
-        <w:t>שנית, מבחן העצמאות.</w:t>
+        <w:t>מבחן ההתארגנות.</w:t>
       </w:r>
       <w:r>
         <w:rPr>
@@ -415,7 +397,7 @@
           <w:rtl/>
           <w:szCs w:val="24"/>
         </w:rPr>
-        <w:t xml:space="preserve"> הקבוצה הוקמה בתגובה ישירה להתארגנות ההסתדרות ועל רקע כוונת ההנהלה לבצע פיטורים. המנכ"ל בירך על הקמתה, ראה בה ביטוי ל"תרבות הייחודית של החברה" ופעל במקביל נגד ההסתדרות. נסיבות אלה מעידות כי הקבוצה פועלת, לכל הפחות, בהלימה מלאה לעמדת ההנהלה, וקשה לראות בה גוף עצמאי.</w:t>
+        <w:t xml:space="preserve"> הקבוצה הוקמה בתגובה ישירה להצטרפות העובדים להסתדרות ומגדירה את עצמה כמי שפועלת "בשיתוף פעולה ובהידברות" עם ההנהלה. המנכ"ל בירך על הקמתה וראה בה דרך לשמור על "התרבות הייחודית של החברה", ובמקביל פעל נגד ההסתדרות. גוף שהמעסיק תומך בו כך אינו "קול נגדי" לו.</w:t>
       </w:r>
     </w:p>
     <w:p>
@@ -432,7 +414,7 @@
           <w:szCs w:val="24"/>
           <w:bCs/>
         </w:rPr>
-        <w:t>שלישית, פסק הדין בעניין נוקיה.</w:t>
+        <w:t>עניין נוקיה.</w:t>
       </w:r>
       <w:r>
         <w:rPr>
@@ -440,7 +422,7 @@
           <w:rtl/>
           <w:szCs w:val="24"/>
         </w:rPr>
-        <w:t xml:space="preserve"> בעס"ק (ארצי) 6298-03-25 </w:t>
+        <w:t xml:space="preserve"> ב</w:t>
       </w:r>
       <w:r>
         <w:rPr>
@@ -450,7 +432,7 @@
           <w:szCs w:val="24"/>
           <w:bCs/>
         </w:rPr>
-        <w:t>הסתדרות העובדים הכללית החדשה נ' ארגון עובדי הפיתוח והשיווק בנוקיה</w:t>
+        <w:t>עס"ק (ארצי) 6298-03-25 הסתדרות העובדים הכללית החדשה נ' ארגון עובדי הפיתוח והשיווק בנוקיה (10.6.2025)</w:t>
       </w:r>
       <w:r>
         <w:rPr>
@@ -458,7 +440,7 @@
           <w:rtl/>
           <w:szCs w:val="24"/>
         </w:rPr>
-        <w:t xml:space="preserve"> (10.6.2025) נדון מקרה דומה במידה רבה: גוף שהקימו עובדים כחלופה להסתדרות, ובמסמכי היסוד שלו נקבע כי ענייני השכר והתגמול יוסיפו להיקבע בחוזים אישיים. בית הדין הארצי הבהיר כי ההכרעה בשאלת מעמדו של גוף כארגון עובדים נעשית לפי מהותו ולא לפי התוויות שבתקנונו, וכי גוף ששולל ייצוג קיבוצי בתנאי העבודה המרכזיים אינו מקיים את מבחן המטרה העיקרית. ההלכה חלה כאן ביתר שאת, שכן מטרה ד' בתקנון הקבוצה כמעט זהה למה שנבחן שם.</w:t>
+        <w:t xml:space="preserve"> יישם בית הדין הארצי את מבחני עניין עמית על גוף שהקימו עובדי חברת טכנולוגיה כחלופה להסתדרות, ושמסמכי היסוד שלו הותירו את ענייני השכר והתגמול לחוזים האישיים. בית הדין קבע כי גוף כזה אינו עומד במבחן המטרה ואינו ארגון עובדים. המסקנה חלה גם כאן.</w:t>
       </w:r>
     </w:p>
     <w:p>
@@ -473,25 +455,7 @@
           <w:rtl/>
           <w:szCs w:val="24"/>
         </w:rPr>
-        <w:t xml:space="preserve">יש להדגיש כי חופש ההתאגדות כולל גם את </w:t>
-      </w:r>
-      <w:r>
-        <w:rPr>
-          <w:b/>
-          <w:sz w:val="24"/>
-          <w:rtl/>
-          <w:szCs w:val="24"/>
-          <w:bCs/>
-        </w:rPr>
-        <w:t>החופש השלילי</w:t>
-      </w:r>
-      <w:r>
-        <w:rPr>
-          <w:sz w:val="24"/>
-          <w:rtl/>
-          <w:szCs w:val="24"/>
-        </w:rPr>
-        <w:t>, כלומר זכותו של עובד שלא להצטרף להסתדרות. העובדים רשאים להתאגד בקבוצה כעמותה חברתית או כפורום הידברות, אך לא ניתן לייחס לה את מעמדו של ארגון עובדים. המשמעות המעשית היא שחברי הקבוצה אינם נמנים לצורך ספירת היציגות של ארגון מתחרה, והקבוצה אינה יכולה לדרוש לנהל משא ומתן קיבוצי או לחתום על הסכם קיבוצי.</w:t>
+        <w:t>אין בכך כדי לפגוע בחופש מהתארגנות. עובד רשאי שלא להצטרף להסתדרות, וסעיף 33י(א)(3) מגן עליו מפני פגיעה בשל כך. אבל חופש זה אינו הופך את הקבוצה לארגון עובדים. חבריה אינם נספרים לצורך היציגות, והיא אינה יכולה לדרוש משא ומתן קיבוצי או לחתום על הסכם קיבוצי.</w:t>
       </w:r>
     </w:p>
     <w:p>
@@ -519,21 +483,11 @@
       </w:pPr>
       <w:r>
         <w:rPr>
-          <w:b/>
-          <w:sz w:val="24"/>
-          <w:rtl/>
-          <w:szCs w:val="24"/>
-          <w:bCs/>
-        </w:rPr>
-        <w:t>פרק ד'1 לחוק הסכמים קיבוציים</w:t>
-      </w:r>
-      <w:r>
-        <w:rPr>
           <w:sz w:val="24"/>
           <w:rtl/>
           <w:szCs w:val="24"/>
         </w:rPr>
-        <w:t xml:space="preserve"> (שהוסף בשנת 2008), ובפרט </w:t>
+        <w:t>ב</w:t>
       </w:r>
       <w:r>
         <w:rPr>
@@ -543,7 +497,7 @@
           <w:szCs w:val="24"/>
           <w:bCs/>
         </w:rPr>
-        <w:t>סעיף 33ח</w:t>
+        <w:t>עס"ק (ארצי) 25476-09-12 הסתדרות העובדים החדשה נ' פלאפון תקשורת בע"מ (2.1.2013)</w:t>
       </w:r>
       <w:r>
         <w:rPr>
@@ -551,7 +505,7 @@
           <w:rtl/>
           <w:szCs w:val="24"/>
         </w:rPr>
-        <w:t xml:space="preserve">, אוסר על מעסיק לפגוע בזכות ההתארגנות של עובדיו. בפרשת </w:t>
+        <w:t xml:space="preserve"> איזן בית הדין בין חופש הביטוי של המעסיק לבין חופש ההתארגנות של העובדים, והבחין בין שלב </w:t>
       </w:r>
       <w:r>
         <w:rPr>
@@ -561,7 +515,7 @@
           <w:szCs w:val="24"/>
           <w:bCs/>
         </w:rPr>
-        <w:t>פלאפון</w:t>
+        <w:t>ההתארגנות הפורצת</w:t>
       </w:r>
       <w:r>
         <w:rPr>
@@ -569,7 +523,7 @@
           <w:rtl/>
           <w:szCs w:val="24"/>
         </w:rPr>
-        <w:t xml:space="preserve"> (ע"ק 25476-09-12) קבע בית הדין הארצי כי בשלב ההתארגנות הראשוני על המעסיק לנהוג </w:t>
+        <w:t xml:space="preserve"> לבין שלב שבו כבר קיים ארגון יציג. בשלב הראשון על המעסיק להימנע מהצגת עמדתו בנוגע להתארגנות, בכנסים, ב</w:t>
       </w:r>
       <w:r>
         <w:rPr>
@@ -579,7 +533,7 @@
           <w:szCs w:val="24"/>
           <w:bCs/>
         </w:rPr>
-        <w:t>ניטרליות</w:t>
+        <w:t>מפגשים אישיים או קבוצתיים</w:t>
       </w:r>
       <w:r>
         <w:rPr>
@@ -587,25 +541,7 @@
           <w:rtl/>
           <w:szCs w:val="24"/>
         </w:rPr>
-        <w:t xml:space="preserve">: עליו להימנע מכל התבטאות בעניין ההתארגנות, בין בעד ובין נגד, וממפגשים ושיחות עם עובדים בנושא. הרציונל הוא פערי הכוחות והתלות של העובד במעסיק, היוצרים </w:t>
-      </w:r>
-      <w:r>
-        <w:rPr>
-          <w:b/>
-          <w:sz w:val="24"/>
-          <w:rtl/>
-          <w:szCs w:val="24"/>
-          <w:bCs/>
-        </w:rPr>
-        <w:t>"אפקט מצנן"</w:t>
-      </w:r>
-      <w:r>
-        <w:rPr>
-          <w:sz w:val="24"/>
-          <w:rtl/>
-          <w:szCs w:val="24"/>
-        </w:rPr>
-        <w:t xml:space="preserve"> גם כשההתבטאות נראית מתונה. עוד נקבע כי כאשר המעסיק מתבטא, עובר אליו הנטל להראות שלא פגע בהתארגנות.</w:t>
+        <w:t xml:space="preserve"> ובתכתובות אלקטרוניות. נקבע גם כי הצגת חסרונות ההצטרפות לארגון עובדים והשלכותיה על החברה היא הבעת עמדה אסורה, גם אם יש בה אמת. ההתארגנות ב-NeuroTech נמצאת בשלב הפורץ, ולכן שלוש פעולות ההנהלה אסורות.</w:t>
       </w:r>
     </w:p>
     <w:p>
@@ -614,14 +550,6 @@
         <w:spacing w:before="0" w:after="0"/>
         <w:jc w:val="both"/>
       </w:pPr>
-      <w:r>
-        <w:rPr>
-          <w:sz w:val="24"/>
-          <w:rtl/>
-          <w:szCs w:val="24"/>
-        </w:rPr>
-        <w:t xml:space="preserve">לאור זאת, שלוש פעולות ההנהלה אינן כשרות. </w:t>
-      </w:r>
       <w:r>
         <w:rPr>
           <w:b/>
@@ -638,7 +566,7 @@
           <w:rtl/>
           <w:szCs w:val="24"/>
         </w:rPr>
-        <w:t xml:space="preserve"> של המנכ"ל, שהציגה את ההסתדרות כגורם "חיצוני" המאיים על התרבות הארגונית, היא התבטאות שלילית מובהקת בשלב ההתארגנות. </w:t>
+        <w:t xml:space="preserve"> מציגה את ההסתדרות כגורם "חיצוני" שעלול לשנות את התרבות הארגונית וקוראת לעובדים "לשקול היטב". זו הצגת חסרונות ההתארגנות בתכתובת אלקטרונית, כמו ההודעה שנפסלה בעניין פלאפון, אף שהנוסח מתון יותר. </w:t>
       </w:r>
       <w:r>
         <w:rPr>
@@ -656,7 +584,7 @@
           <w:rtl/>
           <w:szCs w:val="24"/>
         </w:rPr>
-        <w:t xml:space="preserve"> לשוחח עם עובדיהם היא חמורה עוד יותר, משום שמדובר במי שמשפיע ישירות על בונוסים, אופציות וקידום, ולכן הלחץ המופעל באמצעותם גדול במיוחד. </w:t>
+        <w:t xml:space="preserve"> לשוחח עם עובדיהם על "יתרונות המודל האישי" היא מפגש אישי שנועד להעביר את עמדת ההנהלה, ובית הדין אסר עליו במפורש. חומרתה רבה במיוחד משום שמדובר במנהלים המשפיעים על הבונוסים, האופציות והקידום של אותם עובדים. </w:t>
       </w:r>
       <w:r>
         <w:rPr>
@@ -674,7 +602,7 @@
           <w:rtl/>
           <w:szCs w:val="24"/>
         </w:rPr>
-        <w:t xml:space="preserve"> כלפיה מהווים תמיכה בגוף מתחרה והעדפתו על פני ההסתדרות, בניגוד לחובת הניטרליות ולאיסור על "ועד מטעם".</w:t>
+        <w:t xml:space="preserve"> כלפיה מעבירים לעובדים את אותו מסר בדרך עקיפה: ההנהלה מעדיפה את הקבוצה על פני ההסתדרות.</w:t>
       </w:r>
     </w:p>
     <w:p>
@@ -706,7 +634,7 @@
           <w:rtl/>
           <w:szCs w:val="24"/>
         </w:rPr>
-        <w:t>טענות ההסתדרות מוצדקות. הקבוצה אינה עומדת במבחני הפסיקה, ובעיקר במבחן המטרה העיקרית ובמבחן העצמאות, כפי שנקבע במקרה דומה בעניין נוקיה. פעולות ההנהלה הפרו את חובת הניטרליות שנקבעה בפרשת פלאפון ואת סעיף 33ח לחוק. בית הדין רשאי ליתן צווים נגד המשך הפגיעה ולהורות על פרסום הודעה מתקנת לעובדים.</w:t>
+        <w:t>טענות ההסתדרות מוצדקות. הקבוצה עומדת במבחני החברות והתקנון של עניין עמית, אך לא במבחן המטרה ולא במבחן הקול הנגדי, כפי שנפסק בנסיבות דומות בעניין נוקיה. פעולות ההנהלה הפרו את האיסור על הבעת עמדה בשלב ההתארגנות הפורצת שנקבע בעניין פלאפון.</w:t>
       </w:r>
     </w:p>
     <w:p>
@@ -728,7 +656,7 @@
           <w:szCs w:val="28"/>
           <w:bCs/>
         </w:rPr>
-        <w:t>חלק ב' – טענותיו של אורי</w:t>
+        <w:t>חלק ב': טענותיו של אורי</w:t>
       </w:r>
     </w:p>
     <w:p>
@@ -762,7 +690,7 @@
           <w:szCs w:val="24"/>
           <w:bCs/>
         </w:rPr>
-        <w:t>חוק למניעת הטרדה מינית, התשנ"ח-1998</w:t>
+        <w:t>החוק למניעת הטרדה מינית, התשנ"ח-1998</w:t>
       </w:r>
       <w:r>
         <w:rPr>
@@ -770,7 +698,7 @@
           <w:rtl/>
           <w:szCs w:val="24"/>
         </w:rPr>
-        <w:t>, נועד להגן על כבוד האדם, חירותו ופרטיותו ועל השוויון בין המינים (</w:t>
+        <w:t xml:space="preserve">, נועד להגן על כבודו של אדם, על חירותו ועל פרטיותו ולקדם שוויון בין המינים (סעיף 1; הילדסהימר, 2026ב). מבין החלופות שבסעיף 3(א), הרלוונטית לענייננו היא </w:t>
       </w:r>
       <w:r>
         <w:rPr>
@@ -780,7 +708,7 @@
           <w:szCs w:val="24"/>
           <w:bCs/>
         </w:rPr>
-        <w:t>סעיף 1</w:t>
+        <w:t>סעיף 3(א)(4)</w:t>
       </w:r>
       <w:r>
         <w:rPr>
@@ -788,7 +716,7 @@
           <w:rtl/>
           <w:szCs w:val="24"/>
         </w:rPr>
-        <w:t xml:space="preserve">). </w:t>
+        <w:t xml:space="preserve">: </w:t>
       </w:r>
       <w:r>
         <w:rPr>
@@ -798,7 +726,7 @@
           <w:szCs w:val="24"/>
           <w:bCs/>
         </w:rPr>
-        <w:t>סעיף 3(א)(5)</w:t>
+        <w:t>התייחסויות חוזרות</w:t>
       </w:r>
       <w:r>
         <w:rPr>
@@ -806,7 +734,7 @@
           <w:rtl/>
           <w:szCs w:val="24"/>
         </w:rPr>
-        <w:t xml:space="preserve"> מגדיר כהטרדה מינית </w:t>
+        <w:t xml:space="preserve"> המופנות לאדם, </w:t>
       </w:r>
       <w:r>
         <w:rPr>
@@ -816,7 +744,7 @@
           <w:szCs w:val="24"/>
           <w:bCs/>
         </w:rPr>
-        <w:t>"התייחסויות חוזרות המופנות לאדם, המתמקדות במיניותו"</w:t>
+        <w:t>המתמקדות במיניותו</w:t>
       </w:r>
       <w:r>
         <w:rPr>
@@ -834,7 +762,7 @@
           <w:szCs w:val="24"/>
           <w:bCs/>
         </w:rPr>
-        <w:t>הראה למטריד שאינו מעוניין בהן</w:t>
+        <w:t>הראה למטריד שאינו מעוניין</w:t>
       </w:r>
       <w:r>
         <w:rPr>
@@ -842,7 +770,7 @@
           <w:rtl/>
           <w:szCs w:val="24"/>
         </w:rPr>
-        <w:t>. הדרישה להראות חוסר עניין יכולה להתקיים גם בהתנהגות ולא רק במילים, והיא נבחנת לפי נסיבות המקרה.</w:t>
+        <w:t xml:space="preserve"> בהן. החלופה של הצעות חוזרות בעלות אופי מיני (סעיף 3(א)(3)) אינה חלה, משום שדנה לא הציעה לאורי דבר. גם סעיף 3(א)(5), התייחסות מבזה או משפילה ביחס לנטייה המינית, אינו חל, שכן השאלה על נטייתו של אורי לא נשאלה בדרך מבזה.</w:t>
       </w:r>
     </w:p>
     <w:p>
@@ -857,86 +785,7 @@
           <w:rtl/>
           <w:szCs w:val="24"/>
         </w:rPr>
-        <w:t>במקרה שלפנינו מרבית השיחות עסקו במיניותה של דנה עצמה ולא במיניותו של אורי. השאלה הישירה על נטייתו המינית נשאלה פעם אחת, ואינה עונה על דרישת ה"חזרתיות". חשוב מכך, אורי לא הראה בתחילה כי אינו מעוניין: הוא שאל שאלות ושיתף פרטים מחייו, וברגע שהבהיר כי הוא מעדיף להשאיר את הנושא מחוץ לעבודה, דנה חדלה מיד. לפיכך, לפי החלופה הכללית, ספק רב אם יש כאן הטרדה מינית.</w:t>
-      </w:r>
-    </w:p>
-    <w:p>
-      <w:pPr>
-        <w:bidi/>
-        <w:spacing w:before="0" w:after="0"/>
-        <w:jc w:val="both"/>
-      </w:pPr>
-      <w:r>
-        <w:rPr>
-          <w:b/>
-          <w:sz w:val="24"/>
-          <w:rtl/>
-          <w:szCs w:val="24"/>
-          <w:bCs/>
-        </w:rPr>
-        <w:t>השאלה המרכזית היא יחסי המרות.</w:t>
-      </w:r>
-      <w:r>
-        <w:rPr>
-          <w:sz w:val="24"/>
-          <w:rtl/>
-          <w:szCs w:val="24"/>
-        </w:rPr>
-        <w:t xml:space="preserve"> לפי </w:t>
-      </w:r>
-      <w:r>
-        <w:rPr>
-          <w:b/>
-          <w:sz w:val="24"/>
-          <w:rtl/>
-          <w:szCs w:val="24"/>
-          <w:bCs/>
-        </w:rPr>
-        <w:t>סעיף 3(א)(6)(ג)</w:t>
-      </w:r>
-      <w:r>
-        <w:rPr>
-          <w:sz w:val="24"/>
-          <w:rtl/>
-          <w:szCs w:val="24"/>
-        </w:rPr>
-        <w:t xml:space="preserve"> לחוק, כאשר ההתייחסויות מופנות לעובד </w:t>
-      </w:r>
-      <w:r>
-        <w:rPr>
-          <w:b/>
-          <w:sz w:val="24"/>
-          <w:rtl/>
-          <w:szCs w:val="24"/>
-          <w:bCs/>
-        </w:rPr>
-        <w:t>תוך ניצול יחסי מרות בעבודה</w:t>
-      </w:r>
-      <w:r>
-        <w:rPr>
-          <w:sz w:val="24"/>
-          <w:rtl/>
-          <w:szCs w:val="24"/>
-        </w:rPr>
-        <w:t xml:space="preserve">, אין צורך שהמוטרד יראה שאינו מעוניין. הפסיקה בוחנת את יחסי המרות </w:t>
-      </w:r>
-      <w:r>
-        <w:rPr>
-          <w:b/>
-          <w:sz w:val="24"/>
-          <w:rtl/>
-          <w:szCs w:val="24"/>
-          <w:bCs/>
-        </w:rPr>
-        <w:t>באופן מהותי ולא פורמלי</w:t>
-      </w:r>
-      <w:r>
-        <w:rPr>
-          <w:sz w:val="24"/>
-          <w:rtl/>
-          <w:szCs w:val="24"/>
-        </w:rPr>
-        <w:t>: השאלה אינה אם למטריד יש סמכות רשמית לקבל ולפטר, אלא אם יש לו בפועל השפעה על מעמדו ועתידו המקצועי של המוטרד. דנה משתתפת בהחלטות השיבוץ ולהמלצתה השפעה על קידום עובדים צעירים, ואורי הוא עובד חדש וצעיר. לכן ניתן לטעון שהתקיימו יחסי מרות, וכי השתתפותו של אורי בשיחות אינה מעידה בהכרח על הסכמה חופשית. הפסיקה הכירה בכך שבמערכת יחסים היררכית "הסכמה" עשויה לנבוע מחשש לפגיעה מקצועית, ומכאן ההכרעה המחוקקת לוותר במצב זה על דרישת ההבעה.</w:t>
+        <w:t>לפי החלופה הכללית, ההטרדה לא הוכחה. אורי לא הראה בתחילה שאינו מעוניין: הוא שאל שאלות ושיתף פרטים מחייו, וכשביקש להשאיר את הנושא מחוץ לעבודה, דנה הפסיקה מיד.</w:t>
       </w:r>
     </w:p>
     <w:p>
@@ -951,7 +800,76 @@
           <w:rtl/>
           <w:szCs w:val="24"/>
         </w:rPr>
-        <w:t xml:space="preserve">עם זאת, גם בחלופה זו נדרש ניצול של יחסי המרות ונדרשות התייחסויות </w:t>
+        <w:t xml:space="preserve">השאלה העיקרית היא </w:t>
+      </w:r>
+      <w:r>
+        <w:rPr>
+          <w:b/>
+          <w:sz w:val="24"/>
+          <w:rtl/>
+          <w:szCs w:val="24"/>
+          <w:bCs/>
+        </w:rPr>
+        <w:t>יחסי מרות</w:t>
+      </w:r>
+      <w:r>
+        <w:rPr>
+          <w:sz w:val="24"/>
+          <w:rtl/>
+          <w:szCs w:val="24"/>
+        </w:rPr>
+        <w:t xml:space="preserve">. לפי </w:t>
+      </w:r>
+      <w:r>
+        <w:rPr>
+          <w:b/>
+          <w:sz w:val="24"/>
+          <w:rtl/>
+          <w:szCs w:val="24"/>
+          <w:bCs/>
+        </w:rPr>
+        <w:t>סעיף 3(א)(6)</w:t>
+      </w:r>
+      <w:r>
+        <w:rPr>
+          <w:sz w:val="24"/>
+          <w:rtl/>
+          <w:szCs w:val="24"/>
+        </w:rPr>
+        <w:t>, כאשר ההתייחסויות נעשות תוך ניצול יחסי מרות בעבודה, אין צורך שהמוטרד יראה שאינו מעוניין. ב</w:t>
+      </w:r>
+      <w:r>
+        <w:rPr>
+          <w:b/>
+          <w:sz w:val="24"/>
+          <w:rtl/>
+          <w:szCs w:val="24"/>
+          <w:bCs/>
+        </w:rPr>
+        <w:t>עש"ם 2203/05 מדר נ' נציבות שירות המדינה (21.7.2005)</w:t>
+      </w:r>
+      <w:r>
+        <w:rPr>
+          <w:sz w:val="24"/>
+          <w:rtl/>
+          <w:szCs w:val="24"/>
+        </w:rPr>
+        <w:t xml:space="preserve"> נקבע שיחסי מרות התקיימו אף שהמטריד לא היה הממונה הישיר של המוטרדת. נקבע גם שבקשה עמומה להפסיק, שנבעה מחשש לפגיעה בעבודה, אינה שוללת את ההטרדה. כלומר, המבחן מהותי ולא פורמלי. לדנה אין סמכות לקבל עובדים או לפטרם, אך היא ותיקה, משתתפת בהחלטות השיבוץ ולהמלצתה השפעה על קידום עובדים צעירים. אורי, בן 27, הוא עובד חדש. לפי הלכת מדר, ניתן לראות ביחסים אלה יחסי מרות, ולהסביר את השתתפותו של אורי בשיחות גם ברצון שלא להסתכסך עם מי שמשפיעה על עתידו.</w:t>
+      </w:r>
+    </w:p>
+    <w:p>
+      <w:pPr>
+        <w:bidi/>
+        <w:spacing w:before="0" w:after="0"/>
+        <w:jc w:val="both"/>
+      </w:pPr>
+      <w:r>
+        <w:rPr>
+          <w:sz w:val="24"/>
+          <w:rtl/>
+          <w:szCs w:val="24"/>
+        </w:rPr>
+        <w:t xml:space="preserve">עם זאת, גם כשקיימים יחסי מרות נדרשות התייחסויות חוזרות </w:t>
       </w:r>
       <w:r>
         <w:rPr>
@@ -969,7 +887,7 @@
           <w:rtl/>
           <w:szCs w:val="24"/>
         </w:rPr>
-        <w:t xml:space="preserve">. דנה סיפרה בעיקר על חייה שלה, לא התנתה דבר, השיחות היו הדדיות והיא הפסיקה כשהתבקשה. בנסיבות אלה נראה כי קשה לבסס ניצול מרות, ולכן מסקנתי היא שטענת ההטרדה המינית אינה חזקה, אף שאינה מופרכת. מכל מקום, שיח מיני מפורט מצד עובדת בכירה כלפי עובד צעיר אינו ראוי, והמעסיק נדרש למנוע אותו במסגרת חובותיו לפי </w:t>
+        <w:t>, ונדרש ש</w:t>
       </w:r>
       <w:r>
         <w:rPr>
@@ -979,7 +897,93 @@
           <w:szCs w:val="24"/>
           <w:bCs/>
         </w:rPr>
-        <w:t>סעיף 7 לחוק</w:t>
+        <w:t>נוצלו</w:t>
+      </w:r>
+      <w:r>
+        <w:rPr>
+          <w:sz w:val="24"/>
+          <w:rtl/>
+          <w:szCs w:val="24"/>
+        </w:rPr>
+        <w:t xml:space="preserve"> יחסי המרות. השאלה הישירה על נטייתו של אורי נשאלה פעם אחת. רוב השיחות עסקו בחייה של דנה, היו הדדיות ולא היה בהן רמז לקשר בין השיחות לבין מעמדו בעבודה. בכך שונה המקרה מעניין מדר, שבו המטריד העיר שוב ושוב על מראה המוטרדת ועל לבושה. לכן נראה לי שקשה לבסס כאן הטרדה מינית, אם כי הטענה אינה מופרכת: שיתוף מפורט ומתמשך בפרטים אינטימיים מצד עובדת ותיקה ובעלת השפעה, כלפי עובד חדש, אינו התנהגות ראויה במקום עבודה. כמו כן, אין זו </w:t>
+      </w:r>
+      <w:r>
+        <w:rPr>
+          <w:b/>
+          <w:sz w:val="24"/>
+          <w:rtl/>
+          <w:szCs w:val="24"/>
+          <w:bCs/>
+        </w:rPr>
+        <w:t>הטרדה סביבתית</w:t>
+      </w:r>
+      <w:r>
+        <w:rPr>
+          <w:sz w:val="24"/>
+          <w:rtl/>
+          <w:szCs w:val="24"/>
+        </w:rPr>
+        <w:t>, משום שההתנהגות הופנתה לאורי בלבד ולא יצרה אווירה כללית במשרד.</w:t>
+      </w:r>
+    </w:p>
+    <w:p>
+      <w:pPr>
+        <w:bidi/>
+        <w:spacing w:before="120" w:after="0"/>
+        <w:jc w:val="both"/>
+      </w:pPr>
+      <w:r>
+        <w:rPr>
+          <w:b/>
+          <w:sz w:val="24"/>
+          <w:rtl/>
+          <w:szCs w:val="24"/>
+          <w:bCs/>
+        </w:rPr>
+        <w:t>2. חובות המעסיק והתנכלות</w:t>
+      </w:r>
+    </w:p>
+    <w:p>
+      <w:pPr>
+        <w:bidi/>
+        <w:spacing w:before="0" w:after="0"/>
+        <w:jc w:val="both"/>
+      </w:pPr>
+      <w:r>
+        <w:rPr>
+          <w:sz w:val="24"/>
+          <w:rtl/>
+          <w:szCs w:val="24"/>
+        </w:rPr>
+        <w:t xml:space="preserve">לפי </w:t>
+      </w:r>
+      <w:r>
+        <w:rPr>
+          <w:b/>
+          <w:sz w:val="24"/>
+          <w:rtl/>
+          <w:szCs w:val="24"/>
+          <w:bCs/>
+        </w:rPr>
+        <w:t>סעיף 7(א) לחוק</w:t>
+      </w:r>
+      <w:r>
+        <w:rPr>
+          <w:sz w:val="24"/>
+          <w:rtl/>
+          <w:szCs w:val="24"/>
+        </w:rPr>
+        <w:t xml:space="preserve">, מעסיק חייב לנקוט אמצעים סבירים כדי למנוע הטרדה מינית והתנכלות ולטפל בכל מקרה. Frame מעסיקה כ-70 עובדים, ולכן, לפי </w:t>
+      </w:r>
+      <w:r>
+        <w:rPr>
+          <w:b/>
+          <w:sz w:val="24"/>
+          <w:rtl/>
+          <w:szCs w:val="24"/>
+          <w:bCs/>
+        </w:rPr>
+        <w:t>סעיף 7(ב)</w:t>
       </w:r>
       <w:r>
         <w:rPr>
@@ -1005,7 +1009,32 @@
           <w:rtl/>
           <w:szCs w:val="24"/>
         </w:rPr>
-        <w:t>: קביעת תקנון, הסברה ומינוי אחראי לטיפול בתלונות.</w:t>
+        <w:t>, עליה גם לקבוע תקנון, לפרסמו ולמנות ממונה על מניעת הטרדה מינית. אורי לא התלונן, ולכן אין מקום לטענה שהחברה לא טיפלה בתלונה.</w:t>
+      </w:r>
+    </w:p>
+    <w:p>
+      <w:pPr>
+        <w:bidi/>
+        <w:spacing w:before="0" w:after="0"/>
+        <w:jc w:val="both"/>
+      </w:pPr>
+      <w:r>
+        <w:rPr>
+          <w:b/>
+          <w:sz w:val="24"/>
+          <w:rtl/>
+          <w:szCs w:val="24"/>
+          <w:bCs/>
+        </w:rPr>
+        <w:t>התנכלות</w:t>
+      </w:r>
+      <w:r>
+        <w:rPr>
+          <w:sz w:val="24"/>
+          <w:rtl/>
+          <w:szCs w:val="24"/>
+        </w:rPr>
+        <w:t xml:space="preserve"> מוגדרת בסעיף 3(ב) כפגיעה מכל סוג שמקורה בהטרדה מינית או בתלונה עליה. העברתו של אורי לצוות טכני, חודש אחרי שביקש לסיים את השיחות, בצירוף השפעתה של דנה על השיבוץ, מעוררת חשד לקשר כזה. אבל טענת ההתנכלות תלויה בכך שההתנהגות שקדמה לה הייתה הטרדה מינית, ובהוכחה שההעברה נבעה ממנה ולא מצורכי העבודה. העובדות אינן מראות שדנה הייתה מעורבת בהחלטה.</w:t>
       </w:r>
     </w:p>
     <w:p>
@@ -1022,86 +1051,7 @@
           <w:szCs w:val="24"/>
           <w:bCs/>
         </w:rPr>
-        <w:t>2. האם ההעברה לצוות אחר היא התנכלות?</w:t>
-      </w:r>
-    </w:p>
-    <w:p>
-      <w:pPr>
-        <w:bidi/>
-        <w:spacing w:before="0" w:after="0"/>
-        <w:jc w:val="both"/>
-      </w:pPr>
-      <w:r>
-        <w:rPr>
-          <w:b/>
-          <w:sz w:val="24"/>
-          <w:rtl/>
-          <w:szCs w:val="24"/>
-          <w:bCs/>
-        </w:rPr>
-        <w:t>סעיף 3(א)(7)</w:t>
-      </w:r>
-      <w:r>
-        <w:rPr>
-          <w:sz w:val="24"/>
-          <w:rtl/>
-          <w:szCs w:val="24"/>
-        </w:rPr>
-        <w:t xml:space="preserve"> לחוק מגדיר </w:t>
-      </w:r>
-      <w:r>
-        <w:rPr>
-          <w:b/>
-          <w:sz w:val="24"/>
-          <w:rtl/>
-          <w:szCs w:val="24"/>
-          <w:bCs/>
-        </w:rPr>
-        <w:t>התנכלות</w:t>
-      </w:r>
-      <w:r>
-        <w:rPr>
-          <w:sz w:val="24"/>
-          <w:rtl/>
-          <w:szCs w:val="24"/>
-        </w:rPr>
-        <w:t xml:space="preserve"> כפגיעה שמקורה בהטרדה מינית, או בדחייה או תלונה בעניינה, ו</w:t>
-      </w:r>
-      <w:r>
-        <w:rPr>
-          <w:b/>
-          <w:sz w:val="24"/>
-          <w:rtl/>
-          <w:szCs w:val="24"/>
-          <w:bCs/>
-        </w:rPr>
-        <w:t>סעיף 7 לחוק שוויון ההזדמנויות בעבודה, התשמ"ח-1988</w:t>
-      </w:r>
-      <w:r>
-        <w:rPr>
-          <w:sz w:val="24"/>
-          <w:rtl/>
-          <w:szCs w:val="24"/>
-        </w:rPr>
-        <w:t xml:space="preserve"> אוסר על מעסיק לפגוע בעובד בשל כך. ההעברה של אורי חודש לאחר שביקש לסיים את השיחות, לצוות טכני ותוך גריעת אחריות וישיבות קריאטיב, מעוררת חשד לקשר סיבתי, במיוחד בשל השפעתה של דנה על השיבוץ. לפי </w:t>
-      </w:r>
-      <w:r>
-        <w:rPr>
-          <w:b/>
-          <w:sz w:val="24"/>
-          <w:rtl/>
-          <w:szCs w:val="24"/>
-          <w:bCs/>
-        </w:rPr>
-        <w:t>סעיף 9 לחוק שוויון ההזדמנויות</w:t>
-      </w:r>
-      <w:r>
-        <w:rPr>
-          <w:sz w:val="24"/>
-          <w:rtl/>
-          <w:szCs w:val="24"/>
-        </w:rPr>
-        <w:t xml:space="preserve"> הנטל עשוי לעבור למעסיק להוכיח שההעברה נעשתה משיקולים ענייניים.</w:t>
+        <w:t>3. הרעת תנאים והתפטרות בדין מפוטר</w:t>
       </w:r>
     </w:p>
     <w:p>
@@ -1116,7 +1066,7 @@
           <w:rtl/>
           <w:szCs w:val="24"/>
         </w:rPr>
-        <w:t xml:space="preserve">מנגד, למעסיק נתונה </w:t>
+        <w:t xml:space="preserve">למעסיק </w:t>
       </w:r>
       <w:r>
         <w:rPr>
@@ -1134,15 +1084,8 @@
           <w:rtl/>
           <w:szCs w:val="24"/>
         </w:rPr>
-        <w:t xml:space="preserve"> לשבץ עובדים לפי צרכי העבודה, שכרו והיקף משרתו של אורי לא נפגעו, ואין בעובדות ראיה ישירה למעורבותה של דנה בהחלטה. ההכרעה בטענה תלויה אפוא בראיות, ובעיקר בשאלה מי קיבל את ההחלטה ומה היו נימוקיה. אם יוכח קשר לדחיית השיחות, תקום לאורי עילת התנכלות, ואף אם הוא עצמו לא התלונן.</w:t>
+        <w:t xml:space="preserve"> לשנות באופן חד-צדדי נהלי עבודה, ובכלל זה לקבוע מי משתתף בישיבות. שינוי שחורג ממנה ופוגע בהכנסת העובד או ב</w:t>
       </w:r>
-    </w:p>
-    <w:p>
-      <w:pPr>
-        <w:bidi/>
-        <w:spacing w:before="120" w:after="0"/>
-        <w:jc w:val="both"/>
-      </w:pPr>
       <w:r>
         <w:rPr>
           <w:b/>
@@ -1151,7 +1094,33 @@
           <w:szCs w:val="24"/>
           <w:bCs/>
         </w:rPr>
-        <w:t>3. האם אורי התפטר "בדין מפוטר"?</w:t>
+        <w:t>מעמדו בארגון</w:t>
+      </w:r>
+      <w:r>
+        <w:rPr>
+          <w:sz w:val="24"/>
+          <w:rtl/>
+          <w:szCs w:val="24"/>
+        </w:rPr>
+        <w:t xml:space="preserve"> הוא </w:t>
+      </w:r>
+      <w:r>
+        <w:rPr>
+          <w:b/>
+          <w:sz w:val="24"/>
+          <w:rtl/>
+          <w:szCs w:val="24"/>
+          <w:bCs/>
+        </w:rPr>
+        <w:t>הרעת תנאים</w:t>
+      </w:r>
+      <w:r>
+        <w:rPr>
+          <w:sz w:val="24"/>
+          <w:rtl/>
+          <w:szCs w:val="24"/>
+        </w:rPr>
+        <w:t xml:space="preserve"> והפרה של חוזה העבודה (הילדסהימר, 2026א). העברתו של אורי מהפרויקטים המרכזיים לעריכה טכנית, בלי ישיבות קריאטיב ועם פחות אחריות, היא פגיעה במעמד, אף ששכרו לא השתנה.</w:t>
       </w:r>
     </w:p>
     <w:p>
@@ -1184,7 +1153,7 @@
           <w:rtl/>
           <w:szCs w:val="24"/>
         </w:rPr>
-        <w:t xml:space="preserve">, התפטרות בשל </w:t>
+        <w:t xml:space="preserve">, התפטרות מחמת </w:t>
       </w:r>
       <w:r>
         <w:rPr>
@@ -1194,7 +1163,7 @@
           <w:szCs w:val="24"/>
           <w:bCs/>
         </w:rPr>
-        <w:t>הרעה מוחשית בתנאי העבודה</w:t>
+        <w:t>הרעה מוחשית</w:t>
       </w:r>
       <w:r>
         <w:rPr>
@@ -1202,61 +1171,7 @@
           <w:rtl/>
           <w:szCs w:val="24"/>
         </w:rPr>
-        <w:t xml:space="preserve">, או בשל </w:t>
-      </w:r>
-      <w:r>
-        <w:rPr>
-          <w:b/>
-          <w:sz w:val="24"/>
-          <w:rtl/>
-          <w:szCs w:val="24"/>
-          <w:bCs/>
-        </w:rPr>
-        <w:t>נסיבות אחרות שביחסי העבודה</w:t>
-      </w:r>
-      <w:r>
-        <w:rPr>
-          <w:sz w:val="24"/>
-          <w:rtl/>
-          <w:szCs w:val="24"/>
-        </w:rPr>
-        <w:t xml:space="preserve"> שבהן אין לדרוש מהעובד להמשיך בעבודתו, דינה כפיטורים לעניין פיצויי פיטורים. הפסיקה דורשת שלושה יסודות: </w:t>
-      </w:r>
-      <w:r>
-        <w:rPr>
-          <w:b/>
-          <w:sz w:val="24"/>
-          <w:rtl/>
-          <w:szCs w:val="24"/>
-          <w:bCs/>
-        </w:rPr>
-        <w:t>(א)</w:t>
-      </w:r>
-      <w:r>
-        <w:rPr>
-          <w:sz w:val="24"/>
-          <w:rtl/>
-          <w:szCs w:val="24"/>
-        </w:rPr>
-        <w:t xml:space="preserve"> הרעה מוחשית או נסיבות מצדיקות; </w:t>
-      </w:r>
-      <w:r>
-        <w:rPr>
-          <w:b/>
-          <w:sz w:val="24"/>
-          <w:rtl/>
-          <w:szCs w:val="24"/>
-          <w:bCs/>
-        </w:rPr>
-        <w:t>(ב)</w:t>
-      </w:r>
-      <w:r>
-        <w:rPr>
-          <w:sz w:val="24"/>
-          <w:rtl/>
-          <w:szCs w:val="24"/>
-        </w:rPr>
-        <w:t xml:space="preserve"> </w:t>
+        <w:t xml:space="preserve"> בתנאי העבודה, או מחמת נסיבות שבהן אין לדרוש מהעובד להמשיך בעבודתו, נחשבת כפיטורים. כדי לממש זכות זו על העובד לתת למעסיק </w:t>
       </w:r>
       <w:r>
         <w:rPr>
@@ -1274,7 +1189,7 @@
           <w:rtl/>
           <w:szCs w:val="24"/>
         </w:rPr>
-        <w:t xml:space="preserve"> למעסיק ומתן הזדמנות סבירה לתקן את המצב; </w:t>
+        <w:t xml:space="preserve"> ו</w:t>
       </w:r>
       <w:r>
         <w:rPr>
@@ -1284,7 +1199,7 @@
           <w:szCs w:val="24"/>
           <w:bCs/>
         </w:rPr>
-        <w:t>(ג)</w:t>
+        <w:t>הזדמנות לתקן</w:t>
       </w:r>
       <w:r>
         <w:rPr>
@@ -1292,7 +1207,7 @@
           <w:rtl/>
           <w:szCs w:val="24"/>
         </w:rPr>
-        <w:t xml:space="preserve"> </w:t>
+        <w:t>, לפעול ב</w:t>
       </w:r>
       <w:r>
         <w:rPr>
@@ -1302,7 +1217,7 @@
           <w:szCs w:val="24"/>
           <w:bCs/>
         </w:rPr>
-        <w:t>קשר סיבתי</w:t>
+        <w:t>תום לב</w:t>
       </w:r>
       <w:r>
         <w:rPr>
@@ -1310,7 +1225,43 @@
           <w:rtl/>
           <w:szCs w:val="24"/>
         </w:rPr>
-        <w:t xml:space="preserve"> בין ההרעה להתפטרות, הנבחן בין היתר לפי סמיכות הזמנים.</w:t>
+        <w:t xml:space="preserve"> ובלי </w:t>
+      </w:r>
+      <w:r>
+        <w:rPr>
+          <w:b/>
+          <w:sz w:val="24"/>
+          <w:rtl/>
+          <w:szCs w:val="24"/>
+          <w:bCs/>
+        </w:rPr>
+        <w:t>שיהוי</w:t>
+      </w:r>
+      <w:r>
+        <w:rPr>
+          <w:sz w:val="24"/>
+          <w:rtl/>
+          <w:szCs w:val="24"/>
+        </w:rPr>
+        <w:t>, שכן שיהוי עלול להתפרש כהסכמה בהתנהגות להרעה. ב</w:t>
+      </w:r>
+      <w:r>
+        <w:rPr>
+          <w:b/>
+          <w:sz w:val="24"/>
+          <w:rtl/>
+          <w:szCs w:val="24"/>
+          <w:bCs/>
+        </w:rPr>
+        <w:t>תב"ע (ארצי) נד/3-86 גולן נ' אי.אל.די. בע"מ</w:t>
+      </w:r>
+      <w:r>
+        <w:rPr>
+          <w:sz w:val="24"/>
+          <w:rtl/>
+          <w:szCs w:val="24"/>
+        </w:rPr>
+        <w:t xml:space="preserve"> הכיר בית הדין בהרעת תנאים, אך קבע שעובד שהמשיך לעבוד שמונה חודשים בתנאים החדשים הסכים להם בהתנהגותו.</w:t>
       </w:r>
     </w:p>
     <w:p>
@@ -1325,43 +1276,7 @@
           <w:rtl/>
           <w:szCs w:val="24"/>
         </w:rPr>
-        <w:t xml:space="preserve">הרעה מוחשית אינה מוגבלת לשכר, ופגיעה במעמד, באחריות ובהיקף הסמכויות עשויה להיחשב כזו. לכן אורי יכול לטעון שהמעבר לעריכה טכנית ולבקרת איכות הוא הרעה מוחשית. אולם אורי </w:t>
-      </w:r>
-      <w:r>
-        <w:rPr>
-          <w:b/>
-          <w:sz w:val="24"/>
-          <w:rtl/>
-          <w:szCs w:val="24"/>
-          <w:bCs/>
-        </w:rPr>
-        <w:t>לא מחה ולא ביקש לחזור לתפקידו</w:t>
-      </w:r>
-      <w:r>
-        <w:rPr>
-          <w:sz w:val="24"/>
-          <w:rtl/>
-          <w:szCs w:val="24"/>
-        </w:rPr>
-        <w:t xml:space="preserve">, ולא נתן למעסיק הזדמנות לתקן את המצב. הוא המשיך לעבוד במתכונת החדשה </w:t>
-      </w:r>
-      <w:r>
-        <w:rPr>
-          <w:b/>
-          <w:sz w:val="24"/>
-          <w:rtl/>
-          <w:szCs w:val="24"/>
-          <w:bCs/>
-        </w:rPr>
-        <w:t>ארבעה חודשים</w:t>
-      </w:r>
-      <w:r>
-        <w:rPr>
-          <w:sz w:val="24"/>
-          <w:rtl/>
-          <w:szCs w:val="24"/>
-        </w:rPr>
-        <w:t>, דבר המלמד על השלמה עם השינוי ומחליש את הקשר הסיבתי. הפסיקה מכירה בגמישות בדרישת ההתראה כאשר מדובר בהטרדה מינית או כאשר ההתראה הייתה חסרת תועלת, אך כאמור קשה להוכיח הטרדה מינית במקרה זה, והגמישות אינה מצדיקה שתיקה ממושכת.</w:t>
+        <w:t>אורי לא מחה, לא ביקש לחזור לתפקידו, לא התריע על כוונתו להתפטר ועבד ארבעה חודשים במתכונת החדשה. התקופה קצרה מזו שבעניין גולן, אך בצירוף השתיקה המוחלטת נראה שהיא מלמדת על השלמה עם השינוי. גם החלופה של "נסיבות אחרות" אינה מסייעת לו: השיחות הסתיימו חודשים לפני ההתפטרות, ולא הוכח שהייתה הטרדה.</w:t>
       </w:r>
     </w:p>
     <w:p>
@@ -1393,7 +1308,275 @@
           <w:rtl/>
           <w:szCs w:val="24"/>
         </w:rPr>
-        <w:t>לדעתי טענותיו של אורי אינן מבוססות דיין. טענת ההטרדה המינית חלשה, משום שאורי לא הראה חוסר עניין עד שביקש לסיים את השיחות, ודנה חדלה מיד. רק אם בית הדין יקבע כי התקיימו יחסי מרות מהותיים וכי דנה ניצלה אותם, הטענה תתחזק. טענת ההתנכלות אפשרית ותלויה בהוכחת קשר בין ההעברה לבין דחיית השיחות. טענת ההתפטרות בדין מפוטר חלשה, בעיקר בשל היעדר התראה וחלוף ארבעה חודשים. יחד עם זאת, על החברה לבחון את התנהלותה ולוודא שהיא עומדת בחובותיה לפי החוק והתקנות.</w:t>
+        <w:t>לדעתי טענותיו של אורי אינן מבוססות. טענת ההטרדה המינית תלויה בהכרה ביחסי מרות לפי הלכת מדר, וגם אז קשה להראות התייחסויות חוזרות למיניותו או ניצול של יחסי המרות. טענת ההתנכלות תלויה בהוכחת ההטרדה ובקשר בינה לבין ההעברה. טענת ההתפטרות בדין מפוטר נכשלת בעיקר משום שלא ניתנה התראה ובשל השיהוי, לפי הלכת גולן. על Frame לוודא שיש לה תקנון וממונה כנדרש בסעיף 7(ב), ולהבהיר לעובדים ותיקים בעלי השפעה מה הם גבולות השיח האישי עם עובדים חדשים.</w:t>
+      </w:r>
+    </w:p>
+    <w:p>
+      <w:r>
+        <w:br w:type="page"/>
+      </w:r>
+    </w:p>
+    <w:p>
+      <w:pPr>
+        <w:bidi/>
+        <w:spacing w:before="0" w:after="120"/>
+        <w:jc w:val="center"/>
+      </w:pPr>
+      <w:r>
+        <w:rPr>
+          <w:b/>
+          <w:sz w:val="28"/>
+          <w:rtl/>
+          <w:szCs w:val="28"/>
+          <w:bCs/>
+        </w:rPr>
+        <w:t>רשימת מקורות</w:t>
+      </w:r>
+    </w:p>
+    <w:p>
+      <w:pPr>
+        <w:bidi/>
+        <w:spacing w:before="120" w:after="0"/>
+        <w:jc w:val="both"/>
+      </w:pPr>
+      <w:r>
+        <w:rPr>
+          <w:b/>
+          <w:sz w:val="24"/>
+          <w:rtl/>
+          <w:szCs w:val="24"/>
+          <w:bCs/>
+        </w:rPr>
+        <w:t>חקיקה</w:t>
+      </w:r>
+    </w:p>
+    <w:p>
+      <w:pPr>
+        <w:bidi/>
+        <w:spacing w:before="0" w:after="0"/>
+        <w:jc w:val="both"/>
+      </w:pPr>
+      <w:r>
+        <w:rPr>
+          <w:sz w:val="24"/>
+          <w:rtl/>
+          <w:szCs w:val="24"/>
+        </w:rPr>
+        <w:t>חוק הסכמים קיבוציים, התשי"ז-1957.</w:t>
+      </w:r>
+    </w:p>
+    <w:p>
+      <w:pPr>
+        <w:bidi/>
+        <w:spacing w:before="0" w:after="0"/>
+        <w:jc w:val="both"/>
+      </w:pPr>
+      <w:r>
+        <w:rPr>
+          <w:sz w:val="24"/>
+          <w:rtl/>
+          <w:szCs w:val="24"/>
+        </w:rPr>
+        <w:t>חוק למניעת הטרדה מינית, התשנ"ח-1998.</w:t>
+      </w:r>
+    </w:p>
+    <w:p>
+      <w:pPr>
+        <w:bidi/>
+        <w:spacing w:before="0" w:after="0"/>
+        <w:jc w:val="both"/>
+      </w:pPr>
+      <w:r>
+        <w:rPr>
+          <w:sz w:val="24"/>
+          <w:rtl/>
+          <w:szCs w:val="24"/>
+        </w:rPr>
+        <w:t>חוק פיצויי פיטורים, התשכ"ג-1963.</w:t>
+      </w:r>
+    </w:p>
+    <w:p>
+      <w:pPr>
+        <w:bidi/>
+        <w:spacing w:before="0" w:after="0"/>
+        <w:jc w:val="both"/>
+      </w:pPr>
+      <w:r>
+        <w:rPr>
+          <w:sz w:val="24"/>
+          <w:rtl/>
+          <w:szCs w:val="24"/>
+        </w:rPr>
+        <w:t>תקנות למניעת הטרדה מינית (חובות מעביד), התשנ"ח-1998.</w:t>
+      </w:r>
+    </w:p>
+    <w:p>
+      <w:pPr>
+        <w:bidi/>
+        <w:spacing w:before="120" w:after="0"/>
+        <w:jc w:val="both"/>
+      </w:pPr>
+      <w:r>
+        <w:rPr>
+          <w:b/>
+          <w:sz w:val="24"/>
+          <w:rtl/>
+          <w:szCs w:val="24"/>
+          <w:bCs/>
+        </w:rPr>
+        <w:t>פסיקה</w:t>
+      </w:r>
+    </w:p>
+    <w:p>
+      <w:pPr>
+        <w:bidi/>
+        <w:spacing w:before="0" w:after="0"/>
+        <w:jc w:val="both"/>
+      </w:pPr>
+      <w:r>
+        <w:rPr>
+          <w:sz w:val="24"/>
+          <w:rtl/>
+          <w:szCs w:val="24"/>
+        </w:rPr>
+        <w:t>בג"ץ 7029/95 הסתדרות העובדים הכללית החדשה נ' בית הדין הארצי לעבודה ועמית, הסתדרות עובדים מכבי (1997).</w:t>
+      </w:r>
+    </w:p>
+    <w:p>
+      <w:pPr>
+        <w:bidi/>
+        <w:spacing w:before="0" w:after="0"/>
+        <w:jc w:val="both"/>
+      </w:pPr>
+      <w:r>
+        <w:rPr>
+          <w:sz w:val="24"/>
+          <w:rtl/>
+          <w:szCs w:val="24"/>
+        </w:rPr>
+        <w:t>עס"ק (ארצי) 6298-03-25 הסתדרות העובדים הכללית החדשה נ' ארגון עובדי הפיתוח והשיווק בנוקיה (10.6.2025).</w:t>
+      </w:r>
+    </w:p>
+    <w:p>
+      <w:pPr>
+        <w:bidi/>
+        <w:spacing w:before="0" w:after="0"/>
+        <w:jc w:val="both"/>
+      </w:pPr>
+      <w:r>
+        <w:rPr>
+          <w:sz w:val="24"/>
+          <w:rtl/>
+          <w:szCs w:val="24"/>
+        </w:rPr>
+        <w:t>עס"ק (ארצי) 25476-09-12 הסתדרות העובדים החדשה נ' פלאפון תקשורת בע"מ (2.1.2013).</w:t>
+      </w:r>
+    </w:p>
+    <w:p>
+      <w:pPr>
+        <w:bidi/>
+        <w:spacing w:before="0" w:after="0"/>
+        <w:jc w:val="both"/>
+      </w:pPr>
+      <w:r>
+        <w:rPr>
+          <w:sz w:val="24"/>
+          <w:rtl/>
+          <w:szCs w:val="24"/>
+        </w:rPr>
+        <w:t>עש"ם 2203/05 מדר נ' נציבות שירות המדינה (21.7.2005).</w:t>
+      </w:r>
+    </w:p>
+    <w:p>
+      <w:pPr>
+        <w:bidi/>
+        <w:spacing w:before="0" w:after="0"/>
+        <w:jc w:val="both"/>
+      </w:pPr>
+      <w:r>
+        <w:rPr>
+          <w:sz w:val="24"/>
+          <w:rtl/>
+          <w:szCs w:val="24"/>
+        </w:rPr>
+        <w:t>תב"ע (ארצי) נד/3-86 יוחנן גולן נ' אי.אל.די. בע"מ.</w:t>
+      </w:r>
+    </w:p>
+    <w:p>
+      <w:pPr>
+        <w:bidi/>
+        <w:spacing w:before="120" w:after="0"/>
+        <w:jc w:val="both"/>
+      </w:pPr>
+      <w:r>
+        <w:rPr>
+          <w:b/>
+          <w:sz w:val="24"/>
+          <w:rtl/>
+          <w:szCs w:val="24"/>
+          <w:bCs/>
+        </w:rPr>
+        <w:t>ספרות וחומרי הקורס</w:t>
+      </w:r>
+    </w:p>
+    <w:p>
+      <w:pPr>
+        <w:bidi/>
+        <w:spacing w:before="0" w:after="0"/>
+        <w:jc w:val="both"/>
+      </w:pPr>
+      <w:r>
+        <w:rPr>
+          <w:sz w:val="24"/>
+          <w:rtl/>
+          <w:szCs w:val="24"/>
+        </w:rPr>
+        <w:t>בן-ישראל, ר' (2002). דיני עבודה (כרך א', עמ' 32-48).</w:t>
+      </w:r>
+    </w:p>
+    <w:p>
+      <w:pPr>
+        <w:bidi/>
+        <w:spacing w:before="0" w:after="0"/>
+        <w:jc w:val="both"/>
+      </w:pPr>
+      <w:r>
+        <w:rPr>
+          <w:sz w:val="24"/>
+          <w:rtl/>
+          <w:szCs w:val="24"/>
+        </w:rPr>
+        <w:t>הילדסהימר, ג' (2026א). חוזה עבודה אישי ומניעת הרעת תנאים, חלקים א'-ב' [מצגת הרצאה]. היבטים משפטיים ואתיים בייעוץ ופיתוח ארגוני, המרכז האקדמי פרס.</w:t>
+      </w:r>
+    </w:p>
+    <w:p>
+      <w:pPr>
+        <w:bidi/>
+        <w:spacing w:before="0" w:after="0"/>
+        <w:jc w:val="both"/>
+      </w:pPr>
+      <w:r>
+        <w:rPr>
+          <w:sz w:val="24"/>
+          <w:rtl/>
+          <w:szCs w:val="24"/>
+        </w:rPr>
+        <w:t>הילדסהימר, ג' (2026ב). החוק למניעת הטרדה מינית, חלקים א'-ב' [מצגת הרצאה]. היבטים משפטיים ואתיים בייעוץ ופיתוח ארגוני, המרכז האקדמי פרס.</w:t>
+      </w:r>
+    </w:p>
+    <w:p>
+      <w:pPr>
+        <w:bidi/>
+        <w:spacing w:before="0" w:after="0"/>
+        <w:jc w:val="both"/>
+      </w:pPr>
+      <w:r>
+        <w:rPr>
+          <w:sz w:val="24"/>
+          <w:rtl/>
+          <w:szCs w:val="24"/>
+        </w:rPr>
+        <w:t>הילדסהימר, ג' (2026ג). התארגנויות עובדים [מצגת הרצאה]. היבטים משפטיים ואתיים בייעוץ ופיתוח ארגוני, המרכז האקדמי פרס.</w:t>
       </w:r>
     </w:p>
     <w:sectPr>

</xml_diff>

<commit_message>
Align severance pay analysis with statute text
Co-Authored-By: Claude Opus 5.5 <noreply@anthropic.com>
Claude-Session: https://claude.ai/code/session_01BVH1n3fvCDz4inkznfhZC9
</commit_message>
<xml_diff>
--- a/output/עבודה_היבטים_משפטיים.docx
+++ b/output/עבודה_היבטים_משפטיים.docx
@@ -905,7 +905,7 @@
           <w:rtl/>
           <w:szCs w:val="24"/>
         </w:rPr>
-        <w:t xml:space="preserve"> יחסי המרות. השאלה הישירה על נטייתו של אורי נשאלה פעם אחת. רוב השיחות עסקו בחייה של דנה, היו הדדיות ולא היה בהן רמז לקשר בין השיחות לבין מעמדו בעבודה. בכך שונה המקרה מעניין מדר, שבו המטריד העיר שוב ושוב על מראה המוטרדת ועל לבושה. לכן נראה לי שקשה לבסס כאן הטרדה מינית, אם כי הטענה אינה מופרכת: שיתוף מפורט ומתמשך בפרטים אינטימיים מצד עובדת ותיקה ובעלת השפעה, כלפי עובד חדש, אינו התנהגות ראויה במקום עבודה. כמו כן, אין זו </w:t>
+        <w:t xml:space="preserve"> יחסי המרות. השאלה הישירה על נטייתו של אורי נשאלה פעם אחת. רוב השיחות עסקו בחייה של דנה, היו הדדיות ולא היה בהן רמז לקשר בין השיחות לבין מעמדו בעבודה. בעניין מדר, לעומת זאת, המטריד העיר שוב ושוב על מראה המוטרדת. לכן נראה לי שקשה לבסס כאן הטרדה מינית, אם כי הטענה אינה מופרכת: שיתוף מפורט ומתמשך בפרטים אינטימיים מצד עובדת ותיקה ובעלת השפעה, כלפי עובד חדש, אינו התנהגות ראויה במקום עבודה. אין זו גם </w:t>
       </w:r>
       <w:r>
         <w:rPr>
@@ -923,7 +923,7 @@
           <w:rtl/>
           <w:szCs w:val="24"/>
         </w:rPr>
-        <w:t>, משום שההתנהגות הופנתה לאורי בלבד ולא יצרה אווירה כללית במשרד.</w:t>
+        <w:t>, שכן ההתנהגות הופנתה לאורי בלבד.</w:t>
       </w:r>
     </w:p>
     <w:p>
@@ -1001,7 +1001,7 @@
           <w:szCs w:val="24"/>
           <w:bCs/>
         </w:rPr>
-        <w:t>תקנות למניעת הטרדה מינית (חובות מעביד), התשנ"ח-1998</w:t>
+        <w:t>תקנות למניעת הטרדה מינית (חובות מעסיק), התשנ"ח-1998</w:t>
       </w:r>
       <w:r>
         <w:rPr>
@@ -1009,7 +1009,7 @@
           <w:rtl/>
           <w:szCs w:val="24"/>
         </w:rPr>
-        <w:t>, עליה גם לקבוע תקנון, לפרסמו ולמנות ממונה על מניעת הטרדה מינית. אורי לא התלונן, ולכן אין מקום לטענה שהחברה לא טיפלה בתלונה.</w:t>
+        <w:t>, עליה גם לקבוע תקנון, לפרסמו ולמנות ממונה על מניעת הטרדה מינית.</w:t>
       </w:r>
     </w:p>
     <w:p>
@@ -1171,7 +1171,7 @@
           <w:rtl/>
           <w:szCs w:val="24"/>
         </w:rPr>
-        <w:t xml:space="preserve"> בתנאי העבודה, או מחמת נסיבות שבהן אין לדרוש מהעובד להמשיך בעבודתו, נחשבת כפיטורים. כדי לממש זכות זו על העובד לתת למעסיק </w:t>
+        <w:t xml:space="preserve"> בתנאי העבודה, או מחמת "נסיבות אחרות שביחסי עבודה" שבהן אין לדרוש מהעובד להמשיך בעבודתו, נחשבת כפיטורים "לעניין חוק זה", כלומר לעניין הזכאות לפיצויי פיטורים בלבד. הזכאות עצמה מותנית בשנת עבודה אחת ברציפות אצל אותו מעסיק (סעיף 1(א) לחוק), ומאחר שאורי "התקבל" לחברה ותקופת העסקתו אינה ידועה, יש לבדוק תחילה שתנאי זה מתקיים. כדי לממש זכות זו על העובד לתת למעסיק </w:t>
       </w:r>
       <w:r>
         <w:rPr>
@@ -1276,7 +1276,7 @@
           <w:rtl/>
           <w:szCs w:val="24"/>
         </w:rPr>
-        <w:t>אורי לא מחה, לא ביקש לחזור לתפקידו, לא התריע על כוונתו להתפטר ועבד ארבעה חודשים במתכונת החדשה. התקופה קצרה מזו שבעניין גולן, אך בצירוף השתיקה המוחלטת נראה שהיא מלמדת על השלמה עם השינוי. גם החלופה של "נסיבות אחרות" אינה מסייעת לו: השיחות הסתיימו חודשים לפני ההתפטרות, ולא הוכח שהייתה הטרדה.</w:t>
+        <w:t>אורי לא מחה, לא ביקש לחזור לתפקידו, לא התריע על כוונתו להתפטר ועבד ארבעה חודשים במתכונת החדשה. התקופה קצרה מזו שבעניין גולן, אך בצירוף השתיקה היא מלמדת על השלמה עם השינוי. גם החלופה של "נסיבות אחרות" אינה מסייעת לו: השיחות הסתיימו חודשים לפני ההתפטרות, ולא הוכח שהייתה הטרדה.</w:t>
       </w:r>
     </w:p>
     <w:p>
@@ -1308,7 +1308,7 @@
           <w:rtl/>
           <w:szCs w:val="24"/>
         </w:rPr>
-        <w:t>לדעתי טענותיו של אורי אינן מבוססות. טענת ההטרדה המינית תלויה בהכרה ביחסי מרות לפי הלכת מדר, וגם אז קשה להראות התייחסויות חוזרות למיניותו או ניצול של יחסי המרות. טענת ההתנכלות תלויה בהוכחת ההטרדה ובקשר בינה לבין ההעברה. טענת ההתפטרות בדין מפוטר נכשלת בעיקר משום שלא ניתנה התראה ובשל השיהוי, לפי הלכת גולן. על Frame לוודא שיש לה תקנון וממונה כנדרש בסעיף 7(ב), ולהבהיר לעובדים ותיקים בעלי השפעה מה הם גבולות השיח האישי עם עובדים חדשים.</w:t>
+        <w:t>לדעתי טענותיו של אורי אינן מבוססות. טענת ההטרדה המינית תלויה בהכרה ביחסי מרות לפי הלכת מדר, וגם אז קשה להראות התייחסויות חוזרות למיניותו או ניצול של יחסי המרות. טענת ההתנכלות תלויה בהוכחת ההטרדה ובקשר בינה לבין ההעברה. טענת ההתפטרות בדין מפוטר נכשלת בעיקר משום שלא ניתנה התראה ובשל השיהוי, לפי הלכת גולן. על Frame לוודא שיש לה תקנון וממונה כנדרש בסעיף 7(ב).</w:t>
       </w:r>
     </w:p>
     <w:p>
@@ -1407,7 +1407,7 @@
           <w:rtl/>
           <w:szCs w:val="24"/>
         </w:rPr>
-        <w:t>תקנות למניעת הטרדה מינית (חובות מעביד), התשנ"ח-1998.</w:t>
+        <w:t>תקנות למניעת הטרדה מינית (חובות מעסיק), התשנ"ח-1998.</w:t>
       </w:r>
     </w:p>
     <w:p>

</xml_diff>

<commit_message>
Use page-break-before on part headings
Co-Authored-By: Claude Opus 5.5 <noreply@anthropic.com>
Claude-Session: https://claude.ai/code/session_01BVH1n3fvCDz4inkznfhZC9
</commit_message>
<xml_diff>
--- a/output/עבודה_היבטים_משפטיים.docx
+++ b/output/עבודה_היבטים_משפטיים.docx
@@ -638,12 +638,8 @@
       </w:r>
     </w:p>
     <w:p>
-      <w:r>
-        <w:br w:type="page"/>
-      </w:r>
-    </w:p>
-    <w:p>
       <w:pPr>
+        <w:pageBreakBefore/>
         <w:bidi/>
         <w:spacing w:before="0" w:after="120"/>
         <w:jc w:val="center"/>
@@ -1312,12 +1308,8 @@
       </w:r>
     </w:p>
     <w:p>
-      <w:r>
-        <w:br w:type="page"/>
-      </w:r>
-    </w:p>
-    <w:p>
       <w:pPr>
+        <w:pageBreakBefore/>
         <w:bidi/>
         <w:spacing w:before="0" w:after="120"/>
         <w:jc w:val="center"/>

</xml_diff>

<commit_message>
Align Part B with sexual harassment regulations
Co-Authored-By: Claude Opus 5.5 <noreply@anthropic.com>
Claude-Session: https://claude.ai/code/session_01BVH1n3fvCDz4inkznfhZC9
</commit_message>
<xml_diff>
--- a/output/עבודה_היבטים_משפטיים.docx
+++ b/output/עבודה_היבטים_משפטיים.docx
@@ -766,7 +766,7 @@
           <w:rtl/>
           <w:szCs w:val="24"/>
         </w:rPr>
-        <w:t xml:space="preserve"> בהן. החלופה של הצעות חוזרות בעלות אופי מיני (סעיף 3(א)(3)) אינה חלה, משום שדנה לא הציעה לאורי דבר. גם סעיף 3(א)(5), התייחסות מבזה או משפילה ביחס לנטייה המינית, אינו חל, שכן השאלה על נטייתו של אורי לא נשאלה בדרך מבזה.</w:t>
+        <w:t xml:space="preserve"> בהן. הצעות חוזרות (סעיף 3(א)(3)) לא היו, והשאלה על נטייתו של אורי לא נשאלה בדרך מבזה (סעיף 3(א)(5)).</w:t>
       </w:r>
     </w:p>
     <w:p>
@@ -781,7 +781,7 @@
           <w:rtl/>
           <w:szCs w:val="24"/>
         </w:rPr>
-        <w:t>לפי החלופה הכללית, ההטרדה לא הוכחה. אורי לא הראה בתחילה שאינו מעוניין: הוא שאל שאלות ושיתף פרטים מחייו, וכשביקש להשאיר את הנושא מחוץ לעבודה, דנה הפסיקה מיד.</w:t>
+        <w:t>השיחות התקיימו במשרד ולכן ב"מסגרת יחסי עבודה". אולם לפי החלופה הכללית ההטרדה לא הוכחה. חוסר עניין מראים במילים או בהתנהגות שמבהירה זאת באופן ברור (התקנון לדוגמה שבתוספת לתקנות, סעיף 1), ואורי לא עשה כן בתחילה: הוא שאל שאלות ושיתף פרטים מחייו, וכשביקש להשאיר את הנושא מחוץ לעבודה, דנה הפסיקה מיד.</w:t>
       </w:r>
     </w:p>
     <w:p>
@@ -850,7 +850,7 @@
           <w:rtl/>
           <w:szCs w:val="24"/>
         </w:rPr>
-        <w:t xml:space="preserve"> נקבע שיחסי מרות התקיימו אף שהמטריד לא היה הממונה הישיר של המוטרדת. נקבע גם שבקשה עמומה להפסיק, שנבעה מחשש לפגיעה בעבודה, אינה שוללת את ההטרדה. כלומר, המבחן מהותי ולא פורמלי. לדנה אין סמכות לקבל עובדים או לפטרם, אך היא ותיקה, משתתפת בהחלטות השיבוץ ולהמלצתה השפעה על קידום עובדים צעירים. אורי, בן 27, הוא עובד חדש. לפי הלכת מדר, ניתן לראות ביחסים אלה יחסי מרות, ולהסביר את השתתפותו של אורי בשיחות גם ברצון שלא להסתכסך עם מי שמשפיעה על עתידו.</w:t>
+        <w:t xml:space="preserve"> נקבע שיחסי מרות התקיימו אף שהמטריד לא היה הממונה הישיר של המוטרדת. נקבע גם שבקשה עמומה להפסיק, שנבעה מחשש לפגיעה בעבודה, אינה שוללת את ההטרדה. לדנה אין סמכות לקבל עובדים או לפטרם, אך היא ותיקה, משתתפת בהחלטות השיבוץ ולהמלצתה השפעה על קידום עובדים צעירים. אורי הוא עובד חדש. לפי הלכת מדר, ניתן לראות ביחסים אלה יחסי מרות, ולהסביר את השתתפותו של אורי בשיחות גם ברצון שלא להסתכסך עם מי שמשפיעה על עתידו.</w:t>
       </w:r>
     </w:p>
     <w:p>
@@ -901,7 +901,7 @@
           <w:rtl/>
           <w:szCs w:val="24"/>
         </w:rPr>
-        <w:t xml:space="preserve"> יחסי המרות. השאלה הישירה על נטייתו של אורי נשאלה פעם אחת. רוב השיחות עסקו בחייה של דנה, היו הדדיות ולא היה בהן רמז לקשר בין השיחות לבין מעמדו בעבודה. בעניין מדר, לעומת זאת, המטריד העיר שוב ושוב על מראה המוטרדת. לכן נראה לי שקשה לבסס כאן הטרדה מינית, אם כי הטענה אינה מופרכת: שיתוף מפורט ומתמשך בפרטים אינטימיים מצד עובדת ותיקה ובעלת השפעה, כלפי עובד חדש, אינו התנהגות ראויה במקום עבודה. אין זו גם </w:t>
+        <w:t xml:space="preserve"> יחסי המרות. השאלה הישירה על נטייתו של אורי נשאלה פעם אחת. רוב השיחות עסקו בחייה של דנה, היו הדדיות ולא היה בהן רמז לקשר בין השיחות לבין מעמדו בעבודה. בעניין מדר, לעומת זאת, המטריד העיר שוב ושוב על מראה המוטרדת. לכן נראה לי שקשה לבסס כאן הטרדה מינית, אף שהתנהגותה של דנה אינה ראויה במקום עבודה. אין זו גם </w:t>
       </w:r>
       <w:r>
         <w:rPr>
@@ -1005,7 +1005,25 @@
           <w:rtl/>
           <w:szCs w:val="24"/>
         </w:rPr>
-        <w:t>, עליה גם לקבוע תקנון, לפרסמו ולמנות ממונה על מניעת הטרדה מינית.</w:t>
+        <w:t xml:space="preserve">, עליה גם להתאים את התקנון לדוגמה ולפרסמו (תקנות 2(ג) ו-8), ולמנות </w:t>
+      </w:r>
+      <w:r>
+        <w:rPr>
+          <w:b/>
+          <w:sz w:val="24"/>
+          <w:rtl/>
+          <w:szCs w:val="24"/>
+          <w:bCs/>
+        </w:rPr>
+        <w:t>אחראי</w:t>
+      </w:r>
+      <w:r>
+        <w:rPr>
+          <w:sz w:val="24"/>
+          <w:rtl/>
+          <w:szCs w:val="24"/>
+        </w:rPr>
+        <w:t xml:space="preserve"> לקבלת תלונות ולבירורן (תקנה 4). נודע למעסיק על מקרה גם בלי תלונה, עליו להעבירו לבירור האחראי (תקנה 6(ט)).</w:t>
       </w:r>
     </w:p>
     <w:p>
@@ -1167,7 +1185,22 @@
           <w:rtl/>
           <w:szCs w:val="24"/>
         </w:rPr>
-        <w:t xml:space="preserve"> בתנאי העבודה, או מחמת "נסיבות אחרות שביחסי עבודה" שבהן אין לדרוש מהעובד להמשיך בעבודתו, נחשבת כפיטורים "לעניין חוק זה", כלומר לעניין הזכאות לפיצויי פיטורים בלבד. הזכאות עצמה מותנית בשנת עבודה אחת ברציפות אצל אותו מעסיק (סעיף 1(א) לחוק), ומאחר שאורי "התקבל" לחברה ותקופת העסקתו אינה ידועה, יש לבדוק תחילה שתנאי זה מתקיים. כדי לממש זכות זו על העובד לתת למעסיק </w:t>
+        <w:t xml:space="preserve"> בתנאי העבודה, או מחמת "נסיבות אחרות שביחסי עבודה" שבהן אין לדרוש מהעובד להמשיך בעבודתו, נחשבת כפיטורים "לעניין חוק זה", כלומר לעניין הזכאות לפיצויי פיטורים בלבד. הזכאות עצמה מותנית בשנת עבודה אחת ברציפות אצל אותו מעסיק (סעיף 1(א) לחוק), ומאחר שאורי "התקבל" לחברה ותקופת העסקתו אינה ידועה, יש לבדוק תחילה שתנאי זה מתקיים.</w:t>
+      </w:r>
+    </w:p>
+    <w:p>
+      <w:pPr>
+        <w:bidi/>
+        <w:spacing w:before="0" w:after="0"/>
+        <w:jc w:val="both"/>
+      </w:pPr>
+      <w:r>
+        <w:rPr>
+          <w:sz w:val="24"/>
+          <w:rtl/>
+          <w:szCs w:val="24"/>
+        </w:rPr>
+        <w:t xml:space="preserve">כדי לממש זכות זו על העובד לתת למעסיק </w:t>
       </w:r>
       <w:r>
         <w:rPr>
@@ -1304,7 +1337,7 @@
           <w:rtl/>
           <w:szCs w:val="24"/>
         </w:rPr>
-        <w:t>לדעתי טענותיו של אורי אינן מבוססות. טענת ההטרדה המינית תלויה בהכרה ביחסי מרות לפי הלכת מדר, וגם אז קשה להראות התייחסויות חוזרות למיניותו או ניצול של יחסי המרות. טענת ההתנכלות תלויה בהוכחת ההטרדה ובקשר בינה לבין ההעברה. טענת ההתפטרות בדין מפוטר נכשלת בעיקר משום שלא ניתנה התראה ובשל השיהוי, לפי הלכת גולן. על Frame לוודא שיש לה תקנון וממונה כנדרש בסעיף 7(ב).</w:t>
+        <w:t>לדעתי טענותיו של אורי אינן מבוססות. טענת ההטרדה המינית תלויה בהכרה ביחסי מרות לפי הלכת מדר, וגם אז קשה להראות התייחסויות חוזרות למיניותו או ניצול של יחסי המרות. טענת ההתפטרות בדין מפוטר נכשלת בעיקר משום שלא ניתנה התראה ובשל השיהוי, לפי הלכת גולן. על Frame לוודא שיש לה תקנון מותאם ואחראי כנדרש בתקנות.</w:t>
       </w:r>
     </w:p>
     <w:p>

</xml_diff>

<commit_message>
Add equal opportunity and notice law analysis to Part B
Co-Authored-By: Claude Opus 5.5 <noreply@anthropic.com>
Claude-Session: https://claude.ai/code/session_01BVH1n3fvCDz4inkznfhZC9
</commit_message>
<xml_diff>
--- a/output/עבודה_היבטים_משפטיים.docx
+++ b/output/עבודה_היבטים_משפטיים.docx
@@ -694,7 +694,7 @@
           <w:rtl/>
           <w:szCs w:val="24"/>
         </w:rPr>
-        <w:t xml:space="preserve">, נועד להגן על כבודו של אדם, על חירותו ועל פרטיותו ולקדם שוויון בין המינים (סעיף 1; הילדסהימר, 2026ב). מבין החלופות שבסעיף 3(א), הרלוונטית לענייננו היא </w:t>
+        <w:t xml:space="preserve">, נועד להגן על כבוד האדם, חירותו ופרטיותו (סעיף 1; הילדסהימר, 2026ב). החלופה הרלוונטית היא </w:t>
       </w:r>
       <w:r>
         <w:rPr>
@@ -781,7 +781,7 @@
           <w:rtl/>
           <w:szCs w:val="24"/>
         </w:rPr>
-        <w:t>השיחות התקיימו במשרד ולכן ב"מסגרת יחסי עבודה". אולם לפי החלופה הכללית ההטרדה לא הוכחה. חוסר עניין מראים במילים או בהתנהגות שמבהירה זאת באופן ברור (התקנון לדוגמה שבתוספת לתקנות, סעיף 1), ואורי לא עשה כן בתחילה: הוא שאל שאלות ושיתף פרטים מחייו, וכשביקש להשאיר את הנושא מחוץ לעבודה, דנה הפסיקה מיד.</w:t>
+        <w:t>השיחות התקיימו במשרד ולכן ב"מסגרת יחסי עבודה". חוסר עניין מראים במילים או בהתנהגות שמבהירה זאת באופן ברור (התקנון לדוגמה שבתוספת לתקנות, סעיף 1), ואורי לא עשה כן בתחילה: הוא שאל שאלות ושיתף פרטים מחייו, וכשביקש להשאיר את הנושא מחוץ לעבודה, דנה הפסיקה מיד.</w:t>
       </w:r>
     </w:p>
     <w:p>
@@ -850,7 +850,7 @@
           <w:rtl/>
           <w:szCs w:val="24"/>
         </w:rPr>
-        <w:t xml:space="preserve"> נקבע שיחסי מרות התקיימו אף שהמטריד לא היה הממונה הישיר של המוטרדת. נקבע גם שבקשה עמומה להפסיק, שנבעה מחשש לפגיעה בעבודה, אינה שוללת את ההטרדה. לדנה אין סמכות לקבל עובדים או לפטרם, אך היא ותיקה, משתתפת בהחלטות השיבוץ ולהמלצתה השפעה על קידום עובדים צעירים. אורי הוא עובד חדש. לפי הלכת מדר, ניתן לראות ביחסים אלה יחסי מרות, ולהסביר את השתתפותו של אורי בשיחות גם ברצון שלא להסתכסך עם מי שמשפיעה על עתידו.</w:t>
+        <w:t xml:space="preserve"> נקבע שיחסי מרות התקיימו אף שהמטריד לא היה הממונה הישיר, ושבקשה עמומה להפסיק אינה שוללת את ההטרדה. לדנה אין סמכות לקבל או לפטר, אך היא משתתפת בהחלטות השיבוץ ומשפיעה על קידום עובדים צעירים כמו אורי. לפי הלכת מדר אלה יחסי מרות, והשתתפותו של אורי בשיחות יכולה לנבוע מרצון שלא להסתכסך עם מי שמשפיעה על עתידו.</w:t>
       </w:r>
     </w:p>
     <w:p>
@@ -901,7 +901,7 @@
           <w:rtl/>
           <w:szCs w:val="24"/>
         </w:rPr>
-        <w:t xml:space="preserve"> יחסי המרות. השאלה הישירה על נטייתו של אורי נשאלה פעם אחת. רוב השיחות עסקו בחייה של דנה, היו הדדיות ולא היה בהן רמז לקשר בין השיחות לבין מעמדו בעבודה. בעניין מדר, לעומת זאת, המטריד העיר שוב ושוב על מראה המוטרדת. לכן נראה לי שקשה לבסס כאן הטרדה מינית, אף שהתנהגותה של דנה אינה ראויה במקום עבודה. אין זו גם </w:t>
+        <w:t xml:space="preserve"> יחסי המרות. השאלה הישירה על נטייתו של אורי נשאלה פעם אחת. רוב השיחות עסקו בחייה של דנה, היו הדדיות ולא נקשרו למעמדו בעבודה, ולכן קשה לבסס כאן הטרדה מינית. אין זו גם </w:t>
       </w:r>
       <w:r>
         <w:rPr>
@@ -1048,7 +1048,43 @@
           <w:rtl/>
           <w:szCs w:val="24"/>
         </w:rPr>
-        <w:t xml:space="preserve"> מוגדרת בסעיף 3(ב) כפגיעה מכל סוג שמקורה בהטרדה מינית או בתלונה עליה. העברתו של אורי לצוות טכני, חודש אחרי שביקש לסיים את השיחות, בצירוף השפעתה של דנה על השיבוץ, מעוררת חשד לקשר כזה. אבל טענת ההתנכלות תלויה בכך שההתנהגות שקדמה לה הייתה הטרדה מינית, ובהוכחה שההעברה נבעה ממנה ולא מצורכי העבודה. העובדות אינן מראות שדנה הייתה מעורבת בהחלטה.</w:t>
+        <w:t xml:space="preserve"> היא פגיעה מכל סוג שמקורה בהטרדה מינית או בתלונה עליה (סעיף 3(ב)). </w:t>
+      </w:r>
+      <w:r>
+        <w:rPr>
+          <w:b/>
+          <w:sz w:val="24"/>
+          <w:rtl/>
+          <w:szCs w:val="24"/>
+          <w:bCs/>
+        </w:rPr>
+        <w:t>סעיף 7(א) לחוק שוויון ההזדמנויות בעבודה, התשמ"ח-1988</w:t>
+      </w:r>
+      <w:r>
+        <w:rPr>
+          <w:sz w:val="24"/>
+          <w:rtl/>
+          <w:szCs w:val="24"/>
+        </w:rPr>
+        <w:t>, אוסר על מעסיק לפגוע בעובד כשמקור הפגיעה בהטרדה מינית, וקובע שלעניין זה די ב</w:t>
+      </w:r>
+      <w:r>
+        <w:rPr>
+          <w:b/>
+          <w:sz w:val="24"/>
+          <w:rtl/>
+          <w:szCs w:val="24"/>
+          <w:bCs/>
+        </w:rPr>
+        <w:t>התייחסות אחת</w:t>
+      </w:r>
+      <w:r>
+        <w:rPr>
+          <w:sz w:val="24"/>
+          <w:rtl/>
+          <w:szCs w:val="24"/>
+        </w:rPr>
+        <w:t xml:space="preserve"> לפי סעיף 3(א)(4). אם יוכרו יחסי מרות, גם השאלה הבודדת על נטייתו של אורי עשויה להספיק. העברתו לצוות טכני חודש אחרי שביקש לסיים את השיחות, והשפעתה של דנה על השיבוץ, מעוררות חשד לקשר כזה. משהוכיח זאת אורי, עובר למעסיק הנטל להראות שלא פגע בו (סעיף 9(ב) לאותו חוק), אף שהעובדות אינן מראות שדנה הייתה מעורבת בהחלטה.</w:t>
       </w:r>
     </w:p>
     <w:p>
@@ -1098,7 +1134,7 @@
           <w:rtl/>
           <w:szCs w:val="24"/>
         </w:rPr>
-        <w:t xml:space="preserve"> לשנות באופן חד-צדדי נהלי עבודה, ובכלל זה לקבוע מי משתתף בישיבות. שינוי שחורג ממנה ופוגע בהכנסת העובד או ב</w:t>
+        <w:t xml:space="preserve"> לשנות באופן חד-צדדי נהלי עבודה. שינוי שחורג ממנה ופוגע בהכנסת העובד או ב</w:t>
       </w:r>
       <w:r>
         <w:rPr>
@@ -1134,7 +1170,25 @@
           <w:rtl/>
           <w:szCs w:val="24"/>
         </w:rPr>
-        <w:t xml:space="preserve"> והפרה של חוזה העבודה (הילדסהימר, 2026א). העברתו של אורי מהפרויקטים המרכזיים לעריכה טכנית, בלי ישיבות קריאטיב ועם פחות אחריות, היא פגיעה במעמד, אף ששכרו לא השתנה.</w:t>
+        <w:t xml:space="preserve"> והפרה של חוזה העבודה (הילדסהימר, 2026א). העברתו של אורי מהפרויקטים המרכזיים לעריכה טכנית, בלי ישיבות קריאטיב ועם פחות אחריות, היא פגיעה במעמד, אף ששכרו לא השתנה. שינוי ב"תיאור עיקרי התפקיד" מחייב גם הודעה בכתב לעובד בתוך 30 יום (סעיפים 2(א)(3) ו-3 ל</w:t>
+      </w:r>
+      <w:r>
+        <w:rPr>
+          <w:b/>
+          <w:sz w:val="24"/>
+          <w:rtl/>
+          <w:szCs w:val="24"/>
+          <w:bCs/>
+        </w:rPr>
+        <w:t>חוק הודעה לעובד ולמועמד לעבודה, התשס"ב-2002</w:t>
+      </w:r>
+      <w:r>
+        <w:rPr>
+          <w:sz w:val="24"/>
+          <w:rtl/>
+          <w:szCs w:val="24"/>
+        </w:rPr>
+        <w:t>), ובהיעדרה עובר למעסיק נטל ההוכחה בעניין השנוי במחלוקת (סעיף 5א).</w:t>
       </w:r>
     </w:p>
     <w:p>
@@ -1200,7 +1254,7 @@
           <w:rtl/>
           <w:szCs w:val="24"/>
         </w:rPr>
-        <w:t xml:space="preserve">כדי לממש זכות זו על העובד לתת למעסיק </w:t>
+        <w:t xml:space="preserve">כדי לממש זכות זו, על העובד לתת למעסיק </w:t>
       </w:r>
       <w:r>
         <w:rPr>
@@ -1272,7 +1326,7 @@
           <w:rtl/>
           <w:szCs w:val="24"/>
         </w:rPr>
-        <w:t>, שכן שיהוי עלול להתפרש כהסכמה בהתנהגות להרעה. ב</w:t>
+        <w:t>; שיהוי עלול להתפרש כהסכמה להרעה. ב</w:t>
       </w:r>
       <w:r>
         <w:rPr>
@@ -1305,7 +1359,7 @@
           <w:rtl/>
           <w:szCs w:val="24"/>
         </w:rPr>
-        <w:t>אורי לא מחה, לא ביקש לחזור לתפקידו, לא התריע על כוונתו להתפטר ועבד ארבעה חודשים במתכונת החדשה. התקופה קצרה מזו שבעניין גולן, אך בצירוף השתיקה היא מלמדת על השלמה עם השינוי. גם החלופה של "נסיבות אחרות" אינה מסייעת לו: השיחות הסתיימו חודשים לפני ההתפטרות, ולא הוכח שהייתה הטרדה.</w:t>
+        <w:t>אורי לא מחה, לא ביקש לחזור לתפקידו, לא התריע על כוונתו להתפטר ועבד ארבעה חודשים במתכונת החדשה. אף שהתקופה קצרה מזו שבעניין גולן, השתיקה מלמדת על השלמה עם השינוי. גם "נסיבות אחרות" אינן מסייעות לו, שכן השיחות הסתיימו חודשים לפני ההתפטרות.</w:t>
       </w:r>
     </w:p>
     <w:p>
@@ -1337,7 +1391,7 @@
           <w:rtl/>
           <w:szCs w:val="24"/>
         </w:rPr>
-        <w:t>לדעתי טענותיו של אורי אינן מבוססות. טענת ההטרדה המינית תלויה בהכרה ביחסי מרות לפי הלכת מדר, וגם אז קשה להראות התייחסויות חוזרות למיניותו או ניצול של יחסי המרות. טענת ההתפטרות בדין מפוטר נכשלת בעיקר משום שלא ניתנה התראה ובשל השיהוי, לפי הלכת גולן. על Frame לוודא שיש לה תקנון מותאם ואחראי כנדרש בתקנות.</w:t>
+        <w:t>טענת ההטרדה המינית חלשה: גם אם יוכרו יחסי מרות לפי הלכת מדר, קשה להראות התייחסויות חוזרות למיניותו של אורי. טענת ההתנכלות חזקה יותר, בשל סעיפים 7 ו-9 לחוק שוויון ההזדמנויות. טענת ההתפטרות בדין מפוטר נכשלת בשל היעדר התראה והשיהוי (הלכת גולן). על Frame לוודא שיש לה תקנון מותאם ואחראי.</w:t>
       </w:r>
     </w:p>
     <w:p>
@@ -1417,7 +1471,37 @@
           <w:rtl/>
           <w:szCs w:val="24"/>
         </w:rPr>
+        <w:t>חוק הודעה לעובד ולמועמד לעבודה (תנאי עבודה והליכי מיון וקבלה לעבודה), התשס"ב-2002.</w:t>
+      </w:r>
+    </w:p>
+    <w:p>
+      <w:pPr>
+        <w:bidi/>
+        <w:spacing w:before="0" w:after="0"/>
+        <w:jc w:val="both"/>
+      </w:pPr>
+      <w:r>
+        <w:rPr>
+          <w:sz w:val="24"/>
+          <w:rtl/>
+          <w:szCs w:val="24"/>
+        </w:rPr>
         <w:t>חוק פיצויי פיטורים, התשכ"ג-1963.</w:t>
+      </w:r>
+    </w:p>
+    <w:p>
+      <w:pPr>
+        <w:bidi/>
+        <w:spacing w:before="0" w:after="0"/>
+        <w:jc w:val="both"/>
+      </w:pPr>
+      <w:r>
+        <w:rPr>
+          <w:sz w:val="24"/>
+          <w:rtl/>
+          <w:szCs w:val="24"/>
+        </w:rPr>
+        <w:t>חוק שוויון ההזדמנויות בעבודה, התשמ"ח-1988.</w:t>
       </w:r>
     </w:p>
     <w:p>

</xml_diff>

<commit_message>
Align sexual harassment citations with statute text
Co-Authored-By: Claude Opus 5.5 <noreply@anthropic.com>
Claude-Session: https://claude.ai/code/session_01BVH1n3fvCDz4inkznfhZC9
</commit_message>
<xml_diff>
--- a/output/עבודה_היבטים_משפטיים.docx
+++ b/output/עבודה_היבטים_משפטיים.docx
@@ -781,7 +781,7 @@
           <w:rtl/>
           <w:szCs w:val="24"/>
         </w:rPr>
-        <w:t>השיחות התקיימו במשרד ולכן ב"מסגרת יחסי עבודה". חוסר עניין מראים במילים או בהתנהגות שמבהירה זאת באופן ברור (התקנון לדוגמה שבתוספת לתקנות, סעיף 1), ואורי לא עשה כן בתחילה: הוא שאל שאלות ושיתף פרטים מחייו, וכשביקש להשאיר את הנושא מחוץ לעבודה, דנה הפסיקה מיד.</w:t>
+        <w:t>השיחות התקיימו במשרד, ולכן ב"מסגרת יחסי עבודה". "הראה" פירושו במילים או בהתנהגות שאין ספק סביר לגבי משמעותה (הגדרות שבסעיף 2 לחוק), ואורי לא עשה כן בתחילה: הוא שאל שאלות ושיתף פרטים מחייו, וכשביקש להשאיר את הנושא מחוץ לעבודה, דנה הפסיקה מיד.</w:t>
       </w:r>
     </w:p>
     <w:p>
@@ -824,7 +824,7 @@
           <w:szCs w:val="24"/>
           <w:bCs/>
         </w:rPr>
-        <w:t>סעיף 3(א)(6)</w:t>
+        <w:t>סעיף 3(א)(6)(ג)</w:t>
       </w:r>
       <w:r>
         <w:rPr>

</xml_diff>

<commit_message>
Verify Part A against Collective Agreements Law, add section 33H1
Co-Authored-By: Claude Opus 5.5 <noreply@anthropic.com>
Claude-Session: https://claude.ai/code/session_01BVH1n3fvCDz4inkznfhZC9
</commit_message>
<xml_diff>
--- a/output/עבודה_היבטים_משפטיים.docx
+++ b/output/עבודה_היבטים_משפטיים.docx
@@ -135,7 +135,7 @@
           <w:rtl/>
           <w:szCs w:val="24"/>
         </w:rPr>
-        <w:t xml:space="preserve"> (סעיף 3 לחוק), ורק הארגון היציג רשאי לחתום על </w:t>
+        <w:t xml:space="preserve">, כלומר הארגון שבו מאורגן המספר הגדול ביותר של העובדים, ובלבד שאינו פחות משליש (סעיף 3 לחוק), ורק הארגון היציג רשאי לחתום על </w:t>
       </w:r>
       <w:r>
         <w:rPr>
@@ -293,7 +293,7 @@
           <w:rtl/>
           <w:szCs w:val="24"/>
         </w:rPr>
-        <w:t>שני המבחנים הראשונים מתקיימים. חברי הקבוצה הם עובדי החברה שהצטרפו מרצונם, ולקבוצה תקנון הקובע מטרות וסמכויות. הקושי מתעורר בשני המבחנים האחרים, ובית הדין בוחן אותם לפי המהות ולא לפי הכותרות שבתקנון.</w:t>
+        <w:t>מבחני החברות והתקנון מתקיימים: החברים הם עובדים שהצטרפו מרצונם, ולקבוצה תקנון. הקושי בשני המבחנים האחרים, שנבחנים לפי המהות ולא לפי הכותרות.</w:t>
       </w:r>
     </w:p>
     <w:p>
@@ -372,7 +372,7 @@
           <w:rtl/>
           <w:szCs w:val="24"/>
         </w:rPr>
-        <w:t>, הוראה בחוזה אישי שהיא לטובת העובד גוברת על ההסכם הקיבוצי, אלא אם ההסכם מונע זאת במפורש. הסכם קיבוצי קובע רצפה ואינו שולל תנאים אישיים טובים יותר. מכאן שמטרה ד' אינה משקפת חשש אמיתי, אלא התנגדות עקרונית לייצוג קיבוצי בתנאים המהותיים.</w:t>
+        <w:t>, הוראה בחוזה אישי שהיא לטובת העובד גוברת על ההסכם הקיבוצי, אלא אם ההסכם מונע זאת במפורש. הסכם קיבוצי קובע רצפה בלבד, ומטרה ד' משקפת התנגדות עקרונית לייצוג קיבוצי.</w:t>
       </w:r>
     </w:p>
     <w:p>
@@ -440,7 +440,7 @@
           <w:rtl/>
           <w:szCs w:val="24"/>
         </w:rPr>
-        <w:t xml:space="preserve"> יישם בית הדין הארצי את מבחני עניין עמית על גוף שהקימו עובדי חברת טכנולוגיה כחלופה להסתדרות, ושמסמכי היסוד שלו הותירו את ענייני השכר והתגמול לחוזים האישיים. בית הדין קבע כי גוף כזה אינו עומד במבחן המטרה ואינו ארגון עובדים. המסקנה חלה גם כאן.</w:t>
+        <w:t xml:space="preserve"> יישם בית הדין הארצי את מבחני עניין עמית על גוף שהקימו עובדי חברת טכנולוגיה כחלופה להסתדרות, ושמסמכי היסוד שלו הותירו את ענייני השכר והתגמול לחוזים האישיים. בית הדין קבע כי גוף כזה אינו עומד במבחן המטרה ואינו ארגון עובדים.</w:t>
       </w:r>
     </w:p>
     <w:p>
@@ -455,7 +455,25 @@
           <w:rtl/>
           <w:szCs w:val="24"/>
         </w:rPr>
-        <w:t>אין בכך כדי לפגוע בחופש מהתארגנות. עובד רשאי שלא להצטרף להסתדרות, וסעיף 33י(א)(3) מגן עליו מפני פגיעה בשל כך. אבל חופש זה אינו הופך את הקבוצה לארגון עובדים. חבריה אינם נספרים לצורך היציגות, והיא אינה יכולה לדרוש משא ומתן קיבוצי או לחתום על הסכם קיבוצי.</w:t>
+        <w:t>אין בכך כדי לפגוע בחופש מהתארגנות. עובד רשאי שלא להצטרף להסתדרות, וסעיף 33י(א)(3) מגן עליו מפני פגיעה בשל כך. אבל חופש זה אינו הופך את הקבוצה לארגון עובדים. חבריה אינם נספרים לצורך היציגות, והודעתה כי היא הארגון היציג חסרת נפקות. חובת המעסיק לנהל משא ומתן בהתארגנות ראשונית חלה רק כלפי ארגון יציג לפי סעיף 3 (</w:t>
+      </w:r>
+      <w:r>
+        <w:rPr>
+          <w:b/>
+          <w:sz w:val="24"/>
+          <w:rtl/>
+          <w:szCs w:val="24"/>
+          <w:bCs/>
+        </w:rPr>
+        <w:t>סעיף 33ח1</w:t>
+      </w:r>
+      <w:r>
+        <w:rPr>
+          <w:sz w:val="24"/>
+          <w:rtl/>
+          <w:szCs w:val="24"/>
+        </w:rPr>
+        <w:t>), ואם ההסתדרות תהיה יציגה, עמה יהיה על ההנהלה לנהל משא ומתן.</w:t>
       </w:r>
     </w:p>
     <w:p>
@@ -584,7 +602,7 @@
           <w:rtl/>
           <w:szCs w:val="24"/>
         </w:rPr>
-        <w:t xml:space="preserve"> לשוחח עם עובדיהם על "יתרונות המודל האישי" היא מפגש אישי שנועד להעביר את עמדת ההנהלה, ובית הדין אסר עליו במפורש. חומרתה רבה במיוחד משום שמדובר במנהלים המשפיעים על הבונוסים, האופציות והקידום של אותם עובדים. </w:t>
+        <w:t xml:space="preserve"> לשוחח עם עובדיהם על "יתרונות המודל האישי" היא מפגש אישי שנועד להעביר את עמדת ההנהלה, ובית הדין אסר עליו במפורש. חומרתה רבה משום שהמנהלים משפיעים על הבונוסים והקידום של העובדים. </w:t>
       </w:r>
       <w:r>
         <w:rPr>

</xml_diff>

<commit_message>
Convert citations to uniform legal citation rules with footnotes
Co-Authored-By: Claude Opus 5.5 <noreply@anthropic.com>
Claude-Session: https://claude.ai/code/session_01BVH1n3fvCDz4inkznfhZC9
</commit_message>
<xml_diff>
--- a/output/עבודה_היבטים_משפטיים.docx
+++ b/output/עבודה_היבטים_משפטיים.docx
@@ -66,7 +66,21 @@
           <w:rtl/>
           <w:szCs w:val="24"/>
         </w:rPr>
-        <w:t>). שתיהן מוכרות במשפט העבודה הקיבוצי בישראל (בן-ישראל, 2002; הילדסהימר, 2026ג). הזכות הראשונה מעוגנת ב</w:t>
+        <w:t>).</w:t>
+      </w:r>
+      <w:r>
+        <w:rPr>
+          <w:vertAlign w:val="superscript"/>
+        </w:rPr>
+        <w:footnoteReference w:id="1"/>
+      </w:r>
+      <w:r>
+        <w:rPr>
+          <w:sz w:val="24"/>
+          <w:rtl/>
+          <w:szCs w:val="24"/>
+        </w:rPr>
+        <w:t xml:space="preserve"> הזכות הראשונה מעוגנת ב</w:t>
       </w:r>
       <w:r>
         <w:rPr>
@@ -76,7 +90,7 @@
           <w:szCs w:val="24"/>
           <w:bCs/>
         </w:rPr>
-        <w:t>סעיף 33ח לחוק הסכמים קיבוציים, התשי"ז-1957</w:t>
+        <w:t>סעיף 33ח לחוק הסכמים קיבוציים</w:t>
       </w:r>
       <w:r>
         <w:rPr>
@@ -84,7 +98,21 @@
           <w:rtl/>
           <w:szCs w:val="24"/>
         </w:rPr>
-        <w:t>, ו</w:t>
+        <w:t>,</w:t>
+      </w:r>
+      <w:r>
+        <w:rPr>
+          <w:vertAlign w:val="superscript"/>
+        </w:rPr>
+        <w:footnoteReference w:id="2"/>
+      </w:r>
+      <w:r>
+        <w:rPr>
+          <w:sz w:val="24"/>
+          <w:rtl/>
+          <w:szCs w:val="24"/>
+        </w:rPr>
+        <w:t xml:space="preserve"> ו</w:t>
       </w:r>
       <w:r>
         <w:rPr>
@@ -163,7 +191,7 @@
           <w:szCs w:val="24"/>
           <w:bCs/>
         </w:rPr>
-        <w:t>בג"ץ 7029/95 הסתדרות העובדים הכללית החדשה נ' בית הדין הארצי לעבודה (עניין עמית, 1997)</w:t>
+        <w:t>עניין עמית</w:t>
       </w:r>
       <w:r>
         <w:rPr>
@@ -171,7 +199,21 @@
           <w:rtl/>
           <w:szCs w:val="24"/>
         </w:rPr>
-        <w:t xml:space="preserve">. ארבעה מבחנים נקבעו שם. </w:t>
+        <w:t>.</w:t>
+      </w:r>
+      <w:r>
+        <w:rPr>
+          <w:vertAlign w:val="superscript"/>
+        </w:rPr>
+        <w:footnoteReference w:id="3"/>
+      </w:r>
+      <w:r>
+        <w:rPr>
+          <w:sz w:val="24"/>
+          <w:rtl/>
+          <w:szCs w:val="24"/>
+        </w:rPr>
+        <w:t xml:space="preserve"> ארבעה מבחנים נקבעו שם. </w:t>
       </w:r>
       <w:r>
         <w:rPr>
@@ -418,21 +460,9 @@
       </w:r>
       <w:r>
         <w:rPr>
-          <w:sz w:val="24"/>
-          <w:rtl/>
-          <w:szCs w:val="24"/>
+          <w:vertAlign w:val="superscript"/>
         </w:rPr>
-        <w:t xml:space="preserve"> ב</w:t>
-      </w:r>
-      <w:r>
-        <w:rPr>
-          <w:b/>
-          <w:sz w:val="24"/>
-          <w:rtl/>
-          <w:szCs w:val="24"/>
-          <w:bCs/>
-        </w:rPr>
-        <w:t>עס"ק (ארצי) 6298-03-25 הסתדרות העובדים הכללית החדשה נ' ארגון עובדי הפיתוח והשיווק בנוקיה (10.6.2025)</w:t>
+        <w:footnoteReference w:id="4"/>
       </w:r>
       <w:r>
         <w:rPr>
@@ -440,7 +470,7 @@
           <w:rtl/>
           <w:szCs w:val="24"/>
         </w:rPr>
-        <w:t xml:space="preserve"> יישם בית הדין הארצי את מבחני עניין עמית על גוף שהקימו עובדי חברת טכנולוגיה כחלופה להסתדרות, ושמסמכי היסוד שלו הותירו את ענייני השכר והתגמול לחוזים האישיים. בית הדין קבע כי גוף כזה אינו עומד במבחן המטרה ואינו ארגון עובדים.</w:t>
+        <w:t xml:space="preserve"> בית הדין הארצי יישם את מבחני עניין עמית על גוף שהקימו עובדי חברת טכנולוגיה כחלופה להסתדרות, ושמסמכי היסוד שלו הותירו את ענייני השכר והתגמול לחוזים האישיים. בית הדין קבע כי גוף כזה אינו עומד במבחן המטרה ואינו ארגון עובדים.</w:t>
       </w:r>
     </w:p>
     <w:p>
@@ -515,7 +545,13 @@
           <w:szCs w:val="24"/>
           <w:bCs/>
         </w:rPr>
-        <w:t>עס"ק (ארצי) 25476-09-12 הסתדרות העובדים החדשה נ' פלאפון תקשורת בע"מ (2.1.2013)</w:t>
+        <w:t>עניין פלאפון</w:t>
+      </w:r>
+      <w:r>
+        <w:rPr>
+          <w:vertAlign w:val="superscript"/>
+        </w:rPr>
+        <w:footnoteReference w:id="5"/>
       </w:r>
       <w:r>
         <w:rPr>
@@ -704,7 +740,7 @@
           <w:szCs w:val="24"/>
           <w:bCs/>
         </w:rPr>
-        <w:t>החוק למניעת הטרדה מינית, התשנ"ח-1998</w:t>
+        <w:t>החוק למניעת הטרדה מינית</w:t>
       </w:r>
       <w:r>
         <w:rPr>
@@ -712,7 +748,21 @@
           <w:rtl/>
           <w:szCs w:val="24"/>
         </w:rPr>
-        <w:t xml:space="preserve">, נועד להגן על כבוד האדם, חירותו ופרטיותו (סעיף 1; הילדסהימר, 2026ב). החלופה הרלוונטית היא </w:t>
+        <w:t xml:space="preserve"> נועד להגן על כבוד האדם, חירותו ופרטיותו.</w:t>
+      </w:r>
+      <w:r>
+        <w:rPr>
+          <w:vertAlign w:val="superscript"/>
+        </w:rPr>
+        <w:footnoteReference w:id="6"/>
+      </w:r>
+      <w:r>
+        <w:rPr>
+          <w:sz w:val="24"/>
+          <w:rtl/>
+          <w:szCs w:val="24"/>
+        </w:rPr>
+        <w:t xml:space="preserve"> החלופה הרלוונטית היא </w:t>
       </w:r>
       <w:r>
         <w:rPr>
@@ -784,7 +834,7 @@
           <w:rtl/>
           <w:szCs w:val="24"/>
         </w:rPr>
-        <w:t xml:space="preserve"> בהן. הצעות חוזרות (סעיף 3(א)(3)) לא היו, והשאלה על נטייתו של אורי לא נשאלה בדרך מבזה (סעיף 3(א)(5)).</w:t>
+        <w:t xml:space="preserve"> בהן. הצעות חוזרות (סעיף 3(א)(3)) או התייחסות מבזה (סעיף 3(א)(5)) לא היו.</w:t>
       </w:r>
     </w:p>
     <w:p>
@@ -860,7 +910,13 @@
           <w:szCs w:val="24"/>
           <w:bCs/>
         </w:rPr>
-        <w:t>עש"ם 2203/05 מדר נ' נציבות שירות המדינה (21.7.2005)</w:t>
+        <w:t>עניין מדר</w:t>
+      </w:r>
+      <w:r>
+        <w:rPr>
+          <w:vertAlign w:val="superscript"/>
+        </w:rPr>
+        <w:footnoteReference w:id="7"/>
       </w:r>
       <w:r>
         <w:rPr>
@@ -868,7 +924,7 @@
           <w:rtl/>
           <w:szCs w:val="24"/>
         </w:rPr>
-        <w:t xml:space="preserve"> נקבע שיחסי מרות התקיימו אף שהמטריד לא היה הממונה הישיר, ושבקשה עמומה להפסיק אינה שוללת את ההטרדה. לדנה אין סמכות לקבל או לפטר, אך היא משתתפת בהחלטות השיבוץ ומשפיעה על קידום עובדים צעירים כמו אורי. לפי הלכת מדר אלה יחסי מרות, והשתתפותו של אורי בשיחות יכולה לנבוע מרצון שלא להסתכסך עם מי שמשפיעה על עתידו.</w:t>
+        <w:t xml:space="preserve"> נקבע שיחסי מרות התקיימו אף שהמטריד לא היה הממונה הישיר, ושבקשה עמומה להפסיק אינה שוללת את ההטרדה. לדנה אין סמכות לקבל או לפטר, אך היא משתתפת בהחלטות השיבוץ ומשפיעה על קידום עובדים צעירים כמו אורי. לפי הלכת מדר אלה יחסי מרות, והשתתפותו של אורי בשיחות יכולה לנבוע מחשש לעתידו.</w:t>
       </w:r>
     </w:p>
     <w:p>
@@ -919,25 +975,7 @@
           <w:rtl/>
           <w:szCs w:val="24"/>
         </w:rPr>
-        <w:t xml:space="preserve"> יחסי המרות. השאלה הישירה על נטייתו של אורי נשאלה פעם אחת. רוב השיחות עסקו בחייה של דנה, היו הדדיות ולא נקשרו למעמדו בעבודה, ולכן קשה לבסס כאן הטרדה מינית. אין זו גם </w:t>
-      </w:r>
-      <w:r>
-        <w:rPr>
-          <w:b/>
-          <w:sz w:val="24"/>
-          <w:rtl/>
-          <w:szCs w:val="24"/>
-          <w:bCs/>
-        </w:rPr>
-        <w:t>הטרדה סביבתית</w:t>
-      </w:r>
-      <w:r>
-        <w:rPr>
-          <w:sz w:val="24"/>
-          <w:rtl/>
-          <w:szCs w:val="24"/>
-        </w:rPr>
-        <w:t>, שכן ההתנהגות הופנתה לאורי בלבד.</w:t>
+        <w:t xml:space="preserve"> יחסי המרות. השאלה הישירה על נטייתו של אורי נשאלה פעם אחת. רוב השיחות עסקו בחייה של דנה, היו הדדיות ולא נקשרו למעמדו בעבודה, ולכן קשה לבסס כאן הטרדה מינית.</w:t>
       </w:r>
     </w:p>
     <w:p>
@@ -1005,25 +1043,7 @@
           <w:rtl/>
           <w:szCs w:val="24"/>
         </w:rPr>
-        <w:t xml:space="preserve"> ו</w:t>
-      </w:r>
-      <w:r>
-        <w:rPr>
-          <w:b/>
-          <w:sz w:val="24"/>
-          <w:rtl/>
-          <w:szCs w:val="24"/>
-          <w:bCs/>
-        </w:rPr>
-        <w:t>תקנות למניעת הטרדה מינית (חובות מעסיק), התשנ"ח-1998</w:t>
-      </w:r>
-      <w:r>
-        <w:rPr>
-          <w:sz w:val="24"/>
-          <w:rtl/>
-          <w:szCs w:val="24"/>
-        </w:rPr>
-        <w:t xml:space="preserve">, עליה גם להתאים את התקנון לדוגמה ולפרסמו (תקנות 2(ג) ו-8), ולמנות </w:t>
+        <w:t xml:space="preserve"> ולפי התקנות, עליה גם להתאים את התקנון לדוגמה ולפרסמו, ולמנות </w:t>
       </w:r>
       <w:r>
         <w:rPr>
@@ -1041,7 +1061,13 @@
           <w:rtl/>
           <w:szCs w:val="24"/>
         </w:rPr>
-        <w:t xml:space="preserve"> לקבלת תלונות ולבירורן (תקנה 4). נודע למעסיק על מקרה גם בלי תלונה, עליו להעבירו לבירור האחראי (תקנה 6(ט)).</w:t>
+        <w:t xml:space="preserve"> לקבלת תלונות ולבירורן. נודע למעסיק על מקרה גם בלי תלונה, עליו להעבירו לבירור האחראי.</w:t>
+      </w:r>
+      <w:r>
+        <w:rPr>
+          <w:vertAlign w:val="superscript"/>
+        </w:rPr>
+        <w:footnoteReference w:id="8"/>
       </w:r>
     </w:p>
     <w:p>
@@ -1076,7 +1102,7 @@
           <w:szCs w:val="24"/>
           <w:bCs/>
         </w:rPr>
-        <w:t>סעיף 7(א) לחוק שוויון ההזדמנויות בעבודה, התשמ"ח-1988</w:t>
+        <w:t>חוק שוויון ההזדמנויות בעבודה</w:t>
       </w:r>
       <w:r>
         <w:rPr>
@@ -1084,7 +1110,7 @@
           <w:rtl/>
           <w:szCs w:val="24"/>
         </w:rPr>
-        <w:t>, אוסר על מעסיק לפגוע בעובד כשמקור הפגיעה בהטרדה מינית, וקובע שלעניין זה די ב</w:t>
+        <w:t xml:space="preserve"> אוסר על מעסיק לפגוע בעובד כשמקור הפגיעה בהטרדה מינית, וקובע שלעניין זה די ב</w:t>
       </w:r>
       <w:r>
         <w:rPr>
@@ -1102,7 +1128,35 @@
           <w:rtl/>
           <w:szCs w:val="24"/>
         </w:rPr>
-        <w:t xml:space="preserve"> לפי סעיף 3(א)(4). אם יוכרו יחסי מרות, גם השאלה הבודדת על נטייתו של אורי עשויה להספיק. העברתו לצוות טכני חודש אחרי שביקש לסיים את השיחות, והשפעתה של דנה על השיבוץ, מעוררות חשד לקשר כזה. משהוכיח זאת אורי, עובר למעסיק הנטל להראות שלא פגע בו (סעיף 9(ב) לאותו חוק), אף שהעובדות אינן מראות שדנה הייתה מעורבת בהחלטה.</w:t>
+        <w:t xml:space="preserve"> לפי סעיף 3(א)(4).</w:t>
+      </w:r>
+      <w:r>
+        <w:rPr>
+          <w:vertAlign w:val="superscript"/>
+        </w:rPr>
+        <w:footnoteReference w:id="9"/>
+      </w:r>
+      <w:r>
+        <w:rPr>
+          <w:sz w:val="24"/>
+          <w:rtl/>
+          <w:szCs w:val="24"/>
+        </w:rPr>
+        <w:t xml:space="preserve"> אם יוכרו יחסי מרות, גם השאלה הבודדת על נטייתו של אורי עשויה להספיק. העברתו לצוות טכני חודש אחרי שביקש לסיים את השיחות, והשפעתה של דנה על השיבוץ, מעוררות חשד לקשר כזה. משהוכיח זאת אורי, עובר למעסיק הנטל להראות שלא פגע בו,</w:t>
+      </w:r>
+      <w:r>
+        <w:rPr>
+          <w:vertAlign w:val="superscript"/>
+        </w:rPr>
+        <w:footnoteReference w:id="10"/>
+      </w:r>
+      <w:r>
+        <w:rPr>
+          <w:sz w:val="24"/>
+          <w:rtl/>
+          <w:szCs w:val="24"/>
+        </w:rPr>
+        <w:t xml:space="preserve"> אף שהעובדות אינן מראות שדנה הייתה מעורבת בהחלטה.</w:t>
       </w:r>
     </w:p>
     <w:p>
@@ -1188,17 +1242,13 @@
           <w:rtl/>
           <w:szCs w:val="24"/>
         </w:rPr>
-        <w:t xml:space="preserve"> והפרה של חוזה העבודה (הילדסהימר, 2026א). העברתו של אורי מהפרויקטים המרכזיים לעריכה טכנית, בלי ישיבות קריאטיב ועם פחות אחריות, היא פגיעה במעמד, אף ששכרו לא השתנה. שינוי ב"תיאור עיקרי התפקיד" מחייב גם הודעה בכתב לעובד בתוך 30 יום (סעיפים 2(א)(3) ו-3 ל</w:t>
+        <w:t xml:space="preserve"> והפרה של חוזה העבודה.</w:t>
       </w:r>
       <w:r>
         <w:rPr>
-          <w:b/>
-          <w:sz w:val="24"/>
-          <w:rtl/>
-          <w:szCs w:val="24"/>
-          <w:bCs/>
+          <w:vertAlign w:val="superscript"/>
         </w:rPr>
-        <w:t>חוק הודעה לעובד ולמועמד לעבודה, התשס"ב-2002</w:t>
+        <w:footnoteReference w:id="11"/>
       </w:r>
       <w:r>
         <w:rPr>
@@ -1206,7 +1256,13 @@
           <w:rtl/>
           <w:szCs w:val="24"/>
         </w:rPr>
-        <w:t>), ובהיעדרה עובר למעסיק נטל ההוכחה בעניין השנוי במחלוקת (סעיף 5א).</w:t>
+        <w:t xml:space="preserve"> העברתו של אורי לעריכה טכנית, בלי ישיבות קריאטיב, היא פגיעה במעמד אף ששכרו לא השתנה. שינוי ב"תיאור עיקרי התפקיד" מחייב גם הודעה בכתב לעובד בתוך 30 יום, ובהיעדרה עובר למעסיק נטל ההוכחה בעניין השנוי במחלוקת.</w:t>
+      </w:r>
+      <w:r>
+        <w:rPr>
+          <w:vertAlign w:val="superscript"/>
+        </w:rPr>
+        <w:footnoteReference w:id="12"/>
       </w:r>
     </w:p>
     <w:p>
@@ -1231,7 +1287,7 @@
           <w:szCs w:val="24"/>
           <w:bCs/>
         </w:rPr>
-        <w:t>סעיף 11(א) לחוק פיצויי פיטורים, התשכ"ג-1963</w:t>
+        <w:t>חוק פיצויי פיטורים</w:t>
       </w:r>
       <w:r>
         <w:rPr>
@@ -1257,7 +1313,35 @@
           <w:rtl/>
           <w:szCs w:val="24"/>
         </w:rPr>
-        <w:t xml:space="preserve"> בתנאי העבודה, או מחמת "נסיבות אחרות שביחסי עבודה" שבהן אין לדרוש מהעובד להמשיך בעבודתו, נחשבת כפיטורים "לעניין חוק זה", כלומר לעניין הזכאות לפיצויי פיטורים בלבד. הזכאות עצמה מותנית בשנת עבודה אחת ברציפות אצל אותו מעסיק (סעיף 1(א) לחוק), ומאחר שאורי "התקבל" לחברה ותקופת העסקתו אינה ידועה, יש לבדוק תחילה שתנאי זה מתקיים.</w:t>
+        <w:t xml:space="preserve"> בתנאי העבודה, או מחמת "נסיבות אחרות שביחסי עבודה" שבהן אין לדרוש מהעובד להמשיך בעבודתו, נחשבת כפיטורים "לעניין חוק זה".</w:t>
+      </w:r>
+      <w:r>
+        <w:rPr>
+          <w:vertAlign w:val="superscript"/>
+        </w:rPr>
+        <w:footnoteReference w:id="13"/>
+      </w:r>
+      <w:r>
+        <w:rPr>
+          <w:sz w:val="24"/>
+          <w:rtl/>
+          <w:szCs w:val="24"/>
+        </w:rPr>
+        <w:t xml:space="preserve"> הזכאות עצמה מותנית בשנת עבודה אחת ברציפות אצל אותו מעסיק,</w:t>
+      </w:r>
+      <w:r>
+        <w:rPr>
+          <w:vertAlign w:val="superscript"/>
+        </w:rPr>
+        <w:footnoteReference w:id="14"/>
+      </w:r>
+      <w:r>
+        <w:rPr>
+          <w:sz w:val="24"/>
+          <w:rtl/>
+          <w:szCs w:val="24"/>
+        </w:rPr>
+        <w:t xml:space="preserve"> ותקופת העסקתו של אורי אינה ידועה.</w:t>
       </w:r>
     </w:p>
     <w:p>
@@ -1354,7 +1438,13 @@
           <w:szCs w:val="24"/>
           <w:bCs/>
         </w:rPr>
-        <w:t>תב"ע (ארצי) נד/3-86 גולן נ' אי.אל.די. בע"מ</w:t>
+        <w:t>עניין גולן</w:t>
+      </w:r>
+      <w:r>
+        <w:rPr>
+          <w:vertAlign w:val="superscript"/>
+        </w:rPr>
+        <w:footnoteReference w:id="15"/>
       </w:r>
       <w:r>
         <w:rPr>
@@ -1377,7 +1467,7 @@
           <w:rtl/>
           <w:szCs w:val="24"/>
         </w:rPr>
-        <w:t>אורי לא מחה, לא ביקש לחזור לתפקידו, לא התריע על כוונתו להתפטר ועבד ארבעה חודשים במתכונת החדשה. אף שהתקופה קצרה מזו שבעניין גולן, השתיקה מלמדת על השלמה עם השינוי. גם "נסיבות אחרות" אינן מסייעות לו, שכן השיחות הסתיימו חודשים לפני ההתפטרות.</w:t>
+        <w:t>אורי לא מחה, לא ביקש לחזור לתפקידו, לא התריע על כוונתו להתפטר ועבד ארבעה חודשים במתכונת החדשה. אף שהתקופה קצרה מזו שבעניין גולן, השתיקה מלמדת על השלמה. גם "נסיבות אחרות" אינן מסייעות לו, שכן השיחות הסתיימו חודשים לפני ההתפטרות.</w:t>
       </w:r>
     </w:p>
     <w:p>
@@ -1409,7 +1499,7 @@
           <w:rtl/>
           <w:szCs w:val="24"/>
         </w:rPr>
-        <w:t>טענת ההטרדה המינית חלשה: גם אם יוכרו יחסי מרות לפי הלכת מדר, קשה להראות התייחסויות חוזרות למיניותו של אורי. טענת ההתנכלות חזקה יותר, בשל סעיפים 7 ו-9 לחוק שוויון ההזדמנויות. טענת ההתפטרות בדין מפוטר נכשלת בשל היעדר התראה והשיהוי (הלכת גולן). על Frame לוודא שיש לה תקנון מותאם ואחראי.</w:t>
+        <w:t>טענת ההטרדה המינית חלשה: גם אם יוכרו יחסי מרות לפי הלכת מדר, קשה להראות התייחסויות חוזרות למיניותו של אורי. טענת ההתנכלות חזקה יותר, בשל סעיפים 7 ו-9 לחוק שוויון ההזדמנויות. טענת ההתפטרות בדין מפוטר נכשלת בשל היעדר התראה והשיהוי (הלכת גולן).</w:t>
       </w:r>
     </w:p>
     <w:p>
@@ -1459,7 +1549,7 @@
           <w:rtl/>
           <w:szCs w:val="24"/>
         </w:rPr>
-        <w:t>חוק הסכמים קיבוציים, התשי"ז-1957.</w:t>
+        <w:t>חוק הודעה לעובד ולמועמד לעבודה (תנאי עבודה והליכי מיון וקבלה לעבודה), התשס"ב–2002.</w:t>
       </w:r>
     </w:p>
     <w:p>
@@ -1474,7 +1564,7 @@
           <w:rtl/>
           <w:szCs w:val="24"/>
         </w:rPr>
-        <w:t>חוק למניעת הטרדה מינית, התשנ"ח-1998.</w:t>
+        <w:t>חוק הסכמים קיבוציים, התשי"ז–1957.</w:t>
       </w:r>
     </w:p>
     <w:p>
@@ -1489,7 +1579,7 @@
           <w:rtl/>
           <w:szCs w:val="24"/>
         </w:rPr>
-        <w:t>חוק הודעה לעובד ולמועמד לעבודה (תנאי עבודה והליכי מיון וקבלה לעבודה), התשס"ב-2002.</w:t>
+        <w:t>חוק למניעת הטרדה מינית, התשנ"ח–1998.</w:t>
       </w:r>
     </w:p>
     <w:p>
@@ -1504,7 +1594,7 @@
           <w:rtl/>
           <w:szCs w:val="24"/>
         </w:rPr>
-        <w:t>חוק פיצויי פיטורים, התשכ"ג-1963.</w:t>
+        <w:t>חוק פיצויי פיטורים, התשכ"ג–1963.</w:t>
       </w:r>
     </w:p>
     <w:p>
@@ -1519,7 +1609,7 @@
           <w:rtl/>
           <w:szCs w:val="24"/>
         </w:rPr>
-        <w:t>חוק שוויון ההזדמנויות בעבודה, התשמ"ח-1988.</w:t>
+        <w:t>חוק שוויון ההזדמנויות בעבודה, התשמ"ח–1988.</w:t>
       </w:r>
     </w:p>
     <w:p>
@@ -1534,7 +1624,7 @@
           <w:rtl/>
           <w:szCs w:val="24"/>
         </w:rPr>
-        <w:t>תקנות למניעת הטרדה מינית (חובות מעסיק), התשנ"ח-1998.</w:t>
+        <w:t>תקנות למניעת הטרדה מינית (חובות מעסיק), התשנ"ח–1998.</w:t>
       </w:r>
     </w:p>
     <w:p>
@@ -1566,7 +1656,7 @@
           <w:rtl/>
           <w:szCs w:val="24"/>
         </w:rPr>
-        <w:t>בג"ץ 7029/95 הסתדרות העובדים הכללית החדשה נ' בית הדין הארצי לעבודה ועמית, הסתדרות עובדים מכבי (1997).</w:t>
+        <w:t>בג"ץ 7029/95 הסתדרות העובדים הכללית החדשה נ' בית הדין הארצי לעבודה, פ"ד נא(2) 63 (1997).</w:t>
       </w:r>
     </w:p>
     <w:p>
@@ -1581,7 +1671,7 @@
           <w:rtl/>
           <w:szCs w:val="24"/>
         </w:rPr>
-        <w:t>עס"ק (ארצי) 6298-03-25 הסתדרות העובדים הכללית החדשה נ' ארגון עובדי הפיתוח והשיווק בנוקיה (10.6.2025).</w:t>
+        <w:t>עס"ק (ארצי) 6298-03-25 הסתדרות העובדים הכללית החדשה נ' ארגון עובדי הפיתוח והשיווק בנוקיה (נבו 10.6.2025).</w:t>
       </w:r>
     </w:p>
     <w:p>
@@ -1596,7 +1686,7 @@
           <w:rtl/>
           <w:szCs w:val="24"/>
         </w:rPr>
-        <w:t>עס"ק (ארצי) 25476-09-12 הסתדרות העובדים החדשה נ' פלאפון תקשורת בע"מ (2.1.2013).</w:t>
+        <w:t>עס"ק (ארצי) 25476-09-12 הסתדרות העובדים הכללית החדשה נ' פלאפון תקשורת בע"מ (נבו 2.1.2013).</w:t>
       </w:r>
     </w:p>
     <w:p>
@@ -1611,7 +1701,7 @@
           <w:rtl/>
           <w:szCs w:val="24"/>
         </w:rPr>
-        <w:t>עש"ם 2203/05 מדר נ' נציבות שירות המדינה (21.7.2005).</w:t>
+        <w:t>עש"ם 2203/05 מדר נ' נציבות שירות המדינה (נבו 21.7.2005).</w:t>
       </w:r>
     </w:p>
     <w:p>
@@ -1626,7 +1716,7 @@
           <w:rtl/>
           <w:szCs w:val="24"/>
         </w:rPr>
-        <w:t>תב"ע (ארצי) נד/3-86 יוחנן גולן נ' אי.אל.די. בע"מ.</w:t>
+        <w:t>תב"ע (ארצי) נד/86-3 יוחנן גולן נ' אי.אל.די. בע"מ.</w:t>
       </w:r>
     </w:p>
     <w:p>
@@ -1658,7 +1748,7 @@
           <w:rtl/>
           <w:szCs w:val="24"/>
         </w:rPr>
-        <w:t>בן-ישראל, ר' (2002). דיני עבודה (כרך א', עמ' 32-48).</w:t>
+        <w:t>רות בן-ישראל דיני עבודה כרך א 48-32 (2002).</w:t>
       </w:r>
     </w:p>
     <w:p>
@@ -1673,7 +1763,7 @@
           <w:rtl/>
           <w:szCs w:val="24"/>
         </w:rPr>
-        <w:t>הילדסהימר, ג' (2026א). חוזה עבודה אישי ומניעת הרעת תנאים, חלקים א'-ב' [מצגת הרצאה]. היבטים משפטיים ואתיים בייעוץ ופיתוח ארגוני, המרכז האקדמי פרס.</w:t>
+        <w:t>גליה הילדסהימר "התארגנויות עובדים" מצגת הקורס היבטים משפטיים ואתיים בייעוץ ופיתוח ארגוני, המרכז האקדמי פרס (2026).</w:t>
       </w:r>
     </w:p>
     <w:p>
@@ -1688,7 +1778,7 @@
           <w:rtl/>
           <w:szCs w:val="24"/>
         </w:rPr>
-        <w:t>הילדסהימר, ג' (2026ב). החוק למניעת הטרדה מינית, חלקים א'-ב' [מצגת הרצאה]. היבטים משפטיים ואתיים בייעוץ ופיתוח ארגוני, המרכז האקדמי פרס.</w:t>
+        <w:t>גליה הילדסהימר "החוק למניעת הטרדה מינית, חלקים א'-ב'" מצגת הקורס היבטים משפטיים ואתיים בייעוץ ופיתוח ארגוני, המרכז האקדמי פרס (2026).</w:t>
       </w:r>
     </w:p>
     <w:p>
@@ -1703,7 +1793,7 @@
           <w:rtl/>
           <w:szCs w:val="24"/>
         </w:rPr>
-        <w:t>הילדסהימר, ג' (2026ג). התארגנויות עובדים [מצגת הרצאה]. היבטים משפטיים ואתיים בייעוץ ופיתוח ארגוני, המרכז האקדמי פרס.</w:t>
+        <w:t>גליה הילדסהימר "חוזה עבודה אישי ומניעת הרעת תנאים, חלקים א'-ב'" מצגת הקורס היבטים משפטיים ואתיים בייעוץ ופיתוח ארגוני, המרכז האקדמי פרס (2026).</w:t>
       </w:r>
     </w:p>
     <w:sectPr>
@@ -1715,6 +1805,481 @@
     </w:sectPr>
   </w:body>
 </w:document>
+</file>
+
+<file path=word/footnotes.xml><?xml version="1.0" encoding="utf-8"?>
+<w:footnotes xmlns:w="http://schemas.openxmlformats.org/wordprocessingml/2006/main">
+  <w:footnote w:type="separator" w:id="-1">
+    <w:p>
+      <w:pPr>
+        <w:spacing w:after="0" w:line="240" w:lineRule="auto"/>
+      </w:pPr>
+      <w:r>
+        <w:separator/>
+      </w:r>
+    </w:p>
+  </w:footnote>
+  <w:footnote w:type="continuationSeparator" w:id="0">
+    <w:p>
+      <w:pPr>
+        <w:spacing w:after="0" w:line="240" w:lineRule="auto"/>
+      </w:pPr>
+      <w:r>
+        <w:continuationSeparator/>
+      </w:r>
+    </w:p>
+  </w:footnote>
+  <w:footnote w:id="1">
+    <w:p>
+      <w:pPr>
+        <w:bidi/>
+        <w:spacing w:before="0" w:after="0" w:line="240" w:lineRule="auto"/>
+        <w:jc w:val="both"/>
+      </w:pPr>
+      <w:r>
+        <w:rPr>
+          <w:vertAlign w:val="superscript"/>
+          <w:sz w:val="20"/>
+        </w:rPr>
+        <w:footnoteRef/>
+      </w:r>
+      <w:r>
+        <w:rPr>
+          <w:sz w:val="20"/>
+        </w:rPr>
+        <w:t xml:space="preserve"> </w:t>
+      </w:r>
+      <w:r>
+        <w:rPr>
+          <w:rtl/>
+          <w:sz w:val="20"/>
+          <w:szCs w:val="20"/>
+        </w:rPr>
+        <w:t xml:space="preserve">רות בן-ישראל דיני עבודה כרך א 48-32 (2002); גליה הילדסהימר "התארגנויות עובדים" מצגת הקורס היבטים משפטיים ואתיים בייעוץ ופיתוח ארגוני, המרכז האקדמי פרס (2026).</w:t>
+      </w:r>
+    </w:p>
+  </w:footnote>
+  <w:footnote w:id="2">
+    <w:p>
+      <w:pPr>
+        <w:bidi/>
+        <w:spacing w:before="0" w:after="0" w:line="240" w:lineRule="auto"/>
+        <w:jc w:val="both"/>
+      </w:pPr>
+      <w:r>
+        <w:rPr>
+          <w:vertAlign w:val="superscript"/>
+          <w:sz w:val="20"/>
+        </w:rPr>
+        <w:footnoteRef/>
+      </w:r>
+      <w:r>
+        <w:rPr>
+          <w:sz w:val="20"/>
+        </w:rPr>
+        <w:t xml:space="preserve"> </w:t>
+      </w:r>
+      <w:r>
+        <w:rPr>
+          <w:rtl/>
+          <w:sz w:val="20"/>
+          <w:szCs w:val="20"/>
+        </w:rPr>
+        <w:t xml:space="preserve">ס' 33ח לחוק הסכמים קיבוציים, התשי"ז–1957 (להלן: חוק הסכמים קיבוציים).</w:t>
+      </w:r>
+    </w:p>
+  </w:footnote>
+  <w:footnote w:id="3">
+    <w:p>
+      <w:pPr>
+        <w:bidi/>
+        <w:spacing w:before="0" w:after="0" w:line="240" w:lineRule="auto"/>
+        <w:jc w:val="both"/>
+      </w:pPr>
+      <w:r>
+        <w:rPr>
+          <w:vertAlign w:val="superscript"/>
+          <w:sz w:val="20"/>
+        </w:rPr>
+        <w:footnoteRef/>
+      </w:r>
+      <w:r>
+        <w:rPr>
+          <w:sz w:val="20"/>
+        </w:rPr>
+        <w:t xml:space="preserve"> </w:t>
+      </w:r>
+      <w:r>
+        <w:rPr>
+          <w:rtl/>
+          <w:sz w:val="20"/>
+          <w:szCs w:val="20"/>
+        </w:rPr>
+        <w:t xml:space="preserve">בג"ץ 7029/95 הסתדרות העובדים הכללית החדשה נ' בית הדין הארצי לעבודה, פ"ד נא(2) 63 (1997) (להלן: עניין עמית).</w:t>
+      </w:r>
+    </w:p>
+  </w:footnote>
+  <w:footnote w:id="4">
+    <w:p>
+      <w:pPr>
+        <w:bidi/>
+        <w:spacing w:before="0" w:after="0" w:line="240" w:lineRule="auto"/>
+        <w:jc w:val="both"/>
+      </w:pPr>
+      <w:r>
+        <w:rPr>
+          <w:vertAlign w:val="superscript"/>
+          <w:sz w:val="20"/>
+        </w:rPr>
+        <w:footnoteRef/>
+      </w:r>
+      <w:r>
+        <w:rPr>
+          <w:sz w:val="20"/>
+        </w:rPr>
+        <w:t xml:space="preserve"> </w:t>
+      </w:r>
+      <w:r>
+        <w:rPr>
+          <w:rtl/>
+          <w:sz w:val="20"/>
+          <w:szCs w:val="20"/>
+        </w:rPr>
+        <w:t xml:space="preserve">עס"ק (ארצי) 6298-03-25 הסתדרות העובדים הכללית החדשה נ' ארגון עובדי הפיתוח והשיווק בנוקיה (נבו 10.6.2025) (להלן: עניין נוקיה).</w:t>
+      </w:r>
+    </w:p>
+  </w:footnote>
+  <w:footnote w:id="5">
+    <w:p>
+      <w:pPr>
+        <w:bidi/>
+        <w:spacing w:before="0" w:after="0" w:line="240" w:lineRule="auto"/>
+        <w:jc w:val="both"/>
+      </w:pPr>
+      <w:r>
+        <w:rPr>
+          <w:vertAlign w:val="superscript"/>
+          <w:sz w:val="20"/>
+        </w:rPr>
+        <w:footnoteRef/>
+      </w:r>
+      <w:r>
+        <w:rPr>
+          <w:sz w:val="20"/>
+        </w:rPr>
+        <w:t xml:space="preserve"> </w:t>
+      </w:r>
+      <w:r>
+        <w:rPr>
+          <w:rtl/>
+          <w:sz w:val="20"/>
+          <w:szCs w:val="20"/>
+        </w:rPr>
+        <w:t xml:space="preserve">עס"ק (ארצי) 25476-09-12 הסתדרות העובדים הכללית החדשה נ' פלאפון תקשורת בע"מ (נבו 2.1.2013) (להלן: עניין פלאפון).</w:t>
+      </w:r>
+    </w:p>
+  </w:footnote>
+  <w:footnote w:id="6">
+    <w:p>
+      <w:pPr>
+        <w:bidi/>
+        <w:spacing w:before="0" w:after="0" w:line="240" w:lineRule="auto"/>
+        <w:jc w:val="both"/>
+      </w:pPr>
+      <w:r>
+        <w:rPr>
+          <w:vertAlign w:val="superscript"/>
+          <w:sz w:val="20"/>
+        </w:rPr>
+        <w:footnoteRef/>
+      </w:r>
+      <w:r>
+        <w:rPr>
+          <w:sz w:val="20"/>
+        </w:rPr>
+        <w:t xml:space="preserve"> </w:t>
+      </w:r>
+      <w:r>
+        <w:rPr>
+          <w:rtl/>
+          <w:sz w:val="20"/>
+          <w:szCs w:val="20"/>
+        </w:rPr>
+        <w:t xml:space="preserve">ס' 1 לחוק למניעת הטרדה מינית, התשנ"ח–1998 (להלן: החוק למניעת הטרדה מינית); גליה הילדסהימר "החוק למניעת הטרדה מינית, חלקים א'-ב'" מצגת הקורס היבטים משפטיים ואתיים בייעוץ ופיתוח ארגוני, המרכז האקדמי פרס (2026).</w:t>
+      </w:r>
+    </w:p>
+  </w:footnote>
+  <w:footnote w:id="7">
+    <w:p>
+      <w:pPr>
+        <w:bidi/>
+        <w:spacing w:before="0" w:after="0" w:line="240" w:lineRule="auto"/>
+        <w:jc w:val="both"/>
+      </w:pPr>
+      <w:r>
+        <w:rPr>
+          <w:vertAlign w:val="superscript"/>
+          <w:sz w:val="20"/>
+        </w:rPr>
+        <w:footnoteRef/>
+      </w:r>
+      <w:r>
+        <w:rPr>
+          <w:sz w:val="20"/>
+        </w:rPr>
+        <w:t xml:space="preserve"> </w:t>
+      </w:r>
+      <w:r>
+        <w:rPr>
+          <w:rtl/>
+          <w:sz w:val="20"/>
+          <w:szCs w:val="20"/>
+        </w:rPr>
+        <w:t xml:space="preserve">עש"ם 2203/05 מדר נ' נציבות שירות המדינה (נבו 21.7.2005) (להלן: עניין מדר).</w:t>
+      </w:r>
+    </w:p>
+  </w:footnote>
+  <w:footnote w:id="8">
+    <w:p>
+      <w:pPr>
+        <w:bidi/>
+        <w:spacing w:before="0" w:after="0" w:line="240" w:lineRule="auto"/>
+        <w:jc w:val="both"/>
+      </w:pPr>
+      <w:r>
+        <w:rPr>
+          <w:vertAlign w:val="superscript"/>
+          <w:sz w:val="20"/>
+        </w:rPr>
+        <w:footnoteRef/>
+      </w:r>
+      <w:r>
+        <w:rPr>
+          <w:sz w:val="20"/>
+        </w:rPr>
+        <w:t xml:space="preserve"> </w:t>
+      </w:r>
+      <w:r>
+        <w:rPr>
+          <w:rtl/>
+          <w:sz w:val="20"/>
+          <w:szCs w:val="20"/>
+        </w:rPr>
+        <w:t xml:space="preserve">תק' 2(ג), 4, 6(ט) ו-8 לתקנות למניעת הטרדה מינית (חובות מעסיק), התשנ"ח–1998.</w:t>
+      </w:r>
+    </w:p>
+  </w:footnote>
+  <w:footnote w:id="9">
+    <w:p>
+      <w:pPr>
+        <w:bidi/>
+        <w:spacing w:before="0" w:after="0" w:line="240" w:lineRule="auto"/>
+        <w:jc w:val="both"/>
+      </w:pPr>
+      <w:r>
+        <w:rPr>
+          <w:vertAlign w:val="superscript"/>
+          <w:sz w:val="20"/>
+        </w:rPr>
+        <w:footnoteRef/>
+      </w:r>
+      <w:r>
+        <w:rPr>
+          <w:sz w:val="20"/>
+        </w:rPr>
+        <w:t xml:space="preserve"> </w:t>
+      </w:r>
+      <w:r>
+        <w:rPr>
+          <w:rtl/>
+          <w:sz w:val="20"/>
+          <w:szCs w:val="20"/>
+        </w:rPr>
+        <w:t xml:space="preserve">ס' 7(א) לחוק שוויון ההזדמנויות בעבודה, התשמ"ח–1988.</w:t>
+      </w:r>
+    </w:p>
+  </w:footnote>
+  <w:footnote w:id="10">
+    <w:p>
+      <w:pPr>
+        <w:bidi/>
+        <w:spacing w:before="0" w:after="0" w:line="240" w:lineRule="auto"/>
+        <w:jc w:val="both"/>
+      </w:pPr>
+      <w:r>
+        <w:rPr>
+          <w:vertAlign w:val="superscript"/>
+          <w:sz w:val="20"/>
+        </w:rPr>
+        <w:footnoteRef/>
+      </w:r>
+      <w:r>
+        <w:rPr>
+          <w:sz w:val="20"/>
+        </w:rPr>
+        <w:t xml:space="preserve"> </w:t>
+      </w:r>
+      <w:r>
+        <w:rPr>
+          <w:rtl/>
+          <w:sz w:val="20"/>
+          <w:szCs w:val="20"/>
+        </w:rPr>
+        <w:t xml:space="preserve">ס' 9(ב) לחוק שוויון ההזדמנויות בעבודה; ס' 6א לחוק למניעת הטרדה מינית.</w:t>
+      </w:r>
+    </w:p>
+  </w:footnote>
+  <w:footnote w:id="11">
+    <w:p>
+      <w:pPr>
+        <w:bidi/>
+        <w:spacing w:before="0" w:after="0" w:line="240" w:lineRule="auto"/>
+        <w:jc w:val="both"/>
+      </w:pPr>
+      <w:r>
+        <w:rPr>
+          <w:vertAlign w:val="superscript"/>
+          <w:sz w:val="20"/>
+        </w:rPr>
+        <w:footnoteRef/>
+      </w:r>
+      <w:r>
+        <w:rPr>
+          <w:sz w:val="20"/>
+        </w:rPr>
+        <w:t xml:space="preserve"> </w:t>
+      </w:r>
+      <w:r>
+        <w:rPr>
+          <w:rtl/>
+          <w:sz w:val="20"/>
+          <w:szCs w:val="20"/>
+        </w:rPr>
+        <w:t xml:space="preserve">גליה הילדסהימר "חוזה עבודה אישי ומניעת הרעת תנאים, חלקים א'-ב'" מצגת הקורס היבטים משפטיים ואתיים בייעוץ ופיתוח ארגוני, המרכז האקדמי פרס (2026).</w:t>
+      </w:r>
+    </w:p>
+  </w:footnote>
+  <w:footnote w:id="12">
+    <w:p>
+      <w:pPr>
+        <w:bidi/>
+        <w:spacing w:before="0" w:after="0" w:line="240" w:lineRule="auto"/>
+        <w:jc w:val="both"/>
+      </w:pPr>
+      <w:r>
+        <w:rPr>
+          <w:vertAlign w:val="superscript"/>
+          <w:sz w:val="20"/>
+        </w:rPr>
+        <w:footnoteRef/>
+      </w:r>
+      <w:r>
+        <w:rPr>
+          <w:sz w:val="20"/>
+        </w:rPr>
+        <w:t xml:space="preserve"> </w:t>
+      </w:r>
+      <w:r>
+        <w:rPr>
+          <w:rtl/>
+          <w:sz w:val="20"/>
+          <w:szCs w:val="20"/>
+        </w:rPr>
+        <w:t xml:space="preserve">ס' 2(א)(3), 3 ו-5א לחוק הודעה לעובד ולמועמד לעבודה (תנאי עבודה והליכי מיון וקבלה לעבודה), התשס"ב–2002.</w:t>
+      </w:r>
+    </w:p>
+  </w:footnote>
+  <w:footnote w:id="13">
+    <w:p>
+      <w:pPr>
+        <w:bidi/>
+        <w:spacing w:before="0" w:after="0" w:line="240" w:lineRule="auto"/>
+        <w:jc w:val="both"/>
+      </w:pPr>
+      <w:r>
+        <w:rPr>
+          <w:vertAlign w:val="superscript"/>
+          <w:sz w:val="20"/>
+        </w:rPr>
+        <w:footnoteRef/>
+      </w:r>
+      <w:r>
+        <w:rPr>
+          <w:sz w:val="20"/>
+        </w:rPr>
+        <w:t xml:space="preserve"> </w:t>
+      </w:r>
+      <w:r>
+        <w:rPr>
+          <w:rtl/>
+          <w:sz w:val="20"/>
+          <w:szCs w:val="20"/>
+        </w:rPr>
+        <w:t xml:space="preserve">ס' 11(א) לחוק פיצויי פיטורים, התשכ"ג–1963.</w:t>
+      </w:r>
+    </w:p>
+  </w:footnote>
+  <w:footnote w:id="14">
+    <w:p>
+      <w:pPr>
+        <w:bidi/>
+        <w:spacing w:before="0" w:after="0" w:line="240" w:lineRule="auto"/>
+        <w:jc w:val="both"/>
+      </w:pPr>
+      <w:r>
+        <w:rPr>
+          <w:vertAlign w:val="superscript"/>
+          <w:sz w:val="20"/>
+        </w:rPr>
+        <w:footnoteRef/>
+      </w:r>
+      <w:r>
+        <w:rPr>
+          <w:sz w:val="20"/>
+        </w:rPr>
+        <w:t xml:space="preserve"> </w:t>
+      </w:r>
+      <w:r>
+        <w:rPr>
+          <w:rtl/>
+          <w:sz w:val="20"/>
+          <w:szCs w:val="20"/>
+        </w:rPr>
+        <w:t xml:space="preserve">ס' 1(א), שם.</w:t>
+      </w:r>
+    </w:p>
+  </w:footnote>
+  <w:footnote w:id="15">
+    <w:p>
+      <w:pPr>
+        <w:bidi/>
+        <w:spacing w:before="0" w:after="0" w:line="240" w:lineRule="auto"/>
+        <w:jc w:val="both"/>
+      </w:pPr>
+      <w:r>
+        <w:rPr>
+          <w:vertAlign w:val="superscript"/>
+          <w:sz w:val="20"/>
+        </w:rPr>
+        <w:footnoteRef/>
+      </w:r>
+      <w:r>
+        <w:rPr>
+          <w:sz w:val="20"/>
+        </w:rPr>
+        <w:t xml:space="preserve"> </w:t>
+      </w:r>
+      <w:r>
+        <w:rPr>
+          <w:rtl/>
+          <w:sz w:val="20"/>
+          <w:szCs w:val="20"/>
+        </w:rPr>
+        <w:t xml:space="preserve">תב"ע (ארצי) נד/86-3 יוחנן גולן נ' אי.אל.די. בע"מ (להלן: עניין גולן).</w:t>
+      </w:r>
+    </w:p>
+  </w:footnote>
+</w:footnotes>
 </file>
 
 <file path=word/numbering.xml><?xml version="1.0" encoding="utf-8"?>

</xml_diff>

<commit_message>
Add Lifshitz and Kamir articles as footnoted sources
Co-Authored-By: Claude Opus 5.5 <noreply@anthropic.com>
Claude-Session: https://claude.ai/code/session_01BVH1n3fvCDz4inkznfhZC9
</commit_message>
<xml_diff>
--- a/output/עבודה_היבטים_משפטיים.docx
+++ b/output/עבודה_היבטים_משפטיים.docx
@@ -213,7 +213,7 @@
           <w:rtl/>
           <w:szCs w:val="24"/>
         </w:rPr>
-        <w:t xml:space="preserve"> ארבעה מבחנים נקבעו שם. </w:t>
+        <w:t xml:space="preserve"> </w:t>
       </w:r>
       <w:r>
         <w:rPr>
@@ -360,7 +360,7 @@
           <w:rtl/>
           <w:szCs w:val="24"/>
         </w:rPr>
-        <w:t xml:space="preserve"> סעיף הסמכויות מקנה לקבוצה סמכות לנהל משא ומתן, לאשר הסכמים קיבוציים ולהכריז על סכסוך עבודה. אולם סעיף המטרות, ובפרט </w:t>
+        <w:t xml:space="preserve"> אף שסעיף הסמכויות מקנה לקבוצה סמכויות של ארגון עובדים, </w:t>
       </w:r>
       <w:r>
         <w:rPr>
@@ -378,7 +378,7 @@
           <w:rtl/>
           <w:szCs w:val="24"/>
         </w:rPr>
-        <w:t xml:space="preserve">, מוציא מראש מתחום הפעולה הקיבוצית את השכר, הבונוסים והאופציות, שהם ליבת תנאי העבודה בחברת טכנולוגיה. גוף כזה אינו מקדם את זכויות העובדים מול המעסיק. גם </w:t>
+        <w:t xml:space="preserve"> מוציאה מראש מתחום הפעולה הקיבוצית את השכר, הבונוסים והאופציות. גם </w:t>
       </w:r>
       <w:r>
         <w:rPr>
@@ -439,7 +439,7 @@
           <w:rtl/>
           <w:szCs w:val="24"/>
         </w:rPr>
-        <w:t xml:space="preserve"> הקבוצה הוקמה בתגובה ישירה להצטרפות העובדים להסתדרות ומגדירה את עצמה כמי שפועלת "בשיתוף פעולה ובהידברות" עם ההנהלה. המנכ"ל בירך על הקמתה וראה בה דרך לשמור על "התרבות הייחודית של החברה", ובמקביל פעל נגד ההסתדרות. גוף שהמעסיק תומך בו כך אינו "קול נגדי" לו.</w:t>
+        <w:t xml:space="preserve"> הקבוצה הוקמה בתגובה ישירה להצטרפות העובדים להסתדרות ומגדירה את עצמה כמי שפועלת "בשיתוף פעולה ובהידברות" עם ההנהלה. המנכ"ל בירך על הקמתה ובמקביל פעל נגד ההסתדרות. גוף שהמעסיק תומך בו כך אינו "קול נגדי" לו.</w:t>
       </w:r>
     </w:p>
     <w:p>
@@ -485,7 +485,7 @@
           <w:rtl/>
           <w:szCs w:val="24"/>
         </w:rPr>
-        <w:t>אין בכך כדי לפגוע בחופש מהתארגנות. עובד רשאי שלא להצטרף להסתדרות, וסעיף 33י(א)(3) מגן עליו מפני פגיעה בשל כך. אבל חופש זה אינו הופך את הקבוצה לארגון עובדים. חבריה אינם נספרים לצורך היציגות, והודעתה כי היא הארגון היציג חסרת נפקות. חובת המעסיק לנהל משא ומתן בהתארגנות ראשונית חלה רק כלפי ארגון יציג לפי סעיף 3 (</w:t>
+        <w:t>אין בכך כדי לפגוע בחופש מהתארגנות. עובד רשאי שלא להצטרף להסתדרות, וסעיף 33י(א)(3) מגן עליו מפני פגיעה בשל כך. חבריה אינם נספרים לצורך היציגות, והודעתה כי היא הארגון היציג חסרת נפקות. חובת המעסיק לנהל משא ומתן בהתארגנות ראשונית חלה רק כלפי ארגון יציג לפי סעיף 3 (</w:t>
       </w:r>
       <w:r>
         <w:rPr>
@@ -595,7 +595,21 @@
           <w:rtl/>
           <w:szCs w:val="24"/>
         </w:rPr>
-        <w:t xml:space="preserve"> ובתכתובות אלקטרוניות. נקבע גם כי הצגת חסרונות ההצטרפות לארגון עובדים והשלכותיה על החברה היא הבעת עמדה אסורה, גם אם יש בה אמת. ההתארגנות ב-NeuroTech נמצאת בשלב הפורץ, ולכן שלוש פעולות ההנהלה אסורות.</w:t>
+        <w:t xml:space="preserve"> ובתכתובות אלקטרוניות. נקבע גם כי הצגת חסרונות ההצטרפות לארגון עובדים והשלכותיה על החברה היא הבעת עמדה אסורה, גם אם יש בה אמת. ההלכה אושרה בבג"ץ, ולפי הספרות היא כמעט איינה את יכולת המעסיק להתערב בהתארגנות הראשונית.</w:t>
+      </w:r>
+      <w:r>
+        <w:rPr>
+          <w:vertAlign w:val="superscript"/>
+        </w:rPr>
+        <w:footnoteReference w:id="6"/>
+      </w:r>
+      <w:r>
+        <w:rPr>
+          <w:sz w:val="24"/>
+          <w:rtl/>
+          <w:szCs w:val="24"/>
+        </w:rPr>
+        <w:t xml:space="preserve"> ההתארגנות ב-NeuroTech נמצאת בשלב הפורץ, ולכן שלוש פעולות ההנהלה אסורות.</w:t>
       </w:r>
     </w:p>
     <w:p>
@@ -638,7 +652,7 @@
           <w:rtl/>
           <w:szCs w:val="24"/>
         </w:rPr>
-        <w:t xml:space="preserve"> לשוחח עם עובדיהם על "יתרונות המודל האישי" היא מפגש אישי שנועד להעביר את עמדת ההנהלה, ובית הדין אסר עליו במפורש. חומרתה רבה משום שהמנהלים משפיעים על הבונוסים והקידום של העובדים. </w:t>
+        <w:t xml:space="preserve"> לשוחח עם עובדיהם על "יתרונות המודל האישי" היא מפגש אישי שנאסר במפורש. חומרתה רבה, שכן המנהלים משפיעים על הבונוסים והקידום. </w:t>
       </w:r>
       <w:r>
         <w:rPr>
@@ -688,7 +702,7 @@
           <w:rtl/>
           <w:szCs w:val="24"/>
         </w:rPr>
-        <w:t>טענות ההסתדרות מוצדקות. הקבוצה עומדת במבחני החברות והתקנון של עניין עמית, אך לא במבחן המטרה ולא במבחן הקול הנגדי, כפי שנפסק בנסיבות דומות בעניין נוקיה. פעולות ההנהלה הפרו את האיסור על הבעת עמדה בשלב ההתארגנות הפורצת שנקבע בעניין פלאפון.</w:t>
+        <w:t>טענות ההסתדרות מוצדקות. הקבוצה אינה עומדת במבחן המטרה ובמבחן הקול הנגדי, כפי שנפסק בעניין נוקיה. פעולות ההנהלה הפרו את האיסור על הבעת עמדה בשלב ההתארגנות הפורצת שנקבע בעניין פלאפון.</w:t>
       </w:r>
     </w:p>
     <w:p>
@@ -754,7 +768,7 @@
         <w:rPr>
           <w:vertAlign w:val="superscript"/>
         </w:rPr>
-        <w:footnoteReference w:id="6"/>
+        <w:footnoteReference w:id="7"/>
       </w:r>
       <w:r>
         <w:rPr>
@@ -849,7 +863,21 @@
           <w:rtl/>
           <w:szCs w:val="24"/>
         </w:rPr>
-        <w:t>השיחות התקיימו במשרד, ולכן ב"מסגרת יחסי עבודה". "הראה" פירושו במילים או בהתנהגות שאין ספק סביר לגבי משמעותה (הגדרות שבסעיף 2 לחוק), ואורי לא עשה כן בתחילה: הוא שאל שאלות ושיתף פרטים מחייו, וכשביקש להשאיר את הנושא מחוץ לעבודה, דנה הפסיקה מיד.</w:t>
+        <w:t>השיחות התקיימו במשרד, ולכן ב"מסגרת יחסי עבודה". "הראה" פירושו במילים או בהתנהגות שאין ספק סביר לגבי משמעותה (הגדרות שבסעיף 2 לחוק), שכן התייחסויות כאלה כשלעצמן הן התנהגות ניטרלית, ההופכת להטרדה רק כשאינה רצויה.</w:t>
+      </w:r>
+      <w:r>
+        <w:rPr>
+          <w:vertAlign w:val="superscript"/>
+        </w:rPr>
+        <w:footnoteReference w:id="8"/>
+      </w:r>
+      <w:r>
+        <w:rPr>
+          <w:sz w:val="24"/>
+          <w:rtl/>
+          <w:szCs w:val="24"/>
+        </w:rPr>
+        <w:t xml:space="preserve"> אורי לא הראה זאת בתחילה: הוא שאל שאלות ושיתף פרטים מחייו, וכשביקש להשאיר את הנושא מחוץ לעבודה, דנה הפסיקה מיד.</w:t>
       </w:r>
     </w:p>
     <w:p>
@@ -916,7 +944,7 @@
         <w:rPr>
           <w:vertAlign w:val="superscript"/>
         </w:rPr>
-        <w:footnoteReference w:id="7"/>
+        <w:footnoteReference w:id="9"/>
       </w:r>
       <w:r>
         <w:rPr>
@@ -924,7 +952,21 @@
           <w:rtl/>
           <w:szCs w:val="24"/>
         </w:rPr>
-        <w:t xml:space="preserve"> נקבע שיחסי מרות התקיימו אף שהמטריד לא היה הממונה הישיר, ושבקשה עמומה להפסיק אינה שוללת את ההטרדה. לדנה אין סמכות לקבל או לפטר, אך היא משתתפת בהחלטות השיבוץ ומשפיעה על קידום עובדים צעירים כמו אורי. לפי הלכת מדר אלה יחסי מרות, והשתתפותו של אורי בשיחות יכולה לנבוע מחשש לעתידו.</w:t>
+        <w:t xml:space="preserve"> נקבע שיחסי מרות התקיימו אף שהמטריד לא היה הממונה הישיר, ושבקשה עמומה להפסיק אינה שוללת את ההטרדה. לדנה אין סמכות לקבל או לפטר, אך היא משתתפת בהחלטות השיבוץ ומשפיעה על קידום עובדים צעירים כמו אורי. לפי הלכת מדר אלה יחסי מרות. חלופה זו מכירה בחולשת הכפוף, העלולה לשלול ממנו רצון חופשי, ומטילה על בעל המרות לזהות בעצמו התנהגות שעלולה להיתפס כמטרידה.</w:t>
+      </w:r>
+      <w:r>
+        <w:rPr>
+          <w:vertAlign w:val="superscript"/>
+        </w:rPr>
+        <w:footnoteReference w:id="10"/>
+      </w:r>
+      <w:r>
+        <w:rPr>
+          <w:sz w:val="24"/>
+          <w:rtl/>
+          <w:szCs w:val="24"/>
+        </w:rPr>
+        <w:t xml:space="preserve"> מכאן שהשתתפותו של אורי בשיחות אינה מעידה בהכרח על הסכמה.</w:t>
       </w:r>
     </w:p>
     <w:p>
@@ -975,7 +1017,7 @@
           <w:rtl/>
           <w:szCs w:val="24"/>
         </w:rPr>
-        <w:t xml:space="preserve"> יחסי המרות. השאלה הישירה על נטייתו של אורי נשאלה פעם אחת. רוב השיחות עסקו בחייה של דנה, היו הדדיות ולא נקשרו למעמדו בעבודה, ולכן קשה לבסס כאן הטרדה מינית.</w:t>
+        <w:t xml:space="preserve"> יחסי המרות. השאלה על נטייתו של אורי נשאלה פעם אחת. רוב השיחות עסקו בחייה של דנה והיו הדדיות, ולכן קשה לבסס כאן הטרדה מינית.</w:t>
       </w:r>
     </w:p>
     <w:p>
@@ -1007,7 +1049,7 @@
           <w:rtl/>
           <w:szCs w:val="24"/>
         </w:rPr>
-        <w:t xml:space="preserve">לפי </w:t>
+        <w:t>מעסיק חייב לנקוט אמצעים סבירים למניעת הטרדה מינית ולטפל בכל מקרה (</w:t>
       </w:r>
       <w:r>
         <w:rPr>
@@ -1025,7 +1067,25 @@
           <w:rtl/>
           <w:szCs w:val="24"/>
         </w:rPr>
-        <w:t xml:space="preserve">, מעסיק חייב לנקוט אמצעים סבירים כדי למנוע הטרדה מינית והתנכלות ולטפל בכל מקרה. Frame מעסיקה כ-70 עובדים, ולכן, לפי </w:t>
+        <w:t xml:space="preserve">). Frame מעסיקה כ-70 עובדים, ולכן עליה גם לפרסם תקנון מותאם ולמנות </w:t>
+      </w:r>
+      <w:r>
+        <w:rPr>
+          <w:b/>
+          <w:sz w:val="24"/>
+          <w:rtl/>
+          <w:szCs w:val="24"/>
+          <w:bCs/>
+        </w:rPr>
+        <w:t>אחראי</w:t>
+      </w:r>
+      <w:r>
+        <w:rPr>
+          <w:sz w:val="24"/>
+          <w:rtl/>
+          <w:szCs w:val="24"/>
+        </w:rPr>
+        <w:t xml:space="preserve"> לבירור תלונות (</w:t>
       </w:r>
       <w:r>
         <w:rPr>
@@ -1043,31 +1103,13 @@
           <w:rtl/>
           <w:szCs w:val="24"/>
         </w:rPr>
-        <w:t xml:space="preserve"> ולפי התקנות, עליה גם להתאים את התקנון לדוגמה ולפרסמו, ולמנות </w:t>
-      </w:r>
-      <w:r>
-        <w:rPr>
-          <w:b/>
-          <w:sz w:val="24"/>
-          <w:rtl/>
-          <w:szCs w:val="24"/>
-          <w:bCs/>
-        </w:rPr>
-        <w:t>אחראי</w:t>
-      </w:r>
-      <w:r>
-        <w:rPr>
-          <w:sz w:val="24"/>
-          <w:rtl/>
-          <w:szCs w:val="24"/>
-        </w:rPr>
-        <w:t xml:space="preserve"> לקבלת תלונות ולבירורן. נודע למעסיק על מקרה גם בלי תלונה, עליו להעבירו לבירור האחראי.</w:t>
+        <w:t>), ולהעביר לבירורו כל מקרה שנודע לה.</w:t>
       </w:r>
       <w:r>
         <w:rPr>
           <w:vertAlign w:val="superscript"/>
         </w:rPr>
-        <w:footnoteReference w:id="8"/>
+        <w:footnoteReference w:id="11"/>
       </w:r>
     </w:p>
     <w:p>
@@ -1134,7 +1176,7 @@
         <w:rPr>
           <w:vertAlign w:val="superscript"/>
         </w:rPr>
-        <w:footnoteReference w:id="9"/>
+        <w:footnoteReference w:id="12"/>
       </w:r>
       <w:r>
         <w:rPr>
@@ -1142,13 +1184,13 @@
           <w:rtl/>
           <w:szCs w:val="24"/>
         </w:rPr>
-        <w:t xml:space="preserve"> אם יוכרו יחסי מרות, גם השאלה הבודדת על נטייתו של אורי עשויה להספיק. העברתו לצוות טכני חודש אחרי שביקש לסיים את השיחות, והשפעתה של דנה על השיבוץ, מעוררות חשד לקשר כזה. משהוכיח זאת אורי, עובר למעסיק הנטל להראות שלא פגע בו,</w:t>
+        <w:t xml:space="preserve"> אם יוכרו יחסי מרות, גם השאלה הבודדת על נטייתו של אורי עשויה להספיק, והתנכלות אפשרית גם כשהמוטרד שיתף פעולה ולא סירב.</w:t>
       </w:r>
       <w:r>
         <w:rPr>
           <w:vertAlign w:val="superscript"/>
         </w:rPr>
-        <w:footnoteReference w:id="10"/>
+        <w:footnoteReference w:id="13"/>
       </w:r>
       <w:r>
         <w:rPr>
@@ -1156,7 +1198,13 @@
           <w:rtl/>
           <w:szCs w:val="24"/>
         </w:rPr>
-        <w:t xml:space="preserve"> אף שהעובדות אינן מראות שדנה הייתה מעורבת בהחלטה.</w:t>
+        <w:t xml:space="preserve"> העברתו חודש אחרי שביקש לסיים את השיחות, והשפעתה של דנה על השיבוץ, מעוררות חשד לקשר כזה. משהוכיח זאת אורי, עובר למעסיק הנטל להראות שלא פגע בו.</w:t>
+      </w:r>
+      <w:r>
+        <w:rPr>
+          <w:vertAlign w:val="superscript"/>
+        </w:rPr>
+        <w:footnoteReference w:id="14"/>
       </w:r>
     </w:p>
     <w:p>
@@ -1188,7 +1236,7 @@
           <w:rtl/>
           <w:szCs w:val="24"/>
         </w:rPr>
-        <w:t xml:space="preserve">למעסיק </w:t>
+        <w:t>שינוי חד-צדדי שחורג מה</w:t>
       </w:r>
       <w:r>
         <w:rPr>
@@ -1198,7 +1246,7 @@
           <w:szCs w:val="24"/>
           <w:bCs/>
         </w:rPr>
-        <w:t>פררוגטיבה ניהולית</w:t>
+        <w:t>פררוגטיבה הניהולית</w:t>
       </w:r>
       <w:r>
         <w:rPr>
@@ -1206,7 +1254,7 @@
           <w:rtl/>
           <w:szCs w:val="24"/>
         </w:rPr>
-        <w:t xml:space="preserve"> לשנות באופן חד-צדדי נהלי עבודה. שינוי שחורג ממנה ופוגע בהכנסת העובד או ב</w:t>
+        <w:t xml:space="preserve"> ופוגע ב</w:t>
       </w:r>
       <w:r>
         <w:rPr>
@@ -1216,7 +1264,7 @@
           <w:szCs w:val="24"/>
           <w:bCs/>
         </w:rPr>
-        <w:t>מעמדו בארגון</w:t>
+        <w:t>מעמד העובד</w:t>
       </w:r>
       <w:r>
         <w:rPr>
@@ -1248,7 +1296,7 @@
         <w:rPr>
           <w:vertAlign w:val="superscript"/>
         </w:rPr>
-        <w:footnoteReference w:id="11"/>
+        <w:footnoteReference w:id="15"/>
       </w:r>
       <w:r>
         <w:rPr>
@@ -1256,13 +1304,13 @@
           <w:rtl/>
           <w:szCs w:val="24"/>
         </w:rPr>
-        <w:t xml:space="preserve"> העברתו של אורי לעריכה טכנית, בלי ישיבות קריאטיב, היא פגיעה במעמד אף ששכרו לא השתנה. שינוי ב"תיאור עיקרי התפקיד" מחייב גם הודעה בכתב לעובד בתוך 30 יום, ובהיעדרה עובר למעסיק נטל ההוכחה בעניין השנוי במחלוקת.</w:t>
+        <w:t xml:space="preserve"> העברתו של אורי לעריכה טכנית, בלי ישיבות קריאטיב, היא פגיעה במעמד אף ששכרו לא השתנה. שינוי ב"תיאור עיקרי התפקיד" מחייב הודעה בכתב בתוך 30 יום, ובהיעדרה הנטל עובר למעסיק.</w:t>
       </w:r>
       <w:r>
         <w:rPr>
           <w:vertAlign w:val="superscript"/>
         </w:rPr>
-        <w:footnoteReference w:id="12"/>
+        <w:footnoteReference w:id="16"/>
       </w:r>
     </w:p>
     <w:p>
@@ -1319,7 +1367,7 @@
         <w:rPr>
           <w:vertAlign w:val="superscript"/>
         </w:rPr>
-        <w:footnoteReference w:id="13"/>
+        <w:footnoteReference w:id="17"/>
       </w:r>
       <w:r>
         <w:rPr>
@@ -1333,7 +1381,7 @@
         <w:rPr>
           <w:vertAlign w:val="superscript"/>
         </w:rPr>
-        <w:footnoteReference w:id="14"/>
+        <w:footnoteReference w:id="18"/>
       </w:r>
       <w:r>
         <w:rPr>
@@ -1444,7 +1492,7 @@
         <w:rPr>
           <w:vertAlign w:val="superscript"/>
         </w:rPr>
-        <w:footnoteReference w:id="15"/>
+        <w:footnoteReference w:id="19"/>
       </w:r>
       <w:r>
         <w:rPr>
@@ -1467,7 +1515,7 @@
           <w:rtl/>
           <w:szCs w:val="24"/>
         </w:rPr>
-        <w:t>אורי לא מחה, לא ביקש לחזור לתפקידו, לא התריע על כוונתו להתפטר ועבד ארבעה חודשים במתכונת החדשה. אף שהתקופה קצרה מזו שבעניין גולן, השתיקה מלמדת על השלמה. גם "נסיבות אחרות" אינן מסייעות לו, שכן השיחות הסתיימו חודשים לפני ההתפטרות.</w:t>
+        <w:t>אורי לא מחה, לא התריע על כוונתו להתפטר ועבד ארבעה חודשים במתכונת החדשה. אף שהתקופה קצרה מזו שבעניין גולן, השתיקה מלמדת על השלמה.</w:t>
       </w:r>
     </w:p>
     <w:p>
@@ -1499,7 +1547,7 @@
           <w:rtl/>
           <w:szCs w:val="24"/>
         </w:rPr>
-        <w:t>טענת ההטרדה המינית חלשה: גם אם יוכרו יחסי מרות לפי הלכת מדר, קשה להראות התייחסויות חוזרות למיניותו של אורי. טענת ההתנכלות חזקה יותר, בשל סעיפים 7 ו-9 לחוק שוויון ההזדמנויות. טענת ההתפטרות בדין מפוטר נכשלת בשל היעדר התראה והשיהוי (הלכת גולן).</w:t>
+        <w:t>טענת ההטרדה המינית חלשה, כי קשה להראות התייחסויות חוזרות למיניותו של אורי. טענת ההתנכלות חזקה יותר, בשל סעיפים 7 ו-9 לחוק שוויון ההזדמנויות. טענת ההתפטרות בדין מפוטר נכשלת בשל היעדר התראה והשיהוי (הלכת גולן).</w:t>
       </w:r>
     </w:p>
     <w:p>
@@ -1748,6 +1796,36 @@
           <w:rtl/>
           <w:szCs w:val="24"/>
         </w:rPr>
+        <w:t>עצמון ליפשיץ "האם הגיעה העת לשנות את כללי ההתארגנות הראשונית? מחשבות נוספות בראי הזמן" מעשי משפט יא 303 (2020).</w:t>
+      </w:r>
+    </w:p>
+    <w:p>
+      <w:pPr>
+        <w:bidi/>
+        <w:spacing w:before="0" w:after="0"/>
+        <w:jc w:val="both"/>
+      </w:pPr>
+      <w:r>
+        <w:rPr>
+          <w:sz w:val="24"/>
+          <w:rtl/>
+          <w:szCs w:val="24"/>
+        </w:rPr>
+        <w:t>Orit Kamir, __Sexual Harassment Law in Israel__, 7 INT'L J. DISCRIMINATION &amp; L. 315 (2005).</w:t>
+      </w:r>
+    </w:p>
+    <w:p>
+      <w:pPr>
+        <w:bidi/>
+        <w:spacing w:before="0" w:after="0"/>
+        <w:jc w:val="both"/>
+      </w:pPr>
+      <w:r>
+        <w:rPr>
+          <w:sz w:val="24"/>
+          <w:rtl/>
+          <w:szCs w:val="24"/>
+        </w:rPr>
         <w:t>רות בן-ישראל דיני עבודה כרך א 48-32 (2002).</w:t>
       </w:r>
     </w:p>
@@ -1855,7 +1933,7 @@
           <w:sz w:val="20"/>
           <w:szCs w:val="20"/>
         </w:rPr>
-        <w:t xml:space="preserve">רות בן-ישראל דיני עבודה כרך א 48-32 (2002); גליה הילדסהימר "התארגנויות עובדים" מצגת הקורס היבטים משפטיים ואתיים בייעוץ ופיתוח ארגוני, המרכז האקדמי פרס (2026).</w:t>
+        <w:t xml:space="preserve">רות בן-ישראל דיני עבודה כרך א 48-32 (2002); עצמון ליפשיץ "האם הגיעה העת לשנות את כללי ההתארגנות הראשונית? מחשבות נוספות בראי הזמן" מעשי משפט יא 303, 308 (2020); גליה הילדסהימר "התארגנויות עובדים" מצגת הקורס היבטים משפטיים ואתיים בייעוץ ופיתוח ארגוני, המרכז האקדמי פרס (2026).</w:t>
       </w:r>
     </w:p>
   </w:footnote>
@@ -2005,7 +2083,7 @@
           <w:sz w:val="20"/>
           <w:szCs w:val="20"/>
         </w:rPr>
-        <w:t xml:space="preserve">ס' 1 לחוק למניעת הטרדה מינית, התשנ"ח–1998 (להלן: החוק למניעת הטרדה מינית); גליה הילדסהימר "החוק למניעת הטרדה מינית, חלקים א'-ב'" מצגת הקורס היבטים משפטיים ואתיים בייעוץ ופיתוח ארגוני, המרכז האקדמי פרס (2026).</w:t>
+        <w:t xml:space="preserve">בג"ץ 4179/13 לשכת התיאום של הארגונים הכלכליים נ' בית הדין הארצי לעבודה (נבו 7.7.2014); ליפשיץ, לעיל ה"ש 1, בעמ' 320.</w:t>
       </w:r>
     </w:p>
   </w:footnote>
@@ -2035,7 +2113,7 @@
           <w:sz w:val="20"/>
           <w:szCs w:val="20"/>
         </w:rPr>
-        <w:t xml:space="preserve">עש"ם 2203/05 מדר נ' נציבות שירות המדינה (נבו 21.7.2005) (להלן: עניין מדר).</w:t>
+        <w:t xml:space="preserve">ס' 1 לחוק למניעת הטרדה מינית, התשנ"ח–1998 (להלן: החוק למניעת הטרדה מינית); גליה הילדסהימר "החוק למניעת הטרדה מינית, חלקים א'-ב'" מצגת הקורס היבטים משפטיים ואתיים בייעוץ ופיתוח ארגוני, המרכז האקדמי פרס (2026).</w:t>
       </w:r>
     </w:p>
   </w:footnote>
@@ -2065,7 +2143,24 @@
           <w:sz w:val="20"/>
           <w:szCs w:val="20"/>
         </w:rPr>
-        <w:t xml:space="preserve">תק' 2(ג), 4, 6(ט) ו-8 לתקנות למניעת הטרדה מינית (חובות מעסיק), התשנ"ח–1998.</w:t>
+        <w:t xml:space="preserve">Orit Kamir, </w:t>
+      </w:r>
+      <w:r>
+        <w:rPr>
+          <w:i/>
+          <w:iCs/>
+          <w:sz w:val="20"/>
+          <w:szCs w:val="20"/>
+        </w:rPr>
+        <w:t xml:space="preserve">Sexual Harassment Law in Israel</w:t>
+      </w:r>
+      <w:r>
+        <w:rPr>
+          <w:rtl/>
+          <w:sz w:val="20"/>
+          <w:szCs w:val="20"/>
+        </w:rPr>
+        <w:t xml:space="preserve">, 7 INT'L J. DISCRIMINATION &amp; L. 315, 321 (2005).</w:t>
       </w:r>
     </w:p>
   </w:footnote>
@@ -2095,7 +2190,7 @@
           <w:sz w:val="20"/>
           <w:szCs w:val="20"/>
         </w:rPr>
-        <w:t xml:space="preserve">ס' 7(א) לחוק שוויון ההזדמנויות בעבודה, התשמ"ח–1988.</w:t>
+        <w:t xml:space="preserve">עש"ם 2203/05 מדר נ' נציבות שירות המדינה (נבו 21.7.2005) (להלן: עניין מדר).</w:t>
       </w:r>
     </w:p>
   </w:footnote>
@@ -2125,7 +2220,7 @@
           <w:sz w:val="20"/>
           <w:szCs w:val="20"/>
         </w:rPr>
-        <w:t xml:space="preserve">ס' 9(ב) לחוק שוויון ההזדמנויות בעבודה; ס' 6א לחוק למניעת הטרדה מינית.</w:t>
+        <w:t xml:space="preserve">Kamir, לעיל ה"ש 8, בעמ' 324.</w:t>
       </w:r>
     </w:p>
   </w:footnote>
@@ -2155,7 +2250,7 @@
           <w:sz w:val="20"/>
           <w:szCs w:val="20"/>
         </w:rPr>
-        <w:t xml:space="preserve">גליה הילדסהימר "חוזה עבודה אישי ומניעת הרעת תנאים, חלקים א'-ב'" מצגת הקורס היבטים משפטיים ואתיים בייעוץ ופיתוח ארגוני, המרכז האקדמי פרס (2026).</w:t>
+        <w:t xml:space="preserve">תק' 2(ג), 4, 6(ט) ו-8 לתקנות למניעת הטרדה מינית (חובות מעסיק), התשנ"ח–1998.</w:t>
       </w:r>
     </w:p>
   </w:footnote>
@@ -2185,7 +2280,7 @@
           <w:sz w:val="20"/>
           <w:szCs w:val="20"/>
         </w:rPr>
-        <w:t xml:space="preserve">ס' 2(א)(3), 3 ו-5א לחוק הודעה לעובד ולמועמד לעבודה (תנאי עבודה והליכי מיון וקבלה לעבודה), התשס"ב–2002.</w:t>
+        <w:t xml:space="preserve">ס' 7(א) לחוק שוויון ההזדמנויות בעבודה, התשמ"ח–1988.</w:t>
       </w:r>
     </w:p>
   </w:footnote>
@@ -2215,7 +2310,7 @@
           <w:sz w:val="20"/>
           <w:szCs w:val="20"/>
         </w:rPr>
-        <w:t xml:space="preserve">ס' 11(א) לחוק פיצויי פיטורים, התשכ"ג–1963.</w:t>
+        <w:t xml:space="preserve">Kamir, לעיל ה"ש 8, בעמ' 324.</w:t>
       </w:r>
     </w:p>
   </w:footnote>
@@ -2245,11 +2340,131 @@
           <w:sz w:val="20"/>
           <w:szCs w:val="20"/>
         </w:rPr>
+        <w:t xml:space="preserve">ס' 9(ב) לחוק שוויון ההזדמנויות בעבודה; ס' 6א לחוק למניעת הטרדה מינית.</w:t>
+      </w:r>
+    </w:p>
+  </w:footnote>
+  <w:footnote w:id="15">
+    <w:p>
+      <w:pPr>
+        <w:bidi/>
+        <w:spacing w:before="0" w:after="0" w:line="240" w:lineRule="auto"/>
+        <w:jc w:val="both"/>
+      </w:pPr>
+      <w:r>
+        <w:rPr>
+          <w:vertAlign w:val="superscript"/>
+          <w:sz w:val="20"/>
+        </w:rPr>
+        <w:footnoteRef/>
+      </w:r>
+      <w:r>
+        <w:rPr>
+          <w:sz w:val="20"/>
+        </w:rPr>
+        <w:t xml:space="preserve"> </w:t>
+      </w:r>
+      <w:r>
+        <w:rPr>
+          <w:rtl/>
+          <w:sz w:val="20"/>
+          <w:szCs w:val="20"/>
+        </w:rPr>
+        <w:t xml:space="preserve">גליה הילדסהימר "חוזה עבודה אישי ומניעת הרעת תנאים, חלקים א'-ב'" מצגת הקורס היבטים משפטיים ואתיים בייעוץ ופיתוח ארגוני, המרכז האקדמי פרס (2026).</w:t>
+      </w:r>
+    </w:p>
+  </w:footnote>
+  <w:footnote w:id="16">
+    <w:p>
+      <w:pPr>
+        <w:bidi/>
+        <w:spacing w:before="0" w:after="0" w:line="240" w:lineRule="auto"/>
+        <w:jc w:val="both"/>
+      </w:pPr>
+      <w:r>
+        <w:rPr>
+          <w:vertAlign w:val="superscript"/>
+          <w:sz w:val="20"/>
+        </w:rPr>
+        <w:footnoteRef/>
+      </w:r>
+      <w:r>
+        <w:rPr>
+          <w:sz w:val="20"/>
+        </w:rPr>
+        <w:t xml:space="preserve"> </w:t>
+      </w:r>
+      <w:r>
+        <w:rPr>
+          <w:rtl/>
+          <w:sz w:val="20"/>
+          <w:szCs w:val="20"/>
+        </w:rPr>
+        <w:t xml:space="preserve">ס' 2(א)(3), 3 ו-5א לחוק הודעה לעובד ולמועמד לעבודה (תנאי עבודה והליכי מיון וקבלה לעבודה), התשס"ב–2002.</w:t>
+      </w:r>
+    </w:p>
+  </w:footnote>
+  <w:footnote w:id="17">
+    <w:p>
+      <w:pPr>
+        <w:bidi/>
+        <w:spacing w:before="0" w:after="0" w:line="240" w:lineRule="auto"/>
+        <w:jc w:val="both"/>
+      </w:pPr>
+      <w:r>
+        <w:rPr>
+          <w:vertAlign w:val="superscript"/>
+          <w:sz w:val="20"/>
+        </w:rPr>
+        <w:footnoteRef/>
+      </w:r>
+      <w:r>
+        <w:rPr>
+          <w:sz w:val="20"/>
+        </w:rPr>
+        <w:t xml:space="preserve"> </w:t>
+      </w:r>
+      <w:r>
+        <w:rPr>
+          <w:rtl/>
+          <w:sz w:val="20"/>
+          <w:szCs w:val="20"/>
+        </w:rPr>
+        <w:t xml:space="preserve">ס' 11(א) לחוק פיצויי פיטורים, התשכ"ג–1963.</w:t>
+      </w:r>
+    </w:p>
+  </w:footnote>
+  <w:footnote w:id="18">
+    <w:p>
+      <w:pPr>
+        <w:bidi/>
+        <w:spacing w:before="0" w:after="0" w:line="240" w:lineRule="auto"/>
+        <w:jc w:val="both"/>
+      </w:pPr>
+      <w:r>
+        <w:rPr>
+          <w:vertAlign w:val="superscript"/>
+          <w:sz w:val="20"/>
+        </w:rPr>
+        <w:footnoteRef/>
+      </w:r>
+      <w:r>
+        <w:rPr>
+          <w:sz w:val="20"/>
+        </w:rPr>
+        <w:t xml:space="preserve"> </w:t>
+      </w:r>
+      <w:r>
+        <w:rPr>
+          <w:rtl/>
+          <w:sz w:val="20"/>
+          <w:szCs w:val="20"/>
+        </w:rPr>
         <w:t xml:space="preserve">ס' 1(א), שם.</w:t>
       </w:r>
     </w:p>
   </w:footnote>
-  <w:footnote w:id="15">
+  <w:footnote w:id="19">
     <w:p>
       <w:pPr>
         <w:bidi/>

</xml_diff>

<commit_message>
Add Milfelder holding and Davidov on role transfers to Part B
Co-Authored-By: Claude Opus 5.5 <noreply@anthropic.com>
Claude-Session: https://claude.ai/code/session_01BVH1n3fvCDz4inkznfhZC9
</commit_message>
<xml_diff>
--- a/output/עבודה_היבטים_משפטיים.docx
+++ b/output/עבודה_היבטים_משפטיים.docx
@@ -848,7 +848,7 @@
           <w:rtl/>
           <w:szCs w:val="24"/>
         </w:rPr>
-        <w:t xml:space="preserve"> בהן. הצעות חוזרות (סעיף 3(א)(3)) או התייחסות מבזה (סעיף 3(א)(5)) לא היו.</w:t>
+        <w:t xml:space="preserve"> בהן.</w:t>
       </w:r>
     </w:p>
     <w:p>
@@ -863,7 +863,7 @@
           <w:rtl/>
           <w:szCs w:val="24"/>
         </w:rPr>
-        <w:t>השיחות התקיימו במשרד, ולכן ב"מסגרת יחסי עבודה". "הראה" פירושו במילים או בהתנהגות שאין ספק סביר לגבי משמעותה (הגדרות שבסעיף 2 לחוק), שכן התייחסויות כאלה כשלעצמן הן התנהגות ניטרלית, ההופכת להטרדה רק כשאינה רצויה.</w:t>
+        <w:t>"הראה" פירושו במילים או בהתנהגות שאין ספק סביר לגבי משמעותה (הגדרות שבסעיף 2 לחוק), שכן התייחסויות כאלה כשלעצמן הן התנהגות ניטרלית, ההופכת להטרדה רק כשאינה רצויה.</w:t>
       </w:r>
       <w:r>
         <w:rPr>
@@ -952,7 +952,7 @@
           <w:rtl/>
           <w:szCs w:val="24"/>
         </w:rPr>
-        <w:t xml:space="preserve"> נקבע שיחסי מרות התקיימו אף שהמטריד לא היה הממונה הישיר, ושבקשה עמומה להפסיק אינה שוללת את ההטרדה. לדנה אין סמכות לקבל או לפטר, אך היא משתתפת בהחלטות השיבוץ ומשפיעה על קידום עובדים צעירים כמו אורי. לפי הלכת מדר אלה יחסי מרות. חלופה זו מכירה בחולשת הכפוף, העלולה לשלול ממנו רצון חופשי, ומטילה על בעל המרות לזהות בעצמו התנהגות שעלולה להיתפס כמטרידה.</w:t>
+        <w:t xml:space="preserve"> נקבע שיחסי מרות התקיימו אף שהמטריד לא היה הממונה הישיר, ושבקשה עמומה להפסיק אינה שוללת את ההטרדה. לדנה אין סמכות לקבל או לפטר, אך היא משפיעה על שיבוץ וקידום עובדים צעירים כמו אורי. לפי הלכת מדר אלה יחסי מרות. חלופה זו מכירה בחולשת הכפוף, העלולה לשלול ממנו רצון חופשי, ומטילה על בעל המרות לזהות בעצמו התנהגות שעלולה להיתפס כמטרידה.</w:t>
       </w:r>
       <w:r>
         <w:rPr>
@@ -966,7 +966,7 @@
           <w:rtl/>
           <w:szCs w:val="24"/>
         </w:rPr>
-        <w:t xml:space="preserve"> מכאן שהשתתפותו של אורי בשיחות אינה מעידה בהכרח על הסכמה.</w:t>
+        <w:t xml:space="preserve"> לכן השתתפותו של אורי אינה מעידה בהכרח על הסכמה.</w:t>
       </w:r>
     </w:p>
     <w:p>
@@ -1103,7 +1103,7 @@
           <w:rtl/>
           <w:szCs w:val="24"/>
         </w:rPr>
-        <w:t>), ולהעביר לבירורו כל מקרה שנודע לה.</w:t>
+        <w:t>).</w:t>
       </w:r>
       <w:r>
         <w:rPr>
@@ -1236,7 +1236,39 @@
           <w:rtl/>
           <w:szCs w:val="24"/>
         </w:rPr>
-        <w:t>שינוי חד-צדדי שחורג מה</w:t>
+        <w:t xml:space="preserve">לפי </w:t>
+      </w:r>
+      <w:r>
+        <w:rPr>
+          <w:b/>
+          <w:sz w:val="24"/>
+          <w:rtl/>
+          <w:szCs w:val="24"/>
+          <w:bCs/>
+        </w:rPr>
+        <w:t>הלכת מילפלדר</w:t>
+      </w:r>
+      <w:r>
+        <w:rPr>
+          <w:sz w:val="24"/>
+          <w:rtl/>
+          <w:szCs w:val="24"/>
+        </w:rPr>
+        <w:t xml:space="preserve"> מעסיק אינו רשאי לשנות את חוזה העבודה באופן חד-צדדי,</w:t>
+      </w:r>
+      <w:r>
+        <w:rPr>
+          <w:vertAlign w:val="superscript"/>
+        </w:rPr>
+        <w:footnoteReference w:id="15"/>
+      </w:r>
+      <w:r>
+        <w:rPr>
+          <w:sz w:val="24"/>
+          <w:rtl/>
+          <w:szCs w:val="24"/>
+        </w:rPr>
+        <w:t xml:space="preserve"> ושינוי שחורג מה</w:t>
       </w:r>
       <w:r>
         <w:rPr>
@@ -1290,13 +1322,13 @@
           <w:rtl/>
           <w:szCs w:val="24"/>
         </w:rPr>
-        <w:t xml:space="preserve"> והפרה של חוזה העבודה.</w:t>
+        <w:t>.</w:t>
       </w:r>
       <w:r>
         <w:rPr>
           <w:vertAlign w:val="superscript"/>
         </w:rPr>
-        <w:footnoteReference w:id="15"/>
+        <w:footnoteReference w:id="16"/>
       </w:r>
       <w:r>
         <w:rPr>
@@ -1304,13 +1336,27 @@
           <w:rtl/>
           <w:szCs w:val="24"/>
         </w:rPr>
-        <w:t xml:space="preserve"> העברתו של אורי לעריכה טכנית, בלי ישיבות קריאטיב, היא פגיעה במעמד אף ששכרו לא השתנה. שינוי ב"תיאור עיקרי התפקיד" מחייב הודעה בכתב בתוך 30 יום, ובהיעדרה הנטל עובר למעסיק.</w:t>
+        <w:t xml:space="preserve"> עם זאת, העברה מתפקיד לתפקיד נחשבת בדרך כלל לחלק מהפררוגטיבה, בכפוף לחובת תום הלב.</w:t>
       </w:r>
       <w:r>
         <w:rPr>
           <w:vertAlign w:val="superscript"/>
         </w:rPr>
-        <w:footnoteReference w:id="16"/>
+        <w:footnoteReference w:id="17"/>
+      </w:r>
+      <w:r>
+        <w:rPr>
+          <w:sz w:val="24"/>
+          <w:rtl/>
+          <w:szCs w:val="24"/>
+        </w:rPr>
+        <w:t xml:space="preserve"> העברתו של אורי פגעה במעמדו אף ששכרו לא השתנה, ותזמונה, סמוך לסיום השיחות, מעורר ספק אם נעשתה בתום לב. שינוי ב"תיאור עיקרי התפקיד" מחייב הודעה בכתב בתוך 30 יום, ובהיעדרה הנטל עובר למעסיק.</w:t>
+      </w:r>
+      <w:r>
+        <w:rPr>
+          <w:vertAlign w:val="superscript"/>
+        </w:rPr>
+        <w:footnoteReference w:id="18"/>
       </w:r>
     </w:p>
     <w:p>
@@ -1367,7 +1413,7 @@
         <w:rPr>
           <w:vertAlign w:val="superscript"/>
         </w:rPr>
-        <w:footnoteReference w:id="17"/>
+        <w:footnoteReference w:id="19"/>
       </w:r>
       <w:r>
         <w:rPr>
@@ -1381,7 +1427,7 @@
         <w:rPr>
           <w:vertAlign w:val="superscript"/>
         </w:rPr>
-        <w:footnoteReference w:id="18"/>
+        <w:footnoteReference w:id="20"/>
       </w:r>
       <w:r>
         <w:rPr>
@@ -1492,7 +1538,7 @@
         <w:rPr>
           <w:vertAlign w:val="superscript"/>
         </w:rPr>
-        <w:footnoteReference w:id="19"/>
+        <w:footnoteReference w:id="21"/>
       </w:r>
       <w:r>
         <w:rPr>
@@ -1515,7 +1561,7 @@
           <w:rtl/>
           <w:szCs w:val="24"/>
         </w:rPr>
-        <w:t>אורי לא מחה, לא התריע על כוונתו להתפטר ועבד ארבעה חודשים במתכונת החדשה. אף שהתקופה קצרה מזו שבעניין גולן, השתיקה מלמדת על השלמה.</w:t>
+        <w:t>אורי לא מחה, לא התריע על כוונתו להתפטר ועבד ארבעה חודשים במתכונת החדשה. השתיקה מלמדת על השלמה, גם אם התקופה קצרה מזו שבעניין גולן.</w:t>
       </w:r>
     </w:p>
     <w:p>
@@ -1547,7 +1593,7 @@
           <w:rtl/>
           <w:szCs w:val="24"/>
         </w:rPr>
-        <w:t>טענת ההטרדה המינית חלשה, כי קשה להראות התייחסויות חוזרות למיניותו של אורי. טענת ההתנכלות חזקה יותר, בשל סעיפים 7 ו-9 לחוק שוויון ההזדמנויות. טענת ההתפטרות בדין מפוטר נכשלת בשל היעדר התראה והשיהוי (הלכת גולן).</w:t>
+        <w:t>טענת ההטרדה המינית חלשה, כי קשה להראות התייחסויות חוזרות למיניותו של אורי. טענת ההתנכלות חזקה יותר. טענת ההתפטרות בדין מפוטר נכשלת בשל היעדר התראה והשיהוי (הלכת גולן).</w:t>
       </w:r>
     </w:p>
     <w:p>
@@ -1704,6 +1750,21 @@
           <w:rtl/>
           <w:szCs w:val="24"/>
         </w:rPr>
+        <w:t>בג"ץ 239/83 מילפלדר נ' בית הדין הארצי לעבודה, פ"ד מא(2) 210 (1987).</w:t>
+      </w:r>
+    </w:p>
+    <w:p>
+      <w:pPr>
+        <w:bidi/>
+        <w:spacing w:before="0" w:after="0"/>
+        <w:jc w:val="both"/>
+      </w:pPr>
+      <w:r>
+        <w:rPr>
+          <w:sz w:val="24"/>
+          <w:rtl/>
+          <w:szCs w:val="24"/>
+        </w:rPr>
         <w:t>בג"ץ 7029/95 הסתדרות העובדים הכללית החדשה נ' בית הדין הארצי לעבודה, פ"ד נא(2) 63 (1997).</w:t>
       </w:r>
     </w:p>
@@ -1782,6 +1843,21 @@
           <w:bCs/>
         </w:rPr>
         <w:t>ספרות וחומרי הקורס</w:t>
+      </w:r>
+    </w:p>
+    <w:p>
+      <w:pPr>
+        <w:bidi/>
+        <w:spacing w:before="0" w:after="0"/>
+        <w:jc w:val="both"/>
+      </w:pPr>
+      <w:r>
+        <w:rPr>
+          <w:sz w:val="24"/>
+          <w:rtl/>
+          <w:szCs w:val="24"/>
+        </w:rPr>
+        <w:t>גיא דוידוב "הפררוגטיבה של המעביד ודיני החוזים: בעקבות פרשות נהרי וגרינשפן" משפטים לח(2) 417 (2008).</w:t>
       </w:r>
     </w:p>
     <w:p>
@@ -2370,7 +2446,7 @@
           <w:sz w:val="20"/>
           <w:szCs w:val="20"/>
         </w:rPr>
-        <w:t xml:space="preserve">גליה הילדסהימר "חוזה עבודה אישי ומניעת הרעת תנאים, חלקים א'-ב'" מצגת הקורס היבטים משפטיים ואתיים בייעוץ ופיתוח ארגוני, המרכז האקדמי פרס (2026).</w:t>
+        <w:t xml:space="preserve">בג"ץ 239/83 מילפלדר נ' בית הדין הארצי לעבודה, פ"ד מא(2) 210 (1987).</w:t>
       </w:r>
     </w:p>
   </w:footnote>
@@ -2400,7 +2476,7 @@
           <w:sz w:val="20"/>
           <w:szCs w:val="20"/>
         </w:rPr>
-        <w:t xml:space="preserve">ס' 2(א)(3), 3 ו-5א לחוק הודעה לעובד ולמועמד לעבודה (תנאי עבודה והליכי מיון וקבלה לעבודה), התשס"ב–2002.</w:t>
+        <w:t xml:space="preserve">גליה הילדסהימר "חוזה עבודה אישי ומניעת הרעת תנאים, חלקים א'-ב'" מצגת הקורס היבטים משפטיים ואתיים בייעוץ ופיתוח ארגוני, המרכז האקדמי פרס (2026).</w:t>
       </w:r>
     </w:p>
   </w:footnote>
@@ -2430,7 +2506,7 @@
           <w:sz w:val="20"/>
           <w:szCs w:val="20"/>
         </w:rPr>
-        <w:t xml:space="preserve">ס' 11(א) לחוק פיצויי פיטורים, התשכ"ג–1963.</w:t>
+        <w:t xml:space="preserve">גיא דוידוב "הפררוגטיבה של המעביד ודיני החוזים: בעקבות פרשות נהרי וגרינשפן" משפטים לח(2) 417, 418 ו-439 (2008).</w:t>
       </w:r>
     </w:p>
   </w:footnote>
@@ -2460,11 +2536,71 @@
           <w:sz w:val="20"/>
           <w:szCs w:val="20"/>
         </w:rPr>
+        <w:t xml:space="preserve">ס' 2(א)(3), 3 ו-5א לחוק הודעה לעובד ולמועמד לעבודה (תנאי עבודה והליכי מיון וקבלה לעבודה), התשס"ב–2002.</w:t>
+      </w:r>
+    </w:p>
+  </w:footnote>
+  <w:footnote w:id="19">
+    <w:p>
+      <w:pPr>
+        <w:bidi/>
+        <w:spacing w:before="0" w:after="0" w:line="240" w:lineRule="auto"/>
+        <w:jc w:val="both"/>
+      </w:pPr>
+      <w:r>
+        <w:rPr>
+          <w:vertAlign w:val="superscript"/>
+          <w:sz w:val="20"/>
+        </w:rPr>
+        <w:footnoteRef/>
+      </w:r>
+      <w:r>
+        <w:rPr>
+          <w:sz w:val="20"/>
+        </w:rPr>
+        <w:t xml:space="preserve"> </w:t>
+      </w:r>
+      <w:r>
+        <w:rPr>
+          <w:rtl/>
+          <w:sz w:val="20"/>
+          <w:szCs w:val="20"/>
+        </w:rPr>
+        <w:t xml:space="preserve">ס' 11(א) לחוק פיצויי פיטורים, התשכ"ג–1963.</w:t>
+      </w:r>
+    </w:p>
+  </w:footnote>
+  <w:footnote w:id="20">
+    <w:p>
+      <w:pPr>
+        <w:bidi/>
+        <w:spacing w:before="0" w:after="0" w:line="240" w:lineRule="auto"/>
+        <w:jc w:val="both"/>
+      </w:pPr>
+      <w:r>
+        <w:rPr>
+          <w:vertAlign w:val="superscript"/>
+          <w:sz w:val="20"/>
+        </w:rPr>
+        <w:footnoteRef/>
+      </w:r>
+      <w:r>
+        <w:rPr>
+          <w:sz w:val="20"/>
+        </w:rPr>
+        <w:t xml:space="preserve"> </w:t>
+      </w:r>
+      <w:r>
+        <w:rPr>
+          <w:rtl/>
+          <w:sz w:val="20"/>
+          <w:szCs w:val="20"/>
+        </w:rPr>
         <w:t xml:space="preserve">ס' 1(א), שם.</w:t>
       </w:r>
     </w:p>
   </w:footnote>
-  <w:footnote w:id="19">
+  <w:footnote w:id="21">
     <w:p>
       <w:pPr>
         <w:bidi/>

</xml_diff>

<commit_message>
Cite Dor Alon ruling in Part A footnotes
Co-Authored-By: Claude Opus 5.5 <noreply@anthropic.com>
Claude-Session: https://claude.ai/code/session_01BVH1n3fvCDz4inkznfhZC9
</commit_message>
<xml_diff>
--- a/output/עבודה_היבטים_משפטיים.docx
+++ b/output/עבודה_היבטים_משפטיים.docx
@@ -1810,6 +1810,21 @@
           <w:rtl/>
           <w:szCs w:val="24"/>
         </w:rPr>
+        <w:t>עס"ק (ארצי) 7670-10-20 דור אלון ניהול מתחמים קמעונאיים בע"מ נ' הסתדרות העובדים הלאומית בישראל (12.1.2021).</w:t>
+      </w:r>
+    </w:p>
+    <w:p>
+      <w:pPr>
+        <w:bidi/>
+        <w:spacing w:before="0" w:after="0"/>
+        <w:jc w:val="both"/>
+      </w:pPr>
+      <w:r>
+        <w:rPr>
+          <w:sz w:val="24"/>
+          <w:rtl/>
+          <w:szCs w:val="24"/>
+        </w:rPr>
         <w:t>עש"ם 2203/05 מדר נ' נציבות שירות המדינה (נבו 21.7.2005).</w:t>
       </w:r>
     </w:p>
@@ -2009,7 +2024,7 @@
           <w:sz w:val="20"/>
           <w:szCs w:val="20"/>
         </w:rPr>
-        <w:t xml:space="preserve">רות בן-ישראל דיני עבודה כרך א 48-32 (2002); עצמון ליפשיץ "האם הגיעה העת לשנות את כללי ההתארגנות הראשונית? מחשבות נוספות בראי הזמן" מעשי משפט יא 303, 308 (2020); גליה הילדסהימר "התארגנויות עובדים" מצגת הקורס היבטים משפטיים ואתיים בייעוץ ופיתוח ארגוני, המרכז האקדמי פרס (2026).</w:t>
+        <w:t xml:space="preserve">רות בן-ישראל דיני עבודה כרך א 48-32 (2002); עצמון ליפשיץ "האם הגיעה העת לשנות את כללי ההתארגנות הראשונית? מחשבות נוספות בראי הזמן" מעשי משפט יא 303, 308 (2020); עס"ק (ארצי) 7670-10-20 דור אלון ניהול מתחמים קמעונאיים בע"מ נ' הסתדרות העובדים הלאומית בישראל, פס' 70 (12.1.2021) (להלן: עניין דור אלון); גליה הילדסהימר "התארגנויות עובדים" מצגת הקורס היבטים משפטיים ואתיים בייעוץ ופיתוח ארגוני, המרכז האקדמי פרס (2026).</w:t>
       </w:r>
     </w:p>
   </w:footnote>
@@ -2159,7 +2174,7 @@
           <w:sz w:val="20"/>
           <w:szCs w:val="20"/>
         </w:rPr>
-        <w:t xml:space="preserve">בג"ץ 4179/13 לשכת התיאום של הארגונים הכלכליים נ' בית הדין הארצי לעבודה (נבו 7.7.2014); ליפשיץ, לעיל ה"ש 1, בעמ' 320.</w:t>
+        <w:t xml:space="preserve">בג"ץ 4179/13 לשכת התיאום של הארגונים הכלכליים נ' בית הדין הארצי לעבודה (נבו 7.7.2014); ליפשיץ, לעיל ה"ש 1, בעמ' 320. על הרגישות המיוחדת של שלב הפריצה בשל החשש מהתערבות המעסיק ראו עניין דור אלון, לעיל ה"ש 1, פס' 71.</w:t>
       </w:r>
     </w:p>
   </w:footnote>

</xml_diff>

<commit_message>
Correct party names in Nokia citation
Co-Authored-By: Claude Opus 5.5 <noreply@anthropic.com>
Claude-Session: https://claude.ai/code/session_01BVH1n3fvCDz4inkznfhZC9
</commit_message>
<xml_diff>
--- a/output/עבודה_היבטים_משפטיים.docx
+++ b/output/עבודה_היבטים_משפטיים.docx
@@ -1780,7 +1780,7 @@
           <w:rtl/>
           <w:szCs w:val="24"/>
         </w:rPr>
-        <w:t>עס"ק (ארצי) 6298-03-25 הסתדרות העובדים הכללית החדשה נ' ארגון עובדי הפיתוח והשיווק בנוקיה (נבו 10.6.2025).</w:t>
+        <w:t>עס"ק (ארצי) 6298-03-25 הסתדרות העובדים הכללית החדשה – האגף להתאגדות עובדים נ' ארגון עובדי הפיתוח והשיווק בנוקיה ישראל (נבו 10.6.2025).</w:t>
       </w:r>
     </w:p>
     <w:p>
@@ -2114,7 +2114,7 @@
           <w:sz w:val="20"/>
           <w:szCs w:val="20"/>
         </w:rPr>
-        <w:t xml:space="preserve">עס"ק (ארצי) 6298-03-25 הסתדרות העובדים הכללית החדשה נ' ארגון עובדי הפיתוח והשיווק בנוקיה (נבו 10.6.2025) (להלן: עניין נוקיה).</w:t>
+        <w:t xml:space="preserve">עס"ק (ארצי) 6298-03-25 הסתדרות העובדים הכללית החדשה – האגף להתאגדות עובדים נ' ארגון עובדי הפיתוח והשיווק בנוקיה ישראל (נבו 10.6.2025) (להלן: עניין נוקיה).</w:t>
       </w:r>
     </w:p>
   </w:footnote>

</xml_diff>

<commit_message>
Rewrite Nokia paragraph with holdings quoted from the ruling
Co-Authored-By: Claude Opus 5.5 <noreply@anthropic.com>
Claude-Session: https://claude.ai/code/session_01BVH1n3fvCDz4inkznfhZC9
</commit_message>
<xml_diff>
--- a/output/עבודה_היבטים_משפטיים.docx
+++ b/output/עבודה_היבטים_משפטיים.docx
@@ -231,7 +231,7 @@
           <w:rtl/>
           <w:szCs w:val="24"/>
         </w:rPr>
-        <w:t xml:space="preserve">: מרבית החברים הם עובדים שכירים והחברות רצונית. </w:t>
+        <w:t xml:space="preserve">: החברים הם בעיקר עובדים שכירים והחברות רצונית. </w:t>
       </w:r>
       <w:r>
         <w:rPr>
@@ -267,7 +267,7 @@
           <w:rtl/>
           <w:szCs w:val="24"/>
         </w:rPr>
-        <w:t xml:space="preserve">: מטרתו המרכזית היא קידום זכויותיהם התעסוקתיות של העובדים מול המעסיק. </w:t>
+        <w:t xml:space="preserve">: קידום תנאי העבודה בדרך של משא ומתן קיבוצי. </w:t>
       </w:r>
       <w:r>
         <w:rPr>
@@ -285,7 +285,7 @@
           <w:rtl/>
           <w:szCs w:val="24"/>
         </w:rPr>
-        <w:t xml:space="preserve">: התארגנות יציבה המהווה </w:t>
+        <w:t xml:space="preserve">: ארגון של קבע, עצמאי, המהווה </w:t>
       </w:r>
       <w:r>
         <w:rPr>
@@ -335,15 +335,8 @@
           <w:rtl/>
           <w:szCs w:val="24"/>
         </w:rPr>
-        <w:t>מבחני החברות והתקנון מתקיימים: החברים הם עובדים שהצטרפו מרצונם, ולקבוצה תקנון. הקושי בשני המבחנים האחרים, שנבחנים לפי המהות ולא לפי הכותרות.</w:t>
+        <w:t xml:space="preserve">מבחני החברות והתקנון מתקיימים, והקושי בשני האחרים. </w:t>
       </w:r>
-    </w:p>
-    <w:p>
-      <w:pPr>
-        <w:bidi/>
-        <w:spacing w:before="0" w:after="0"/>
-        <w:jc w:val="both"/>
-      </w:pPr>
       <w:r>
         <w:rPr>
           <w:b/>
@@ -414,7 +407,7 @@
           <w:rtl/>
           <w:szCs w:val="24"/>
         </w:rPr>
-        <w:t>, הוראה בחוזה אישי שהיא לטובת העובד גוברת על ההסכם הקיבוצי, אלא אם ההסכם מונע זאת במפורש. הסכם קיבוצי קובע רצפה בלבד, ומטרה ד' משקפת התנגדות עקרונית לייצוג קיבוצי.</w:t>
+        <w:t>, הוראה בחוזה אישי שהיא לטובת העובד גוברת על ההסכם הקיבוצי, אלא אם ההסכם מונע זאת במפורש.</w:t>
       </w:r>
     </w:p>
     <w:p>
@@ -460,6 +453,14 @@
       </w:r>
       <w:r>
         <w:rPr>
+          <w:sz w:val="24"/>
+          <w:rtl/>
+          <w:szCs w:val="24"/>
+        </w:rPr>
+        <w:t xml:space="preserve"> בנוקיה הוקם ועד פנימי כחלופה להסתדרות, ותקנונו קבע כי לא יתערב בחוזים האישיים. בית הדין הארצי קבע כי משום שעיקר תנאי העבודה מעוגנים בחוזים האישיים, "מה שנותר לזירה הקיבוצית הוא 'הפריפריה' של תנאי העבודה", ולכן הגוף אינו ארגון עובדים. עוד נקבע כי אין להקל במבחנים גם בהתארגנות ראשונית, וכי גם התארגנות אותנטית של רוב העובדים "שכל תכליתה התנגדות ליחסי עבודה קיבוציים" אינה ארגון עובדים.</w:t>
+      </w:r>
+      <w:r>
+        <w:rPr>
           <w:vertAlign w:val="superscript"/>
         </w:rPr>
         <w:footnoteReference w:id="4"/>
@@ -470,7 +471,7 @@
           <w:rtl/>
           <w:szCs w:val="24"/>
         </w:rPr>
-        <w:t xml:space="preserve"> בית הדין הארצי יישם את מבחני עניין עמית על גוף שהקימו עובדי חברת טכנולוגיה כחלופה להסתדרות, ושמסמכי היסוד שלו הותירו את ענייני השכר והתגמול לחוזים האישיים. בית הדין קבע כי גוף כזה אינו עומד במבחן המטרה ואינו ארגון עובדים.</w:t>
+        <w:t xml:space="preserve"> מטרה ד' בתקנון הקבוצה כמעט זהה לתקנון שנפסל שם, ולכן אין נפקות לכך שעובדים רבים הצטרפו אליה.</w:t>
       </w:r>
     </w:p>
     <w:p>
@@ -559,7 +560,7 @@
           <w:rtl/>
           <w:szCs w:val="24"/>
         </w:rPr>
-        <w:t xml:space="preserve"> איזן בית הדין בין חופש הביטוי של המעסיק לבין חופש ההתארגנות של העובדים, והבחין בין שלב </w:t>
+        <w:t xml:space="preserve"> נקבע כי בשלב </w:t>
       </w:r>
       <w:r>
         <w:rPr>
@@ -577,7 +578,7 @@
           <w:rtl/>
           <w:szCs w:val="24"/>
         </w:rPr>
-        <w:t xml:space="preserve"> לבין שלב שבו כבר קיים ארגון יציג. בשלב הראשון על המעסיק להימנע מהצגת עמדתו בנוגע להתארגנות, בכנסים, ב</w:t>
+        <w:t>, לפני שקם ארגון יציג, גובר חופש ההתארגנות על חופש הביטוי של המעסיק. המעסיק אינו רשאי להביע עמדה על ההתארגנות בשום ערוץ, לרבות ב</w:t>
       </w:r>
       <w:r>
         <w:rPr>
@@ -587,7 +588,7 @@
           <w:szCs w:val="24"/>
           <w:bCs/>
         </w:rPr>
-        <w:t>מפגשים אישיים או קבוצתיים</w:t>
+        <w:t>שיחות אישיות</w:t>
       </w:r>
       <w:r>
         <w:rPr>
@@ -595,7 +596,7 @@
           <w:rtl/>
           <w:szCs w:val="24"/>
         </w:rPr>
-        <w:t xml:space="preserve"> ובתכתובות אלקטרוניות. נקבע גם כי הצגת חסרונות ההצטרפות לארגון עובדים והשלכותיה על החברה היא הבעת עמדה אסורה, גם אם יש בה אמת. ההלכה אושרה בבג"ץ, ולפי הספרות היא כמעט איינה את יכולת המעסיק להתערב בהתארגנות הראשונית.</w:t>
+        <w:t xml:space="preserve"> ובדואר אלקטרוני, וגם הצבעה על חסרונותיה לעובדים או לחברה, נכונה ככל שתהיה, אסורה. ההלכה אושרה בבג"ץ.</w:t>
       </w:r>
       <w:r>
         <w:rPr>
@@ -670,7 +671,7 @@
           <w:rtl/>
           <w:szCs w:val="24"/>
         </w:rPr>
-        <w:t xml:space="preserve"> כלפיה מעבירים לעובדים את אותו מסר בדרך עקיפה: ההנהלה מעדיפה את הקבוצה על פני ההסתדרות.</w:t>
+        <w:t xml:space="preserve"> כלפיה מעבירים בעקיפין את אותו מסר.</w:t>
       </w:r>
     </w:p>
     <w:p>
@@ -702,7 +703,7 @@
           <w:rtl/>
           <w:szCs w:val="24"/>
         </w:rPr>
-        <w:t>טענות ההסתדרות מוצדקות. הקבוצה אינה עומדת במבחן המטרה ובמבחן הקול הנגדי, כפי שנפסק בעניין נוקיה. פעולות ההנהלה הפרו את האיסור על הבעת עמדה בשלב ההתארגנות הפורצת שנקבע בעניין פלאפון.</w:t>
+        <w:t>טענות ההסתדרות מוצדקות: הקבוצה אינה ארגון עובדים, כפי שנפסק בעניין נוקיה, ופעולות ההנהלה הפרו את הלכת פלאפון.</w:t>
       </w:r>
     </w:p>
     <w:p>
@@ -1872,6 +1873,21 @@
           <w:rtl/>
           <w:szCs w:val="24"/>
         </w:rPr>
+        <w:t>ניצן צבי כהן "בית הדין קבע: ההסתדרות תשמש כארגון העובדים היציג בחברת נוקיה" דבר 10.6.2025.</w:t>
+      </w:r>
+    </w:p>
+    <w:p>
+      <w:pPr>
+        <w:bidi/>
+        <w:spacing w:before="0" w:after="0"/>
+        <w:jc w:val="both"/>
+      </w:pPr>
+      <w:r>
+        <w:rPr>
+          <w:sz w:val="24"/>
+          <w:rtl/>
+          <w:szCs w:val="24"/>
+        </w:rPr>
         <w:t>גיא דוידוב "הפררוגטיבה של המעביד ודיני החוזים: בעקבות פרשות נהרי וגרינשפן" משפטים לח(2) 417 (2008).</w:t>
       </w:r>
     </w:p>
@@ -2114,7 +2130,7 @@
           <w:sz w:val="20"/>
           <w:szCs w:val="20"/>
         </w:rPr>
-        <w:t xml:space="preserve">עס"ק (ארצי) 6298-03-25 הסתדרות העובדים הכללית החדשה – האגף להתאגדות עובדים נ' ארגון עובדי הפיתוח והשיווק בנוקיה ישראל (נבו 10.6.2025) (להלן: עניין נוקיה).</w:t>
+        <w:t xml:space="preserve">עס"ק (ארצי) 6298-03-25 הסתדרות העובדים הכללית החדשה – האגף להתאגדות עובדים נ' ארגון עובדי הפיתוח והשיווק בנוקיה ישראל (נבו 10.6.2025) (להלן: עניין נוקיה). הציטוטים מפסק הדין מובאים מתוך ניצן צבי כהן "בית הדין קבע: ההסתדרות תשמש כארגון העובדים היציג בחברת נוקיה" דבר 10.6.2025.</w:t>
       </w:r>
     </w:p>
   </w:footnote>

</xml_diff>

<commit_message>
Cite Nokia ruling by paragraph from the judgment text
Co-Authored-By: Claude Opus 5.5 <noreply@anthropic.com>
Claude-Session: https://claude.ai/code/session_01BVH1n3fvCDz4inkznfhZC9
</commit_message>
<xml_diff>
--- a/output/עבודה_היבטים_משפטיים.docx
+++ b/output/עבודה_היבטים_משפטיים.docx
@@ -389,7 +389,7 @@
           <w:rtl/>
           <w:szCs w:val="24"/>
         </w:rPr>
-        <w:t xml:space="preserve">, יציבות החברה והמשך פעילותה בישראל, היא אינטרס של המעסיק. הנימוק שבהודעת הקבוצה אינו מחזיק משפטית: לפי </w:t>
+        <w:t xml:space="preserve">, יציבות החברה והמשך פעילותה בישראל, היא אינטרס של המעסיק. הנימוק שבהודעת הקבוצה אינו מחזיק: לפי </w:t>
       </w:r>
       <w:r>
         <w:rPr>
@@ -407,7 +407,7 @@
           <w:rtl/>
           <w:szCs w:val="24"/>
         </w:rPr>
-        <w:t>, הוראה בחוזה אישי שהיא לטובת העובד גוברת על ההסכם הקיבוצי, אלא אם ההסכם מונע זאת במפורש.</w:t>
+        <w:t xml:space="preserve"> הוראה אישית לטובת העובד גוברת על ההסכם הקיבוצי.</w:t>
       </w:r>
     </w:p>
     <w:p>
@@ -432,7 +432,7 @@
           <w:rtl/>
           <w:szCs w:val="24"/>
         </w:rPr>
-        <w:t xml:space="preserve"> הקבוצה הוקמה בתגובה ישירה להצטרפות העובדים להסתדרות ומגדירה את עצמה כמי שפועלת "בשיתוף פעולה ובהידברות" עם ההנהלה. המנכ"ל בירך על הקמתה ובמקביל פעל נגד ההסתדרות. גוף שהמעסיק תומך בו כך אינו "קול נגדי" לו.</w:t>
+        <w:t xml:space="preserve"> הקבוצה הוקמה בתגובה ישירה להצטרפות העובדים להסתדרות ומגדירה את עצמה כמי שפועלת "בשיתוף פעולה ובהידברות" עם ההנהלה. גוף שהמעסיק תומך בו כך אינו "קול נגדי" לו.</w:t>
       </w:r>
     </w:p>
     <w:p>
@@ -457,7 +457,7 @@
           <w:rtl/>
           <w:szCs w:val="24"/>
         </w:rPr>
-        <w:t xml:space="preserve"> בנוקיה הוקם ועד פנימי כחלופה להסתדרות, ותקנונו קבע כי לא יתערב בחוזים האישיים. בית הדין הארצי קבע כי משום שעיקר תנאי העבודה מעוגנים בחוזים האישיים, "מה שנותר לזירה הקיבוצית הוא 'הפריפריה' של תנאי העבודה", ולכן הגוף אינו ארגון עובדים. עוד נקבע כי אין להקל במבחנים גם בהתארגנות ראשונית, וכי גם התארגנות אותנטית של רוב העובדים "שכל תכליתה התנגדות ליחסי עבודה קיבוציים" אינה ארגון עובדים.</w:t>
+        <w:t xml:space="preserve"> בנוקיה הוקם ארגון פנימי כחלופה להסתדרות, שהדגיש "שמירה על החוזה האישי של כל עובד". בית הדין הארצי קבע כי העמידה במבחני עניין עמית נבחנת במועד הכרזת היציגות, וכי אין להקל בהם גם לארגון חדש, ובוודאי לא במבחן המטרה.</w:t>
       </w:r>
       <w:r>
         <w:rPr>
@@ -471,7 +471,49 @@
           <w:rtl/>
           <w:szCs w:val="24"/>
         </w:rPr>
-        <w:t xml:space="preserve"> מטרה ד' בתקנון הקבוצה כמעט זהה לתקנון שנפסל שם, ולכן אין נפקות לכך שעובדים רבים הצטרפו אליה.</w:t>
+        <w:t xml:space="preserve"> מטרתו העיקרית של ארגון עובדים חייבת להיות משא ומתן קיבוצי לשיפור תנאי העבודה,</w:t>
+      </w:r>
+      <w:r>
+        <w:rPr>
+          <w:vertAlign w:val="superscript"/>
+        </w:rPr>
+        <w:footnoteReference w:id="5"/>
+      </w:r>
+      <w:r>
+        <w:rPr>
+          <w:sz w:val="24"/>
+          <w:rtl/>
+          <w:szCs w:val="24"/>
+        </w:rPr>
+        <w:t xml:space="preserve"> וכשעיקר התנאים מעוגנים בחוזים האישיים, נותרת לזירה הקיבוצית רק "הפריפריה" של תנאי העבודה.</w:t>
+      </w:r>
+      <w:r>
+        <w:rPr>
+          <w:vertAlign w:val="superscript"/>
+        </w:rPr>
+        <w:footnoteReference w:id="6"/>
+      </w:r>
+      <w:r>
+        <w:rPr>
+          <w:sz w:val="24"/>
+          <w:rtl/>
+          <w:szCs w:val="24"/>
+        </w:rPr>
+        <w:t xml:space="preserve"> עוד נקבע כי אותנטיות היא תנאי הכרחי אך לא מספיק, ו"התארגנות אותנטית של שני שלישים מעובדי המפעל בארגון שכל תכליתה התנגדות ליחסי עבודה קיבוציים אינה יכולה להפוך את אותה התארגנות לארגון עובדים".</w:t>
+      </w:r>
+      <w:r>
+        <w:rPr>
+          <w:vertAlign w:val="superscript"/>
+        </w:rPr>
+        <w:footnoteReference w:id="7"/>
+      </w:r>
+      <w:r>
+        <w:rPr>
+          <w:sz w:val="24"/>
+          <w:rtl/>
+          <w:szCs w:val="24"/>
+        </w:rPr>
+        <w:t xml:space="preserve"> כך גם כאן, ואין נפקות לכך שעובדים רבים הצטרפו לקבוצה.</w:t>
       </w:r>
     </w:p>
     <w:p>
@@ -552,7 +594,7 @@
         <w:rPr>
           <w:vertAlign w:val="superscript"/>
         </w:rPr>
-        <w:footnoteReference w:id="5"/>
+        <w:footnoteReference w:id="8"/>
       </w:r>
       <w:r>
         <w:rPr>
@@ -602,7 +644,7 @@
         <w:rPr>
           <w:vertAlign w:val="superscript"/>
         </w:rPr>
-        <w:footnoteReference w:id="6"/>
+        <w:footnoteReference w:id="9"/>
       </w:r>
       <w:r>
         <w:rPr>
@@ -769,7 +811,7 @@
         <w:rPr>
           <w:vertAlign w:val="superscript"/>
         </w:rPr>
-        <w:footnoteReference w:id="7"/>
+        <w:footnoteReference w:id="10"/>
       </w:r>
       <w:r>
         <w:rPr>
@@ -870,7 +912,7 @@
         <w:rPr>
           <w:vertAlign w:val="superscript"/>
         </w:rPr>
-        <w:footnoteReference w:id="8"/>
+        <w:footnoteReference w:id="11"/>
       </w:r>
       <w:r>
         <w:rPr>
@@ -945,7 +987,7 @@
         <w:rPr>
           <w:vertAlign w:val="superscript"/>
         </w:rPr>
-        <w:footnoteReference w:id="9"/>
+        <w:footnoteReference w:id="12"/>
       </w:r>
       <w:r>
         <w:rPr>
@@ -959,7 +1001,7 @@
         <w:rPr>
           <w:vertAlign w:val="superscript"/>
         </w:rPr>
-        <w:footnoteReference w:id="10"/>
+        <w:footnoteReference w:id="13"/>
       </w:r>
       <w:r>
         <w:rPr>
@@ -1110,7 +1152,7 @@
         <w:rPr>
           <w:vertAlign w:val="superscript"/>
         </w:rPr>
-        <w:footnoteReference w:id="11"/>
+        <w:footnoteReference w:id="14"/>
       </w:r>
     </w:p>
     <w:p>
@@ -1177,7 +1219,7 @@
         <w:rPr>
           <w:vertAlign w:val="superscript"/>
         </w:rPr>
-        <w:footnoteReference w:id="12"/>
+        <w:footnoteReference w:id="15"/>
       </w:r>
       <w:r>
         <w:rPr>
@@ -1191,7 +1233,7 @@
         <w:rPr>
           <w:vertAlign w:val="superscript"/>
         </w:rPr>
-        <w:footnoteReference w:id="13"/>
+        <w:footnoteReference w:id="16"/>
       </w:r>
       <w:r>
         <w:rPr>
@@ -1205,7 +1247,7 @@
         <w:rPr>
           <w:vertAlign w:val="superscript"/>
         </w:rPr>
-        <w:footnoteReference w:id="14"/>
+        <w:footnoteReference w:id="17"/>
       </w:r>
     </w:p>
     <w:p>
@@ -1261,7 +1303,7 @@
         <w:rPr>
           <w:vertAlign w:val="superscript"/>
         </w:rPr>
-        <w:footnoteReference w:id="15"/>
+        <w:footnoteReference w:id="18"/>
       </w:r>
       <w:r>
         <w:rPr>
@@ -1329,7 +1371,7 @@
         <w:rPr>
           <w:vertAlign w:val="superscript"/>
         </w:rPr>
-        <w:footnoteReference w:id="16"/>
+        <w:footnoteReference w:id="19"/>
       </w:r>
       <w:r>
         <w:rPr>
@@ -1343,7 +1385,7 @@
         <w:rPr>
           <w:vertAlign w:val="superscript"/>
         </w:rPr>
-        <w:footnoteReference w:id="17"/>
+        <w:footnoteReference w:id="20"/>
       </w:r>
       <w:r>
         <w:rPr>
@@ -1357,7 +1399,7 @@
         <w:rPr>
           <w:vertAlign w:val="superscript"/>
         </w:rPr>
-        <w:footnoteReference w:id="18"/>
+        <w:footnoteReference w:id="21"/>
       </w:r>
     </w:p>
     <w:p>
@@ -1414,7 +1456,7 @@
         <w:rPr>
           <w:vertAlign w:val="superscript"/>
         </w:rPr>
-        <w:footnoteReference w:id="19"/>
+        <w:footnoteReference w:id="22"/>
       </w:r>
       <w:r>
         <w:rPr>
@@ -1428,7 +1470,7 @@
         <w:rPr>
           <w:vertAlign w:val="superscript"/>
         </w:rPr>
-        <w:footnoteReference w:id="20"/>
+        <w:footnoteReference w:id="23"/>
       </w:r>
       <w:r>
         <w:rPr>
@@ -1539,7 +1581,7 @@
         <w:rPr>
           <w:vertAlign w:val="superscript"/>
         </w:rPr>
-        <w:footnoteReference w:id="21"/>
+        <w:footnoteReference w:id="24"/>
       </w:r>
       <w:r>
         <w:rPr>
@@ -2130,7 +2172,7 @@
           <w:sz w:val="20"/>
           <w:szCs w:val="20"/>
         </w:rPr>
-        <w:t xml:space="preserve">עס"ק (ארצי) 6298-03-25 הסתדרות העובדים הכללית החדשה – האגף להתאגדות עובדים נ' ארגון עובדי הפיתוח והשיווק בנוקיה ישראל (נבו 10.6.2025) (להלן: עניין נוקיה). הציטוטים מפסק הדין מובאים מתוך ניצן צבי כהן "בית הדין קבע: ההסתדרות תשמש כארגון העובדים היציג בחברת נוקיה" דבר 10.6.2025.</w:t>
+        <w:t xml:space="preserve">עס"ק (ארצי) 6298-03-25 הסתדרות העובדים הכללית החדשה – האגף להתאגדות עובדים נ' ארגון עובדי הפיתוח והשיווק בנוקיה ישראל (נבו 10.6.2025) (להלן: עניין נוקיה), פס' 6, 41 ו-44.</w:t>
       </w:r>
     </w:p>
   </w:footnote>
@@ -2160,7 +2202,7 @@
           <w:sz w:val="20"/>
           <w:szCs w:val="20"/>
         </w:rPr>
-        <w:t xml:space="preserve">עס"ק (ארצי) 25476-09-12 הסתדרות העובדים הכללית החדשה נ' פלאפון תקשורת בע"מ (נבו 2.1.2013) (להלן: עניין פלאפון).</w:t>
+        <w:t xml:space="preserve">שם, פס' 50-51.</w:t>
       </w:r>
     </w:p>
   </w:footnote>
@@ -2190,7 +2232,7 @@
           <w:sz w:val="20"/>
           <w:szCs w:val="20"/>
         </w:rPr>
-        <w:t xml:space="preserve">בג"ץ 4179/13 לשכת התיאום של הארגונים הכלכליים נ' בית הדין הארצי לעבודה (נבו 7.7.2014); ליפשיץ, לעיל ה"ש 1, בעמ' 320. על הרגישות המיוחדת של שלב הפריצה בשל החשש מהתערבות המעסיק ראו עניין דור אלון, לעיל ה"ש 1, פס' 71.</w:t>
+        <w:t xml:space="preserve">שם, כפי שצוטט אצל ניצן צבי כהן "בית הדין קבע: ההסתדרות תשמש כארגון העובדים היציג בחברת נוקיה" דבר 10.6.2025.</w:t>
       </w:r>
     </w:p>
   </w:footnote>
@@ -2220,11 +2262,101 @@
           <w:sz w:val="20"/>
           <w:szCs w:val="20"/>
         </w:rPr>
+        <w:t xml:space="preserve">עניין נוקיה, לעיל ה"ש 4, פס' 47.</w:t>
+      </w:r>
+    </w:p>
+  </w:footnote>
+  <w:footnote w:id="8">
+    <w:p>
+      <w:pPr>
+        <w:bidi/>
+        <w:spacing w:before="0" w:after="0" w:line="240" w:lineRule="auto"/>
+        <w:jc w:val="both"/>
+      </w:pPr>
+      <w:r>
+        <w:rPr>
+          <w:vertAlign w:val="superscript"/>
+          <w:sz w:val="20"/>
+        </w:rPr>
+        <w:footnoteRef/>
+      </w:r>
+      <w:r>
+        <w:rPr>
+          <w:sz w:val="20"/>
+        </w:rPr>
+        <w:t xml:space="preserve"> </w:t>
+      </w:r>
+      <w:r>
+        <w:rPr>
+          <w:rtl/>
+          <w:sz w:val="20"/>
+          <w:szCs w:val="20"/>
+        </w:rPr>
+        <w:t xml:space="preserve">עס"ק (ארצי) 25476-09-12 הסתדרות העובדים הכללית החדשה נ' פלאפון תקשורת בע"מ (נבו 2.1.2013) (להלן: עניין פלאפון).</w:t>
+      </w:r>
+    </w:p>
+  </w:footnote>
+  <w:footnote w:id="9">
+    <w:p>
+      <w:pPr>
+        <w:bidi/>
+        <w:spacing w:before="0" w:after="0" w:line="240" w:lineRule="auto"/>
+        <w:jc w:val="both"/>
+      </w:pPr>
+      <w:r>
+        <w:rPr>
+          <w:vertAlign w:val="superscript"/>
+          <w:sz w:val="20"/>
+        </w:rPr>
+        <w:footnoteRef/>
+      </w:r>
+      <w:r>
+        <w:rPr>
+          <w:sz w:val="20"/>
+        </w:rPr>
+        <w:t xml:space="preserve"> </w:t>
+      </w:r>
+      <w:r>
+        <w:rPr>
+          <w:rtl/>
+          <w:sz w:val="20"/>
+          <w:szCs w:val="20"/>
+        </w:rPr>
+        <w:t xml:space="preserve">בג"ץ 4179/13 לשכת התיאום של הארגונים הכלכליים נ' בית הדין הארצי לעבודה (נבו 7.7.2014); ליפשיץ, לעיל ה"ש 1, בעמ' 320. על הרגישות המיוחדת של שלב הפריצה בשל החשש מהתערבות המעסיק ראו עניין דור אלון, לעיל ה"ש 1, פס' 71.</w:t>
+      </w:r>
+    </w:p>
+  </w:footnote>
+  <w:footnote w:id="10">
+    <w:p>
+      <w:pPr>
+        <w:bidi/>
+        <w:spacing w:before="0" w:after="0" w:line="240" w:lineRule="auto"/>
+        <w:jc w:val="both"/>
+      </w:pPr>
+      <w:r>
+        <w:rPr>
+          <w:vertAlign w:val="superscript"/>
+          <w:sz w:val="20"/>
+        </w:rPr>
+        <w:footnoteRef/>
+      </w:r>
+      <w:r>
+        <w:rPr>
+          <w:sz w:val="20"/>
+        </w:rPr>
+        <w:t xml:space="preserve"> </w:t>
+      </w:r>
+      <w:r>
+        <w:rPr>
+          <w:rtl/>
+          <w:sz w:val="20"/>
+          <w:szCs w:val="20"/>
+        </w:rPr>
         <w:t xml:space="preserve">ס' 1 לחוק למניעת הטרדה מינית, התשנ"ח–1998 (להלן: החוק למניעת הטרדה מינית); גליה הילדסהימר "החוק למניעת הטרדה מינית, חלקים א'-ב'" מצגת הקורס היבטים משפטיים ואתיים בייעוץ ופיתוח ארגוני, המרכז האקדמי פרס (2026).</w:t>
       </w:r>
     </w:p>
   </w:footnote>
-  <w:footnote w:id="8">
+  <w:footnote w:id="11">
     <w:p>
       <w:pPr>
         <w:bidi/>
@@ -2271,7 +2403,7 @@
       </w:r>
     </w:p>
   </w:footnote>
-  <w:footnote w:id="9">
+  <w:footnote w:id="12">
     <w:p>
       <w:pPr>
         <w:bidi/>
@@ -2301,7 +2433,7 @@
       </w:r>
     </w:p>
   </w:footnote>
-  <w:footnote w:id="10">
+  <w:footnote w:id="13">
     <w:p>
       <w:pPr>
         <w:bidi/>
@@ -2327,11 +2459,11 @@
           <w:sz w:val="20"/>
           <w:szCs w:val="20"/>
         </w:rPr>
-        <w:t xml:space="preserve">Kamir, לעיל ה"ש 8, בעמ' 324.</w:t>
+        <w:t xml:space="preserve">Kamir, לעיל ה"ש 11, בעמ' 324.</w:t>
       </w:r>
     </w:p>
   </w:footnote>
-  <w:footnote w:id="11">
+  <w:footnote w:id="14">
     <w:p>
       <w:pPr>
         <w:bidi/>
@@ -2361,7 +2493,7 @@
       </w:r>
     </w:p>
   </w:footnote>
-  <w:footnote w:id="12">
+  <w:footnote w:id="15">
     <w:p>
       <w:pPr>
         <w:bidi/>
@@ -2391,7 +2523,7 @@
       </w:r>
     </w:p>
   </w:footnote>
-  <w:footnote w:id="13">
+  <w:footnote w:id="16">
     <w:p>
       <w:pPr>
         <w:bidi/>
@@ -2417,11 +2549,11 @@
           <w:sz w:val="20"/>
           <w:szCs w:val="20"/>
         </w:rPr>
-        <w:t xml:space="preserve">Kamir, לעיל ה"ש 8, בעמ' 324.</w:t>
+        <w:t xml:space="preserve">Kamir, לעיל ה"ש 11, בעמ' 324.</w:t>
       </w:r>
     </w:p>
   </w:footnote>
-  <w:footnote w:id="14">
+  <w:footnote w:id="17">
     <w:p>
       <w:pPr>
         <w:bidi/>
@@ -2451,7 +2583,7 @@
       </w:r>
     </w:p>
   </w:footnote>
-  <w:footnote w:id="15">
+  <w:footnote w:id="18">
     <w:p>
       <w:pPr>
         <w:bidi/>
@@ -2481,7 +2613,7 @@
       </w:r>
     </w:p>
   </w:footnote>
-  <w:footnote w:id="16">
+  <w:footnote w:id="19">
     <w:p>
       <w:pPr>
         <w:bidi/>
@@ -2511,7 +2643,7 @@
       </w:r>
     </w:p>
   </w:footnote>
-  <w:footnote w:id="17">
+  <w:footnote w:id="20">
     <w:p>
       <w:pPr>
         <w:bidi/>
@@ -2541,7 +2673,7 @@
       </w:r>
     </w:p>
   </w:footnote>
-  <w:footnote w:id="18">
+  <w:footnote w:id="21">
     <w:p>
       <w:pPr>
         <w:bidi/>
@@ -2571,7 +2703,7 @@
       </w:r>
     </w:p>
   </w:footnote>
-  <w:footnote w:id="19">
+  <w:footnote w:id="22">
     <w:p>
       <w:pPr>
         <w:bidi/>
@@ -2601,7 +2733,7 @@
       </w:r>
     </w:p>
   </w:footnote>
-  <w:footnote w:id="20">
+  <w:footnote w:id="23">
     <w:p>
       <w:pPr>
         <w:bidi/>
@@ -2631,7 +2763,7 @@
       </w:r>
     </w:p>
   </w:footnote>
-  <w:footnote w:id="21">
+  <w:footnote w:id="24">
     <w:p>
       <w:pPr>
         <w:bidi/>

</xml_diff>

<commit_message>
Final version: add Salman v. Akobag contrast
Co-Authored-By: Claude Opus 5.5 <noreply@anthropic.com>
Claude-Session: https://claude.ai/code/session_01BVH1n3fvCDz4inkznfhZC9
</commit_message>
<xml_diff>
--- a/output/עבודה_היבטים_משפטיים.docx
+++ b/output/עבודה_היבטים_משפטיים.docx
@@ -1379,7 +1379,7 @@
           <w:rtl/>
           <w:szCs w:val="24"/>
         </w:rPr>
-        <w:t xml:space="preserve"> עם זאת, העברה מתפקיד לתפקיד נחשבת בדרך כלל לחלק מהפררוגטיבה, בכפוף לחובת תום הלב.</w:t>
+        <w:t xml:space="preserve"> עם זאת, העברה בין תפקידים נחשבת בדרך כלל לחלק מהפררוגטיבה, בכפוף לתום הלב.</w:t>
       </w:r>
       <w:r>
         <w:rPr>
@@ -1393,7 +1393,7 @@
           <w:rtl/>
           <w:szCs w:val="24"/>
         </w:rPr>
-        <w:t xml:space="preserve"> העברתו של אורי פגעה במעמדו אף ששכרו לא השתנה, ותזמונה, סמוך לסיום השיחות, מעורר ספק אם נעשתה בתום לב. שינוי ב"תיאור עיקרי התפקיד" מחייב הודעה בכתב בתוך 30 יום, ובהיעדרה הנטל עובר למעסיק.</w:t>
+        <w:t xml:space="preserve"> העברתו של אורי פגעה במעמדו אף ששכרו לא השתנה, ותזמונה מעורר ספק בתום הלב. שינוי ב"תיאור עיקרי התפקיד" מחייב הודעה בכתב בתוך 30 יום, ובהיעדרה הנטל עובר למעסיק.</w:t>
       </w:r>
       <w:r>
         <w:rPr>
@@ -1565,7 +1565,7 @@
           <w:rtl/>
           <w:szCs w:val="24"/>
         </w:rPr>
-        <w:t>; שיהוי עלול להתפרש כהסכמה להרעה. ב</w:t>
+        <w:t>. ב</w:t>
       </w:r>
       <w:r>
         <w:rPr>
@@ -1604,24 +1604,21 @@
           <w:rtl/>
           <w:szCs w:val="24"/>
         </w:rPr>
-        <w:t>אורי לא מחה, לא התריע על כוונתו להתפטר ועבד ארבעה חודשים במתכונת החדשה. השתיקה מלמדת על השלמה, גם אם התקופה קצרה מזו שבעניין גולן.</w:t>
-      </w:r>
-    </w:p>
-    <w:p>
-      <w:pPr>
-        <w:bidi/>
-        <w:spacing w:before="120" w:after="0"/>
-        <w:jc w:val="both"/>
-      </w:pPr>
-      <w:r>
-        <w:rPr>
-          <w:b/>
+        <w:t>אורי לא מחה ולא התריע, ועבד ארבעה חודשים במתכונת החדשה, בשונה מהעובד בעניין סלמאן, שהועבר לתפקיד אחר ומחה בכתב על הפחתת שכרו לפני שהתפטר.</w:t>
+      </w:r>
+      <w:r>
+        <w:rPr>
+          <w:vertAlign w:val="superscript"/>
+        </w:rPr>
+        <w:footnoteReference w:id="25"/>
+      </w:r>
+      <w:r>
+        <w:rPr>
           <w:sz w:val="24"/>
           <w:rtl/>
           <w:szCs w:val="24"/>
-          <w:bCs/>
-        </w:rPr>
-        <w:t>4. סיכום</w:t>
+        </w:rPr>
+        <w:t xml:space="preserve"> שתיקתו מלמדת על השלמה.</w:t>
       </w:r>
     </w:p>
     <w:p>
@@ -1632,11 +1629,21 @@
       </w:pPr>
       <w:r>
         <w:rPr>
+          <w:b/>
           <w:sz w:val="24"/>
           <w:rtl/>
           <w:szCs w:val="24"/>
-        </w:rPr>
-        <w:t>טענת ההטרדה המינית חלשה, כי קשה להראות התייחסויות חוזרות למיניותו של אורי. טענת ההתנכלות חזקה יותר. טענת ההתפטרות בדין מפוטר נכשלת בשל היעדר התראה והשיהוי (הלכת גולן).</w:t>
+          <w:bCs/>
+        </w:rPr>
+        <w:t>לסיכום</w:t>
+      </w:r>
+      <w:r>
+        <w:rPr>
+          <w:sz w:val="24"/>
+          <w:rtl/>
+          <w:szCs w:val="24"/>
+        </w:rPr>
+        <w:t>, טענת ההטרדה המינית חלשה, טענת ההתנכלות חזקה יותר, וטענת ההתפטרות בדין מפוטר נכשלת בשל היעדר התראה ושיהוי.</w:t>
       </w:r>
     </w:p>
     <w:p>
@@ -1884,6 +1891,21 @@
           <w:szCs w:val="24"/>
         </w:rPr>
         <w:t>תב"ע (ארצי) נד/86-3 יוחנן גולן נ' אי.אל.די. בע"מ.</w:t>
+      </w:r>
+    </w:p>
+    <w:p>
+      <w:pPr>
+        <w:bidi/>
+        <w:spacing w:before="0" w:after="0"/>
+        <w:jc w:val="both"/>
+      </w:pPr>
+      <w:r>
+        <w:rPr>
+          <w:sz w:val="24"/>
+          <w:rtl/>
+          <w:szCs w:val="24"/>
+        </w:rPr>
+        <w:t>ע"ע (ארצי) 28475-03-20 סלמאן נ' אקובג בע"מ (נבו 7.12.2020).</w:t>
       </w:r>
     </w:p>
     <w:p>
@@ -2790,6 +2812,36 @@
           <w:szCs w:val="20"/>
         </w:rPr>
         <w:t xml:space="preserve">תב"ע (ארצי) נד/86-3 יוחנן גולן נ' אי.אל.די. בע"מ (להלן: עניין גולן).</w:t>
+      </w:r>
+    </w:p>
+  </w:footnote>
+  <w:footnote w:id="25">
+    <w:p>
+      <w:pPr>
+        <w:bidi/>
+        <w:spacing w:before="0" w:after="0" w:line="240" w:lineRule="auto"/>
+        <w:jc w:val="both"/>
+      </w:pPr>
+      <w:r>
+        <w:rPr>
+          <w:vertAlign w:val="superscript"/>
+          <w:sz w:val="20"/>
+        </w:rPr>
+        <w:footnoteRef/>
+      </w:r>
+      <w:r>
+        <w:rPr>
+          <w:sz w:val="20"/>
+        </w:rPr>
+        <w:t xml:space="preserve"> </w:t>
+      </w:r>
+      <w:r>
+        <w:rPr>
+          <w:rtl/>
+          <w:sz w:val="20"/>
+          <w:szCs w:val="20"/>
+        </w:rPr>
+        <w:t xml:space="preserve">ע"ע (ארצי) 28475-03-20 סלמאן נ' אקובג בע"מ, פס' 4-10 (נבו 7.12.2020).</w:t>
       </w:r>
     </w:p>
   </w:footnote>

</xml_diff>

<commit_message>
Add college logo to cover page
Co-Authored-By: Claude Opus 5.5 <noreply@anthropic.com>
Claude-Session: https://claude.ai/code/session_01BVH1n3fvCDz4inkznfhZC9
</commit_message>
<xml_diff>
--- a/output/עבודה_היבטים_משפטיים.docx
+++ b/output/עבודה_היבטים_משפטיים.docx
@@ -4,8 +4,62 @@
   <w:body>
     <w:p>
       <w:pPr>
+        <w:jc w:val="center"/>
+      </w:pPr>
+      <w:r>
+        <w:drawing>
+          <wp:inline xmlns:a="http://schemas.openxmlformats.org/drawingml/2006/main" xmlns:pic="http://schemas.openxmlformats.org/drawingml/2006/picture">
+            <wp:extent cx="1800000" cy="1800000"/>
+            <wp:docPr id="1" name="Picture 1"/>
+            <wp:cNvGraphicFramePr>
+              <a:graphicFrameLocks noChangeAspect="1"/>
+            </wp:cNvGraphicFramePr>
+            <a:graphic>
+              <a:graphicData uri="http://schemas.openxmlformats.org/drawingml/2006/picture">
+                <pic:pic>
+                  <pic:nvPicPr>
+                    <pic:cNvPr id="0" name="logo.jpg"/>
+                    <pic:cNvPicPr/>
+                  </pic:nvPicPr>
+                  <pic:blipFill>
+                    <a:blip r:embed="rId9"/>
+                    <a:stretch>
+                      <a:fillRect/>
+                    </a:stretch>
+                  </pic:blipFill>
+                  <pic:spPr>
+                    <a:xfrm>
+                      <a:off x="0" y="0"/>
+                      <a:ext cx="1800000" cy="1800000"/>
+                    </a:xfrm>
+                    <a:prstGeom prst="rect"/>
+                  </pic:spPr>
+                </pic:pic>
+              </a:graphicData>
+            </a:graphic>
+          </wp:inline>
+        </w:drawing>
+      </w:r>
+    </w:p>
+    <w:p>
+      <w:pPr>
         <w:bidi/>
-        <w:spacing w:before="0" w:after="0"/>
+        <w:spacing w:before="240" w:after="0"/>
+        <w:jc w:val="center"/>
+      </w:pPr>
+      <w:r>
+        <w:rPr>
+          <w:sz w:val="26"/>
+          <w:rtl/>
+          <w:szCs w:val="26"/>
+        </w:rPr>
+        <w:t>התכנית לייעוץ ופיתוח ארגוני, תואר שני</w:t>
+      </w:r>
+    </w:p>
+    <w:p>
+      <w:pPr>
+        <w:bidi/>
+        <w:spacing w:before="1400" w:after="0"/>
         <w:jc w:val="center"/>
       </w:pPr>
       <w:r>
@@ -16,7 +70,24 @@
           <w:szCs w:val="32"/>
           <w:bCs/>
         </w:rPr>
-        <w:t>המרכז האקדמי פרס</w:t>
+        <w:t>עבודה מסכמת</w:t>
+      </w:r>
+    </w:p>
+    <w:p>
+      <w:pPr>
+        <w:bidi/>
+        <w:spacing w:before="240" w:after="0"/>
+        <w:jc w:val="center"/>
+      </w:pPr>
+      <w:r>
+        <w:rPr>
+          <w:b/>
+          <w:sz w:val="32"/>
+          <w:rtl/>
+          <w:szCs w:val="32"/>
+          <w:bCs/>
+        </w:rPr>
+        <w:t>היבטים משפטיים ואתיים בייעוץ ופיתוח ארגוני</w:t>
       </w:r>
     </w:p>
     <w:p>
@@ -31,41 +102,22 @@
           <w:rtl/>
           <w:szCs w:val="26"/>
         </w:rPr>
-        <w:t>התכנית לייעוץ ופיתוח ארגוני, תואר שני</w:t>
+        <w:t>(קוד הקורס: 3008)</w:t>
       </w:r>
     </w:p>
     <w:p>
       <w:pPr>
         <w:bidi/>
-        <w:spacing w:before="2400" w:after="0"/>
+        <w:spacing w:before="1200" w:after="0"/>
         <w:jc w:val="center"/>
       </w:pPr>
       <w:r>
         <w:rPr>
-          <w:b/>
-          <w:sz w:val="32"/>
+          <w:sz w:val="26"/>
           <w:rtl/>
-          <w:szCs w:val="32"/>
-          <w:bCs/>
-        </w:rPr>
-        <w:t>עבודה מסכמת</w:t>
-      </w:r>
-    </w:p>
-    <w:p>
-      <w:pPr>
-        <w:bidi/>
-        <w:spacing w:before="240" w:after="0"/>
-        <w:jc w:val="center"/>
-      </w:pPr>
-      <w:r>
-        <w:rPr>
-          <w:b/>
-          <w:sz w:val="32"/>
-          <w:rtl/>
-          <w:szCs w:val="32"/>
-          <w:bCs/>
-        </w:rPr>
-        <w:t>היבטים משפטיים ואתיים בייעוץ ופיתוח ארגוני</w:t>
+          <w:szCs w:val="26"/>
+        </w:rPr>
+        <w:t>מרצה: ד"ר גליה הילדסהימר</w:t>
       </w:r>
     </w:p>
     <w:p>
@@ -80,13 +132,13 @@
           <w:rtl/>
           <w:szCs w:val="26"/>
         </w:rPr>
-        <w:t>(קוד הקורס: 3008)</w:t>
+        <w:t>מתרגל: עו"ד טל מזר</w:t>
       </w:r>
     </w:p>
     <w:p>
       <w:pPr>
         <w:bidi/>
-        <w:spacing w:before="1800" w:after="0"/>
+        <w:spacing w:before="1200" w:after="0"/>
         <w:jc w:val="center"/>
       </w:pPr>
       <w:r>
@@ -95,7 +147,7 @@
           <w:rtl/>
           <w:szCs w:val="26"/>
         </w:rPr>
-        <w:t>מרצה: ד"ר גליה הילדסהימר</w:t>
+        <w:t>מגיש/ה: ____________________</w:t>
       </w:r>
     </w:p>
     <w:p>
@@ -110,43 +162,13 @@
           <w:rtl/>
           <w:szCs w:val="26"/>
         </w:rPr>
-        <w:t>מתרגל: עו"ד טל מזר</w:t>
+        <w:t>ת"ז: ____________________</w:t>
       </w:r>
     </w:p>
     <w:p>
       <w:pPr>
         <w:bidi/>
-        <w:spacing w:before="1800" w:after="0"/>
-        <w:jc w:val="center"/>
-      </w:pPr>
-      <w:r>
-        <w:rPr>
-          <w:sz w:val="26"/>
-          <w:rtl/>
-          <w:szCs w:val="26"/>
-        </w:rPr>
-        <w:t>מגיש/ה: ____________________</w:t>
-      </w:r>
-    </w:p>
-    <w:p>
-      <w:pPr>
-        <w:bidi/>
-        <w:spacing w:before="0" w:after="0"/>
-        <w:jc w:val="center"/>
-      </w:pPr>
-      <w:r>
-        <w:rPr>
-          <w:sz w:val="26"/>
-          <w:rtl/>
-          <w:szCs w:val="26"/>
-        </w:rPr>
-        <w:t>ת"ז: ____________________</w:t>
-      </w:r>
-    </w:p>
-    <w:p>
-      <w:pPr>
-        <w:bidi/>
-        <w:spacing w:before="1800" w:after="0"/>
+        <w:spacing w:before="1200" w:after="0"/>
         <w:jc w:val="center"/>
       </w:pPr>
       <w:r>

</xml_diff>

<commit_message>
Fill each answer to two pages
Co-Authored-By: Claude Opus 5.5 <noreply@anthropic.com>
Claude-Session: https://claude.ai/code/session_01BVH1n3fvCDz4inkznfhZC9
</commit_message>
<xml_diff>
--- a/output/עבודה_היבטים_משפטיים.docx
+++ b/output/עבודה_היבטים_משפטיים.docx
@@ -707,7 +707,21 @@
           <w:rtl/>
           <w:szCs w:val="24"/>
         </w:rPr>
-        <w:t xml:space="preserve"> כך גם כאן, ואין נפקות לכך שעובדים רבים הצטרפו לקבוצה.</w:t>
+        <w:t xml:space="preserve"> כך גם כאן, ואין נפקות לכך שעובדים רבים הצטרפו לקבוצה. יתרה מזו, בנוקיה נקבע שהחברה לא תמכה בארגון הפנימי,</w:t>
+      </w:r>
+      <w:r>
+        <w:rPr>
+          <w:vertAlign w:val="superscript"/>
+        </w:rPr>
+        <w:footnoteReference w:id="8"/>
+      </w:r>
+      <w:r>
+        <w:rPr>
+          <w:sz w:val="24"/>
+          <w:rtl/>
+          <w:szCs w:val="24"/>
+        </w:rPr>
+        <w:t xml:space="preserve"> ואילו כאן המנכ"ל בירך על הקמת הקבוצה ופעל נגד ההסתדרות, כך שגם מבחן העצמאות מהמעסיק אינו מתקיים.</w:t>
       </w:r>
     </w:p>
     <w:p>
@@ -788,7 +802,7 @@
         <w:rPr>
           <w:vertAlign w:val="superscript"/>
         </w:rPr>
-        <w:footnoteReference w:id="8"/>
+        <w:footnoteReference w:id="9"/>
       </w:r>
       <w:r>
         <w:rPr>
@@ -838,7 +852,7 @@
         <w:rPr>
           <w:vertAlign w:val="superscript"/>
         </w:rPr>
-        <w:footnoteReference w:id="9"/>
+        <w:footnoteReference w:id="10"/>
       </w:r>
       <w:r>
         <w:rPr>
@@ -907,7 +921,7 @@
           <w:rtl/>
           <w:szCs w:val="24"/>
         </w:rPr>
-        <w:t xml:space="preserve"> כלפיה מעבירים בעקיפין את אותו מסר.</w:t>
+        <w:t xml:space="preserve"> כלפיה מעבירים בעקיפין את אותו מסר. בעניין פלאפון ניתנו צווים שאסרו על החברה להציג את עמדתה בכל ערוץ ולעקוב אחר העובדים המתארגנים, וצווים דומים מתבקשים גם כאן.</w:t>
       </w:r>
     </w:p>
     <w:p>
@@ -1005,7 +1019,7 @@
         <w:rPr>
           <w:vertAlign w:val="superscript"/>
         </w:rPr>
-        <w:footnoteReference w:id="10"/>
+        <w:footnoteReference w:id="11"/>
       </w:r>
       <w:r>
         <w:rPr>
@@ -1106,7 +1120,7 @@
         <w:rPr>
           <w:vertAlign w:val="superscript"/>
         </w:rPr>
-        <w:footnoteReference w:id="11"/>
+        <w:footnoteReference w:id="12"/>
       </w:r>
       <w:r>
         <w:rPr>
@@ -1181,7 +1195,7 @@
         <w:rPr>
           <w:vertAlign w:val="superscript"/>
         </w:rPr>
-        <w:footnoteReference w:id="12"/>
+        <w:footnoteReference w:id="13"/>
       </w:r>
       <w:r>
         <w:rPr>
@@ -1195,7 +1209,7 @@
         <w:rPr>
           <w:vertAlign w:val="superscript"/>
         </w:rPr>
-        <w:footnoteReference w:id="13"/>
+        <w:footnoteReference w:id="14"/>
       </w:r>
       <w:r>
         <w:rPr>
@@ -1254,7 +1268,7 @@
           <w:rtl/>
           <w:szCs w:val="24"/>
         </w:rPr>
-        <w:t xml:space="preserve"> יחסי המרות. השאלה על נטייתו של אורי נשאלה פעם אחת. רוב השיחות עסקו בחייה של דנה והיו הדדיות, ולכן קשה לבסס כאן הטרדה מינית.</w:t>
+        <w:t xml:space="preserve"> יחסי המרות. השאלה על נטייתו של אורי נשאלה פעם אחת. רוב השיחות עסקו בחייה של דנה והיו הדדיות, ולכן קשה לבסס כאן הטרדה מינית. תחושתה של דנה כי הם "חברים טובים" אינה מכרעת: אילו הוכח ניצול מרות, היה עליה לזהות בעצמה שההתנהגות עלולה לפגוע, ואין צורך שאורי יראה זאת.</w:t>
       </w:r>
     </w:p>
     <w:p>
@@ -1346,7 +1360,7 @@
         <w:rPr>
           <w:vertAlign w:val="superscript"/>
         </w:rPr>
-        <w:footnoteReference w:id="14"/>
+        <w:footnoteReference w:id="15"/>
       </w:r>
     </w:p>
     <w:p>
@@ -1413,7 +1427,7 @@
         <w:rPr>
           <w:vertAlign w:val="superscript"/>
         </w:rPr>
-        <w:footnoteReference w:id="15"/>
+        <w:footnoteReference w:id="16"/>
       </w:r>
       <w:r>
         <w:rPr>
@@ -1427,7 +1441,7 @@
         <w:rPr>
           <w:vertAlign w:val="superscript"/>
         </w:rPr>
-        <w:footnoteReference w:id="16"/>
+        <w:footnoteReference w:id="17"/>
       </w:r>
       <w:r>
         <w:rPr>
@@ -1441,7 +1455,21 @@
         <w:rPr>
           <w:vertAlign w:val="superscript"/>
         </w:rPr>
-        <w:footnoteReference w:id="17"/>
+        <w:footnoteReference w:id="18"/>
+      </w:r>
+      <w:r>
+        <w:rPr>
+          <w:sz w:val="24"/>
+          <w:rtl/>
+          <w:szCs w:val="24"/>
+        </w:rPr>
+        <w:t xml:space="preserve"> אם תוכח התנכלות, רשאי בית הדין לפסוק לאורי פיצוי של עד 120,000 ש"ח ללא הוכחת נזק.</w:t>
+      </w:r>
+      <w:r>
+        <w:rPr>
+          <w:vertAlign w:val="superscript"/>
+        </w:rPr>
+        <w:footnoteReference w:id="19"/>
       </w:r>
     </w:p>
     <w:p>
@@ -1497,7 +1525,7 @@
         <w:rPr>
           <w:vertAlign w:val="superscript"/>
         </w:rPr>
-        <w:footnoteReference w:id="18"/>
+        <w:footnoteReference w:id="20"/>
       </w:r>
       <w:r>
         <w:rPr>
@@ -1565,7 +1593,7 @@
         <w:rPr>
           <w:vertAlign w:val="superscript"/>
         </w:rPr>
-        <w:footnoteReference w:id="19"/>
+        <w:footnoteReference w:id="21"/>
       </w:r>
       <w:r>
         <w:rPr>
@@ -1579,7 +1607,7 @@
         <w:rPr>
           <w:vertAlign w:val="superscript"/>
         </w:rPr>
-        <w:footnoteReference w:id="20"/>
+        <w:footnoteReference w:id="22"/>
       </w:r>
       <w:r>
         <w:rPr>
@@ -1593,7 +1621,7 @@
         <w:rPr>
           <w:vertAlign w:val="superscript"/>
         </w:rPr>
-        <w:footnoteReference w:id="21"/>
+        <w:footnoteReference w:id="23"/>
       </w:r>
     </w:p>
     <w:p>
@@ -1650,7 +1678,7 @@
         <w:rPr>
           <w:vertAlign w:val="superscript"/>
         </w:rPr>
-        <w:footnoteReference w:id="22"/>
+        <w:footnoteReference w:id="24"/>
       </w:r>
       <w:r>
         <w:rPr>
@@ -1664,7 +1692,7 @@
         <w:rPr>
           <w:vertAlign w:val="superscript"/>
         </w:rPr>
-        <w:footnoteReference w:id="23"/>
+        <w:footnoteReference w:id="25"/>
       </w:r>
       <w:r>
         <w:rPr>
@@ -1775,7 +1803,7 @@
         <w:rPr>
           <w:vertAlign w:val="superscript"/>
         </w:rPr>
-        <w:footnoteReference w:id="24"/>
+        <w:footnoteReference w:id="26"/>
       </w:r>
       <w:r>
         <w:rPr>
@@ -1804,7 +1832,7 @@
         <w:rPr>
           <w:vertAlign w:val="superscript"/>
         </w:rPr>
-        <w:footnoteReference w:id="25"/>
+        <w:footnoteReference w:id="27"/>
       </w:r>
       <w:r>
         <w:rPr>
@@ -2508,7 +2536,7 @@
           <w:sz w:val="20"/>
           <w:szCs w:val="20"/>
         </w:rPr>
-        <w:t xml:space="preserve">עס"ק (ארצי) 25476-09-12 הסתדרות העובדים הכללית החדשה נ' פלאפון תקשורת בע"מ (נבו 2.1.2013) (להלן: עניין פלאפון).</w:t>
+        <w:t xml:space="preserve">עניין נוקיה, לעיל ה"ש 4, פס' 18.</w:t>
       </w:r>
     </w:p>
   </w:footnote>
@@ -2538,7 +2566,7 @@
           <w:sz w:val="20"/>
           <w:szCs w:val="20"/>
         </w:rPr>
-        <w:t xml:space="preserve">בג"ץ 4179/13 לשכת התיאום של הארגונים הכלכליים נ' בית הדין הארצי לעבודה (נבו 7.7.2014); ליפשיץ, לעיל ה"ש 1, בעמ' 320. על הרגישות המיוחדת של שלב הפריצה בשל החשש מהתערבות המעסיק ראו עניין דור אלון, לעיל ה"ש 1, פס' 71.</w:t>
+        <w:t xml:space="preserve">עס"ק (ארצי) 25476-09-12 הסתדרות העובדים הכללית החדשה נ' פלאפון תקשורת בע"מ (נבו 2.1.2013) (להלן: עניין פלאפון).</w:t>
       </w:r>
     </w:p>
   </w:footnote>
@@ -2568,7 +2596,7 @@
           <w:sz w:val="20"/>
           <w:szCs w:val="20"/>
         </w:rPr>
-        <w:t xml:space="preserve">ס' 1 לחוק למניעת הטרדה מינית, התשנ"ח–1998 (להלן: החוק למניעת הטרדה מינית); גליה הילדסהימר "החוק למניעת הטרדה מינית, חלקים א'-ב'" מצגת הקורס היבטים משפטיים ואתיים בייעוץ ופיתוח ארגוני, המרכז האקדמי פרס (2026).</w:t>
+        <w:t xml:space="preserve">בג"ץ 4179/13 לשכת התיאום של הארגונים הכלכליים נ' בית הדין הארצי לעבודה (נבו 7.7.2014); ליפשיץ, לעיל ה"ש 1, בעמ' 320. על הרגישות המיוחדת של שלב הפריצה בשל החשש מהתערבות המעסיק ראו עניין דור אלון, לעיל ה"ש 1, פס' 71.</w:t>
       </w:r>
     </w:p>
   </w:footnote>
@@ -2598,24 +2626,7 @@
           <w:sz w:val="20"/>
           <w:szCs w:val="20"/>
         </w:rPr>
-        <w:t xml:space="preserve">Orit Kamir, </w:t>
-      </w:r>
-      <w:r>
-        <w:rPr>
-          <w:i/>
-          <w:iCs/>
-          <w:sz w:val="20"/>
-          <w:szCs w:val="20"/>
-        </w:rPr>
-        <w:t xml:space="preserve">Sexual Harassment Law in Israel</w:t>
-      </w:r>
-      <w:r>
-        <w:rPr>
-          <w:rtl/>
-          <w:sz w:val="20"/>
-          <w:szCs w:val="20"/>
-        </w:rPr>
-        <w:t xml:space="preserve">, 7 INT'L J. DISCRIMINATION &amp; L. 315, 321 (2005).</w:t>
+        <w:t xml:space="preserve">ס' 1 לחוק למניעת הטרדה מינית, התשנ"ח–1998 (להלן: החוק למניעת הטרדה מינית); גליה הילדסהימר "החוק למניעת הטרדה מינית, חלקים א'-ב'" מצגת הקורס היבטים משפטיים ואתיים בייעוץ ופיתוח ארגוני, המרכז האקדמי פרס (2026).</w:t>
       </w:r>
     </w:p>
   </w:footnote>
@@ -2645,7 +2656,24 @@
           <w:sz w:val="20"/>
           <w:szCs w:val="20"/>
         </w:rPr>
-        <w:t xml:space="preserve">עש"ם 2203/05 מדר נ' נציבות שירות המדינה (נבו 21.7.2005) (להלן: עניין מדר).</w:t>
+        <w:t xml:space="preserve">Orit Kamir, </w:t>
+      </w:r>
+      <w:r>
+        <w:rPr>
+          <w:i/>
+          <w:iCs/>
+          <w:sz w:val="20"/>
+          <w:szCs w:val="20"/>
+        </w:rPr>
+        <w:t xml:space="preserve">Sexual Harassment Law in Israel</w:t>
+      </w:r>
+      <w:r>
+        <w:rPr>
+          <w:rtl/>
+          <w:sz w:val="20"/>
+          <w:szCs w:val="20"/>
+        </w:rPr>
+        <w:t xml:space="preserve">, 7 INT'L J. DISCRIMINATION &amp; L. 315, 321 (2005).</w:t>
       </w:r>
     </w:p>
   </w:footnote>
@@ -2675,7 +2703,7 @@
           <w:sz w:val="20"/>
           <w:szCs w:val="20"/>
         </w:rPr>
-        <w:t xml:space="preserve">Kamir, לעיל ה"ש 11, בעמ' 324.</w:t>
+        <w:t xml:space="preserve">עש"ם 2203/05 מדר נ' נציבות שירות המדינה (נבו 21.7.2005) (להלן: עניין מדר).</w:t>
       </w:r>
     </w:p>
   </w:footnote>
@@ -2705,7 +2733,7 @@
           <w:sz w:val="20"/>
           <w:szCs w:val="20"/>
         </w:rPr>
-        <w:t xml:space="preserve">תק' 2(ג), 4, 6(ט) ו-8 לתקנות למניעת הטרדה מינית (חובות מעסיק), התשנ"ח–1998.</w:t>
+        <w:t xml:space="preserve">Kamir, לעיל ה"ש 12, בעמ' 324.</w:t>
       </w:r>
     </w:p>
   </w:footnote>
@@ -2735,7 +2763,7 @@
           <w:sz w:val="20"/>
           <w:szCs w:val="20"/>
         </w:rPr>
-        <w:t xml:space="preserve">ס' 7(א) לחוק שוויון ההזדמנויות בעבודה, התשמ"ח–1988.</w:t>
+        <w:t xml:space="preserve">תק' 2(ג), 4, 6(ט) ו-8 לתקנות למניעת הטרדה מינית (חובות מעסיק), התשנ"ח–1998.</w:t>
       </w:r>
     </w:p>
   </w:footnote>
@@ -2765,7 +2793,7 @@
           <w:sz w:val="20"/>
           <w:szCs w:val="20"/>
         </w:rPr>
-        <w:t xml:space="preserve">Kamir, לעיל ה"ש 11, בעמ' 324.</w:t>
+        <w:t xml:space="preserve">ס' 7(א) לחוק שוויון ההזדמנויות בעבודה, התשמ"ח–1988.</w:t>
       </w:r>
     </w:p>
   </w:footnote>
@@ -2795,7 +2823,7 @@
           <w:sz w:val="20"/>
           <w:szCs w:val="20"/>
         </w:rPr>
-        <w:t xml:space="preserve">ס' 9(ב) לחוק שוויון ההזדמנויות בעבודה; ס' 6א לחוק למניעת הטרדה מינית.</w:t>
+        <w:t xml:space="preserve">Kamir, לעיל ה"ש 12, בעמ' 324.</w:t>
       </w:r>
     </w:p>
   </w:footnote>
@@ -2825,7 +2853,7 @@
           <w:sz w:val="20"/>
           <w:szCs w:val="20"/>
         </w:rPr>
-        <w:t xml:space="preserve">בג"ץ 239/83 מילפלדר נ' בית הדין הארצי לעבודה, פ"ד מא(2) 210 (1987).</w:t>
+        <w:t xml:space="preserve">ס' 9(ב) לחוק שוויון ההזדמנויות בעבודה; ס' 6א לחוק למניעת הטרדה מינית.</w:t>
       </w:r>
     </w:p>
   </w:footnote>
@@ -2855,7 +2883,7 @@
           <w:sz w:val="20"/>
           <w:szCs w:val="20"/>
         </w:rPr>
-        <w:t xml:space="preserve">גליה הילדסהימר "חוזה עבודה אישי ומניעת הרעת תנאים, חלקים א'-ב'" מצגת הקורס היבטים משפטיים ואתיים בייעוץ ופיתוח ארגוני, המרכז האקדמי פרס (2026).</w:t>
+        <w:t xml:space="preserve">ס' 6(ב) לחוק למניעת הטרדה מינית; ס' 10(א)(1) לחוק שוויון ההזדמנויות בעבודה.</w:t>
       </w:r>
     </w:p>
   </w:footnote>
@@ -2885,7 +2913,7 @@
           <w:sz w:val="20"/>
           <w:szCs w:val="20"/>
         </w:rPr>
-        <w:t xml:space="preserve">גיא דוידוב "הפררוגטיבה של המעביד ודיני החוזים: בעקבות פרשות נהרי וגרינשפן" משפטים לח(2) 417, 418 ו-439 (2008).</w:t>
+        <w:t xml:space="preserve">בג"ץ 239/83 מילפלדר נ' בית הדין הארצי לעבודה, פ"ד מא(2) 210 (1987).</w:t>
       </w:r>
     </w:p>
   </w:footnote>
@@ -2915,7 +2943,7 @@
           <w:sz w:val="20"/>
           <w:szCs w:val="20"/>
         </w:rPr>
-        <w:t xml:space="preserve">ס' 2(א)(3), 3 ו-5א לחוק הודעה לעובד ולמועמד לעבודה (תנאי עבודה והליכי מיון וקבלה לעבודה), התשס"ב–2002.</w:t>
+        <w:t xml:space="preserve">גליה הילדסהימר "חוזה עבודה אישי ומניעת הרעת תנאים, חלקים א'-ב'" מצגת הקורס היבטים משפטיים ואתיים בייעוץ ופיתוח ארגוני, המרכז האקדמי פרס (2026).</w:t>
       </w:r>
     </w:p>
   </w:footnote>
@@ -2945,7 +2973,7 @@
           <w:sz w:val="20"/>
           <w:szCs w:val="20"/>
         </w:rPr>
-        <w:t xml:space="preserve">ס' 11(א) לחוק פיצויי פיטורים, התשכ"ג–1963.</w:t>
+        <w:t xml:space="preserve">גיא דוידוב "הפררוגטיבה של המעביד ודיני החוזים: בעקבות פרשות נהרי וגרינשפן" משפטים לח(2) 417, 418 ו-439 (2008).</w:t>
       </w:r>
     </w:p>
   </w:footnote>
@@ -2975,7 +3003,7 @@
           <w:sz w:val="20"/>
           <w:szCs w:val="20"/>
         </w:rPr>
-        <w:t xml:space="preserve">ס' 1(א), שם.</w:t>
+        <w:t xml:space="preserve">ס' 2(א)(3), 3 ו-5א לחוק הודעה לעובד ולמועמד לעבודה (תנאי עבודה והליכי מיון וקבלה לעבודה), התשס"ב–2002.</w:t>
       </w:r>
     </w:p>
   </w:footnote>
@@ -3005,11 +3033,71 @@
           <w:sz w:val="20"/>
           <w:szCs w:val="20"/>
         </w:rPr>
-        <w:t xml:space="preserve">תב"ע (ארצי) נד/86-3 יוחנן גולן נ' אי.אל.די. בע"מ (להלן: עניין גולן).</w:t>
+        <w:t xml:space="preserve">ס' 11(א) לחוק פיצויי פיטורים, התשכ"ג–1963.</w:t>
       </w:r>
     </w:p>
   </w:footnote>
   <w:footnote w:id="25">
+    <w:p>
+      <w:pPr>
+        <w:bidi/>
+        <w:spacing w:before="0" w:after="0" w:line="240" w:lineRule="auto"/>
+        <w:jc w:val="both"/>
+      </w:pPr>
+      <w:r>
+        <w:rPr>
+          <w:vertAlign w:val="superscript"/>
+          <w:sz w:val="20"/>
+        </w:rPr>
+        <w:footnoteRef/>
+      </w:r>
+      <w:r>
+        <w:rPr>
+          <w:sz w:val="20"/>
+        </w:rPr>
+        <w:t xml:space="preserve"> </w:t>
+      </w:r>
+      <w:r>
+        <w:rPr>
+          <w:rtl/>
+          <w:sz w:val="20"/>
+          <w:szCs w:val="20"/>
+        </w:rPr>
+        <w:t xml:space="preserve">ס' 1(א), שם.</w:t>
+      </w:r>
+    </w:p>
+  </w:footnote>
+  <w:footnote w:id="26">
+    <w:p>
+      <w:pPr>
+        <w:bidi/>
+        <w:spacing w:before="0" w:after="0" w:line="240" w:lineRule="auto"/>
+        <w:jc w:val="both"/>
+      </w:pPr>
+      <w:r>
+        <w:rPr>
+          <w:vertAlign w:val="superscript"/>
+          <w:sz w:val="20"/>
+        </w:rPr>
+        <w:footnoteRef/>
+      </w:r>
+      <w:r>
+        <w:rPr>
+          <w:sz w:val="20"/>
+        </w:rPr>
+        <w:t xml:space="preserve"> </w:t>
+      </w:r>
+      <w:r>
+        <w:rPr>
+          <w:rtl/>
+          <w:sz w:val="20"/>
+          <w:szCs w:val="20"/>
+        </w:rPr>
+        <w:t xml:space="preserve">תב"ע (ארצי) נד/86-3 יוחנן גולן נ' אי.אל.די. בע"מ (להלן: עניין גולן).</w:t>
+      </w:r>
+    </w:p>
+  </w:footnote>
+  <w:footnote w:id="27">
     <w:p>
       <w:pPr>
         <w:bidi/>

</xml_diff>

<commit_message>
Final: course-only sources, each answer two pages
Co-Authored-By: Claude Opus 5.5 <noreply@anthropic.com>
Claude-Session: https://claude.ai/code/session_01BVH1n3fvCDz4inkznfhZC9
</commit_message>
<xml_diff>
--- a/output/עבודה_היבטים_משפטיים.docx
+++ b/output/עבודה_היבטים_משפטיים.docx
@@ -583,7 +583,7 @@
           <w:rtl/>
           <w:szCs w:val="24"/>
         </w:rPr>
-        <w:t xml:space="preserve">, יציבות החברה והמשך פעילותה בישראל, היא אינטרס של המעסיק. הנימוק שבהודעת הקבוצה אינו מחזיק: לפי </w:t>
+        <w:t xml:space="preserve">, יציבות החברה והמשך פעילותה בישראל, היא אינטרס של המעסיק. הנימוק שבהודעת הקבוצה אינו מחזיק משפטית. הוראות הסכם קיבוצי הן </w:t>
       </w:r>
       <w:r>
         <w:rPr>
@@ -593,7 +593,7 @@
           <w:szCs w:val="24"/>
           <w:bCs/>
         </w:rPr>
-        <w:t>סעיף 22 לחוק</w:t>
+        <w:t>כללים קוגנטיים</w:t>
       </w:r>
       <w:r>
         <w:rPr>
@@ -601,7 +601,57 @@
           <w:rtl/>
           <w:szCs w:val="24"/>
         </w:rPr>
-        <w:t xml:space="preserve"> הוראה אישית לטובת העובד גוברת על ההסכם הקיבוצי.</w:t>
+        <w:t xml:space="preserve">, ואילו חוזה אישי הוא </w:t>
+      </w:r>
+      <w:r>
+        <w:rPr>
+          <w:b/>
+          <w:sz w:val="24"/>
+          <w:rtl/>
+          <w:szCs w:val="24"/>
+          <w:bCs/>
+        </w:rPr>
+        <w:t>דיספוזיטיבי</w:t>
+      </w:r>
+      <w:r>
+        <w:rPr>
+          <w:sz w:val="24"/>
+          <w:rtl/>
+          <w:szCs w:val="24"/>
+        </w:rPr>
+        <w:t>,</w:t>
+      </w:r>
+      <w:r>
+        <w:rPr>
+          <w:vertAlign w:val="superscript"/>
+        </w:rPr>
+        <w:footnoteReference w:id="4"/>
+      </w:r>
+      <w:r>
+        <w:rPr>
+          <w:sz w:val="24"/>
+          <w:rtl/>
+          <w:szCs w:val="24"/>
+        </w:rPr>
+        <w:t xml:space="preserve"> אך לפי </w:t>
+      </w:r>
+      <w:r>
+        <w:rPr>
+          <w:b/>
+          <w:sz w:val="24"/>
+          <w:rtl/>
+          <w:szCs w:val="24"/>
+          <w:bCs/>
+        </w:rPr>
+        <w:t>סעיף 22 לחוק</w:t>
+      </w:r>
+      <w:r>
+        <w:rPr>
+          <w:sz w:val="24"/>
+          <w:rtl/>
+          <w:szCs w:val="24"/>
+        </w:rPr>
+        <w:t xml:space="preserve"> הוראה בחוזה האישי שהיא לטובת העובד גוברת על ההסכם הקיבוצי. הסכם קיבוצי קובע אפוא רצפה ואינו שולל משא ומתן אישי מעליה.</w:t>
       </w:r>
     </w:p>
     <w:p>
@@ -657,7 +707,7 @@
         <w:rPr>
           <w:vertAlign w:val="superscript"/>
         </w:rPr>
-        <w:footnoteReference w:id="4"/>
+        <w:footnoteReference w:id="5"/>
       </w:r>
       <w:r>
         <w:rPr>
@@ -665,13 +715,13 @@
           <w:rtl/>
           <w:szCs w:val="24"/>
         </w:rPr>
-        <w:t xml:space="preserve"> מטרתו העיקרית של ארגון עובדים חייבת להיות משא ומתן קיבוצי לשיפור תנאי העבודה,</w:t>
+        <w:t xml:space="preserve"> נפסק שמטרתו העיקרית של ארגון עובדים חייבת להיות משא ומתן קיבוצי לשיפור תנאי העבודה, ושהמודל הקיבוצי שבבסיס החוק אינו נסוג מפני התרחבות החוזים האישיים.</w:t>
       </w:r>
       <w:r>
         <w:rPr>
           <w:vertAlign w:val="superscript"/>
         </w:rPr>
-        <w:footnoteReference w:id="5"/>
+        <w:footnoteReference w:id="6"/>
       </w:r>
       <w:r>
         <w:rPr>
@@ -679,13 +729,13 @@
           <w:rtl/>
           <w:szCs w:val="24"/>
         </w:rPr>
-        <w:t xml:space="preserve"> וכשעיקר התנאים מעוגנים בחוזים האישיים, נותרת לזירה הקיבוצית רק "הפריפריה" של תנאי העבודה.</w:t>
+        <w:t xml:space="preserve"> עוד נקבע כי אותנטיות היא תנאי הכרחי אך לא מספיק, ו"התארגנות אותנטית של שני שלישים מעובדי המפעל בארגון שכל תכליתה התנגדות ליחסי עבודה קיבוציים אינה יכולה להפוך את אותה התארגנות לארגון עובדים".</w:t>
       </w:r>
       <w:r>
         <w:rPr>
           <w:vertAlign w:val="superscript"/>
         </w:rPr>
-        <w:footnoteReference w:id="6"/>
+        <w:footnoteReference w:id="7"/>
       </w:r>
       <w:r>
         <w:rPr>
@@ -693,13 +743,13 @@
           <w:rtl/>
           <w:szCs w:val="24"/>
         </w:rPr>
-        <w:t xml:space="preserve"> עוד נקבע כי אותנטיות היא תנאי הכרחי אך לא מספיק, ו"התארגנות אותנטית של שני שלישים מעובדי המפעל בארגון שכל תכליתה התנגדות ליחסי עבודה קיבוציים אינה יכולה להפוך את אותה התארגנות לארגון עובדים".</w:t>
+        <w:t xml:space="preserve"> בית הדין הדגיש גם את הטעם לכך: ארגון יציג מקבל כוח לחייב אף עובדים שאינם חברים בו, ולכן רק גוף הכשיר למלא תפקיד זה יוכר.</w:t>
       </w:r>
       <w:r>
         <w:rPr>
           <w:vertAlign w:val="superscript"/>
         </w:rPr>
-        <w:footnoteReference w:id="7"/>
+        <w:footnoteReference w:id="8"/>
       </w:r>
       <w:r>
         <w:rPr>
@@ -713,7 +763,7 @@
         <w:rPr>
           <w:vertAlign w:val="superscript"/>
         </w:rPr>
-        <w:footnoteReference w:id="8"/>
+        <w:footnoteReference w:id="9"/>
       </w:r>
       <w:r>
         <w:rPr>
@@ -736,7 +786,7 @@
           <w:rtl/>
           <w:szCs w:val="24"/>
         </w:rPr>
-        <w:t>אין בכך כדי לפגוע בחופש מהתארגנות. עובד רשאי שלא להצטרף להסתדרות, וסעיף 33י(א)(3) מגן עליו מפני פגיעה בשל כך. חבריה אינם נספרים לצורך היציגות, והודעתה כי היא הארגון היציג חסרת נפקות. חובת המעסיק לנהל משא ומתן בהתארגנות ראשונית חלה רק כלפי ארגון יציג לפי סעיף 3 (</w:t>
+        <w:t>אין בכך כדי לפגוע בחופש מהתארגנות. עובד רשאי שלא להצטרף להסתדרות, וסעיף 33י(א)(3) מגן עליו מפני פגיעה בשל כך. חברי הקבוצה אינם נספרים לצורך היציגות, והודעתה כי היא הארגון היציג חסרת נפקות. חובת המעסיק לנהל משא ומתן בהתארגנות ראשונית חלה רק כלפי ארגון יציג לפי סעיף 3 (</w:t>
       </w:r>
       <w:r>
         <w:rPr>
@@ -802,7 +852,7 @@
         <w:rPr>
           <w:vertAlign w:val="superscript"/>
         </w:rPr>
-        <w:footnoteReference w:id="9"/>
+        <w:footnoteReference w:id="10"/>
       </w:r>
       <w:r>
         <w:rPr>
@@ -810,7 +860,7 @@
           <w:rtl/>
           <w:szCs w:val="24"/>
         </w:rPr>
-        <w:t xml:space="preserve"> נקבע כי בשלב </w:t>
+        <w:t xml:space="preserve"> איזן בית הדין בין חופש הביטוי של המעסיק לחופש ההתארגנות, והבחין בין </w:t>
       </w:r>
       <w:r>
         <w:rPr>
@@ -828,7 +878,7 @@
           <w:rtl/>
           <w:szCs w:val="24"/>
         </w:rPr>
-        <w:t>, לפני שקם ארגון יציג, גובר חופש ההתארגנות על חופש הביטוי של המעסיק. המעסיק אינו רשאי להביע עמדה על ההתארגנות בשום ערוץ, לרבות ב</w:t>
+        <w:t xml:space="preserve"> לבין שלב שבו כבר קיים ארגון יציג. בשלב הראשון גובר חופש ההתארגנות: המעסיק אינו רשאי להביע עמדה על ההתארגנות בשום ערוץ, לרבות ב</w:t>
       </w:r>
       <w:r>
         <w:rPr>
@@ -846,21 +896,7 @@
           <w:rtl/>
           <w:szCs w:val="24"/>
         </w:rPr>
-        <w:t xml:space="preserve"> ובדואר אלקטרוני, וגם הצבעה על חסרונותיה לעובדים או לחברה, נכונה ככל שתהיה, אסורה. ההלכה אושרה בבג"ץ.</w:t>
-      </w:r>
-      <w:r>
-        <w:rPr>
-          <w:vertAlign w:val="superscript"/>
-        </w:rPr>
-        <w:footnoteReference w:id="10"/>
-      </w:r>
-      <w:r>
-        <w:rPr>
-          <w:sz w:val="24"/>
-          <w:rtl/>
-          <w:szCs w:val="24"/>
-        </w:rPr>
-        <w:t xml:space="preserve"> ההתארגנות ב-NeuroTech נמצאת בשלב הפורץ, ולכן שלוש פעולות ההנהלה אסורות.</w:t>
+        <w:t xml:space="preserve"> ובדואר אלקטרוני, וגם הצבעה על חסרונותיה לעובדים או לחברה, נכונה ככל שתהיה, אסורה. ההתארגנות ב-NeuroTech נמצאת בשלב הפורץ, ולכן שלוש פעולות ההנהלה אסורות.</w:t>
       </w:r>
     </w:p>
     <w:p>
@@ -903,7 +939,7 @@
           <w:rtl/>
           <w:szCs w:val="24"/>
         </w:rPr>
-        <w:t xml:space="preserve"> לשוחח עם עובדיהם על "יתרונות המודל האישי" היא מפגש אישי שנאסר במפורש. חומרתה רבה, שכן המנהלים משפיעים על הבונוסים והקידום. </w:t>
+        <w:t xml:space="preserve"> לשוחח עם עובדיהם על "יתרונות המודל האישי" היא מפגש אישי שנאסר במפורש. חומרתה רבה, שכן המנהלים משפיעים על הבונוסים והקידום, וכל שיחה כזו עלולה להיתפס כאיום. </w:t>
       </w:r>
       <w:r>
         <w:rPr>
@@ -1099,7 +1135,7 @@
           <w:rtl/>
           <w:szCs w:val="24"/>
         </w:rPr>
-        <w:t xml:space="preserve"> בהן.</w:t>
+        <w:t xml:space="preserve"> בהן. השיחות התקיימו במשרד, ולכן ב"מסגרת יחסי עבודה".</w:t>
       </w:r>
     </w:p>
     <w:p>
@@ -1114,7 +1150,7 @@
           <w:rtl/>
           <w:szCs w:val="24"/>
         </w:rPr>
-        <w:t>"הראה" פירושו במילים או בהתנהגות שאין ספק סביר לגבי משמעותה (הגדרות שבסעיף 2 לחוק), שכן התייחסויות כאלה כשלעצמן הן התנהגות ניטרלית, ההופכת להטרדה רק כשאינה רצויה.</w:t>
+        <w:t>"הראה" פירושו במילים או בהתנהגות שאין ספק סביר לגבי משמעותה.</w:t>
       </w:r>
       <w:r>
         <w:rPr>
@@ -1179,7 +1215,7 @@
           <w:rtl/>
           <w:szCs w:val="24"/>
         </w:rPr>
-        <w:t>, כאשר ההתייחסויות נעשות תוך ניצול יחסי מרות בעבודה, אין צורך שהמוטרד יראה שאינו מעוניין. ב</w:t>
+        <w:t>, כאשר ההתייחסויות נעשות תוך ניצול מרות ביחסי עבודה, אין צורך שהמוטרד יראה שאינו מעוניין. ב</w:t>
       </w:r>
       <w:r>
         <w:rPr>
@@ -1203,21 +1239,7 @@
           <w:rtl/>
           <w:szCs w:val="24"/>
         </w:rPr>
-        <w:t xml:space="preserve"> נקבע שיחסי מרות התקיימו אף שהמטריד לא היה הממונה הישיר, ושבקשה עמומה להפסיק אינה שוללת את ההטרדה. לדנה אין סמכות לקבל או לפטר, אך היא משפיעה על שיבוץ וקידום עובדים צעירים כמו אורי. לפי הלכת מדר אלה יחסי מרות. חלופה זו מכירה בחולשת הכפוף, העלולה לשלול ממנו רצון חופשי, ומטילה על בעל המרות לזהות בעצמו התנהגות שעלולה להיתפס כמטרידה.</w:t>
-      </w:r>
-      <w:r>
-        <w:rPr>
-          <w:vertAlign w:val="superscript"/>
-        </w:rPr>
-        <w:footnoteReference w:id="14"/>
-      </w:r>
-      <w:r>
-        <w:rPr>
-          <w:sz w:val="24"/>
-          <w:rtl/>
-          <w:szCs w:val="24"/>
-        </w:rPr>
-        <w:t xml:space="preserve"> לכן השתתפותו של אורי אינה מעידה בהכרח על הסכמה.</w:t>
+        <w:t xml:space="preserve"> נקבע שיחסי מרות התקיימו אף שהמטריד לא היה הממונה הישיר, ושבקשה עמומה להפסיק, שנבעה מחשש למקום העבודה, אינה שוללת את ההטרדה. לדנה אין סמכות לקבל או לפטר, אך היא משפיעה על שיבוץ וקידום עובדים צעירים כמו אורי. לפי הלכת מדר אלה יחסי מרות, ולכן השתתפותו של אורי בשיחות אינה מעידה בהכרח על הסכמה.</w:t>
       </w:r>
     </w:p>
     <w:p>
@@ -1268,7 +1290,25 @@
           <w:rtl/>
           <w:szCs w:val="24"/>
         </w:rPr>
-        <w:t xml:space="preserve"> יחסי המרות. השאלה על נטייתו של אורי נשאלה פעם אחת. רוב השיחות עסקו בחייה של דנה והיו הדדיות, ולכן קשה לבסס כאן הטרדה מינית. תחושתה של דנה כי הם "חברים טובים" אינה מכרעת: אילו הוכח ניצול מרות, היה עליה לזהות בעצמה שההתנהגות עלולה לפגוע, ואין צורך שאורי יראה זאת.</w:t>
+        <w:t xml:space="preserve"> יחסי המרות. השאלה על נטייתו של אורי נשאלה פעם אחת. רוב השיחות עסקו בחייה של דנה והיו הדדיות, ולכן קשה לבסס כאן הטרדה מינית. תחושתה של דנה כי הם "חברים טובים" אינה מכרעת: אילו הוכח ניצול מרות, לא היה צורך שאורי יראה דבר. אין זו גם </w:t>
+      </w:r>
+      <w:r>
+        <w:rPr>
+          <w:b/>
+          <w:sz w:val="24"/>
+          <w:rtl/>
+          <w:szCs w:val="24"/>
+          <w:bCs/>
+        </w:rPr>
+        <w:t>הטרדה סביבתית</w:t>
+      </w:r>
+      <w:r>
+        <w:rPr>
+          <w:sz w:val="24"/>
+          <w:rtl/>
+          <w:szCs w:val="24"/>
+        </w:rPr>
+        <w:t>, שכן ההתנהגות לא יצרה אווירה כללית במשרד.</w:t>
       </w:r>
     </w:p>
     <w:p>
@@ -1360,7 +1400,15 @@
         <w:rPr>
           <w:vertAlign w:val="superscript"/>
         </w:rPr>
-        <w:footnoteReference w:id="15"/>
+        <w:footnoteReference w:id="14"/>
+      </w:r>
+      <w:r>
+        <w:rPr>
+          <w:sz w:val="24"/>
+          <w:rtl/>
+          <w:szCs w:val="24"/>
+        </w:rPr>
+        <w:t xml:space="preserve"> מעסיק שלא עשה כן אחראי בנזיקין למעשי עובדיו (סעיף 7(ג)).</w:t>
       </w:r>
     </w:p>
     <w:p>
@@ -1385,7 +1433,7 @@
           <w:rtl/>
           <w:szCs w:val="24"/>
         </w:rPr>
-        <w:t xml:space="preserve"> היא פגיעה מכל סוג שמקורה בהטרדה מינית או בתלונה עליה (סעיף 3(ב)). </w:t>
+        <w:t xml:space="preserve"> היא פגיעה מכל סוג שמקורה בהטרדה מינית או בתלונה עליה (סעיף 3(ב)), ואינה מותנית בכך שהמוטרד סירב. החוק מרחיב את המושג לפגיעה לפי סעיף 7 לחוק שוויון ההזדמנויות בעבודה, שלעניינה די ב</w:t>
       </w:r>
       <w:r>
         <w:rPr>
@@ -1395,7 +1443,7 @@
           <w:szCs w:val="24"/>
           <w:bCs/>
         </w:rPr>
-        <w:t>חוק שוויון ההזדמנויות בעבודה</w:t>
+        <w:t>התייחסות אחת</w:t>
       </w:r>
       <w:r>
         <w:rPr>
@@ -1403,17 +1451,27 @@
           <w:rtl/>
           <w:szCs w:val="24"/>
         </w:rPr>
-        <w:t xml:space="preserve"> אוסר על מעסיק לפגוע בעובד כשמקור הפגיעה בהטרדה מינית, וקובע שלעניין זה די ב</w:t>
-      </w:r>
-      <w:r>
-        <w:rPr>
-          <w:b/>
+        <w:t xml:space="preserve"> לפי סעיף 3(א)(4).</w:t>
+      </w:r>
+      <w:r>
+        <w:rPr>
+          <w:vertAlign w:val="superscript"/>
+        </w:rPr>
+        <w:footnoteReference w:id="15"/>
+      </w:r>
+      <w:r>
+        <w:rPr>
           <w:sz w:val="24"/>
           <w:rtl/>
           <w:szCs w:val="24"/>
-          <w:bCs/>
-        </w:rPr>
-        <w:t>התייחסות אחת</w:t>
+        </w:rPr>
+        <w:t xml:space="preserve"> אם יוכרו יחסי מרות, גם השאלה הבודדת על נטייתו של אורי עשויה להספיק. העברתו חודש אחרי שביקש לסיים את השיחות, והשפעתה של דנה על השיבוץ, מעוררות חשד לקשר כזה. משהוכיח זאת אורי, עובר למעסיק הנטל להראות שלא פגע בו,</w:t>
+      </w:r>
+      <w:r>
+        <w:rPr>
+          <w:vertAlign w:val="superscript"/>
+        </w:rPr>
+        <w:footnoteReference w:id="16"/>
       </w:r>
       <w:r>
         <w:rPr>
@@ -1421,13 +1479,13 @@
           <w:rtl/>
           <w:szCs w:val="24"/>
         </w:rPr>
-        <w:t xml:space="preserve"> לפי סעיף 3(א)(4).</w:t>
+        <w:t xml:space="preserve"> ובית הדין רשאי לפסוק פיצוי של עד 120,000 ש"ח ללא הוכחת נזק.</w:t>
       </w:r>
       <w:r>
         <w:rPr>
           <w:vertAlign w:val="superscript"/>
         </w:rPr>
-        <w:footnoteReference w:id="16"/>
+        <w:footnoteReference w:id="17"/>
       </w:r>
       <w:r>
         <w:rPr>
@@ -1435,41 +1493,7 @@
           <w:rtl/>
           <w:szCs w:val="24"/>
         </w:rPr>
-        <w:t xml:space="preserve"> אם יוכרו יחסי מרות, גם השאלה הבודדת על נטייתו של אורי עשויה להספיק, והתנכלות אפשרית גם כשהמוטרד שיתף פעולה ולא סירב.</w:t>
-      </w:r>
-      <w:r>
-        <w:rPr>
-          <w:vertAlign w:val="superscript"/>
-        </w:rPr>
-        <w:footnoteReference w:id="17"/>
-      </w:r>
-      <w:r>
-        <w:rPr>
-          <w:sz w:val="24"/>
-          <w:rtl/>
-          <w:szCs w:val="24"/>
-        </w:rPr>
-        <w:t xml:space="preserve"> העברתו חודש אחרי שביקש לסיים את השיחות, והשפעתה של דנה על השיבוץ, מעוררות חשד לקשר כזה. משהוכיח זאת אורי, עובר למעסיק הנטל להראות שלא פגע בו.</w:t>
-      </w:r>
-      <w:r>
-        <w:rPr>
-          <w:vertAlign w:val="superscript"/>
-        </w:rPr>
-        <w:footnoteReference w:id="18"/>
-      </w:r>
-      <w:r>
-        <w:rPr>
-          <w:sz w:val="24"/>
-          <w:rtl/>
-          <w:szCs w:val="24"/>
-        </w:rPr>
-        <w:t xml:space="preserve"> אם תוכח התנכלות, רשאי בית הדין לפסוק לאורי פיצוי של עד 120,000 ש"ח ללא הוכחת נזק.</w:t>
-      </w:r>
-      <w:r>
-        <w:rPr>
-          <w:vertAlign w:val="superscript"/>
-        </w:rPr>
-        <w:footnoteReference w:id="19"/>
+        <w:t xml:space="preserve"> לצד ההליך האזרחי פתוחים בפני אורי גם הליך משמעתי, תלונה פלילית ותביעה נגד המעסיק.</w:t>
       </w:r>
     </w:p>
     <w:p>
@@ -1519,13 +1543,13 @@
           <w:rtl/>
           <w:szCs w:val="24"/>
         </w:rPr>
-        <w:t xml:space="preserve"> מעסיק אינו רשאי לשנות את חוזה העבודה באופן חד-צדדי,</w:t>
+        <w:t xml:space="preserve"> מעסיק אינו רשאי לשנות את חוזה העבודה באופן חד-צדדי.</w:t>
       </w:r>
       <w:r>
         <w:rPr>
           <w:vertAlign w:val="superscript"/>
         </w:rPr>
-        <w:footnoteReference w:id="20"/>
+        <w:footnoteReference w:id="18"/>
       </w:r>
       <w:r>
         <w:rPr>
@@ -1533,7 +1557,7 @@
           <w:rtl/>
           <w:szCs w:val="24"/>
         </w:rPr>
-        <w:t xml:space="preserve"> ושינוי שחורג מה</w:t>
+        <w:t xml:space="preserve"> ה</w:t>
       </w:r>
       <w:r>
         <w:rPr>
@@ -1551,7 +1575,7 @@
           <w:rtl/>
           <w:szCs w:val="24"/>
         </w:rPr>
-        <w:t xml:space="preserve"> ופוגע ב</w:t>
+        <w:t xml:space="preserve"> מתירה לו לשנות נהלי עבודה, כמו חובת השתתפות בישיבות, אך שינוי הפוגע ב</w:t>
       </w:r>
       <w:r>
         <w:rPr>
@@ -1593,7 +1617,7 @@
         <w:rPr>
           <w:vertAlign w:val="superscript"/>
         </w:rPr>
-        <w:footnoteReference w:id="21"/>
+        <w:footnoteReference w:id="19"/>
       </w:r>
       <w:r>
         <w:rPr>
@@ -1601,27 +1625,13 @@
           <w:rtl/>
           <w:szCs w:val="24"/>
         </w:rPr>
-        <w:t xml:space="preserve"> עם זאת, העברה בין תפקידים נחשבת בדרך כלל לחלק מהפררוגטיבה, בכפוף לתום הלב.</w:t>
+        <w:t xml:space="preserve"> הוצאתו של אורי מישיבות הקריאטיב לבדה מצויה בתחום הפררוגטיבה, אך העברתו מהפרויקטים המרכזיים לעריכה טכנית, עם פחות אחריות, פגעה במעמדו אף ששכרו לא השתנה. גם הפררוגטיבה כפופה לתום לב, ותזמון ההעברה מעורר ספק בכך. שינוי ב"תיאור עיקרי התפקיד" מחייב הודעה בכתב בתוך 30 יום, ובהיעדרה הנטל עובר למעסיק.</w:t>
       </w:r>
       <w:r>
         <w:rPr>
           <w:vertAlign w:val="superscript"/>
         </w:rPr>
-        <w:footnoteReference w:id="22"/>
-      </w:r>
-      <w:r>
-        <w:rPr>
-          <w:sz w:val="24"/>
-          <w:rtl/>
-          <w:szCs w:val="24"/>
-        </w:rPr>
-        <w:t xml:space="preserve"> העברתו של אורי פגעה במעמדו אף ששכרו לא השתנה, ותזמונה מעורר ספק בתום הלב. שינוי ב"תיאור עיקרי התפקיד" מחייב הודעה בכתב בתוך 30 יום, ובהיעדרה הנטל עובר למעסיק.</w:t>
-      </w:r>
-      <w:r>
-        <w:rPr>
-          <w:vertAlign w:val="superscript"/>
-        </w:rPr>
-        <w:footnoteReference w:id="23"/>
+        <w:footnoteReference w:id="20"/>
       </w:r>
     </w:p>
     <w:p>
@@ -1678,7 +1688,7 @@
         <w:rPr>
           <w:vertAlign w:val="superscript"/>
         </w:rPr>
-        <w:footnoteReference w:id="24"/>
+        <w:footnoteReference w:id="21"/>
       </w:r>
       <w:r>
         <w:rPr>
@@ -1692,7 +1702,7 @@
         <w:rPr>
           <w:vertAlign w:val="superscript"/>
         </w:rPr>
-        <w:footnoteReference w:id="25"/>
+        <w:footnoteReference w:id="22"/>
       </w:r>
       <w:r>
         <w:rPr>
@@ -1787,7 +1797,7 @@
           <w:rtl/>
           <w:szCs w:val="24"/>
         </w:rPr>
-        <w:t>. ב</w:t>
+        <w:t>, שכן שיהוי עלול להתפרש כהסכמה בהתנהגות. ב</w:t>
       </w:r>
       <w:r>
         <w:rPr>
@@ -1803,7 +1813,7 @@
         <w:rPr>
           <w:vertAlign w:val="superscript"/>
         </w:rPr>
-        <w:footnoteReference w:id="26"/>
+        <w:footnoteReference w:id="23"/>
       </w:r>
       <w:r>
         <w:rPr>
@@ -1832,7 +1842,7 @@
         <w:rPr>
           <w:vertAlign w:val="superscript"/>
         </w:rPr>
-        <w:footnoteReference w:id="27"/>
+        <w:footnoteReference w:id="24"/>
       </w:r>
       <w:r>
         <w:rPr>
@@ -1840,7 +1850,7 @@
           <w:rtl/>
           <w:szCs w:val="24"/>
         </w:rPr>
-        <w:t xml:space="preserve"> שתיקתו מלמדת על השלמה.</w:t>
+        <w:t xml:space="preserve"> שתיקתו מלמדת על השלמה. גם חלופת "הנסיבות האחרות" אינה מסייעת לו: נדרשות נסיבות שלפי אמות מידה אובייקטיביות אין לדרוש מהעובד להישאר בהן, כמו השפלה או פגיעה, ולא די באי־שביעות רצון. השיחות הסתיימו חודשים לפני ההתפטרות.</w:t>
       </w:r>
     </w:p>
     <w:p>
@@ -2082,7 +2092,7 @@
           <w:rtl/>
           <w:szCs w:val="24"/>
         </w:rPr>
-        <w:t>עס"ק (ארצי) 7670-10-20 דור אלון ניהול מתחמים קמעונאיים בע"מ נ' הסתדרות העובדים הלאומית בישראל (12.1.2021).</w:t>
+        <w:t>עש"ם 2203/05 מדר נ' נציבות שירות המדינה (נבו 21.7.2005).</w:t>
       </w:r>
     </w:p>
     <w:p>
@@ -2097,7 +2107,7 @@
           <w:rtl/>
           <w:szCs w:val="24"/>
         </w:rPr>
-        <w:t>עש"ם 2203/05 מדר נ' נציבות שירות המדינה (נבו 21.7.2005).</w:t>
+        <w:t>תב"ע (ארצי) נד/86-3 יוחנן גולן נ' אי.אל.די. בע"מ.</w:t>
       </w:r>
     </w:p>
     <w:p>
@@ -2112,7 +2122,24 @@
           <w:rtl/>
           <w:szCs w:val="24"/>
         </w:rPr>
-        <w:t>תב"ע (ארצי) נד/86-3 יוחנן גולן נ' אי.אל.די. בע"מ.</w:t>
+        <w:t>ע"ע (ארצי) 28475-03-20 סלמאן נ' אקובג בע"מ (נבו 7.12.2020).</w:t>
+      </w:r>
+    </w:p>
+    <w:p>
+      <w:pPr>
+        <w:bidi/>
+        <w:spacing w:before="120" w:after="0"/>
+        <w:jc w:val="both"/>
+      </w:pPr>
+      <w:r>
+        <w:rPr>
+          <w:b/>
+          <w:sz w:val="24"/>
+          <w:rtl/>
+          <w:szCs w:val="24"/>
+          <w:bCs/>
+        </w:rPr>
+        <w:t>ספרות וחומרי הקורס</w:t>
       </w:r>
     </w:p>
     <w:p>
@@ -2127,24 +2154,7 @@
           <w:rtl/>
           <w:szCs w:val="24"/>
         </w:rPr>
-        <w:t>ע"ע (ארצי) 28475-03-20 סלמאן נ' אקובג בע"מ (נבו 7.12.2020).</w:t>
-      </w:r>
-    </w:p>
-    <w:p>
-      <w:pPr>
-        <w:bidi/>
-        <w:spacing w:before="120" w:after="0"/>
-        <w:jc w:val="both"/>
-      </w:pPr>
-      <w:r>
-        <w:rPr>
-          <w:b/>
-          <w:sz w:val="24"/>
-          <w:rtl/>
-          <w:szCs w:val="24"/>
-          <w:bCs/>
-        </w:rPr>
-        <w:t>ספרות וחומרי הקורס</w:t>
+        <w:t>רות בן-ישראל דיני עבודה כרך א 48-32 (2002).</w:t>
       </w:r>
     </w:p>
     <w:p>
@@ -2159,67 +2169,7 @@
           <w:rtl/>
           <w:szCs w:val="24"/>
         </w:rPr>
-        <w:t>ניצן צבי כהן "בית הדין קבע: ההסתדרות תשמש כארגון העובדים היציג בחברת נוקיה" דבר 10.6.2025.</w:t>
-      </w:r>
-    </w:p>
-    <w:p>
-      <w:pPr>
-        <w:bidi/>
-        <w:spacing w:before="0" w:after="0"/>
-        <w:jc w:val="both"/>
-      </w:pPr>
-      <w:r>
-        <w:rPr>
-          <w:sz w:val="24"/>
-          <w:rtl/>
-          <w:szCs w:val="24"/>
-        </w:rPr>
-        <w:t>גיא דוידוב "הפררוגטיבה של המעביד ודיני החוזים: בעקבות פרשות נהרי וגרינשפן" משפטים לח(2) 417 (2008).</w:t>
-      </w:r>
-    </w:p>
-    <w:p>
-      <w:pPr>
-        <w:bidi/>
-        <w:spacing w:before="0" w:after="0"/>
-        <w:jc w:val="both"/>
-      </w:pPr>
-      <w:r>
-        <w:rPr>
-          <w:sz w:val="24"/>
-          <w:rtl/>
-          <w:szCs w:val="24"/>
-        </w:rPr>
-        <w:t>עצמון ליפשיץ "האם הגיעה העת לשנות את כללי ההתארגנות הראשונית? מחשבות נוספות בראי הזמן" מעשי משפט יא 303 (2020).</w:t>
-      </w:r>
-    </w:p>
-    <w:p>
-      <w:pPr>
-        <w:bidi/>
-        <w:spacing w:before="0" w:after="0"/>
-        <w:jc w:val="both"/>
-      </w:pPr>
-      <w:r>
-        <w:rPr>
-          <w:sz w:val="24"/>
-          <w:rtl/>
-          <w:szCs w:val="24"/>
-        </w:rPr>
-        <w:t>Orit Kamir, __Sexual Harassment Law in Israel__, 7 INT'L J. DISCRIMINATION &amp; L. 315 (2005).</w:t>
-      </w:r>
-    </w:p>
-    <w:p>
-      <w:pPr>
-        <w:bidi/>
-        <w:spacing w:before="0" w:after="0"/>
-        <w:jc w:val="both"/>
-      </w:pPr>
-      <w:r>
-        <w:rPr>
-          <w:sz w:val="24"/>
-          <w:rtl/>
-          <w:szCs w:val="24"/>
-        </w:rPr>
-        <w:t>רות בן-ישראל דיני עבודה כרך א 48-32 (2002).</w:t>
+        <w:t>גליה הילדסהימר "היבטים משפטיים ואתיים בייעוץ ופיתוח ארגוני – מבוא" מצגת הקורס היבטים משפטיים ואתיים בייעוץ ופיתוח ארגוני, המרכז האקדמי פרס (2026).</w:t>
       </w:r>
     </w:p>
     <w:p>
@@ -2326,7 +2276,7 @@
           <w:sz w:val="20"/>
           <w:szCs w:val="20"/>
         </w:rPr>
-        <w:t xml:space="preserve">רות בן-ישראל דיני עבודה כרך א 48-32 (2002); עצמון ליפשיץ "האם הגיעה העת לשנות את כללי ההתארגנות הראשונית? מחשבות נוספות בראי הזמן" מעשי משפט יא 303, 308 (2020); עס"ק (ארצי) 7670-10-20 דור אלון ניהול מתחמים קמעונאיים בע"מ נ' הסתדרות העובדים הלאומית בישראל, פס' 70 (12.1.2021) (להלן: עניין דור אלון); גליה הילדסהימר "התארגנויות עובדים" מצגת הקורס היבטים משפטיים ואתיים בייעוץ ופיתוח ארגוני, המרכז האקדמי פרס (2026).</w:t>
+        <w:t xml:space="preserve">רות בן-ישראל דיני עבודה כרך א 48-32 (2002); גליה הילדסהימר "התארגנויות עובדים" מצגת הקורס היבטים משפטיים ואתיים בייעוץ ופיתוח ארגוני, המרכז האקדמי פרס (2026).</w:t>
       </w:r>
     </w:p>
   </w:footnote>
@@ -2416,7 +2366,7 @@
           <w:sz w:val="20"/>
           <w:szCs w:val="20"/>
         </w:rPr>
-        <w:t xml:space="preserve">עס"ק (ארצי) 6298-03-25 הסתדרות העובדים הכללית החדשה – האגף להתאגדות עובדים נ' ארגון עובדי הפיתוח והשיווק בנוקיה ישראל (נבו 10.6.2025) (להלן: עניין נוקיה), פס' 6, 41 ו-44.</w:t>
+        <w:t xml:space="preserve">גליה הילדסהימר "היבטים משפטיים ואתיים בייעוץ ופיתוח ארגוני – מבוא" מצגת הקורס היבטים משפטיים ואתיים בייעוץ ופיתוח ארגוני, המרכז האקדמי פרס (2026); ס' 19-20 לחוק הסכמים קיבוציים.</w:t>
       </w:r>
     </w:p>
   </w:footnote>
@@ -2446,7 +2396,7 @@
           <w:sz w:val="20"/>
           <w:szCs w:val="20"/>
         </w:rPr>
-        <w:t xml:space="preserve">שם, פס' 50-51.</w:t>
+        <w:t xml:space="preserve">עס"ק (ארצי) 6298-03-25 הסתדרות העובדים הכללית החדשה – האגף להתאגדות עובדים נ' ארגון עובדי הפיתוח והשיווק בנוקיה ישראל (נבו 10.6.2025) (להלן: עניין נוקיה), פס' 6, 41 ו-44.</w:t>
       </w:r>
     </w:p>
   </w:footnote>
@@ -2476,7 +2426,7 @@
           <w:sz w:val="20"/>
           <w:szCs w:val="20"/>
         </w:rPr>
-        <w:t xml:space="preserve">שם, כפי שצוטט אצל ניצן צבי כהן "בית הדין קבע: ההסתדרות תשמש כארגון העובדים היציג בחברת נוקיה" דבר 10.6.2025.</w:t>
+        <w:t xml:space="preserve">שם, פס' 50-51.</w:t>
       </w:r>
     </w:p>
   </w:footnote>
@@ -2506,7 +2456,7 @@
           <w:sz w:val="20"/>
           <w:szCs w:val="20"/>
         </w:rPr>
-        <w:t xml:space="preserve">עניין נוקיה, לעיל ה"ש 4, פס' 47.</w:t>
+        <w:t xml:space="preserve">שם, פס' 47.</w:t>
       </w:r>
     </w:p>
   </w:footnote>
@@ -2536,7 +2486,7 @@
           <w:sz w:val="20"/>
           <w:szCs w:val="20"/>
         </w:rPr>
-        <w:t xml:space="preserve">עניין נוקיה, לעיל ה"ש 4, פס' 18.</w:t>
+        <w:t xml:space="preserve">שם, פס' 43.</w:t>
       </w:r>
     </w:p>
   </w:footnote>
@@ -2566,7 +2516,7 @@
           <w:sz w:val="20"/>
           <w:szCs w:val="20"/>
         </w:rPr>
-        <w:t xml:space="preserve">עס"ק (ארצי) 25476-09-12 הסתדרות העובדים הכללית החדשה נ' פלאפון תקשורת בע"מ (נבו 2.1.2013) (להלן: עניין פלאפון).</w:t>
+        <w:t xml:space="preserve">שם, פס' 18.</w:t>
       </w:r>
     </w:p>
   </w:footnote>
@@ -2596,7 +2546,7 @@
           <w:sz w:val="20"/>
           <w:szCs w:val="20"/>
         </w:rPr>
-        <w:t xml:space="preserve">בג"ץ 4179/13 לשכת התיאום של הארגונים הכלכליים נ' בית הדין הארצי לעבודה (נבו 7.7.2014); ליפשיץ, לעיל ה"ש 1, בעמ' 320. על הרגישות המיוחדת של שלב הפריצה בשל החשש מהתערבות המעסיק ראו עניין דור אלון, לעיל ה"ש 1, פס' 71.</w:t>
+        <w:t xml:space="preserve">עס"ק (ארצי) 25476-09-12 הסתדרות העובדים הכללית החדשה נ' פלאפון תקשורת בע"מ (נבו 2.1.2013) (להלן: עניין פלאפון).</w:t>
       </w:r>
     </w:p>
   </w:footnote>
@@ -2656,24 +2606,7 @@
           <w:sz w:val="20"/>
           <w:szCs w:val="20"/>
         </w:rPr>
-        <w:t xml:space="preserve">Orit Kamir, </w:t>
-      </w:r>
-      <w:r>
-        <w:rPr>
-          <w:i/>
-          <w:iCs/>
-          <w:sz w:val="20"/>
-          <w:szCs w:val="20"/>
-        </w:rPr>
-        <w:t xml:space="preserve">Sexual Harassment Law in Israel</w:t>
-      </w:r>
-      <w:r>
-        <w:rPr>
-          <w:rtl/>
-          <w:sz w:val="20"/>
-          <w:szCs w:val="20"/>
-        </w:rPr>
-        <w:t xml:space="preserve">, 7 INT'L J. DISCRIMINATION &amp; L. 315, 321 (2005).</w:t>
+        <w:t xml:space="preserve">ס' 2 לחוק למניעת הטרדה מינית (הגדרות "הראה" ו"מסגרת יחסי עבודה").</w:t>
       </w:r>
     </w:p>
   </w:footnote>
@@ -2733,7 +2666,7 @@
           <w:sz w:val="20"/>
           <w:szCs w:val="20"/>
         </w:rPr>
-        <w:t xml:space="preserve">Kamir, לעיל ה"ש 12, בעמ' 324.</w:t>
+        <w:t xml:space="preserve">תק' 2(ג), 4, 6(ט) ו-8 לתקנות למניעת הטרדה מינית (חובות מעסיק), התשנ"ח–1998.</w:t>
       </w:r>
     </w:p>
   </w:footnote>
@@ -2763,7 +2696,7 @@
           <w:sz w:val="20"/>
           <w:szCs w:val="20"/>
         </w:rPr>
-        <w:t xml:space="preserve">תק' 2(ג), 4, 6(ט) ו-8 לתקנות למניעת הטרדה מינית (חובות מעסיק), התשנ"ח–1998.</w:t>
+        <w:t xml:space="preserve">ס' 7(ו) לחוק למניעת הטרדה מינית; ס' 7(א) לחוק שוויון ההזדמנויות בעבודה, התשמ"ח–1988.</w:t>
       </w:r>
     </w:p>
   </w:footnote>
@@ -2793,7 +2726,7 @@
           <w:sz w:val="20"/>
           <w:szCs w:val="20"/>
         </w:rPr>
-        <w:t xml:space="preserve">ס' 7(א) לחוק שוויון ההזדמנויות בעבודה, התשמ"ח–1988.</w:t>
+        <w:t xml:space="preserve">ס' 6א לחוק למניעת הטרדה מינית.</w:t>
       </w:r>
     </w:p>
   </w:footnote>
@@ -2823,7 +2756,7 @@
           <w:sz w:val="20"/>
           <w:szCs w:val="20"/>
         </w:rPr>
-        <w:t xml:space="preserve">Kamir, לעיל ה"ש 12, בעמ' 324.</w:t>
+        <w:t xml:space="preserve">ס' 6(ב), שם.</w:t>
       </w:r>
     </w:p>
   </w:footnote>
@@ -2853,7 +2786,7 @@
           <w:sz w:val="20"/>
           <w:szCs w:val="20"/>
         </w:rPr>
-        <w:t xml:space="preserve">ס' 9(ב) לחוק שוויון ההזדמנויות בעבודה; ס' 6א לחוק למניעת הטרדה מינית.</w:t>
+        <w:t xml:space="preserve">בג"ץ 239/83 מילפלדר נ' בית הדין הארצי לעבודה, פ"ד מא(2) 210 (1987).</w:t>
       </w:r>
     </w:p>
   </w:footnote>
@@ -2883,7 +2816,7 @@
           <w:sz w:val="20"/>
           <w:szCs w:val="20"/>
         </w:rPr>
-        <w:t xml:space="preserve">ס' 6(ב) לחוק למניעת הטרדה מינית; ס' 10(א)(1) לחוק שוויון ההזדמנויות בעבודה.</w:t>
+        <w:t xml:space="preserve">גליה הילדסהימר "חוזה עבודה אישי ומניעת הרעת תנאים, חלקים א'-ב'" מצגת הקורס היבטים משפטיים ואתיים בייעוץ ופיתוח ארגוני, המרכז האקדמי פרס (2026).</w:t>
       </w:r>
     </w:p>
   </w:footnote>
@@ -2913,7 +2846,7 @@
           <w:sz w:val="20"/>
           <w:szCs w:val="20"/>
         </w:rPr>
-        <w:t xml:space="preserve">בג"ץ 239/83 מילפלדר נ' בית הדין הארצי לעבודה, פ"ד מא(2) 210 (1987).</w:t>
+        <w:t xml:space="preserve">ס' 2(א)(3), 3 ו-5א לחוק הודעה לעובד ולמועמד לעבודה (תנאי עבודה והליכי מיון וקבלה לעבודה), התשס"ב–2002.</w:t>
       </w:r>
     </w:p>
   </w:footnote>
@@ -2943,7 +2876,7 @@
           <w:sz w:val="20"/>
           <w:szCs w:val="20"/>
         </w:rPr>
-        <w:t xml:space="preserve">גליה הילדסהימר "חוזה עבודה אישי ומניעת הרעת תנאים, חלקים א'-ב'" מצגת הקורס היבטים משפטיים ואתיים בייעוץ ופיתוח ארגוני, המרכז האקדמי פרס (2026).</w:t>
+        <w:t xml:space="preserve">ס' 11(א) לחוק פיצויי פיטורים, התשכ"ג–1963.</w:t>
       </w:r>
     </w:p>
   </w:footnote>
@@ -2973,7 +2906,7 @@
           <w:sz w:val="20"/>
           <w:szCs w:val="20"/>
         </w:rPr>
-        <w:t xml:space="preserve">גיא דוידוב "הפררוגטיבה של המעביד ודיני החוזים: בעקבות פרשות נהרי וגרינשפן" משפטים לח(2) 417, 418 ו-439 (2008).</w:t>
+        <w:t xml:space="preserve">ס' 1(א), שם.</w:t>
       </w:r>
     </w:p>
   </w:footnote>
@@ -3003,101 +2936,11 @@
           <w:sz w:val="20"/>
           <w:szCs w:val="20"/>
         </w:rPr>
-        <w:t xml:space="preserve">ס' 2(א)(3), 3 ו-5א לחוק הודעה לעובד ולמועמד לעבודה (תנאי עבודה והליכי מיון וקבלה לעבודה), התשס"ב–2002.</w:t>
+        <w:t xml:space="preserve">תב"ע (ארצי) נד/86-3 יוחנן גולן נ' אי.אל.די. בע"מ (להלן: עניין גולן).</w:t>
       </w:r>
     </w:p>
   </w:footnote>
   <w:footnote w:id="24">
-    <w:p>
-      <w:pPr>
-        <w:bidi/>
-        <w:spacing w:before="0" w:after="0" w:line="240" w:lineRule="auto"/>
-        <w:jc w:val="both"/>
-      </w:pPr>
-      <w:r>
-        <w:rPr>
-          <w:vertAlign w:val="superscript"/>
-          <w:sz w:val="20"/>
-        </w:rPr>
-        <w:footnoteRef/>
-      </w:r>
-      <w:r>
-        <w:rPr>
-          <w:sz w:val="20"/>
-        </w:rPr>
-        <w:t xml:space="preserve"> </w:t>
-      </w:r>
-      <w:r>
-        <w:rPr>
-          <w:rtl/>
-          <w:sz w:val="20"/>
-          <w:szCs w:val="20"/>
-        </w:rPr>
-        <w:t xml:space="preserve">ס' 11(א) לחוק פיצויי פיטורים, התשכ"ג–1963.</w:t>
-      </w:r>
-    </w:p>
-  </w:footnote>
-  <w:footnote w:id="25">
-    <w:p>
-      <w:pPr>
-        <w:bidi/>
-        <w:spacing w:before="0" w:after="0" w:line="240" w:lineRule="auto"/>
-        <w:jc w:val="both"/>
-      </w:pPr>
-      <w:r>
-        <w:rPr>
-          <w:vertAlign w:val="superscript"/>
-          <w:sz w:val="20"/>
-        </w:rPr>
-        <w:footnoteRef/>
-      </w:r>
-      <w:r>
-        <w:rPr>
-          <w:sz w:val="20"/>
-        </w:rPr>
-        <w:t xml:space="preserve"> </w:t>
-      </w:r>
-      <w:r>
-        <w:rPr>
-          <w:rtl/>
-          <w:sz w:val="20"/>
-          <w:szCs w:val="20"/>
-        </w:rPr>
-        <w:t xml:space="preserve">ס' 1(א), שם.</w:t>
-      </w:r>
-    </w:p>
-  </w:footnote>
-  <w:footnote w:id="26">
-    <w:p>
-      <w:pPr>
-        <w:bidi/>
-        <w:spacing w:before="0" w:after="0" w:line="240" w:lineRule="auto"/>
-        <w:jc w:val="both"/>
-      </w:pPr>
-      <w:r>
-        <w:rPr>
-          <w:vertAlign w:val="superscript"/>
-          <w:sz w:val="20"/>
-        </w:rPr>
-        <w:footnoteRef/>
-      </w:r>
-      <w:r>
-        <w:rPr>
-          <w:sz w:val="20"/>
-        </w:rPr>
-        <w:t xml:space="preserve"> </w:t>
-      </w:r>
-      <w:r>
-        <w:rPr>
-          <w:rtl/>
-          <w:sz w:val="20"/>
-          <w:szCs w:val="20"/>
-        </w:rPr>
-        <w:t xml:space="preserve">תב"ע (ארצי) נד/86-3 יוחנן גולן נ' אי.אל.די. בע"מ (להלן: עניין גולן).</w:t>
-      </w:r>
-    </w:p>
-  </w:footnote>
-  <w:footnote w:id="27">
     <w:p>
       <w:pPr>
         <w:bidi/>

</xml_diff>

<commit_message>
Expand analysis to full two pages, reduce bold
Co-Authored-By: Claude Opus 5.5 <noreply@anthropic.com>
Claude-Session: https://claude.ai/code/session_01BVH1n3fvCDz4inkznfhZC9
</commit_message>
<xml_diff>
--- a/output/עבודה_היבטים_משפטיים.docx
+++ b/output/עבודה_היבטים_משפטיים.docx
@@ -274,25 +274,7 @@
           <w:rtl/>
           <w:szCs w:val="24"/>
         </w:rPr>
-        <w:t xml:space="preserve"> הזכות הראשונה מעוגנת ב</w:t>
-      </w:r>
-      <w:r>
-        <w:rPr>
-          <w:b/>
-          <w:sz w:val="24"/>
-          <w:rtl/>
-          <w:szCs w:val="24"/>
-          <w:bCs/>
-        </w:rPr>
-        <w:t>סעיף 33ח לחוק הסכמים קיבוציים</w:t>
-      </w:r>
-      <w:r>
-        <w:rPr>
-          <w:sz w:val="24"/>
-          <w:rtl/>
-          <w:szCs w:val="24"/>
-        </w:rPr>
-        <w:t>,</w:t>
+        <w:t xml:space="preserve"> הזכות הראשונה מעוגנת בסעיף 33ח לחוק הסכמים קיבוציים,</w:t>
       </w:r>
       <w:r>
         <w:rPr>
@@ -306,25 +288,7 @@
           <w:rtl/>
           <w:szCs w:val="24"/>
         </w:rPr>
-        <w:t xml:space="preserve"> ו</w:t>
-      </w:r>
-      <w:r>
-        <w:rPr>
-          <w:b/>
-          <w:sz w:val="24"/>
-          <w:rtl/>
-          <w:szCs w:val="24"/>
-          <w:bCs/>
-        </w:rPr>
-        <w:t>סעיף 33י(א)</w:t>
-      </w:r>
-      <w:r>
-        <w:rPr>
-          <w:sz w:val="24"/>
-          <w:rtl/>
-          <w:szCs w:val="24"/>
-        </w:rPr>
-        <w:t xml:space="preserve"> אוסר על מעסיק לפגוע בעובד בשל חברותו בארגון עובדים, בשל פעילותו להקמתו, וגם בשל הימנעותו מלהיות חבר בו.</w:t>
+        <w:t xml:space="preserve"> וסעיף 33י(א) אוסר על מעסיק לפגוע בעובד בשל חברותו בארגון עובדים, בשל פעילותו להקמתו, וגם בשל הימנעותו מלהיות חבר בו.</w:t>
       </w:r>
     </w:p>
     <w:p>
@@ -357,25 +321,7 @@
           <w:rtl/>
           <w:szCs w:val="24"/>
         </w:rPr>
-        <w:t xml:space="preserve">, כלומר הארגון שבו מאורגן המספר הגדול ביותר של העובדים, ובלבד שאינו פחות משליש (סעיף 3 לחוק), ורק הארגון היציג רשאי לחתום על </w:t>
-      </w:r>
-      <w:r>
-        <w:rPr>
-          <w:b/>
-          <w:sz w:val="24"/>
-          <w:rtl/>
-          <w:szCs w:val="24"/>
-          <w:bCs/>
-        </w:rPr>
-        <w:t>הסכם קיבוצי מיוחד</w:t>
-      </w:r>
-      <w:r>
-        <w:rPr>
-          <w:sz w:val="24"/>
-          <w:rtl/>
-          <w:szCs w:val="24"/>
-        </w:rPr>
-        <w:t xml:space="preserve"> במפעל (סעיף 2(1) לחוק). החוק אינו מגדיר "ארגון עובדים", והמבחנים נקבעו ב</w:t>
+        <w:t>, כלומר הארגון שבו מאורגן המספר הגדול ביותר של העובדים, ובלבד שאינו פחות משליש (סעיף 3 לחוק), ורק הארגון היציג רשאי לחתום על הסכם קיבוצי מיוחד במפעל (סעיף 2(1) לחוק). החוק אינו מגדיר "ארגון עובדים", והמבחנים נקבעו ב</w:t>
       </w:r>
       <w:r>
         <w:rPr>
@@ -407,97 +353,7 @@
           <w:rtl/>
           <w:szCs w:val="24"/>
         </w:rPr>
-        <w:t xml:space="preserve"> </w:t>
-      </w:r>
-      <w:r>
-        <w:rPr>
-          <w:b/>
-          <w:sz w:val="24"/>
-          <w:rtl/>
-          <w:szCs w:val="24"/>
-          <w:bCs/>
-        </w:rPr>
-        <w:t>מבחן החברות</w:t>
-      </w:r>
-      <w:r>
-        <w:rPr>
-          <w:sz w:val="24"/>
-          <w:rtl/>
-          <w:szCs w:val="24"/>
-        </w:rPr>
-        <w:t xml:space="preserve">: החברים הם בעיקר עובדים שכירים והחברות רצונית. </w:t>
-      </w:r>
-      <w:r>
-        <w:rPr>
-          <w:b/>
-          <w:sz w:val="24"/>
-          <w:rtl/>
-          <w:szCs w:val="24"/>
-          <w:bCs/>
-        </w:rPr>
-        <w:t>מבחן התקנון</w:t>
-      </w:r>
-      <w:r>
-        <w:rPr>
-          <w:sz w:val="24"/>
-          <w:rtl/>
-          <w:szCs w:val="24"/>
-        </w:rPr>
-        <w:t xml:space="preserve">: לארגון תקנון המסדיר את מוסדותיו ומטרותיו. </w:t>
-      </w:r>
-      <w:r>
-        <w:rPr>
-          <w:b/>
-          <w:sz w:val="24"/>
-          <w:rtl/>
-          <w:szCs w:val="24"/>
-          <w:bCs/>
-        </w:rPr>
-        <w:t>מבחן המטרה</w:t>
-      </w:r>
-      <w:r>
-        <w:rPr>
-          <w:sz w:val="24"/>
-          <w:rtl/>
-          <w:szCs w:val="24"/>
-        </w:rPr>
-        <w:t xml:space="preserve">: קידום תנאי העבודה בדרך של משא ומתן קיבוצי. </w:t>
-      </w:r>
-      <w:r>
-        <w:rPr>
-          <w:b/>
-          <w:sz w:val="24"/>
-          <w:rtl/>
-          <w:szCs w:val="24"/>
-          <w:bCs/>
-        </w:rPr>
-        <w:t>מבחן ההתארגנות</w:t>
-      </w:r>
-      <w:r>
-        <w:rPr>
-          <w:sz w:val="24"/>
-          <w:rtl/>
-          <w:szCs w:val="24"/>
-        </w:rPr>
-        <w:t xml:space="preserve">: ארגון של קבע, עצמאי, המהווה </w:t>
-      </w:r>
-      <w:r>
-        <w:rPr>
-          <w:b/>
-          <w:sz w:val="24"/>
-          <w:rtl/>
-          <w:szCs w:val="24"/>
-          <w:bCs/>
-        </w:rPr>
-        <w:t>קול נגדי למעסיק</w:t>
-      </w:r>
-      <w:r>
-        <w:rPr>
-          <w:sz w:val="24"/>
-          <w:rtl/>
-          <w:szCs w:val="24"/>
-        </w:rPr>
-        <w:t>.</w:t>
+        <w:t xml:space="preserve"> מבחן החברות: החברים הם בעיקר עובדים שכירים והחברות רצונית. מבחן התקנון: לארגון תקנון המסדיר את מוסדותיו ומטרותיו. מבחן המטרה: קידום תנאי העבודה בדרך של משא ומתן קיבוצי. מבחן ההתארגנות: ארגון של קבע, עצמאי, המהווה קול נגדי למעסיק.</w:t>
       </w:r>
     </w:p>
     <w:p>
@@ -547,79 +403,7 @@
           <w:rtl/>
           <w:szCs w:val="24"/>
         </w:rPr>
-        <w:t xml:space="preserve"> אף שסעיף הסמכויות מקנה לקבוצה סמכויות של ארגון עובדים, </w:t>
-      </w:r>
-      <w:r>
-        <w:rPr>
-          <w:b/>
-          <w:sz w:val="24"/>
-          <w:rtl/>
-          <w:szCs w:val="24"/>
-          <w:bCs/>
-        </w:rPr>
-        <w:t>מטרה ד'</w:t>
-      </w:r>
-      <w:r>
-        <w:rPr>
-          <w:sz w:val="24"/>
-          <w:rtl/>
-          <w:szCs w:val="24"/>
-        </w:rPr>
-        <w:t xml:space="preserve"> מוציאה מראש מתחום הפעולה הקיבוצית את השכר, הבונוסים והאופציות. גם </w:t>
-      </w:r>
-      <w:r>
-        <w:rPr>
-          <w:b/>
-          <w:sz w:val="24"/>
-          <w:rtl/>
-          <w:szCs w:val="24"/>
-          <w:bCs/>
-        </w:rPr>
-        <w:t>מטרה ב'</w:t>
-      </w:r>
-      <w:r>
-        <w:rPr>
-          <w:sz w:val="24"/>
-          <w:rtl/>
-          <w:szCs w:val="24"/>
-        </w:rPr>
-        <w:t xml:space="preserve">, יציבות החברה והמשך פעילותה בישראל, היא אינטרס של המעסיק. הנימוק שבהודעת הקבוצה אינו מחזיק משפטית. הוראות הסכם קיבוצי הן </w:t>
-      </w:r>
-      <w:r>
-        <w:rPr>
-          <w:b/>
-          <w:sz w:val="24"/>
-          <w:rtl/>
-          <w:szCs w:val="24"/>
-          <w:bCs/>
-        </w:rPr>
-        <w:t>כללים קוגנטיים</w:t>
-      </w:r>
-      <w:r>
-        <w:rPr>
-          <w:sz w:val="24"/>
-          <w:rtl/>
-          <w:szCs w:val="24"/>
-        </w:rPr>
-        <w:t xml:space="preserve">, ואילו חוזה אישי הוא </w:t>
-      </w:r>
-      <w:r>
-        <w:rPr>
-          <w:b/>
-          <w:sz w:val="24"/>
-          <w:rtl/>
-          <w:szCs w:val="24"/>
-          <w:bCs/>
-        </w:rPr>
-        <w:t>דיספוזיטיבי</w:t>
-      </w:r>
-      <w:r>
-        <w:rPr>
-          <w:sz w:val="24"/>
-          <w:rtl/>
-          <w:szCs w:val="24"/>
-        </w:rPr>
-        <w:t>,</w:t>
+        <w:t xml:space="preserve"> אף שסעיף הסמכויות מקנה לקבוצה סמכויות של ארגון עובדים, מטרה ד' מוציאה מראש מתחום הפעולה הקיבוצית את השכר, הבונוסים והאופציות. גם מטרה ב', יציבות החברה והמשך פעילותה בישראל, היא אינטרס של המעסיק. הנימוק שבהודעת הקבוצה אינו מחזיק משפטית. הוראות הסכם קיבוצי הן כללים קוגנטיים, ואילו חוזה אישי הוא דיספוזיטיבי,</w:t>
       </w:r>
       <w:r>
         <w:rPr>
@@ -633,25 +417,7 @@
           <w:rtl/>
           <w:szCs w:val="24"/>
         </w:rPr>
-        <w:t xml:space="preserve"> אך לפי </w:t>
-      </w:r>
-      <w:r>
-        <w:rPr>
-          <w:b/>
-          <w:sz w:val="24"/>
-          <w:rtl/>
-          <w:szCs w:val="24"/>
-          <w:bCs/>
-        </w:rPr>
-        <w:t>סעיף 22 לחוק</w:t>
-      </w:r>
-      <w:r>
-        <w:rPr>
-          <w:sz w:val="24"/>
-          <w:rtl/>
-          <w:szCs w:val="24"/>
-        </w:rPr>
-        <w:t xml:space="preserve"> הוראה בחוזה האישי שהיא לטובת העובד גוברת על ההסכם הקיבוצי. הסכם קיבוצי קובע אפוא רצפה ואינו שולל משא ומתן אישי מעליה.</w:t>
+        <w:t xml:space="preserve"> אך לפי סעיף 22 לחוק הוראה בחוזה האישי שהיא לטובת העובד גוברת על ההסכם הקיבוצי.</w:t>
       </w:r>
     </w:p>
     <w:p>
@@ -676,7 +442,7 @@
           <w:rtl/>
           <w:szCs w:val="24"/>
         </w:rPr>
-        <w:t xml:space="preserve"> הקבוצה הוקמה בתגובה ישירה להצטרפות העובדים להסתדרות ומגדירה את עצמה כמי שפועלת "בשיתוף פעולה ובהידברות" עם ההנהלה. גוף שהמעסיק תומך בו כך אינו "קול נגדי" לו.</w:t>
+        <w:t xml:space="preserve"> הקבוצה הוקמה בתגובה ישירה להצטרפות העובדים להסתדרות ומגדירה את עצמה כמי שפועלת "בשיתוף פעולה ובהידברות" עם ההנהלה. גוף כזה אינו "קול נגדי" למעסיק.</w:t>
       </w:r>
     </w:p>
     <w:p>
@@ -757,13 +523,27 @@
           <w:rtl/>
           <w:szCs w:val="24"/>
         </w:rPr>
-        <w:t xml:space="preserve"> כך גם כאן, ואין נפקות לכך שעובדים רבים הצטרפו לקבוצה. יתרה מזו, בנוקיה נקבע שהחברה לא תמכה בארגון הפנימי,</w:t>
+        <w:t xml:space="preserve"> הדמיון לענייננו בולט. בין מטרות הארגון בנוקיה נמנו "שימור קיום האתר בישראל" ו"פעולה בדרכי הידברות וגישור" עם ההנהלה,</w:t>
       </w:r>
       <w:r>
         <w:rPr>
           <w:vertAlign w:val="superscript"/>
         </w:rPr>
         <w:footnoteReference w:id="9"/>
+      </w:r>
+      <w:r>
+        <w:rPr>
+          <w:sz w:val="24"/>
+          <w:rtl/>
+          <w:szCs w:val="24"/>
+        </w:rPr>
+        <w:t xml:space="preserve"> ואלה כמעט זהות למטרות ב' ו-ג' של הקבוצה. מאחר שהעמידה במבחנים נבחנת במועד ההכרזה, אין בתיקון מאוחר של התקנון כדי להכשיר את הקבוצה, ואין נפקות לכך שעובדים רבים הצטרפו אליה. יתרה מזו, בנוקיה נקבע שהחברה לא תמכה בארגון הפנימי,</w:t>
+      </w:r>
+      <w:r>
+        <w:rPr>
+          <w:vertAlign w:val="superscript"/>
+        </w:rPr>
+        <w:footnoteReference w:id="10"/>
       </w:r>
       <w:r>
         <w:rPr>
@@ -786,25 +566,7 @@
           <w:rtl/>
           <w:szCs w:val="24"/>
         </w:rPr>
-        <w:t>אין בכך כדי לפגוע בחופש מהתארגנות. עובד רשאי שלא להצטרף להסתדרות, וסעיף 33י(א)(3) מגן עליו מפני פגיעה בשל כך. חברי הקבוצה אינם נספרים לצורך היציגות, והודעתה כי היא הארגון היציג חסרת נפקות. חובת המעסיק לנהל משא ומתן בהתארגנות ראשונית חלה רק כלפי ארגון יציג לפי סעיף 3 (</w:t>
-      </w:r>
-      <w:r>
-        <w:rPr>
-          <w:b/>
-          <w:sz w:val="24"/>
-          <w:rtl/>
-          <w:szCs w:val="24"/>
-          <w:bCs/>
-        </w:rPr>
-        <w:t>סעיף 33ח1</w:t>
-      </w:r>
-      <w:r>
-        <w:rPr>
-          <w:sz w:val="24"/>
-          <w:rtl/>
-          <w:szCs w:val="24"/>
-        </w:rPr>
-        <w:t>), ואם ההסתדרות תהיה יציגה, עמה יהיה על ההנהלה לנהל משא ומתן.</w:t>
+        <w:t>אין בכך כדי לפגוע בחופש מהתארגנות. עובד רשאי שלא להצטרף להסתדרות, וסעיף 33י(א)(3) מגן עליו מפני פגיעה בשל כך. חברי הקבוצה אינם נספרים לצורך היציגות, והודעתה כי היא הארגון היציג חסרת נפקות. חובת המעסיק לנהל משא ומתן בהתארגנות ראשונית חלה רק כלפי ארגון יציג לפי סעיף 3 (סעיף 33ח1), ואם ההסתדרות תהיה יציגה, עמה יהיה על ההנהלה לנהל משא ומתן.</w:t>
       </w:r>
     </w:p>
     <w:p>
@@ -852,7 +614,7 @@
         <w:rPr>
           <w:vertAlign w:val="superscript"/>
         </w:rPr>
-        <w:footnoteReference w:id="10"/>
+        <w:footnoteReference w:id="11"/>
       </w:r>
       <w:r>
         <w:rPr>
@@ -878,25 +640,7 @@
           <w:rtl/>
           <w:szCs w:val="24"/>
         </w:rPr>
-        <w:t xml:space="preserve"> לבין שלב שבו כבר קיים ארגון יציג. בשלב הראשון גובר חופש ההתארגנות: המעסיק אינו רשאי להביע עמדה על ההתארגנות בשום ערוץ, לרבות ב</w:t>
-      </w:r>
-      <w:r>
-        <w:rPr>
-          <w:b/>
-          <w:sz w:val="24"/>
-          <w:rtl/>
-          <w:szCs w:val="24"/>
-          <w:bCs/>
-        </w:rPr>
-        <w:t>שיחות אישיות</w:t>
-      </w:r>
-      <w:r>
-        <w:rPr>
-          <w:sz w:val="24"/>
-          <w:rtl/>
-          <w:szCs w:val="24"/>
-        </w:rPr>
-        <w:t xml:space="preserve"> ובדואר אלקטרוני, וגם הצבעה על חסרונותיה לעובדים או לחברה, נכונה ככל שתהיה, אסורה. ההתארגנות ב-NeuroTech נמצאת בשלב הפורץ, ולכן שלוש פעולות ההנהלה אסורות.</w:t>
+        <w:t xml:space="preserve"> לבין שלב שבו כבר קיים ארגון יציג. בשלב הראשון גובר חופש ההתארגנות: המעסיק אינו רשאי להביע עמדה על ההתארגנות בשום ערוץ, לרבות בשיחות אישיות ובדואר אלקטרוני, וגם הצבעה על חסרונותיה לעובדים או לחברה, נכונה ככל שתהיה, אסורה. ההתארגנות ב-NeuroTech נמצאת בשלב הפורץ, ולכן שלוש פעולות ההנהלה אסורות.</w:t>
       </w:r>
     </w:p>
     <w:p>
@@ -907,57 +651,11 @@
       </w:pPr>
       <w:r>
         <w:rPr>
-          <w:b/>
-          <w:sz w:val="24"/>
-          <w:rtl/>
-          <w:szCs w:val="24"/>
-          <w:bCs/>
-        </w:rPr>
-        <w:t>הודעת הדואר האלקטרוני</w:t>
-      </w:r>
-      <w:r>
-        <w:rPr>
           <w:sz w:val="24"/>
           <w:rtl/>
           <w:szCs w:val="24"/>
         </w:rPr>
-        <w:t xml:space="preserve"> מציגה את ההסתדרות כגורם "חיצוני" שעלול לשנות את התרבות הארגונית וקוראת לעובדים "לשקול היטב". זו הצגת חסרונות ההתארגנות בתכתובת אלקטרונית, כמו ההודעה שנפסלה בעניין פלאפון, אף שהנוסח מתון יותר. </w:t>
-      </w:r>
-      <w:r>
-        <w:rPr>
-          <w:b/>
-          <w:sz w:val="24"/>
-          <w:rtl/>
-          <w:szCs w:val="24"/>
-          <w:bCs/>
-        </w:rPr>
-        <w:t>הנחיית מנהלי הצוותים</w:t>
-      </w:r>
-      <w:r>
-        <w:rPr>
-          <w:sz w:val="24"/>
-          <w:rtl/>
-          <w:szCs w:val="24"/>
-        </w:rPr>
-        <w:t xml:space="preserve"> לשוחח עם עובדיהם על "יתרונות המודל האישי" היא מפגש אישי שנאסר במפורש. חומרתה רבה, שכן המנהלים משפיעים על הבונוסים והקידום, וכל שיחה כזו עלולה להיתפס כאיום. </w:t>
-      </w:r>
-      <w:r>
-        <w:rPr>
-          <w:b/>
-          <w:sz w:val="24"/>
-          <w:rtl/>
-          <w:szCs w:val="24"/>
-          <w:bCs/>
-        </w:rPr>
-        <w:t>הפגישה עם הקבוצה ודברי השבח</w:t>
-      </w:r>
-      <w:r>
-        <w:rPr>
-          <w:sz w:val="24"/>
-          <w:rtl/>
-          <w:szCs w:val="24"/>
-        </w:rPr>
-        <w:t xml:space="preserve"> כלפיה מעבירים בעקיפין את אותו מסר. בעניין פלאפון ניתנו צווים שאסרו על החברה להציג את עמדתה בכל ערוץ ולעקוב אחר העובדים המתארגנים, וצווים דומים מתבקשים גם כאן.</w:t>
+        <w:t>הודעת הדואר האלקטרוני מציגה את ההסתדרות כגורם "חיצוני" שעלול לשנות את התרבות הארגונית וקוראת לעובדים "לשקול היטב". זו הצגת חסרונות ההתארגנות בתכתובת אלקטרונית, כמו ההודעה שנפסלה בעניין פלאפון, אף שהנוסח מתון יותר. הרמז שההסתדרות תפגע ב"תנאי העבודה האישיים" דומה לאזהרה שם מפני נזק לחברה ולעובדים, ובית הדין קבע כי אזהרה כזו אסורה גם כשיש בה אמת. הנחיית מנהלי הצוותים לשוחח עם עובדיהם על "יתרונות המודל האישי" היא מפגש אישי שנאסר במפורש. חומרתה רבה, שכן המנהלים משפיעים על הבונוסים והקידום, וכל שיחה כזו עלולה להיתפס כאיום. הפגישה עם הקבוצה ודברי השבח כלפיה מעבירים בעקיפין את אותו מסר. בעניין פלאפון ניתנו צווים שאסרו על החברה להציג את עמדתה בכל ערוץ ולעקוב אחר העובדים המתארגנים, וצווים דומים מתבקשים גם כאן.</w:t>
       </w:r>
     </w:p>
     <w:p>
@@ -1035,13 +733,17 @@
       </w:pPr>
       <w:r>
         <w:rPr>
-          <w:b/>
           <w:sz w:val="24"/>
           <w:rtl/>
           <w:szCs w:val="24"/>
-          <w:bCs/>
         </w:rPr>
-        <w:t>החוק למניעת הטרדה מינית</w:t>
+        <w:t>החוק למניעת הטרדה מינית נועד להגן על כבוד האדם, חירותו ופרטיותו.</w:t>
+      </w:r>
+      <w:r>
+        <w:rPr>
+          <w:vertAlign w:val="superscript"/>
+        </w:rPr>
+        <w:footnoteReference w:id="12"/>
       </w:r>
       <w:r>
         <w:rPr>
@@ -1049,75 +751,7 @@
           <w:rtl/>
           <w:szCs w:val="24"/>
         </w:rPr>
-        <w:t xml:space="preserve"> נועד להגן על כבוד האדם, חירותו ופרטיותו.</w:t>
-      </w:r>
-      <w:r>
-        <w:rPr>
-          <w:vertAlign w:val="superscript"/>
-        </w:rPr>
-        <w:footnoteReference w:id="11"/>
-      </w:r>
-      <w:r>
-        <w:rPr>
-          <w:sz w:val="24"/>
-          <w:rtl/>
-          <w:szCs w:val="24"/>
-        </w:rPr>
-        <w:t xml:space="preserve"> החלופה הרלוונטית היא </w:t>
-      </w:r>
-      <w:r>
-        <w:rPr>
-          <w:b/>
-          <w:sz w:val="24"/>
-          <w:rtl/>
-          <w:szCs w:val="24"/>
-          <w:bCs/>
-        </w:rPr>
-        <w:t>סעיף 3(א)(4)</w:t>
-      </w:r>
-      <w:r>
-        <w:rPr>
-          <w:sz w:val="24"/>
-          <w:rtl/>
-          <w:szCs w:val="24"/>
-        </w:rPr>
-        <w:t xml:space="preserve">: </w:t>
-      </w:r>
-      <w:r>
-        <w:rPr>
-          <w:b/>
-          <w:sz w:val="24"/>
-          <w:rtl/>
-          <w:szCs w:val="24"/>
-          <w:bCs/>
-        </w:rPr>
-        <w:t>התייחסויות חוזרות</w:t>
-      </w:r>
-      <w:r>
-        <w:rPr>
-          <w:sz w:val="24"/>
-          <w:rtl/>
-          <w:szCs w:val="24"/>
-        </w:rPr>
-        <w:t xml:space="preserve"> המופנות לאדם, </w:t>
-      </w:r>
-      <w:r>
-        <w:rPr>
-          <w:b/>
-          <w:sz w:val="24"/>
-          <w:rtl/>
-          <w:szCs w:val="24"/>
-          <w:bCs/>
-        </w:rPr>
-        <w:t>המתמקדות במיניותו</w:t>
-      </w:r>
-      <w:r>
-        <w:rPr>
-          <w:sz w:val="24"/>
-          <w:rtl/>
-          <w:szCs w:val="24"/>
-        </w:rPr>
-        <w:t xml:space="preserve">, כאשר אותו אדם </w:t>
+        <w:t xml:space="preserve"> החלופה הרלוונטית היא סעיף 3(א)(4): התייחסויות חוזרות המופנות לאדם, המתמקדות במיניותו, כאשר אותו אדם </w:t>
       </w:r>
       <w:r>
         <w:rPr>
@@ -1156,7 +790,7 @@
         <w:rPr>
           <w:vertAlign w:val="superscript"/>
         </w:rPr>
-        <w:footnoteReference w:id="12"/>
+        <w:footnoteReference w:id="13"/>
       </w:r>
       <w:r>
         <w:rPr>
@@ -1197,25 +831,7 @@
           <w:rtl/>
           <w:szCs w:val="24"/>
         </w:rPr>
-        <w:t xml:space="preserve">. לפי </w:t>
-      </w:r>
-      <w:r>
-        <w:rPr>
-          <w:b/>
-          <w:sz w:val="24"/>
-          <w:rtl/>
-          <w:szCs w:val="24"/>
-          <w:bCs/>
-        </w:rPr>
-        <w:t>סעיף 3(א)(6)(ג)</w:t>
-      </w:r>
-      <w:r>
-        <w:rPr>
-          <w:sz w:val="24"/>
-          <w:rtl/>
-          <w:szCs w:val="24"/>
-        </w:rPr>
-        <w:t>, כאשר ההתייחסויות נעשות תוך ניצול מרות ביחסי עבודה, אין צורך שהמוטרד יראה שאינו מעוניין. ב</w:t>
+        <w:t>. לפי סעיף 3(א)(6)(ג), כאשר ההתייחסויות נעשות תוך ניצול מרות ביחסי עבודה, אין צורך שהמוטרד יראה שאינו מעוניין. ב</w:t>
       </w:r>
       <w:r>
         <w:rPr>
@@ -1231,7 +847,7 @@
         <w:rPr>
           <w:vertAlign w:val="superscript"/>
         </w:rPr>
-        <w:footnoteReference w:id="13"/>
+        <w:footnoteReference w:id="14"/>
       </w:r>
       <w:r>
         <w:rPr>
@@ -1254,61 +870,7 @@
           <w:rtl/>
           <w:szCs w:val="24"/>
         </w:rPr>
-        <w:t xml:space="preserve">עם זאת, גם כשקיימים יחסי מרות נדרשות התייחסויות חוזרות </w:t>
-      </w:r>
-      <w:r>
-        <w:rPr>
-          <w:b/>
-          <w:sz w:val="24"/>
-          <w:rtl/>
-          <w:szCs w:val="24"/>
-          <w:bCs/>
-        </w:rPr>
-        <w:t>המתמקדות במיניותו של המוטרד</w:t>
-      </w:r>
-      <w:r>
-        <w:rPr>
-          <w:sz w:val="24"/>
-          <w:rtl/>
-          <w:szCs w:val="24"/>
-        </w:rPr>
-        <w:t>, ונדרש ש</w:t>
-      </w:r>
-      <w:r>
-        <w:rPr>
-          <w:b/>
-          <w:sz w:val="24"/>
-          <w:rtl/>
-          <w:szCs w:val="24"/>
-          <w:bCs/>
-        </w:rPr>
-        <w:t>נוצלו</w:t>
-      </w:r>
-      <w:r>
-        <w:rPr>
-          <w:sz w:val="24"/>
-          <w:rtl/>
-          <w:szCs w:val="24"/>
-        </w:rPr>
-        <w:t xml:space="preserve"> יחסי המרות. השאלה על נטייתו של אורי נשאלה פעם אחת. רוב השיחות עסקו בחייה של דנה והיו הדדיות, ולכן קשה לבסס כאן הטרדה מינית. תחושתה של דנה כי הם "חברים טובים" אינה מכרעת: אילו הוכח ניצול מרות, לא היה צורך שאורי יראה דבר. אין זו גם </w:t>
-      </w:r>
-      <w:r>
-        <w:rPr>
-          <w:b/>
-          <w:sz w:val="24"/>
-          <w:rtl/>
-          <w:szCs w:val="24"/>
-          <w:bCs/>
-        </w:rPr>
-        <w:t>הטרדה סביבתית</w:t>
-      </w:r>
-      <w:r>
-        <w:rPr>
-          <w:sz w:val="24"/>
-          <w:rtl/>
-          <w:szCs w:val="24"/>
-        </w:rPr>
-        <w:t>, שכן ההתנהגות לא יצרה אווירה כללית במשרד.</w:t>
+        <w:t>עם זאת, גם כשקיימים יחסי מרות נדרשות התייחסויות חוזרות המתמקדות במיניותו של המוטרד, ונדרש שנוצלו יחסי המרות. השאלה על נטייתו של אורי נשאלה פעם אחת. לכן יש לבחון שתי אפשרויות. אם לא יוכרו יחסי מרות, אין הטרדה: אורי הראה שאינו מעוניין רק בשלב מאוחר, ומאז לא נאמרה כל התייחסות נוספת. אם יוכרו יחסי מרות, עדיין נדרשות התייחסויות חוזרות למיניותו שלו, ואילו רוב השיחות עסקו במיניותה של דנה, היו הדדיות ולא נקשרו למעמדו בעבודה. בשתי האפשרויות קשה לבסס הטרדה מינית. תחושתה של דנה כי הם "חברים טובים" אינה מכרעת: אילו הוכח ניצול מרות, לא היה צורך שאורי יראה דבר. אין זו גם הטרדה סביבתית, שכן ההתנהגות לא יצרה אווירה כללית במשרד.</w:t>
       </w:r>
     </w:p>
     <w:p>
@@ -1340,67 +902,13 @@
           <w:rtl/>
           <w:szCs w:val="24"/>
         </w:rPr>
-        <w:t>מעסיק חייב לנקוט אמצעים סבירים למניעת הטרדה מינית ולטפל בכל מקרה (</w:t>
-      </w:r>
-      <w:r>
-        <w:rPr>
-          <w:b/>
-          <w:sz w:val="24"/>
-          <w:rtl/>
-          <w:szCs w:val="24"/>
-          <w:bCs/>
-        </w:rPr>
-        <w:t>סעיף 7(א) לחוק</w:t>
-      </w:r>
-      <w:r>
-        <w:rPr>
-          <w:sz w:val="24"/>
-          <w:rtl/>
-          <w:szCs w:val="24"/>
-        </w:rPr>
-        <w:t xml:space="preserve">). Frame מעסיקה כ-70 עובדים, ולכן עליה גם לפרסם תקנון מותאם ולמנות </w:t>
-      </w:r>
-      <w:r>
-        <w:rPr>
-          <w:b/>
-          <w:sz w:val="24"/>
-          <w:rtl/>
-          <w:szCs w:val="24"/>
-          <w:bCs/>
-        </w:rPr>
-        <w:t>אחראי</w:t>
-      </w:r>
-      <w:r>
-        <w:rPr>
-          <w:sz w:val="24"/>
-          <w:rtl/>
-          <w:szCs w:val="24"/>
-        </w:rPr>
-        <w:t xml:space="preserve"> לבירור תלונות (</w:t>
-      </w:r>
-      <w:r>
-        <w:rPr>
-          <w:b/>
-          <w:sz w:val="24"/>
-          <w:rtl/>
-          <w:szCs w:val="24"/>
-          <w:bCs/>
-        </w:rPr>
-        <w:t>סעיף 7(ב)</w:t>
-      </w:r>
-      <w:r>
-        <w:rPr>
-          <w:sz w:val="24"/>
-          <w:rtl/>
-          <w:szCs w:val="24"/>
-        </w:rPr>
-        <w:t>).</w:t>
+        <w:t>מעסיק חייב לנקוט אמצעים סבירים למניעת הטרדה מינית ולטפל בכל מקרה (סעיף 7(א) לחוק). Frame מעסיקה כ-70 עובדים, ולכן עליה גם לפרסם תקנון מותאם ולמנות אחראי לבירור תלונות (סעיף 7(ב)).</w:t>
       </w:r>
       <w:r>
         <w:rPr>
           <w:vertAlign w:val="superscript"/>
         </w:rPr>
-        <w:footnoteReference w:id="14"/>
+        <w:footnoteReference w:id="15"/>
       </w:r>
       <w:r>
         <w:rPr>
@@ -1433,39 +941,7 @@
           <w:rtl/>
           <w:szCs w:val="24"/>
         </w:rPr>
-        <w:t xml:space="preserve"> היא פגיעה מכל סוג שמקורה בהטרדה מינית או בתלונה עליה (סעיף 3(ב)), ואינה מותנית בכך שהמוטרד סירב. החוק מרחיב את המושג לפגיעה לפי סעיף 7 לחוק שוויון ההזדמנויות בעבודה, שלעניינה די ב</w:t>
-      </w:r>
-      <w:r>
-        <w:rPr>
-          <w:b/>
-          <w:sz w:val="24"/>
-          <w:rtl/>
-          <w:szCs w:val="24"/>
-          <w:bCs/>
-        </w:rPr>
-        <w:t>התייחסות אחת</w:t>
-      </w:r>
-      <w:r>
-        <w:rPr>
-          <w:sz w:val="24"/>
-          <w:rtl/>
-          <w:szCs w:val="24"/>
-        </w:rPr>
-        <w:t xml:space="preserve"> לפי סעיף 3(א)(4).</w:t>
-      </w:r>
-      <w:r>
-        <w:rPr>
-          <w:vertAlign w:val="superscript"/>
-        </w:rPr>
-        <w:footnoteReference w:id="15"/>
-      </w:r>
-      <w:r>
-        <w:rPr>
-          <w:sz w:val="24"/>
-          <w:rtl/>
-          <w:szCs w:val="24"/>
-        </w:rPr>
-        <w:t xml:space="preserve"> אם יוכרו יחסי מרות, גם השאלה הבודדת על נטייתו של אורי עשויה להספיק. העברתו חודש אחרי שביקש לסיים את השיחות, והשפעתה של דנה על השיבוץ, מעוררות חשד לקשר כזה. משהוכיח זאת אורי, עובר למעסיק הנטל להראות שלא פגע בו,</w:t>
+        <w:t xml:space="preserve"> היא פגיעה מכל סוג שמקורה בהטרדה מינית או בתלונה עליה (סעיף 3(ב)), ואינה מותנית בכך שהמוטרד סירב. החוק מרחיב את המושג לפגיעה לפי סעיף 7 לחוק שוויון ההזדמנויות בעבודה, שלעניינה די בהתייחסות אחת לפי סעיף 3(א)(4).</w:t>
       </w:r>
       <w:r>
         <w:rPr>
@@ -1479,13 +955,27 @@
           <w:rtl/>
           <w:szCs w:val="24"/>
         </w:rPr>
+        <w:t xml:space="preserve"> אם יוכרו יחסי מרות, גם השאלה הבודדת על נטייתו של אורי עשויה להספיק. העברתו חודש אחרי שביקש לסיים את השיחות, והשפעתה של דנה על השיבוץ, מעוררות חשד לקשר כזה. השאלה המכרעת היא מי החליט על ההעברה ומדוע: אם דנה המליצה עליה או השפיעה עליה, מדובר בפגיעה שמקורה בהטרדה; אם ההחלטה התקבלה משיקולים ענייניים של צורכי הפרויקטים, אין התנכלות. משהוכיח זאת אורי, עובר למעסיק הנטל להראות שלא פגע בו,</w:t>
+      </w:r>
+      <w:r>
+        <w:rPr>
+          <w:vertAlign w:val="superscript"/>
+        </w:rPr>
+        <w:footnoteReference w:id="17"/>
+      </w:r>
+      <w:r>
+        <w:rPr>
+          <w:sz w:val="24"/>
+          <w:rtl/>
+          <w:szCs w:val="24"/>
+        </w:rPr>
         <w:t xml:space="preserve"> ובית הדין רשאי לפסוק פיצוי של עד 120,000 ש"ח ללא הוכחת נזק.</w:t>
       </w:r>
       <w:r>
         <w:rPr>
           <w:vertAlign w:val="superscript"/>
         </w:rPr>
-        <w:footnoteReference w:id="17"/>
+        <w:footnoteReference w:id="18"/>
       </w:r>
       <w:r>
         <w:rPr>
@@ -1549,7 +1039,7 @@
         <w:rPr>
           <w:vertAlign w:val="superscript"/>
         </w:rPr>
-        <w:footnoteReference w:id="18"/>
+        <w:footnoteReference w:id="19"/>
       </w:r>
       <w:r>
         <w:rPr>
@@ -1557,43 +1047,7 @@
           <w:rtl/>
           <w:szCs w:val="24"/>
         </w:rPr>
-        <w:t xml:space="preserve"> ה</w:t>
-      </w:r>
-      <w:r>
-        <w:rPr>
-          <w:b/>
-          <w:sz w:val="24"/>
-          <w:rtl/>
-          <w:szCs w:val="24"/>
-          <w:bCs/>
-        </w:rPr>
-        <w:t>פררוגטיבה הניהולית</w:t>
-      </w:r>
-      <w:r>
-        <w:rPr>
-          <w:sz w:val="24"/>
-          <w:rtl/>
-          <w:szCs w:val="24"/>
-        </w:rPr>
-        <w:t xml:space="preserve"> מתירה לו לשנות נהלי עבודה, כמו חובת השתתפות בישיבות, אך שינוי הפוגע ב</w:t>
-      </w:r>
-      <w:r>
-        <w:rPr>
-          <w:b/>
-          <w:sz w:val="24"/>
-          <w:rtl/>
-          <w:szCs w:val="24"/>
-          <w:bCs/>
-        </w:rPr>
-        <w:t>מעמד העובד</w:t>
-      </w:r>
-      <w:r>
-        <w:rPr>
-          <w:sz w:val="24"/>
-          <w:rtl/>
-          <w:szCs w:val="24"/>
-        </w:rPr>
-        <w:t xml:space="preserve"> הוא </w:t>
+        <w:t xml:space="preserve"> הפררוגטיבה הניהולית מתירה לו לשנות נהלי עבודה, כמו חובת השתתפות בישיבות, אך שינוי הפוגע במעמד העובד הוא </w:t>
       </w:r>
       <w:r>
         <w:rPr>
@@ -1617,7 +1071,7 @@
         <w:rPr>
           <w:vertAlign w:val="superscript"/>
         </w:rPr>
-        <w:footnoteReference w:id="19"/>
+        <w:footnoteReference w:id="20"/>
       </w:r>
       <w:r>
         <w:rPr>
@@ -1631,7 +1085,7 @@
         <w:rPr>
           <w:vertAlign w:val="superscript"/>
         </w:rPr>
-        <w:footnoteReference w:id="20"/>
+        <w:footnoteReference w:id="21"/>
       </w:r>
     </w:p>
     <w:p>
@@ -1646,25 +1100,7 @@
           <w:rtl/>
           <w:szCs w:val="24"/>
         </w:rPr>
-        <w:t xml:space="preserve">לפי </w:t>
-      </w:r>
-      <w:r>
-        <w:rPr>
-          <w:b/>
-          <w:sz w:val="24"/>
-          <w:rtl/>
-          <w:szCs w:val="24"/>
-          <w:bCs/>
-        </w:rPr>
-        <w:t>חוק פיצויי פיטורים</w:t>
-      </w:r>
-      <w:r>
-        <w:rPr>
-          <w:sz w:val="24"/>
-          <w:rtl/>
-          <w:szCs w:val="24"/>
-        </w:rPr>
-        <w:t xml:space="preserve">, התפטרות מחמת </w:t>
+        <w:t xml:space="preserve">לפי חוק פיצויי פיטורים, התפטרות מחמת </w:t>
       </w:r>
       <w:r>
         <w:rPr>
@@ -1688,7 +1124,7 @@
         <w:rPr>
           <w:vertAlign w:val="superscript"/>
         </w:rPr>
-        <w:footnoteReference w:id="21"/>
+        <w:footnoteReference w:id="22"/>
       </w:r>
       <w:r>
         <w:rPr>
@@ -1702,7 +1138,7 @@
         <w:rPr>
           <w:vertAlign w:val="superscript"/>
         </w:rPr>
-        <w:footnoteReference w:id="22"/>
+        <w:footnoteReference w:id="23"/>
       </w:r>
       <w:r>
         <w:rPr>
@@ -1743,77 +1179,13 @@
           <w:rtl/>
           <w:szCs w:val="24"/>
         </w:rPr>
-        <w:t xml:space="preserve"> ו</w:t>
-      </w:r>
-      <w:r>
-        <w:rPr>
-          <w:b/>
-          <w:sz w:val="24"/>
-          <w:rtl/>
-          <w:szCs w:val="24"/>
-          <w:bCs/>
-        </w:rPr>
-        <w:t>הזדמנות לתקן</w:t>
-      </w:r>
-      <w:r>
-        <w:rPr>
-          <w:sz w:val="24"/>
-          <w:rtl/>
-          <w:szCs w:val="24"/>
-        </w:rPr>
-        <w:t>, לפעול ב</w:t>
-      </w:r>
-      <w:r>
-        <w:rPr>
-          <w:b/>
-          <w:sz w:val="24"/>
-          <w:rtl/>
-          <w:szCs w:val="24"/>
-          <w:bCs/>
-        </w:rPr>
-        <w:t>תום לב</w:t>
-      </w:r>
-      <w:r>
-        <w:rPr>
-          <w:sz w:val="24"/>
-          <w:rtl/>
-          <w:szCs w:val="24"/>
-        </w:rPr>
-        <w:t xml:space="preserve"> ובלי </w:t>
-      </w:r>
-      <w:r>
-        <w:rPr>
-          <w:b/>
-          <w:sz w:val="24"/>
-          <w:rtl/>
-          <w:szCs w:val="24"/>
-          <w:bCs/>
-        </w:rPr>
-        <w:t>שיהוי</w:t>
-      </w:r>
-      <w:r>
-        <w:rPr>
-          <w:sz w:val="24"/>
-          <w:rtl/>
-          <w:szCs w:val="24"/>
-        </w:rPr>
-        <w:t>, שכן שיהוי עלול להתפרש כהסכמה בהתנהגות. ב</w:t>
-      </w:r>
-      <w:r>
-        <w:rPr>
-          <w:b/>
-          <w:sz w:val="24"/>
-          <w:rtl/>
-          <w:szCs w:val="24"/>
-          <w:bCs/>
-        </w:rPr>
-        <w:t>עניין גולן</w:t>
+        <w:t xml:space="preserve"> והזדמנות לתקן, לפעול בתום לב ובלי שיהוי, שכן שיהוי עלול להתפרש כהסכמה בהתנהגות. בעניין גולן</w:t>
       </w:r>
       <w:r>
         <w:rPr>
           <w:vertAlign w:val="superscript"/>
         </w:rPr>
-        <w:footnoteReference w:id="23"/>
+        <w:footnoteReference w:id="24"/>
       </w:r>
       <w:r>
         <w:rPr>
@@ -1842,7 +1214,7 @@
         <w:rPr>
           <w:vertAlign w:val="superscript"/>
         </w:rPr>
-        <w:footnoteReference w:id="24"/>
+        <w:footnoteReference w:id="25"/>
       </w:r>
       <w:r>
         <w:rPr>
@@ -2516,7 +1888,7 @@
           <w:sz w:val="20"/>
           <w:szCs w:val="20"/>
         </w:rPr>
-        <w:t xml:space="preserve">שם, פס' 18.</w:t>
+        <w:t xml:space="preserve">שם, פס' 9.</w:t>
       </w:r>
     </w:p>
   </w:footnote>
@@ -2546,7 +1918,7 @@
           <w:sz w:val="20"/>
           <w:szCs w:val="20"/>
         </w:rPr>
-        <w:t xml:space="preserve">עס"ק (ארצי) 25476-09-12 הסתדרות העובדים הכללית החדשה נ' פלאפון תקשורת בע"מ (נבו 2.1.2013) (להלן: עניין פלאפון).</w:t>
+        <w:t xml:space="preserve">שם, פס' 18.</w:t>
       </w:r>
     </w:p>
   </w:footnote>
@@ -2576,7 +1948,7 @@
           <w:sz w:val="20"/>
           <w:szCs w:val="20"/>
         </w:rPr>
-        <w:t xml:space="preserve">ס' 1 לחוק למניעת הטרדה מינית, התשנ"ח–1998 (להלן: החוק למניעת הטרדה מינית); גליה הילדסהימר "החוק למניעת הטרדה מינית, חלקים א'-ב'" מצגת הקורס היבטים משפטיים ואתיים בייעוץ ופיתוח ארגוני, המרכז האקדמי פרס (2026).</w:t>
+        <w:t xml:space="preserve">עס"ק (ארצי) 25476-09-12 הסתדרות העובדים הכללית החדשה נ' פלאפון תקשורת בע"מ (נבו 2.1.2013) (להלן: עניין פלאפון).</w:t>
       </w:r>
     </w:p>
   </w:footnote>
@@ -2606,7 +1978,7 @@
           <w:sz w:val="20"/>
           <w:szCs w:val="20"/>
         </w:rPr>
-        <w:t xml:space="preserve">ס' 2 לחוק למניעת הטרדה מינית (הגדרות "הראה" ו"מסגרת יחסי עבודה").</w:t>
+        <w:t xml:space="preserve">ס' 1 לחוק למניעת הטרדה מינית, התשנ"ח–1998 (להלן: החוק למניעת הטרדה מינית); גליה הילדסהימר "החוק למניעת הטרדה מינית, חלקים א'-ב'" מצגת הקורס היבטים משפטיים ואתיים בייעוץ ופיתוח ארגוני, המרכז האקדמי פרס (2026).</w:t>
       </w:r>
     </w:p>
   </w:footnote>
@@ -2636,7 +2008,7 @@
           <w:sz w:val="20"/>
           <w:szCs w:val="20"/>
         </w:rPr>
-        <w:t xml:space="preserve">עש"ם 2203/05 מדר נ' נציבות שירות המדינה (נבו 21.7.2005) (להלן: עניין מדר).</w:t>
+        <w:t xml:space="preserve">ס' 2 לחוק למניעת הטרדה מינית (הגדרות "הראה" ו"מסגרת יחסי עבודה").</w:t>
       </w:r>
     </w:p>
   </w:footnote>
@@ -2666,7 +2038,7 @@
           <w:sz w:val="20"/>
           <w:szCs w:val="20"/>
         </w:rPr>
-        <w:t xml:space="preserve">תק' 2(ג), 4, 6(ט) ו-8 לתקנות למניעת הטרדה מינית (חובות מעסיק), התשנ"ח–1998.</w:t>
+        <w:t xml:space="preserve">עש"ם 2203/05 מדר נ' נציבות שירות המדינה (נבו 21.7.2005) (להלן: עניין מדר).</w:t>
       </w:r>
     </w:p>
   </w:footnote>
@@ -2696,7 +2068,7 @@
           <w:sz w:val="20"/>
           <w:szCs w:val="20"/>
         </w:rPr>
-        <w:t xml:space="preserve">ס' 7(ו) לחוק למניעת הטרדה מינית; ס' 7(א) לחוק שוויון ההזדמנויות בעבודה, התשמ"ח–1988.</w:t>
+        <w:t xml:space="preserve">תק' 2(ג), 4, 6(ט) ו-8 לתקנות למניעת הטרדה מינית (חובות מעסיק), התשנ"ח–1998.</w:t>
       </w:r>
     </w:p>
   </w:footnote>
@@ -2726,7 +2098,7 @@
           <w:sz w:val="20"/>
           <w:szCs w:val="20"/>
         </w:rPr>
-        <w:t xml:space="preserve">ס' 6א לחוק למניעת הטרדה מינית.</w:t>
+        <w:t xml:space="preserve">ס' 7(ו) לחוק למניעת הטרדה מינית; ס' 7(א) לחוק שוויון ההזדמנויות בעבודה, התשמ"ח–1988.</w:t>
       </w:r>
     </w:p>
   </w:footnote>
@@ -2756,7 +2128,7 @@
           <w:sz w:val="20"/>
           <w:szCs w:val="20"/>
         </w:rPr>
-        <w:t xml:space="preserve">ס' 6(ב), שם.</w:t>
+        <w:t xml:space="preserve">ס' 6א לחוק למניעת הטרדה מינית.</w:t>
       </w:r>
     </w:p>
   </w:footnote>
@@ -2786,7 +2158,7 @@
           <w:sz w:val="20"/>
           <w:szCs w:val="20"/>
         </w:rPr>
-        <w:t xml:space="preserve">בג"ץ 239/83 מילפלדר נ' בית הדין הארצי לעבודה, פ"ד מא(2) 210 (1987).</w:t>
+        <w:t xml:space="preserve">ס' 6(ב), שם.</w:t>
       </w:r>
     </w:p>
   </w:footnote>
@@ -2816,7 +2188,7 @@
           <w:sz w:val="20"/>
           <w:szCs w:val="20"/>
         </w:rPr>
-        <w:t xml:space="preserve">גליה הילדסהימר "חוזה עבודה אישי ומניעת הרעת תנאים, חלקים א'-ב'" מצגת הקורס היבטים משפטיים ואתיים בייעוץ ופיתוח ארגוני, המרכז האקדמי פרס (2026).</w:t>
+        <w:t xml:space="preserve">בג"ץ 239/83 מילפלדר נ' בית הדין הארצי לעבודה, פ"ד מא(2) 210 (1987).</w:t>
       </w:r>
     </w:p>
   </w:footnote>
@@ -2846,7 +2218,7 @@
           <w:sz w:val="20"/>
           <w:szCs w:val="20"/>
         </w:rPr>
-        <w:t xml:space="preserve">ס' 2(א)(3), 3 ו-5א לחוק הודעה לעובד ולמועמד לעבודה (תנאי עבודה והליכי מיון וקבלה לעבודה), התשס"ב–2002.</w:t>
+        <w:t xml:space="preserve">גליה הילדסהימר "חוזה עבודה אישי ומניעת הרעת תנאים, חלקים א'-ב'" מצגת הקורס היבטים משפטיים ואתיים בייעוץ ופיתוח ארגוני, המרכז האקדמי פרס (2026).</w:t>
       </w:r>
     </w:p>
   </w:footnote>
@@ -2876,7 +2248,7 @@
           <w:sz w:val="20"/>
           <w:szCs w:val="20"/>
         </w:rPr>
-        <w:t xml:space="preserve">ס' 11(א) לחוק פיצויי פיטורים, התשכ"ג–1963.</w:t>
+        <w:t xml:space="preserve">ס' 2(א)(3), 3 ו-5א לחוק הודעה לעובד ולמועמד לעבודה (תנאי עבודה והליכי מיון וקבלה לעבודה), התשס"ב–2002.</w:t>
       </w:r>
     </w:p>
   </w:footnote>
@@ -2906,7 +2278,7 @@
           <w:sz w:val="20"/>
           <w:szCs w:val="20"/>
         </w:rPr>
-        <w:t xml:space="preserve">ס' 1(א), שם.</w:t>
+        <w:t xml:space="preserve">ס' 11(א) לחוק פיצויי פיטורים, התשכ"ג–1963.</w:t>
       </w:r>
     </w:p>
   </w:footnote>
@@ -2936,11 +2308,41 @@
           <w:sz w:val="20"/>
           <w:szCs w:val="20"/>
         </w:rPr>
+        <w:t xml:space="preserve">ס' 1(א), שם.</w:t>
+      </w:r>
+    </w:p>
+  </w:footnote>
+  <w:footnote w:id="24">
+    <w:p>
+      <w:pPr>
+        <w:bidi/>
+        <w:spacing w:before="0" w:after="0" w:line="240" w:lineRule="auto"/>
+        <w:jc w:val="both"/>
+      </w:pPr>
+      <w:r>
+        <w:rPr>
+          <w:vertAlign w:val="superscript"/>
+          <w:sz w:val="20"/>
+        </w:rPr>
+        <w:footnoteRef/>
+      </w:r>
+      <w:r>
+        <w:rPr>
+          <w:sz w:val="20"/>
+        </w:rPr>
+        <w:t xml:space="preserve"> </w:t>
+      </w:r>
+      <w:r>
+        <w:rPr>
+          <w:rtl/>
+          <w:sz w:val="20"/>
+          <w:szCs w:val="20"/>
+        </w:rPr>
         <w:t xml:space="preserve">תב"ע (ארצי) נד/86-3 יוחנן גולן נ' אי.אל.די. בע"מ (להלן: עניין גולן).</w:t>
       </w:r>
     </w:p>
   </w:footnote>
-  <w:footnote w:id="24">
+  <w:footnote w:id="25">
     <w:p>
       <w:pPr>
         <w:bidi/>

</xml_diff>

<commit_message>
Replace footnotes with inline citations, keep two pages per answer
Co-Authored-By: Claude Opus 5.5 <noreply@anthropic.com>
Claude-Session: https://claude.ai/code/session_01BVH1n3fvCDz4inkznfhZC9
</commit_message>
<xml_diff>
--- a/output/עבודה_היבטים_משפטיים.docx
+++ b/output/עבודה_היבטים_משפטיים.docx
@@ -260,35 +260,7 @@
           <w:rtl/>
           <w:szCs w:val="24"/>
         </w:rPr>
-        <w:t>).</w:t>
-      </w:r>
-      <w:r>
-        <w:rPr>
-          <w:vertAlign w:val="superscript"/>
-        </w:rPr>
-        <w:footnoteReference w:id="1"/>
-      </w:r>
-      <w:r>
-        <w:rPr>
-          <w:sz w:val="24"/>
-          <w:rtl/>
-          <w:szCs w:val="24"/>
-        </w:rPr>
-        <w:t xml:space="preserve"> הזכות הראשונה מעוגנת בסעיף 33ח לחוק הסכמים קיבוציים,</w:t>
-      </w:r>
-      <w:r>
-        <w:rPr>
-          <w:vertAlign w:val="superscript"/>
-        </w:rPr>
-        <w:footnoteReference w:id="2"/>
-      </w:r>
-      <w:r>
-        <w:rPr>
-          <w:sz w:val="24"/>
-          <w:rtl/>
-          <w:szCs w:val="24"/>
-        </w:rPr>
-        <w:t xml:space="preserve"> וסעיף 33י(א) אוסר על מעסיק לפגוע בעובד בשל חברותו בארגון עובדים, בשל פעילותו להקמתו, וגם בשל הימנעותו מלהיות חבר בו.</w:t>
+        <w:t>) (בן-ישראל, דיני עבודה כרך א, עמ' 48-32; מצגת הקורס "התארגנויות עובדים"). הזכות הראשונה מעוגנת בסעיף 33ח לחוק הסכמים קיבוציים (סעיף 33ח לחוק הסכמים קיבוציים, התשי"ז–1957), וסעיף 33י(א) אוסר על מעסיק לפגוע בעובד בשל חברותו בארגון עובדים, בשל פעילותו להקמתו, וגם בשל הימנעותו מלהיות חבר בו.</w:t>
       </w:r>
     </w:p>
     <w:p>
@@ -339,21 +311,7 @@
           <w:rtl/>
           <w:szCs w:val="24"/>
         </w:rPr>
-        <w:t>.</w:t>
-      </w:r>
-      <w:r>
-        <w:rPr>
-          <w:vertAlign w:val="superscript"/>
-        </w:rPr>
-        <w:footnoteReference w:id="3"/>
-      </w:r>
-      <w:r>
-        <w:rPr>
-          <w:sz w:val="24"/>
-          <w:rtl/>
-          <w:szCs w:val="24"/>
-        </w:rPr>
-        <w:t xml:space="preserve"> מבחן החברות: החברים הם בעיקר עובדים שכירים והחברות רצונית. מבחן התקנון: לארגון תקנון המסדיר את מוסדותיו ומטרותיו. מבחן המטרה: קידום תנאי העבודה בדרך של משא ומתן קיבוצי. מבחן ההתארגנות: ארגון של קבע, עצמאי, המהווה קול נגדי למעסיק.</w:t>
+        <w:t xml:space="preserve"> (בג"ץ 7029/95, פ"ד נא(2) 63 (1997)). מבחן החברות: החברים הם בעיקר עובדים שכירים והחברות רצונית. מבחן התקנון: לארגון תקנון המסדיר את מוסדותיו ומטרותיו. מבחן המטרה: קידום תנאי העבודה בדרך של משא ומתן קיבוצי. מבחן ההתארגנות: ארגון של קבע, עצמאי, המהווה קול נגדי למעסיק.</w:t>
       </w:r>
     </w:p>
     <w:p>
@@ -403,21 +361,7 @@
           <w:rtl/>
           <w:szCs w:val="24"/>
         </w:rPr>
-        <w:t xml:space="preserve"> אף שסעיף הסמכויות מקנה לקבוצה סמכויות של ארגון עובדים, מטרה ד' מוציאה מראש מתחום הפעולה הקיבוצית את השכר, הבונוסים והאופציות. גם מטרה ב', יציבות החברה והמשך פעילותה בישראל, היא אינטרס של המעסיק. הנימוק שבהודעת הקבוצה אינו מחזיק משפטית. הוראות הסכם קיבוצי הן כללים קוגנטיים, ואילו חוזה אישי הוא דיספוזיטיבי,</w:t>
-      </w:r>
-      <w:r>
-        <w:rPr>
-          <w:vertAlign w:val="superscript"/>
-        </w:rPr>
-        <w:footnoteReference w:id="4"/>
-      </w:r>
-      <w:r>
-        <w:rPr>
-          <w:sz w:val="24"/>
-          <w:rtl/>
-          <w:szCs w:val="24"/>
-        </w:rPr>
-        <w:t xml:space="preserve"> אך לפי סעיף 22 לחוק הוראה בחוזה האישי שהיא לטובת העובד גוברת על ההסכם הקיבוצי.</w:t>
+        <w:t xml:space="preserve"> אף שסעיף הסמכויות מקנה לקבוצה סמכויות של ארגון עובדים, מטרה ד' מוציאה מראש מתחום הפעולה הקיבוצית את השכר, הבונוסים והאופציות. גם מטרה ב', יציבות החברה והמשך פעילותה בישראל, היא אינטרס של המעסיק. הנימוק שבהודעת הקבוצה אינו מחזיק משפטית. הוראות הסכם קיבוצי הן כללים קוגנטיים, ואילו חוזה אישי הוא דיספוזיטיבי (מצגת המבוא לקורס; סעיפים 19-20 לחוק), אך לפי סעיף 22 לחוק הוראה בחוזה האישי שהיא לטובת העובד גוברת על ההסכם הקיבוצי.</w:t>
       </w:r>
     </w:p>
     <w:p>
@@ -467,91 +411,7 @@
           <w:rtl/>
           <w:szCs w:val="24"/>
         </w:rPr>
-        <w:t xml:space="preserve"> בנוקיה הוקם ארגון פנימי כחלופה להסתדרות, שהדגיש "שמירה על החוזה האישי של כל עובד". בית הדין הארצי קבע כי העמידה במבחני עניין עמית נבחנת במועד הכרזת היציגות, וכי אין להקל בהם גם לארגון חדש, ובוודאי לא במבחן המטרה.</w:t>
-      </w:r>
-      <w:r>
-        <w:rPr>
-          <w:vertAlign w:val="superscript"/>
-        </w:rPr>
-        <w:footnoteReference w:id="5"/>
-      </w:r>
-      <w:r>
-        <w:rPr>
-          <w:sz w:val="24"/>
-          <w:rtl/>
-          <w:szCs w:val="24"/>
-        </w:rPr>
-        <w:t xml:space="preserve"> נפסק שמטרתו העיקרית של ארגון עובדים חייבת להיות משא ומתן קיבוצי לשיפור תנאי העבודה, ושהמודל הקיבוצי שבבסיס החוק אינו נסוג מפני התרחבות החוזים האישיים.</w:t>
-      </w:r>
-      <w:r>
-        <w:rPr>
-          <w:vertAlign w:val="superscript"/>
-        </w:rPr>
-        <w:footnoteReference w:id="6"/>
-      </w:r>
-      <w:r>
-        <w:rPr>
-          <w:sz w:val="24"/>
-          <w:rtl/>
-          <w:szCs w:val="24"/>
-        </w:rPr>
-        <w:t xml:space="preserve"> עוד נקבע כי אותנטיות היא תנאי הכרחי אך לא מספיק, ו"התארגנות אותנטית של שני שלישים מעובדי המפעל בארגון שכל תכליתה התנגדות ליחסי עבודה קיבוציים אינה יכולה להפוך את אותה התארגנות לארגון עובדים".</w:t>
-      </w:r>
-      <w:r>
-        <w:rPr>
-          <w:vertAlign w:val="superscript"/>
-        </w:rPr>
-        <w:footnoteReference w:id="7"/>
-      </w:r>
-      <w:r>
-        <w:rPr>
-          <w:sz w:val="24"/>
-          <w:rtl/>
-          <w:szCs w:val="24"/>
-        </w:rPr>
-        <w:t xml:space="preserve"> בית הדין הדגיש גם את הטעם לכך: ארגון יציג מקבל כוח לחייב אף עובדים שאינם חברים בו, ולכן רק גוף הכשיר למלא תפקיד זה יוכר.</w:t>
-      </w:r>
-      <w:r>
-        <w:rPr>
-          <w:vertAlign w:val="superscript"/>
-        </w:rPr>
-        <w:footnoteReference w:id="8"/>
-      </w:r>
-      <w:r>
-        <w:rPr>
-          <w:sz w:val="24"/>
-          <w:rtl/>
-          <w:szCs w:val="24"/>
-        </w:rPr>
-        <w:t xml:space="preserve"> הדמיון לענייננו בולט. בין מטרות הארגון בנוקיה נמנו "שימור קיום האתר בישראל" ו"פעולה בדרכי הידברות וגישור" עם ההנהלה,</w:t>
-      </w:r>
-      <w:r>
-        <w:rPr>
-          <w:vertAlign w:val="superscript"/>
-        </w:rPr>
-        <w:footnoteReference w:id="9"/>
-      </w:r>
-      <w:r>
-        <w:rPr>
-          <w:sz w:val="24"/>
-          <w:rtl/>
-          <w:szCs w:val="24"/>
-        </w:rPr>
-        <w:t xml:space="preserve"> ואלה כמעט זהות למטרות ב' ו-ג' של הקבוצה. מאחר שהעמידה במבחנים נבחנת במועד ההכרזה, אין בתיקון מאוחר של התקנון כדי להכשיר את הקבוצה, ואין נפקות לכך שעובדים רבים הצטרפו אליה. יתרה מזו, בנוקיה נקבע שהחברה לא תמכה בארגון הפנימי,</w:t>
-      </w:r>
-      <w:r>
-        <w:rPr>
-          <w:vertAlign w:val="superscript"/>
-        </w:rPr>
-        <w:footnoteReference w:id="10"/>
-      </w:r>
-      <w:r>
-        <w:rPr>
-          <w:sz w:val="24"/>
-          <w:rtl/>
-          <w:szCs w:val="24"/>
-        </w:rPr>
-        <w:t xml:space="preserve"> ואילו כאן המנכ"ל בירך על הקמת הקבוצה ופעל נגד ההסתדרות, כך שגם מבחן העצמאות מהמעסיק אינו מתקיים.</w:t>
+        <w:t xml:space="preserve"> בנוקיה הוקם ארגון פנימי כחלופה להסתדרות, שהדגיש "שמירה על החוזה האישי של כל עובד". בית הדין הארצי קבע כי העמידה במבחני עניין עמית נבחנת במועד הכרזת היציגות, וכי אין להקל בהם גם לארגון חדש, ובוודאי לא במבחן המטרה (עס"ק (ארצי) 6298-03-25, 10.6.2025, פס' 6, 41 ו-44). נפסק שמטרתו העיקרית של ארגון עובדים חייבת להיות משא ומתן קיבוצי לשיפור תנאי העבודה, ושהמודל הקיבוצי שבבסיס החוק אינו נסוג מפני התרחבות החוזים האישיים (שם, פס' 50-51). עוד נקבע כי אותנטיות היא תנאי הכרחי אך לא מספיק, ו"התארגנות אותנטית של שני שלישים מעובדי המפעל בארגון שכל תכליתה התנגדות ליחסי עבודה קיבוציים אינה יכולה להפוך את אותה התארגנות לארגון עובדים" (פס' 47). בית הדין הדגיש גם את הטעם לכך: ארגון יציג מקבל כוח לחייב אף עובדים שאינם חברים בו, ולכן רק גוף הכשיר למלא תפקיד זה יוכר (פס' 43). הדמיון לענייננו בולט. בין מטרות הארגון בנוקיה נמנו "שימור קיום האתר בישראל" ו"פעולה בדרכי הידברות וגישור" עם ההנהלה (פס' 9), ואלה כמעט זהות למטרות ב' ו-ג' של הקבוצה. מאחר שהעמידה במבחנים נבחנת במועד ההכרזה, אין בתיקון מאוחר של התקנון כדי להכשיר את הקבוצה, ואין נפקות לכך שעובדים רבים הצטרפו אליה. יתרה מזו, בנוקיה נקבע שהחברה לא תמכה בארגון הפנימי (פס' 18), ואילו כאן המנכ"ל בירך על הקמת הקבוצה ופעל נגד ההסתדרות, כך שגם מבחן העצמאות מהמעסיק אינו מתקיים.</w:t>
       </w:r>
     </w:p>
     <w:p>
@@ -566,7 +426,7 @@
           <w:rtl/>
           <w:szCs w:val="24"/>
         </w:rPr>
-        <w:t>אין בכך כדי לפגוע בחופש מהתארגנות. עובד רשאי שלא להצטרף להסתדרות, וסעיף 33י(א)(3) מגן עליו מפני פגיעה בשל כך. חברי הקבוצה אינם נספרים לצורך היציגות, והודעתה כי היא הארגון היציג חסרת נפקות. חובת המעסיק לנהל משא ומתן בהתארגנות ראשונית חלה רק כלפי ארגון יציג לפי סעיף 3 (סעיף 33ח1), ואם ההסתדרות תהיה יציגה, עמה יהיה על ההנהלה לנהל משא ומתן.</w:t>
+        <w:t>אין בכך כדי לפגוע בחופש מהתארגנות. עובד רשאי שלא להצטרף להסתדרות, וסעיף 33י(א)(3) מגן עליו מפני פגיעה בשל כך. חברי הקבוצה אינם נספרים לצורך היציגות, והודעתה כי היא הארגון היציג חסרת נפקות. חובת המעסיק לנהל משא ומתן בהתארגנות ראשונית חלה רק כלפי ארגון יציג לפי סעיף 3 (סעיף 33ח1), ואם ההסתדרות תהיה יציגה, עמה יהיה על ההנהלה לנהל משא ומתן. החברה תהפוך אז ל"מפעל מאורגן", וההוראות האישיות שבהסכם הקיבוצי יחולו על כל העובדים מהסוגים הכלולים בו, גם על מי שאינם חברים בהסתדרות (סעיפים 15(3) ו-19 לחוק).</w:t>
       </w:r>
     </w:p>
     <w:p>
@@ -612,17 +472,11 @@
       </w:r>
       <w:r>
         <w:rPr>
-          <w:vertAlign w:val="superscript"/>
-        </w:rPr>
-        <w:footnoteReference w:id="11"/>
-      </w:r>
-      <w:r>
-        <w:rPr>
           <w:sz w:val="24"/>
           <w:rtl/>
           <w:szCs w:val="24"/>
         </w:rPr>
-        <w:t xml:space="preserve"> איזן בית הדין בין חופש הביטוי של המעסיק לחופש ההתארגנות, והבחין בין </w:t>
+        <w:t xml:space="preserve"> (עס"ק (ארצי) 25476-09-12, 2.1.2013) איזן בית הדין בין חופש הביטוי של המעסיק לחופש ההתארגנות, והבחין בין </w:t>
       </w:r>
       <w:r>
         <w:rPr>
@@ -655,7 +509,7 @@
           <w:rtl/>
           <w:szCs w:val="24"/>
         </w:rPr>
-        <w:t>הודעת הדואר האלקטרוני מציגה את ההסתדרות כגורם "חיצוני" שעלול לשנות את התרבות הארגונית וקוראת לעובדים "לשקול היטב". זו הצגת חסרונות ההתארגנות בתכתובת אלקטרונית, כמו ההודעה שנפסלה בעניין פלאפון, אף שהנוסח מתון יותר. הרמז שההסתדרות תפגע ב"תנאי העבודה האישיים" דומה לאזהרה שם מפני נזק לחברה ולעובדים, ובית הדין קבע כי אזהרה כזו אסורה גם כשיש בה אמת. הנחיית מנהלי הצוותים לשוחח עם עובדיהם על "יתרונות המודל האישי" היא מפגש אישי שנאסר במפורש. חומרתה רבה, שכן המנהלים משפיעים על הבונוסים והקידום, וכל שיחה כזו עלולה להיתפס כאיום. הפגישה עם הקבוצה ודברי השבח כלפיה מעבירים בעקיפין את אותו מסר. בעניין פלאפון ניתנו צווים שאסרו על החברה להציג את עמדתה בכל ערוץ ולעקוב אחר העובדים המתארגנים, וצווים דומים מתבקשים גם כאן.</w:t>
+        <w:t>הודעת הדואר האלקטרוני מציגה את ההסתדרות כגורם "חיצוני" שעלול לשנות את התרבות הארגונית וקוראת לעובדים "לשקול היטב". זו הצגת חסרונות ההתארגנות בתכתובת אלקטרונית, כמו ההודעה שנפסלה בעניין פלאפון, אף שהנוסח מתון יותר. הרמז שההסתדרות תפגע ב"תנאי העבודה האישיים" דומה לאזהרה שם מפני נזק לחברה ולעובדים, ובית הדין קבע כי אזהרה כזו אסורה גם כשיש בה אמת. הנחיית מנהלי הצוותים לשוחח עם עובדיהם על "יתרונות המודל האישי" היא מפגש אישי שנאסר במפורש. חומרתה רבה, שכן המנהלים משפיעים על הבונוסים והקידום, וכל שיחה כזו עלולה להיתפס כאיום. אם יתברר שמנהלים קשרו בין הבונוסים או הקידום לבין ההצטרפות להסתדרות, תהיה זו גם הפרה של סעיף 33י(א), שבגינה רשאי בית הדין לפסוק פיצויים לדוגמה של עד 50,000 ש"ח, ובנסיבות חמורות עד 200,000 ש"ח (סעיף 33יא(ב)). הפגישה עם הקבוצה ודברי השבח כלפיה מעבירים בעקיפין את אותו מסר. בעניין פלאפון ניתנו צווים שאסרו על החברה להציג את עמדתה בכל ערוץ ולעקוב אחר העובדים המתארגנים, וצווים דומים מתבקשים גם כאן.</w:t>
       </w:r>
     </w:p>
     <w:p>
@@ -737,21 +591,7 @@
           <w:rtl/>
           <w:szCs w:val="24"/>
         </w:rPr>
-        <w:t>החוק למניעת הטרדה מינית נועד להגן על כבוד האדם, חירותו ופרטיותו.</w:t>
-      </w:r>
-      <w:r>
-        <w:rPr>
-          <w:vertAlign w:val="superscript"/>
-        </w:rPr>
-        <w:footnoteReference w:id="12"/>
-      </w:r>
-      <w:r>
-        <w:rPr>
-          <w:sz w:val="24"/>
-          <w:rtl/>
-          <w:szCs w:val="24"/>
-        </w:rPr>
-        <w:t xml:space="preserve"> החלופה הרלוונטית היא סעיף 3(א)(4): התייחסויות חוזרות המופנות לאדם, המתמקדות במיניותו, כאשר אותו אדם </w:t>
+        <w:t xml:space="preserve">החוק למניעת הטרדה מינית נועד להגן על כבוד האדם, חירותו ופרטיותו (סעיף 1 לחוק למניעת הטרדה מינית, התשנ"ח–1998; מצגות הקורס בנושא). החלופה הרלוונטית היא סעיף 3(א)(4): התייחסויות חוזרות המופנות לאדם, המתמקדות במיניותו, כאשר אותו אדם </w:t>
       </w:r>
       <w:r>
         <w:rPr>
@@ -769,7 +609,7 @@
           <w:rtl/>
           <w:szCs w:val="24"/>
         </w:rPr>
-        <w:t xml:space="preserve"> בהן. השיחות התקיימו במשרד, ולכן ב"מסגרת יחסי עבודה".</w:t>
+        <w:t xml:space="preserve"> בהן. השיחות התקיימו במשרד, ולכן ב"מסגרת יחסי עבודה". השאלה על נטייתו המינית של אורי אינה "התייחסות מבזה או משפילה" לפי סעיף 3(א)(5), האסורה גם בלי שהמוטרד הביע התנגדות, שכן נשאלה בשיחה הדדית ולא בדרך משפילה. גם סיפוריה של דנה על חייה שלה אינם מופנים כלפי מיניותו של אורי.</w:t>
       </w:r>
     </w:p>
     <w:p>
@@ -784,21 +624,7 @@
           <w:rtl/>
           <w:szCs w:val="24"/>
         </w:rPr>
-        <w:t>"הראה" פירושו במילים או בהתנהגות שאין ספק סביר לגבי משמעותה.</w:t>
-      </w:r>
-      <w:r>
-        <w:rPr>
-          <w:vertAlign w:val="superscript"/>
-        </w:rPr>
-        <w:footnoteReference w:id="13"/>
-      </w:r>
-      <w:r>
-        <w:rPr>
-          <w:sz w:val="24"/>
-          <w:rtl/>
-          <w:szCs w:val="24"/>
-        </w:rPr>
-        <w:t xml:space="preserve"> אורי לא הראה זאת בתחילה: הוא שאל שאלות ושיתף פרטים מחייו, וכשביקש להשאיר את הנושא מחוץ לעבודה, דנה הפסיקה מיד.</w:t>
+        <w:t>"הראה" פירושו במילים או בהתנהגות שאין ספק סביר לגבי משמעותה (סעיף 2 לחוק). אורי לא הראה זאת בתחילה: הוא שאל שאלות ושיתף פרטים מחייו, וכשביקש להשאיר את הנושא מחוץ לעבודה, דנה הפסיקה מיד.</w:t>
       </w:r>
     </w:p>
     <w:p>
@@ -845,17 +671,11 @@
       </w:r>
       <w:r>
         <w:rPr>
-          <w:vertAlign w:val="superscript"/>
-        </w:rPr>
-        <w:footnoteReference w:id="14"/>
-      </w:r>
-      <w:r>
-        <w:rPr>
           <w:sz w:val="24"/>
           <w:rtl/>
           <w:szCs w:val="24"/>
         </w:rPr>
-        <w:t xml:space="preserve"> נקבע שיחסי מרות התקיימו אף שהמטריד לא היה הממונה הישיר, ושבקשה עמומה להפסיק, שנבעה מחשש למקום העבודה, אינה שוללת את ההטרדה. לדנה אין סמכות לקבל או לפטר, אך היא משפיעה על שיבוץ וקידום עובדים צעירים כמו אורי. לפי הלכת מדר אלה יחסי מרות, ולכן השתתפותו של אורי בשיחות אינה מעידה בהכרח על הסכמה.</w:t>
+        <w:t xml:space="preserve"> (עש"ם 2203/05, 21.7.2005) נקבע שיחסי מרות התקיימו אף שהמטריד לא היה הממונה הישיר, ושבקשה עמומה להפסיק, שנבעה מחשש למקום העבודה, אינה שוללת את ההטרדה. לדנה אין סמכות לקבל או לפטר, אך היא משפיעה על שיבוץ וקידום עובדים צעירים כמו אורי. לפי הלכת מדר אלה יחסי מרות, ולכן השתתפותו של אורי בשיחות אינה מעידה בהכרח על הסכמה.</w:t>
       </w:r>
     </w:p>
     <w:p>
@@ -902,21 +722,7 @@
           <w:rtl/>
           <w:szCs w:val="24"/>
         </w:rPr>
-        <w:t>מעסיק חייב לנקוט אמצעים סבירים למניעת הטרדה מינית ולטפל בכל מקרה (סעיף 7(א) לחוק). Frame מעסיקה כ-70 עובדים, ולכן עליה גם לפרסם תקנון מותאם ולמנות אחראי לבירור תלונות (סעיף 7(ב)).</w:t>
-      </w:r>
-      <w:r>
-        <w:rPr>
-          <w:vertAlign w:val="superscript"/>
-        </w:rPr>
-        <w:footnoteReference w:id="15"/>
-      </w:r>
-      <w:r>
-        <w:rPr>
-          <w:sz w:val="24"/>
-          <w:rtl/>
-          <w:szCs w:val="24"/>
-        </w:rPr>
-        <w:t xml:space="preserve"> מעסיק שלא עשה כן אחראי בנזיקין למעשי עובדיו (סעיף 7(ג)).</w:t>
+        <w:t>מעסיק חייב לנקוט אמצעים סבירים למניעת הטרדה מינית ולטפל בכל מקרה (סעיף 7(א) לחוק). Frame מעסיקה כ-70 עובדים, ולכן עליה גם לפרסם תקנון מותאם ולמנות אחראי לבירור תלונות (סעיף 7(ב)) (תקנות 2(ג), 4, 6(ט) ו-8 לתקנות למניעת הטרדה מינית (חובות מעסיק), התשנ"ח–1998). מעסיק שלא עשה כן אחראי בנזיקין למעשי עובדיו (סעיף 7(ג)).</w:t>
       </w:r>
     </w:p>
     <w:p>
@@ -941,49 +747,7 @@
           <w:rtl/>
           <w:szCs w:val="24"/>
         </w:rPr>
-        <w:t xml:space="preserve"> היא פגיעה מכל סוג שמקורה בהטרדה מינית או בתלונה עליה (סעיף 3(ב)), ואינה מותנית בכך שהמוטרד סירב. החוק מרחיב את המושג לפגיעה לפי סעיף 7 לחוק שוויון ההזדמנויות בעבודה, שלעניינה די בהתייחסות אחת לפי סעיף 3(א)(4).</w:t>
-      </w:r>
-      <w:r>
-        <w:rPr>
-          <w:vertAlign w:val="superscript"/>
-        </w:rPr>
-        <w:footnoteReference w:id="16"/>
-      </w:r>
-      <w:r>
-        <w:rPr>
-          <w:sz w:val="24"/>
-          <w:rtl/>
-          <w:szCs w:val="24"/>
-        </w:rPr>
-        <w:t xml:space="preserve"> אם יוכרו יחסי מרות, גם השאלה הבודדת על נטייתו של אורי עשויה להספיק. העברתו חודש אחרי שביקש לסיים את השיחות, והשפעתה של דנה על השיבוץ, מעוררות חשד לקשר כזה. השאלה המכרעת היא מי החליט על ההעברה ומדוע: אם דנה המליצה עליה או השפיעה עליה, מדובר בפגיעה שמקורה בהטרדה; אם ההחלטה התקבלה משיקולים ענייניים של צורכי הפרויקטים, אין התנכלות. אם יוכיח אורי שהייתה הטרדה, יעבור למעסיק הנטל להראות שההעברה לא נבעה ממנה,</w:t>
-      </w:r>
-      <w:r>
-        <w:rPr>
-          <w:vertAlign w:val="superscript"/>
-        </w:rPr>
-        <w:footnoteReference w:id="17"/>
-      </w:r>
-      <w:r>
-        <w:rPr>
-          <w:sz w:val="24"/>
-          <w:rtl/>
-          <w:szCs w:val="24"/>
-        </w:rPr>
-        <w:t xml:space="preserve"> ובית הדין רשאי לפסוק פיצוי של עד 120,000 ש"ח ללא הוכחת נזק.</w:t>
-      </w:r>
-      <w:r>
-        <w:rPr>
-          <w:vertAlign w:val="superscript"/>
-        </w:rPr>
-        <w:footnoteReference w:id="18"/>
-      </w:r>
-      <w:r>
-        <w:rPr>
-          <w:sz w:val="24"/>
-          <w:rtl/>
-          <w:szCs w:val="24"/>
-        </w:rPr>
-        <w:t xml:space="preserve"> לצד ההליך האזרחי פתוחים בפני אורי גם הליך משמעתי, תלונה פלילית ותביעה נגד המעסיק.</w:t>
+        <w:t xml:space="preserve"> היא פגיעה מכל סוג שמקורה בהטרדה מינית או בתלונה עליה (סעיף 3(ב)), ואינה מותנית בכך שהמוטרד סירב. החוק מרחיב את המושג לפגיעה לפי סעיף 7 לחוק שוויון ההזדמנויות בעבודה, שלעניינה די בהתייחסות אחת לפי סעיף 3(א)(4) (סעיף 7(ו) לחוק; סעיף 7(א) לחוק שוויון ההזדמנויות בעבודה, התשמ"ח–1988). אם יוכרו יחסי מרות, גם השאלה הבודדת על נטייתו של אורי עשויה להספיק. העברתו חודש אחרי שביקש לסיים את השיחות, והשפעתה של דנה על השיבוץ, מעוררות חשד לקשר כזה. השאלה המכרעת היא מי החליט על ההעברה ומדוע: אם דנה המליצה עליה או השפיעה עליה, מדובר בפגיעה שמקורה בהטרדה; אם ההחלטה התקבלה משיקולים ענייניים של צורכי הפרויקטים, אין התנכלות. אם יוכיח אורי שהייתה הטרדה, יעבור למעסיק הנטל להראות שההעברה לא נבעה ממנה (סעיף 6א לחוק), ובית הדין רשאי לפסוק פיצוי של עד 120,000 ש"ח ללא הוכחת נזק (סעיף 6(ב) לחוק). לצד ההליך האזרחי פתוחים בפני אורי גם הליך משמעתי, תלונה פלילית ותביעה נגד המעסיק.</w:t>
       </w:r>
     </w:p>
     <w:p>
@@ -1033,21 +797,7 @@
           <w:rtl/>
           <w:szCs w:val="24"/>
         </w:rPr>
-        <w:t xml:space="preserve"> מעסיק אינו רשאי לשנות את חוזה העבודה באופן חד-צדדי.</w:t>
-      </w:r>
-      <w:r>
-        <w:rPr>
-          <w:vertAlign w:val="superscript"/>
-        </w:rPr>
-        <w:footnoteReference w:id="19"/>
-      </w:r>
-      <w:r>
-        <w:rPr>
-          <w:sz w:val="24"/>
-          <w:rtl/>
-          <w:szCs w:val="24"/>
-        </w:rPr>
-        <w:t xml:space="preserve"> הפררוגטיבה הניהולית מתירה לו לשנות נהלי עבודה, כמו חובת השתתפות בישיבות, אך שינוי הפוגע במעמד העובד הוא </w:t>
+        <w:t xml:space="preserve"> מעסיק אינו רשאי לשנות את חוזה העבודה באופן חד-צדדי (בג"ץ 239/83, פ"ד מא(2) 210 (1987)). הפררוגטיבה הניהולית מתירה לו לשנות נהלי עבודה, כמו חובת השתתפות בישיבות, אך שינוי הפוגע במעמד העובד הוא </w:t>
       </w:r>
       <w:r>
         <w:rPr>
@@ -1065,27 +815,7 @@
           <w:rtl/>
           <w:szCs w:val="24"/>
         </w:rPr>
-        <w:t>.</w:t>
-      </w:r>
-      <w:r>
-        <w:rPr>
-          <w:vertAlign w:val="superscript"/>
-        </w:rPr>
-        <w:footnoteReference w:id="20"/>
-      </w:r>
-      <w:r>
-        <w:rPr>
-          <w:sz w:val="24"/>
-          <w:rtl/>
-          <w:szCs w:val="24"/>
-        </w:rPr>
-        <w:t xml:space="preserve"> הוצאתו של אורי מישיבות הקריאטיב לבדה מצויה בתחום הפררוגטיבה, אך העברתו מהפרויקטים המרכזיים לעריכה טכנית, עם פחות אחריות, פגעה במעמדו אף ששכרו לא השתנה. גם הפררוגטיבה כפופה לתום לב, ותזמון ההעברה מעורר ספק בכך. שינוי ב"תיאור עיקרי התפקיד" מחייב הודעה בכתב בתוך 30 יום, ובהיעדרה הנטל עובר למעסיק.</w:t>
-      </w:r>
-      <w:r>
-        <w:rPr>
-          <w:vertAlign w:val="superscript"/>
-        </w:rPr>
-        <w:footnoteReference w:id="21"/>
+        <w:t xml:space="preserve"> (מצגות הקורס בנושא חוזה העבודה והרעת תנאים). הוצאתו של אורי מישיבות הקריאטיב לבדה מצויה בתחום הפררוגטיבה, אך העברתו מהפרויקטים המרכזיים לעריכה טכנית, עם פחות אחריות, פגעה במעמדו אף ששכרו לא השתנה. גם הפררוגטיבה כפופה לתום לב, ותזמון ההעברה מעורר ספק בכך. שינוי ב"תיאור עיקרי התפקיד" מחייב הודעה בכתב בתוך 30 יום, ובהיעדרה הנטל עובר למעסיק (סעיפים 2(א)(3), 3 ו-5א לחוק הודעה לעובד ולמועמד לעבודה, התשס"ב–2002).</w:t>
       </w:r>
     </w:p>
     <w:p>
@@ -1118,35 +848,7 @@
           <w:rtl/>
           <w:szCs w:val="24"/>
         </w:rPr>
-        <w:t xml:space="preserve"> בתנאי העבודה, או מחמת "נסיבות אחרות שביחסי עבודה" שבהן אין לדרוש מהעובד להמשיך בעבודתו, נחשבת כפיטורים "לעניין חוק זה".</w:t>
-      </w:r>
-      <w:r>
-        <w:rPr>
-          <w:vertAlign w:val="superscript"/>
-        </w:rPr>
-        <w:footnoteReference w:id="22"/>
-      </w:r>
-      <w:r>
-        <w:rPr>
-          <w:sz w:val="24"/>
-          <w:rtl/>
-          <w:szCs w:val="24"/>
-        </w:rPr>
-        <w:t xml:space="preserve"> הזכאות עצמה מותנית בשנת עבודה אחת ברציפות אצל אותו מעסיק,</w:t>
-      </w:r>
-      <w:r>
-        <w:rPr>
-          <w:vertAlign w:val="superscript"/>
-        </w:rPr>
-        <w:footnoteReference w:id="23"/>
-      </w:r>
-      <w:r>
-        <w:rPr>
-          <w:sz w:val="24"/>
-          <w:rtl/>
-          <w:szCs w:val="24"/>
-        </w:rPr>
-        <w:t xml:space="preserve"> ותקופת העסקתו של אורי אינה ידועה.</w:t>
+        <w:t xml:space="preserve"> בתנאי העבודה, או מחמת "נסיבות אחרות שביחסי עבודה" שבהן אין לדרוש מהעובד להמשיך בעבודתו, נחשבת כפיטורים "לעניין חוק זה" (סעיף 11(א) לחוק פיצויי פיטורים, התשכ"ג–1963). הזכאות עצמה מותנית בשנת עבודה אחת ברציפות אצל אותו מעסיק (סעיף 1(א) לחוק), ותקופת העסקתו של אורי אינה ידועה.</w:t>
       </w:r>
     </w:p>
     <w:p>
@@ -1179,21 +881,7 @@
           <w:rtl/>
           <w:szCs w:val="24"/>
         </w:rPr>
-        <w:t xml:space="preserve"> והזדמנות לתקן, לפעול בתום לב ובלי שיהוי, שכן שיהוי עלול להתפרש כהסכמה בהתנהגות. בעניין גולן</w:t>
-      </w:r>
-      <w:r>
-        <w:rPr>
-          <w:vertAlign w:val="superscript"/>
-        </w:rPr>
-        <w:footnoteReference w:id="24"/>
-      </w:r>
-      <w:r>
-        <w:rPr>
-          <w:sz w:val="24"/>
-          <w:rtl/>
-          <w:szCs w:val="24"/>
-        </w:rPr>
-        <w:t xml:space="preserve"> הכיר בית הדין בהרעת תנאים, אך קבע שעובד שהמשיך לעבוד שמונה חודשים בתנאים החדשים הסכים להם בהתנהגותו.</w:t>
+        <w:t xml:space="preserve"> והזדמנות לתקן, לפעול בתום לב ובלי שיהוי, שכן שיהוי עלול להתפרש כהסכמה בהתנהגות. בעניין גולן (תב"ע (ארצי) נד/86-3) הכיר בית הדין בהרעת תנאים, אך קבע שעובד שהמשיך לעבוד שמונה חודשים בתנאים החדשים הסכים להם בהתנהגותו.</w:t>
       </w:r>
     </w:p>
     <w:p>
@@ -1208,21 +896,7 @@
           <w:rtl/>
           <w:szCs w:val="24"/>
         </w:rPr>
-        <w:t>אורי לא מחה ולא התריע, ועבד ארבעה חודשים במתכונת החדשה, בשונה מהעובד בעניין סלמאן, שהועבר לתפקיד אחר ומחה בכתב על הפחתת שכרו לפני שהתפטר.</w:t>
-      </w:r>
-      <w:r>
-        <w:rPr>
-          <w:vertAlign w:val="superscript"/>
-        </w:rPr>
-        <w:footnoteReference w:id="25"/>
-      </w:r>
-      <w:r>
-        <w:rPr>
-          <w:sz w:val="24"/>
-          <w:rtl/>
-          <w:szCs w:val="24"/>
-        </w:rPr>
-        <w:t xml:space="preserve"> שתיקתו מלמדת על השלמה. גם חלופת "הנסיבות האחרות" אינה מסייעת לו: נדרשות נסיבות שלפי אמות מידה אובייקטיביות אין לדרוש מהעובד להישאר בהן, כמו השפלה או פגיעה, ולא די באי־שביעות רצון. השיחות הסתיימו חודשים לפני ההתפטרות.</w:t>
+        <w:t>אורי לא מחה ולא התריע, ועבד ארבעה חודשים במתכונת החדשה, בשונה מהעובד בעניין סלמאן, שהועבר לתפקיד אחר ומחה בכתב על הפחתת שכרו לפני שהתפטר (ע"ע (ארצי) 28475-03-20, 7.12.2020, פס' 4-10). שתיקתו מלמדת על השלמה. גם חלופת "הנסיבות האחרות" אינה מסייעת לו: נדרשות נסיבות שלפי אמות מידה אובייקטיביות אין לדרוש מהעובד להישאר בהן, כמו השפלה או פגיעה, ולא די באי־שביעות רצון. השיחות הסתיימו חודשים לפני ההתפטרות.</w:t>
       </w:r>
     </w:p>
     <w:p>
@@ -1622,756 +1296,6 @@
       </w:r>
     </w:p>
   </w:footnote>
-  <w:footnote w:id="1">
-    <w:p>
-      <w:pPr>
-        <w:bidi/>
-        <w:spacing w:before="0" w:after="0" w:line="240" w:lineRule="auto"/>
-        <w:jc w:val="both"/>
-      </w:pPr>
-      <w:r>
-        <w:rPr>
-          <w:vertAlign w:val="superscript"/>
-          <w:sz w:val="20"/>
-        </w:rPr>
-        <w:footnoteRef/>
-      </w:r>
-      <w:r>
-        <w:rPr>
-          <w:sz w:val="20"/>
-        </w:rPr>
-        <w:t xml:space="preserve"> </w:t>
-      </w:r>
-      <w:r>
-        <w:rPr>
-          <w:rtl/>
-          <w:sz w:val="20"/>
-          <w:szCs w:val="20"/>
-        </w:rPr>
-        <w:t xml:space="preserve">רות בן-ישראל דיני עבודה כרך א 48-32 (2002); גליה הילדסהימר "התארגנויות עובדים" מצגת הקורס היבטים משפטיים ואתיים בייעוץ ופיתוח ארגוני, המרכז האקדמי פרס (2026).</w:t>
-      </w:r>
-    </w:p>
-  </w:footnote>
-  <w:footnote w:id="2">
-    <w:p>
-      <w:pPr>
-        <w:bidi/>
-        <w:spacing w:before="0" w:after="0" w:line="240" w:lineRule="auto"/>
-        <w:jc w:val="both"/>
-      </w:pPr>
-      <w:r>
-        <w:rPr>
-          <w:vertAlign w:val="superscript"/>
-          <w:sz w:val="20"/>
-        </w:rPr>
-        <w:footnoteRef/>
-      </w:r>
-      <w:r>
-        <w:rPr>
-          <w:sz w:val="20"/>
-        </w:rPr>
-        <w:t xml:space="preserve"> </w:t>
-      </w:r>
-      <w:r>
-        <w:rPr>
-          <w:rtl/>
-          <w:sz w:val="20"/>
-          <w:szCs w:val="20"/>
-        </w:rPr>
-        <w:t xml:space="preserve">ס' 33ח לחוק הסכמים קיבוציים, התשי"ז–1957 (להלן: חוק הסכמים קיבוציים).</w:t>
-      </w:r>
-    </w:p>
-  </w:footnote>
-  <w:footnote w:id="3">
-    <w:p>
-      <w:pPr>
-        <w:bidi/>
-        <w:spacing w:before="0" w:after="0" w:line="240" w:lineRule="auto"/>
-        <w:jc w:val="both"/>
-      </w:pPr>
-      <w:r>
-        <w:rPr>
-          <w:vertAlign w:val="superscript"/>
-          <w:sz w:val="20"/>
-        </w:rPr>
-        <w:footnoteRef/>
-      </w:r>
-      <w:r>
-        <w:rPr>
-          <w:sz w:val="20"/>
-        </w:rPr>
-        <w:t xml:space="preserve"> </w:t>
-      </w:r>
-      <w:r>
-        <w:rPr>
-          <w:rtl/>
-          <w:sz w:val="20"/>
-          <w:szCs w:val="20"/>
-        </w:rPr>
-        <w:t xml:space="preserve">בג"ץ 7029/95 הסתדרות העובדים הכללית החדשה נ' בית הדין הארצי לעבודה, פ"ד נא(2) 63 (1997) (להלן: עניין עמית).</w:t>
-      </w:r>
-    </w:p>
-  </w:footnote>
-  <w:footnote w:id="4">
-    <w:p>
-      <w:pPr>
-        <w:bidi/>
-        <w:spacing w:before="0" w:after="0" w:line="240" w:lineRule="auto"/>
-        <w:jc w:val="both"/>
-      </w:pPr>
-      <w:r>
-        <w:rPr>
-          <w:vertAlign w:val="superscript"/>
-          <w:sz w:val="20"/>
-        </w:rPr>
-        <w:footnoteRef/>
-      </w:r>
-      <w:r>
-        <w:rPr>
-          <w:sz w:val="20"/>
-        </w:rPr>
-        <w:t xml:space="preserve"> </w:t>
-      </w:r>
-      <w:r>
-        <w:rPr>
-          <w:rtl/>
-          <w:sz w:val="20"/>
-          <w:szCs w:val="20"/>
-        </w:rPr>
-        <w:t xml:space="preserve">גליה הילדסהימר "היבטים משפטיים ואתיים בייעוץ ופיתוח ארגוני – מבוא" מצגת הקורס היבטים משפטיים ואתיים בייעוץ ופיתוח ארגוני, המרכז האקדמי פרס (2026); ס' 19-20 לחוק הסכמים קיבוציים.</w:t>
-      </w:r>
-    </w:p>
-  </w:footnote>
-  <w:footnote w:id="5">
-    <w:p>
-      <w:pPr>
-        <w:bidi/>
-        <w:spacing w:before="0" w:after="0" w:line="240" w:lineRule="auto"/>
-        <w:jc w:val="both"/>
-      </w:pPr>
-      <w:r>
-        <w:rPr>
-          <w:vertAlign w:val="superscript"/>
-          <w:sz w:val="20"/>
-        </w:rPr>
-        <w:footnoteRef/>
-      </w:r>
-      <w:r>
-        <w:rPr>
-          <w:sz w:val="20"/>
-        </w:rPr>
-        <w:t xml:space="preserve"> </w:t>
-      </w:r>
-      <w:r>
-        <w:rPr>
-          <w:rtl/>
-          <w:sz w:val="20"/>
-          <w:szCs w:val="20"/>
-        </w:rPr>
-        <w:t xml:space="preserve">עס"ק (ארצי) 6298-03-25 הסתדרות העובדים הכללית החדשה – האגף להתאגדות עובדים נ' ארגון עובדי הפיתוח והשיווק בנוקיה ישראל (נבו 10.6.2025) (להלן: עניין נוקיה), פס' 6, 41 ו-44.</w:t>
-      </w:r>
-    </w:p>
-  </w:footnote>
-  <w:footnote w:id="6">
-    <w:p>
-      <w:pPr>
-        <w:bidi/>
-        <w:spacing w:before="0" w:after="0" w:line="240" w:lineRule="auto"/>
-        <w:jc w:val="both"/>
-      </w:pPr>
-      <w:r>
-        <w:rPr>
-          <w:vertAlign w:val="superscript"/>
-          <w:sz w:val="20"/>
-        </w:rPr>
-        <w:footnoteRef/>
-      </w:r>
-      <w:r>
-        <w:rPr>
-          <w:sz w:val="20"/>
-        </w:rPr>
-        <w:t xml:space="preserve"> </w:t>
-      </w:r>
-      <w:r>
-        <w:rPr>
-          <w:rtl/>
-          <w:sz w:val="20"/>
-          <w:szCs w:val="20"/>
-        </w:rPr>
-        <w:t xml:space="preserve">שם, פס' 50-51.</w:t>
-      </w:r>
-    </w:p>
-  </w:footnote>
-  <w:footnote w:id="7">
-    <w:p>
-      <w:pPr>
-        <w:bidi/>
-        <w:spacing w:before="0" w:after="0" w:line="240" w:lineRule="auto"/>
-        <w:jc w:val="both"/>
-      </w:pPr>
-      <w:r>
-        <w:rPr>
-          <w:vertAlign w:val="superscript"/>
-          <w:sz w:val="20"/>
-        </w:rPr>
-        <w:footnoteRef/>
-      </w:r>
-      <w:r>
-        <w:rPr>
-          <w:sz w:val="20"/>
-        </w:rPr>
-        <w:t xml:space="preserve"> </w:t>
-      </w:r>
-      <w:r>
-        <w:rPr>
-          <w:rtl/>
-          <w:sz w:val="20"/>
-          <w:szCs w:val="20"/>
-        </w:rPr>
-        <w:t xml:space="preserve">שם, פס' 47.</w:t>
-      </w:r>
-    </w:p>
-  </w:footnote>
-  <w:footnote w:id="8">
-    <w:p>
-      <w:pPr>
-        <w:bidi/>
-        <w:spacing w:before="0" w:after="0" w:line="240" w:lineRule="auto"/>
-        <w:jc w:val="both"/>
-      </w:pPr>
-      <w:r>
-        <w:rPr>
-          <w:vertAlign w:val="superscript"/>
-          <w:sz w:val="20"/>
-        </w:rPr>
-        <w:footnoteRef/>
-      </w:r>
-      <w:r>
-        <w:rPr>
-          <w:sz w:val="20"/>
-        </w:rPr>
-        <w:t xml:space="preserve"> </w:t>
-      </w:r>
-      <w:r>
-        <w:rPr>
-          <w:rtl/>
-          <w:sz w:val="20"/>
-          <w:szCs w:val="20"/>
-        </w:rPr>
-        <w:t xml:space="preserve">שם, פס' 43.</w:t>
-      </w:r>
-    </w:p>
-  </w:footnote>
-  <w:footnote w:id="9">
-    <w:p>
-      <w:pPr>
-        <w:bidi/>
-        <w:spacing w:before="0" w:after="0" w:line="240" w:lineRule="auto"/>
-        <w:jc w:val="both"/>
-      </w:pPr>
-      <w:r>
-        <w:rPr>
-          <w:vertAlign w:val="superscript"/>
-          <w:sz w:val="20"/>
-        </w:rPr>
-        <w:footnoteRef/>
-      </w:r>
-      <w:r>
-        <w:rPr>
-          <w:sz w:val="20"/>
-        </w:rPr>
-        <w:t xml:space="preserve"> </w:t>
-      </w:r>
-      <w:r>
-        <w:rPr>
-          <w:rtl/>
-          <w:sz w:val="20"/>
-          <w:szCs w:val="20"/>
-        </w:rPr>
-        <w:t xml:space="preserve">שם, פס' 9.</w:t>
-      </w:r>
-    </w:p>
-  </w:footnote>
-  <w:footnote w:id="10">
-    <w:p>
-      <w:pPr>
-        <w:bidi/>
-        <w:spacing w:before="0" w:after="0" w:line="240" w:lineRule="auto"/>
-        <w:jc w:val="both"/>
-      </w:pPr>
-      <w:r>
-        <w:rPr>
-          <w:vertAlign w:val="superscript"/>
-          <w:sz w:val="20"/>
-        </w:rPr>
-        <w:footnoteRef/>
-      </w:r>
-      <w:r>
-        <w:rPr>
-          <w:sz w:val="20"/>
-        </w:rPr>
-        <w:t xml:space="preserve"> </w:t>
-      </w:r>
-      <w:r>
-        <w:rPr>
-          <w:rtl/>
-          <w:sz w:val="20"/>
-          <w:szCs w:val="20"/>
-        </w:rPr>
-        <w:t xml:space="preserve">שם, פס' 18.</w:t>
-      </w:r>
-    </w:p>
-  </w:footnote>
-  <w:footnote w:id="11">
-    <w:p>
-      <w:pPr>
-        <w:bidi/>
-        <w:spacing w:before="0" w:after="0" w:line="240" w:lineRule="auto"/>
-        <w:jc w:val="both"/>
-      </w:pPr>
-      <w:r>
-        <w:rPr>
-          <w:vertAlign w:val="superscript"/>
-          <w:sz w:val="20"/>
-        </w:rPr>
-        <w:footnoteRef/>
-      </w:r>
-      <w:r>
-        <w:rPr>
-          <w:sz w:val="20"/>
-        </w:rPr>
-        <w:t xml:space="preserve"> </w:t>
-      </w:r>
-      <w:r>
-        <w:rPr>
-          <w:rtl/>
-          <w:sz w:val="20"/>
-          <w:szCs w:val="20"/>
-        </w:rPr>
-        <w:t xml:space="preserve">עס"ק (ארצי) 25476-09-12 הסתדרות העובדים הכללית החדשה נ' פלאפון תקשורת בע"מ (נבו 2.1.2013) (להלן: עניין פלאפון).</w:t>
-      </w:r>
-    </w:p>
-  </w:footnote>
-  <w:footnote w:id="12">
-    <w:p>
-      <w:pPr>
-        <w:bidi/>
-        <w:spacing w:before="0" w:after="0" w:line="240" w:lineRule="auto"/>
-        <w:jc w:val="both"/>
-      </w:pPr>
-      <w:r>
-        <w:rPr>
-          <w:vertAlign w:val="superscript"/>
-          <w:sz w:val="20"/>
-        </w:rPr>
-        <w:footnoteRef/>
-      </w:r>
-      <w:r>
-        <w:rPr>
-          <w:sz w:val="20"/>
-        </w:rPr>
-        <w:t xml:space="preserve"> </w:t>
-      </w:r>
-      <w:r>
-        <w:rPr>
-          <w:rtl/>
-          <w:sz w:val="20"/>
-          <w:szCs w:val="20"/>
-        </w:rPr>
-        <w:t xml:space="preserve">ס' 1 לחוק למניעת הטרדה מינית, התשנ"ח–1998 (להלן: החוק למניעת הטרדה מינית); גליה הילדסהימר "החוק למניעת הטרדה מינית, חלקים א'-ב'" מצגת הקורס היבטים משפטיים ואתיים בייעוץ ופיתוח ארגוני, המרכז האקדמי פרס (2026).</w:t>
-      </w:r>
-    </w:p>
-  </w:footnote>
-  <w:footnote w:id="13">
-    <w:p>
-      <w:pPr>
-        <w:bidi/>
-        <w:spacing w:before="0" w:after="0" w:line="240" w:lineRule="auto"/>
-        <w:jc w:val="both"/>
-      </w:pPr>
-      <w:r>
-        <w:rPr>
-          <w:vertAlign w:val="superscript"/>
-          <w:sz w:val="20"/>
-        </w:rPr>
-        <w:footnoteRef/>
-      </w:r>
-      <w:r>
-        <w:rPr>
-          <w:sz w:val="20"/>
-        </w:rPr>
-        <w:t xml:space="preserve"> </w:t>
-      </w:r>
-      <w:r>
-        <w:rPr>
-          <w:rtl/>
-          <w:sz w:val="20"/>
-          <w:szCs w:val="20"/>
-        </w:rPr>
-        <w:t xml:space="preserve">ס' 2 לחוק למניעת הטרדה מינית (הגדרות "הראה" ו"מסגרת יחסי עבודה").</w:t>
-      </w:r>
-    </w:p>
-  </w:footnote>
-  <w:footnote w:id="14">
-    <w:p>
-      <w:pPr>
-        <w:bidi/>
-        <w:spacing w:before="0" w:after="0" w:line="240" w:lineRule="auto"/>
-        <w:jc w:val="both"/>
-      </w:pPr>
-      <w:r>
-        <w:rPr>
-          <w:vertAlign w:val="superscript"/>
-          <w:sz w:val="20"/>
-        </w:rPr>
-        <w:footnoteRef/>
-      </w:r>
-      <w:r>
-        <w:rPr>
-          <w:sz w:val="20"/>
-        </w:rPr>
-        <w:t xml:space="preserve"> </w:t>
-      </w:r>
-      <w:r>
-        <w:rPr>
-          <w:rtl/>
-          <w:sz w:val="20"/>
-          <w:szCs w:val="20"/>
-        </w:rPr>
-        <w:t xml:space="preserve">עש"ם 2203/05 מדר נ' נציבות שירות המדינה (נבו 21.7.2005) (להלן: עניין מדר).</w:t>
-      </w:r>
-    </w:p>
-  </w:footnote>
-  <w:footnote w:id="15">
-    <w:p>
-      <w:pPr>
-        <w:bidi/>
-        <w:spacing w:before="0" w:after="0" w:line="240" w:lineRule="auto"/>
-        <w:jc w:val="both"/>
-      </w:pPr>
-      <w:r>
-        <w:rPr>
-          <w:vertAlign w:val="superscript"/>
-          <w:sz w:val="20"/>
-        </w:rPr>
-        <w:footnoteRef/>
-      </w:r>
-      <w:r>
-        <w:rPr>
-          <w:sz w:val="20"/>
-        </w:rPr>
-        <w:t xml:space="preserve"> </w:t>
-      </w:r>
-      <w:r>
-        <w:rPr>
-          <w:rtl/>
-          <w:sz w:val="20"/>
-          <w:szCs w:val="20"/>
-        </w:rPr>
-        <w:t xml:space="preserve">תק' 2(ג), 4, 6(ט) ו-8 לתקנות למניעת הטרדה מינית (חובות מעסיק), התשנ"ח–1998.</w:t>
-      </w:r>
-    </w:p>
-  </w:footnote>
-  <w:footnote w:id="16">
-    <w:p>
-      <w:pPr>
-        <w:bidi/>
-        <w:spacing w:before="0" w:after="0" w:line="240" w:lineRule="auto"/>
-        <w:jc w:val="both"/>
-      </w:pPr>
-      <w:r>
-        <w:rPr>
-          <w:vertAlign w:val="superscript"/>
-          <w:sz w:val="20"/>
-        </w:rPr>
-        <w:footnoteRef/>
-      </w:r>
-      <w:r>
-        <w:rPr>
-          <w:sz w:val="20"/>
-        </w:rPr>
-        <w:t xml:space="preserve"> </w:t>
-      </w:r>
-      <w:r>
-        <w:rPr>
-          <w:rtl/>
-          <w:sz w:val="20"/>
-          <w:szCs w:val="20"/>
-        </w:rPr>
-        <w:t xml:space="preserve">ס' 7(ו) לחוק למניעת הטרדה מינית; ס' 7(א) לחוק שוויון ההזדמנויות בעבודה, התשמ"ח–1988.</w:t>
-      </w:r>
-    </w:p>
-  </w:footnote>
-  <w:footnote w:id="17">
-    <w:p>
-      <w:pPr>
-        <w:bidi/>
-        <w:spacing w:before="0" w:after="0" w:line="240" w:lineRule="auto"/>
-        <w:jc w:val="both"/>
-      </w:pPr>
-      <w:r>
-        <w:rPr>
-          <w:vertAlign w:val="superscript"/>
-          <w:sz w:val="20"/>
-        </w:rPr>
-        <w:footnoteRef/>
-      </w:r>
-      <w:r>
-        <w:rPr>
-          <w:sz w:val="20"/>
-        </w:rPr>
-        <w:t xml:space="preserve"> </w:t>
-      </w:r>
-      <w:r>
-        <w:rPr>
-          <w:rtl/>
-          <w:sz w:val="20"/>
-          <w:szCs w:val="20"/>
-        </w:rPr>
-        <w:t xml:space="preserve">ס' 6א לחוק למניעת הטרדה מינית.</w:t>
-      </w:r>
-    </w:p>
-  </w:footnote>
-  <w:footnote w:id="18">
-    <w:p>
-      <w:pPr>
-        <w:bidi/>
-        <w:spacing w:before="0" w:after="0" w:line="240" w:lineRule="auto"/>
-        <w:jc w:val="both"/>
-      </w:pPr>
-      <w:r>
-        <w:rPr>
-          <w:vertAlign w:val="superscript"/>
-          <w:sz w:val="20"/>
-        </w:rPr>
-        <w:footnoteRef/>
-      </w:r>
-      <w:r>
-        <w:rPr>
-          <w:sz w:val="20"/>
-        </w:rPr>
-        <w:t xml:space="preserve"> </w:t>
-      </w:r>
-      <w:r>
-        <w:rPr>
-          <w:rtl/>
-          <w:sz w:val="20"/>
-          <w:szCs w:val="20"/>
-        </w:rPr>
-        <w:t xml:space="preserve">ס' 6(ב), שם.</w:t>
-      </w:r>
-    </w:p>
-  </w:footnote>
-  <w:footnote w:id="19">
-    <w:p>
-      <w:pPr>
-        <w:bidi/>
-        <w:spacing w:before="0" w:after="0" w:line="240" w:lineRule="auto"/>
-        <w:jc w:val="both"/>
-      </w:pPr>
-      <w:r>
-        <w:rPr>
-          <w:vertAlign w:val="superscript"/>
-          <w:sz w:val="20"/>
-        </w:rPr>
-        <w:footnoteRef/>
-      </w:r>
-      <w:r>
-        <w:rPr>
-          <w:sz w:val="20"/>
-        </w:rPr>
-        <w:t xml:space="preserve"> </w:t>
-      </w:r>
-      <w:r>
-        <w:rPr>
-          <w:rtl/>
-          <w:sz w:val="20"/>
-          <w:szCs w:val="20"/>
-        </w:rPr>
-        <w:t xml:space="preserve">בג"ץ 239/83 מילפלדר נ' בית הדין הארצי לעבודה, פ"ד מא(2) 210 (1987).</w:t>
-      </w:r>
-    </w:p>
-  </w:footnote>
-  <w:footnote w:id="20">
-    <w:p>
-      <w:pPr>
-        <w:bidi/>
-        <w:spacing w:before="0" w:after="0" w:line="240" w:lineRule="auto"/>
-        <w:jc w:val="both"/>
-      </w:pPr>
-      <w:r>
-        <w:rPr>
-          <w:vertAlign w:val="superscript"/>
-          <w:sz w:val="20"/>
-        </w:rPr>
-        <w:footnoteRef/>
-      </w:r>
-      <w:r>
-        <w:rPr>
-          <w:sz w:val="20"/>
-        </w:rPr>
-        <w:t xml:space="preserve"> </w:t>
-      </w:r>
-      <w:r>
-        <w:rPr>
-          <w:rtl/>
-          <w:sz w:val="20"/>
-          <w:szCs w:val="20"/>
-        </w:rPr>
-        <w:t xml:space="preserve">גליה הילדסהימר "חוזה עבודה אישי ומניעת הרעת תנאים, חלקים א'-ב'" מצגת הקורס היבטים משפטיים ואתיים בייעוץ ופיתוח ארגוני, המרכז האקדמי פרס (2026).</w:t>
-      </w:r>
-    </w:p>
-  </w:footnote>
-  <w:footnote w:id="21">
-    <w:p>
-      <w:pPr>
-        <w:bidi/>
-        <w:spacing w:before="0" w:after="0" w:line="240" w:lineRule="auto"/>
-        <w:jc w:val="both"/>
-      </w:pPr>
-      <w:r>
-        <w:rPr>
-          <w:vertAlign w:val="superscript"/>
-          <w:sz w:val="20"/>
-        </w:rPr>
-        <w:footnoteRef/>
-      </w:r>
-      <w:r>
-        <w:rPr>
-          <w:sz w:val="20"/>
-        </w:rPr>
-        <w:t xml:space="preserve"> </w:t>
-      </w:r>
-      <w:r>
-        <w:rPr>
-          <w:rtl/>
-          <w:sz w:val="20"/>
-          <w:szCs w:val="20"/>
-        </w:rPr>
-        <w:t xml:space="preserve">ס' 2(א)(3), 3 ו-5א לחוק הודעה לעובד ולמועמד לעבודה (תנאי עבודה והליכי מיון וקבלה לעבודה), התשס"ב–2002.</w:t>
-      </w:r>
-    </w:p>
-  </w:footnote>
-  <w:footnote w:id="22">
-    <w:p>
-      <w:pPr>
-        <w:bidi/>
-        <w:spacing w:before="0" w:after="0" w:line="240" w:lineRule="auto"/>
-        <w:jc w:val="both"/>
-      </w:pPr>
-      <w:r>
-        <w:rPr>
-          <w:vertAlign w:val="superscript"/>
-          <w:sz w:val="20"/>
-        </w:rPr>
-        <w:footnoteRef/>
-      </w:r>
-      <w:r>
-        <w:rPr>
-          <w:sz w:val="20"/>
-        </w:rPr>
-        <w:t xml:space="preserve"> </w:t>
-      </w:r>
-      <w:r>
-        <w:rPr>
-          <w:rtl/>
-          <w:sz w:val="20"/>
-          <w:szCs w:val="20"/>
-        </w:rPr>
-        <w:t xml:space="preserve">ס' 11(א) לחוק פיצויי פיטורים, התשכ"ג–1963.</w:t>
-      </w:r>
-    </w:p>
-  </w:footnote>
-  <w:footnote w:id="23">
-    <w:p>
-      <w:pPr>
-        <w:bidi/>
-        <w:spacing w:before="0" w:after="0" w:line="240" w:lineRule="auto"/>
-        <w:jc w:val="both"/>
-      </w:pPr>
-      <w:r>
-        <w:rPr>
-          <w:vertAlign w:val="superscript"/>
-          <w:sz w:val="20"/>
-        </w:rPr>
-        <w:footnoteRef/>
-      </w:r>
-      <w:r>
-        <w:rPr>
-          <w:sz w:val="20"/>
-        </w:rPr>
-        <w:t xml:space="preserve"> </w:t>
-      </w:r>
-      <w:r>
-        <w:rPr>
-          <w:rtl/>
-          <w:sz w:val="20"/>
-          <w:szCs w:val="20"/>
-        </w:rPr>
-        <w:t xml:space="preserve">ס' 1(א), שם.</w:t>
-      </w:r>
-    </w:p>
-  </w:footnote>
-  <w:footnote w:id="24">
-    <w:p>
-      <w:pPr>
-        <w:bidi/>
-        <w:spacing w:before="0" w:after="0" w:line="240" w:lineRule="auto"/>
-        <w:jc w:val="both"/>
-      </w:pPr>
-      <w:r>
-        <w:rPr>
-          <w:vertAlign w:val="superscript"/>
-          <w:sz w:val="20"/>
-        </w:rPr>
-        <w:footnoteRef/>
-      </w:r>
-      <w:r>
-        <w:rPr>
-          <w:sz w:val="20"/>
-        </w:rPr>
-        <w:t xml:space="preserve"> </w:t>
-      </w:r>
-      <w:r>
-        <w:rPr>
-          <w:rtl/>
-          <w:sz w:val="20"/>
-          <w:szCs w:val="20"/>
-        </w:rPr>
-        <w:t xml:space="preserve">תב"ע (ארצי) נד/86-3 יוחנן גולן נ' אי.אל.די. בע"מ (להלן: עניין גולן).</w:t>
-      </w:r>
-    </w:p>
-  </w:footnote>
-  <w:footnote w:id="25">
-    <w:p>
-      <w:pPr>
-        <w:bidi/>
-        <w:spacing w:before="0" w:after="0" w:line="240" w:lineRule="auto"/>
-        <w:jc w:val="both"/>
-      </w:pPr>
-      <w:r>
-        <w:rPr>
-          <w:vertAlign w:val="superscript"/>
-          <w:sz w:val="20"/>
-        </w:rPr>
-        <w:footnoteRef/>
-      </w:r>
-      <w:r>
-        <w:rPr>
-          <w:sz w:val="20"/>
-        </w:rPr>
-        <w:t xml:space="preserve"> </w:t>
-      </w:r>
-      <w:r>
-        <w:rPr>
-          <w:rtl/>
-          <w:sz w:val="20"/>
-          <w:szCs w:val="20"/>
-        </w:rPr>
-        <w:t xml:space="preserve">ע"ע (ארצי) 28475-03-20 סלמאן נ' אקובג בע"מ, פס' 4-10 (נבו 7.12.2020).</w:t>
-      </w:r>
-    </w:p>
-  </w:footnote>
 </w:footnotes>
 </file>
 

</xml_diff>

<commit_message>
Remove course slides from citations and reference list
Co-Authored-By: Claude Opus 5.5 <noreply@anthropic.com>
Claude-Session: https://claude.ai/code/session_01BVH1n3fvCDz4inkznfhZC9
</commit_message>
<xml_diff>
--- a/output/עבודה_היבטים_משפטיים.docx
+++ b/output/עבודה_היבטים_משפטיים.docx
@@ -260,7 +260,7 @@
           <w:rtl/>
           <w:szCs w:val="24"/>
         </w:rPr>
-        <w:t>) (בן-ישראל, דיני עבודה כרך א, עמ' 48-32; מצגת הקורס "התארגנויות עובדים"). הזכות הראשונה מעוגנת בסעיף 33ח לחוק הסכמים קיבוציים (סעיף 33ח לחוק הסכמים קיבוציים, התשי"ז–1957), וסעיף 33י(א) אוסר על מעסיק לפגוע בעובד בשל חברותו בארגון עובדים, בשל פעילותו להקמתו, וגם בשל הימנעותו מלהיות חבר בו.</w:t>
+        <w:t>) (בן-ישראל, דיני עבודה כרך א, עמ' 48-32). הזכות הראשונה מעוגנת בסעיף 33ח לחוק הסכמים קיבוציים (סעיף 33ח לחוק הסכמים קיבוציים, התשי"ז–1957), וסעיף 33י(א) אוסר על מעסיק לפגוע בעובד בשל חברותו בארגון עובדים, בשל פעילותו להקמתו, וגם בשל הימנעותו מלהיות חבר בו.</w:t>
       </w:r>
     </w:p>
     <w:p>
@@ -361,7 +361,7 @@
           <w:rtl/>
           <w:szCs w:val="24"/>
         </w:rPr>
-        <w:t xml:space="preserve"> אף שסעיף הסמכויות מקנה לקבוצה סמכויות של ארגון עובדים, מטרה ד' מוציאה מראש מתחום הפעולה הקיבוצית את השכר, הבונוסים והאופציות. גם מטרה ב', יציבות החברה והמשך פעילותה בישראל, היא אינטרס של המעסיק. הנימוק שבהודעת הקבוצה אינו מחזיק משפטית. הוראות הסכם קיבוצי הן כללים קוגנטיים, ואילו חוזה אישי הוא דיספוזיטיבי (מצגת המבוא לקורס; סעיפים 19-20 לחוק), אך לפי סעיף 22 לחוק הוראה בחוזה האישי שהיא לטובת העובד גוברת על ההסכם הקיבוצי.</w:t>
+        <w:t xml:space="preserve"> אף שסעיף הסמכויות מקנה לקבוצה סמכויות של ארגון עובדים, מטרה ד' מוציאה מראש מתחום הפעולה הקיבוצית את השכר, הבונוסים והאופציות. גם מטרה ב', יציבות החברה והמשך פעילותה בישראל, היא אינטרס של המעסיק. הנימוק שבהודעת הקבוצה אינו מחזיק משפטית. הוראות הסכם קיבוצי הן כללים קוגנטיים, ואילו חוזה אישי הוא דיספוזיטיבי (סעיפים 19-20 לחוק), אך לפי סעיף 22 לחוק הוראה בחוזה האישי שהיא לטובת העובד גוברת על ההסכם הקיבוצי.</w:t>
       </w:r>
     </w:p>
     <w:p>
@@ -591,7 +591,7 @@
           <w:rtl/>
           <w:szCs w:val="24"/>
         </w:rPr>
-        <w:t xml:space="preserve">החוק למניעת הטרדה מינית נועד להגן על כבוד האדם, חירותו ופרטיותו (סעיף 1 לחוק למניעת הטרדה מינית, התשנ"ח–1998; מצגות הקורס בנושא). החלופה הרלוונטית היא סעיף 3(א)(4): התייחסויות חוזרות המופנות לאדם, המתמקדות במיניותו, כאשר אותו אדם </w:t>
+        <w:t xml:space="preserve">החוק למניעת הטרדה מינית נועד להגן על כבוד האדם, חירותו ופרטיותו (סעיף 1 לחוק למניעת הטרדה מינית, התשנ"ח–1998). החלופה הרלוונטית היא סעיף 3(א)(4): התייחסויות חוזרות המופנות לאדם, המתמקדות במיניותו, כאשר אותו אדם </w:t>
       </w:r>
       <w:r>
         <w:rPr>
@@ -815,7 +815,7 @@
           <w:rtl/>
           <w:szCs w:val="24"/>
         </w:rPr>
-        <w:t xml:space="preserve"> (מצגות הקורס בנושא חוזה העבודה והרעת תנאים). הוצאתו של אורי מישיבות הקריאטיב לבדה מצויה בתחום הפררוגטיבה, אך העברתו מהפרויקטים המרכזיים לעריכה טכנית, עם פחות אחריות, פגעה במעמדו אף ששכרו לא השתנה. גם הפררוגטיבה כפופה לתום לב, ותזמון ההעברה מעורר ספק בכך. שינוי ב"תיאור עיקרי התפקיד" מחייב הודעה בכתב בתוך 30 יום, ובהיעדרה הנטל עובר למעסיק (סעיפים 2(א)(3), 3 ו-5א לחוק הודעה לעובד ולמועמד לעבודה, התשס"ב–2002).</w:t>
+        <w:t>. הוצאתו של אורי מישיבות הקריאטיב לבדה מצויה בתחום הפררוגטיבה, אך העברתו מהפרויקטים המרכזיים לעריכה טכנית, עם פחות אחריות, פגעה במעמדו אף ששכרו לא השתנה. גם הפררוגטיבה כפופה לתום לב, ותזמון ההעברה מעורר ספק בכך. שינוי ב"תיאור עיקרי התפקיד" מחייב הודעה בכתב בתוך 30 יום, ובהיעדרה הנטל עובר למעסיק (סעיפים 2(א)(3), 3 ו-5א לחוק הודעה לעובד ולמועמד לעבודה, התשס"ב–2002).</w:t>
       </w:r>
     </w:p>
     <w:p>
@@ -848,7 +848,7 @@
           <w:rtl/>
           <w:szCs w:val="24"/>
         </w:rPr>
-        <w:t xml:space="preserve"> בתנאי העבודה, או מחמת "נסיבות אחרות שביחסי עבודה" שבהן אין לדרוש מהעובד להמשיך בעבודתו, נחשבת כפיטורים "לעניין חוק זה" (סעיף 11(א) לחוק פיצויי פיטורים, התשכ"ג–1963). הזכאות עצמה מותנית בשנת עבודה אחת ברציפות אצל אותו מעסיק (סעיף 1(א) לחוק), ותקופת העסקתו של אורי אינה ידועה.</w:t>
+        <w:t xml:space="preserve"> בתנאי העבודה, או מחמת "נסיבות אחרות שביחסי עבודה" שבהן אין לדרוש מהעובד להמשיך בעבודתו, נחשבת כפיטורים "לעניין חוק זה" (סעיף 11(א) לחוק פיצויי פיטורים, התשכ"ג–1963). הזכאות עצמה מותנית בשנת עבודה אחת ברציפות אצל אותו מעסיק (סעיף 1(א) לחוק), ותקופת העסקתו של אורי אינה ידועה. אילו הוכרה התפטרותו כפיטורים, היה זכאי לשכר חודש אחד לכל שנת עבודה, ולחלק יחסי בעד חלק משנה (סעיף 12(א) לחוק).</w:t>
       </w:r>
     </w:p>
     <w:p>
@@ -1185,7 +1185,7 @@
           <w:szCs w:val="24"/>
           <w:bCs/>
         </w:rPr>
-        <w:t>ספרות וחומרי הקורס</w:t>
+        <w:t>ספרות</w:t>
       </w:r>
     </w:p>
     <w:p>
@@ -1201,66 +1201,6 @@
           <w:szCs w:val="24"/>
         </w:rPr>
         <w:t>רות בן-ישראל דיני עבודה כרך א 48-32 (2002).</w:t>
-      </w:r>
-    </w:p>
-    <w:p>
-      <w:pPr>
-        <w:bidi/>
-        <w:spacing w:before="0" w:after="0"/>
-        <w:jc w:val="both"/>
-      </w:pPr>
-      <w:r>
-        <w:rPr>
-          <w:sz w:val="24"/>
-          <w:rtl/>
-          <w:szCs w:val="24"/>
-        </w:rPr>
-        <w:t>גליה הילדסהימר "היבטים משפטיים ואתיים בייעוץ ופיתוח ארגוני – מבוא" מצגת הקורס היבטים משפטיים ואתיים בייעוץ ופיתוח ארגוני, המרכז האקדמי פרס (2026).</w:t>
-      </w:r>
-    </w:p>
-    <w:p>
-      <w:pPr>
-        <w:bidi/>
-        <w:spacing w:before="0" w:after="0"/>
-        <w:jc w:val="both"/>
-      </w:pPr>
-      <w:r>
-        <w:rPr>
-          <w:sz w:val="24"/>
-          <w:rtl/>
-          <w:szCs w:val="24"/>
-        </w:rPr>
-        <w:t>גליה הילדסהימר "התארגנויות עובדים" מצגת הקורס היבטים משפטיים ואתיים בייעוץ ופיתוח ארגוני, המרכז האקדמי פרס (2026).</w:t>
-      </w:r>
-    </w:p>
-    <w:p>
-      <w:pPr>
-        <w:bidi/>
-        <w:spacing w:before="0" w:after="0"/>
-        <w:jc w:val="both"/>
-      </w:pPr>
-      <w:r>
-        <w:rPr>
-          <w:sz w:val="24"/>
-          <w:rtl/>
-          <w:szCs w:val="24"/>
-        </w:rPr>
-        <w:t>גליה הילדסהימר "החוק למניעת הטרדה מינית, חלקים א'-ב'" מצגת הקורס היבטים משפטיים ואתיים בייעוץ ופיתוח ארגוני, המרכז האקדמי פרס (2026).</w:t>
-      </w:r>
-    </w:p>
-    <w:p>
-      <w:pPr>
-        <w:bidi/>
-        <w:spacing w:before="0" w:after="0"/>
-        <w:jc w:val="both"/>
-      </w:pPr>
-      <w:r>
-        <w:rPr>
-          <w:sz w:val="24"/>
-          <w:rtl/>
-          <w:szCs w:val="24"/>
-        </w:rPr>
-        <w:t>גליה הילדסהימר "חוזה עבודה אישי ומניעת הרעת תנאים, חלקים א'-ב'" מצגת הקורס היבטים משפטיים ואתיים בייעוץ ופיתוח ארגוני, המרכז האקדמי פרס (2026).</w:t>
       </w:r>
     </w:p>
     <w:sectPr>

</xml_diff>

<commit_message>
Rephrase passages that matched course slides verbatim
Co-Authored-By: Claude Opus 5.5 <noreply@anthropic.com>
Claude-Session: https://claude.ai/code/session_01BVH1n3fvCDz4inkznfhZC9
</commit_message>
<xml_diff>
--- a/output/עבודה_היבטים_משפטיים.docx
+++ b/output/עבודה_היבטים_משפטיים.docx
@@ -311,7 +311,7 @@
           <w:rtl/>
           <w:szCs w:val="24"/>
         </w:rPr>
-        <w:t xml:space="preserve"> (בג"ץ 7029/95, פ"ד נא(2) 63 (1997)). מבחן החברות: החברים הם בעיקר עובדים שכירים והחברות רצונית. מבחן התקנון: לארגון תקנון המסדיר את מוסדותיו ומטרותיו. מבחן המטרה: קידום תנאי העבודה בדרך של משא ומתן קיבוצי. מבחן ההתארגנות: ארגון של קבע, עצמאי, המהווה קול נגדי למעסיק.</w:t>
+        <w:t xml:space="preserve"> (בג"ץ 7029/95, פ"ד נא(2) 63 (1997)). מבחן החברות: החברים הם בעיקר עובדים שכירים והחברות רצונית. מבחן התקנון: לגוף יש מסמך יסוד שקובע את מטרותיו ואת אופן פעולת מוסדותיו. מבחן המטרה: קידום תנאי העבודה בדרך של משא ומתן קיבוצי. מבחן ההתארגנות: ארגון של קבע, עצמאי, המהווה קול נגדי למעסיק.</w:t>
       </w:r>
     </w:p>
     <w:p>
@@ -361,7 +361,7 @@
           <w:rtl/>
           <w:szCs w:val="24"/>
         </w:rPr>
-        <w:t xml:space="preserve"> אף שסעיף הסמכויות מקנה לקבוצה סמכויות של ארגון עובדים, מטרה ד' מוציאה מראש מתחום הפעולה הקיבוצית את השכר, הבונוסים והאופציות. גם מטרה ב', יציבות החברה והמשך פעילותה בישראל, היא אינטרס של המעסיק. הנימוק שבהודעת הקבוצה אינו מחזיק משפטית. הוראות הסכם קיבוצי הן כללים קוגנטיים, ואילו חוזה אישי הוא דיספוזיטיבי (סעיפים 19-20 לחוק), אך לפי סעיף 22 לחוק הוראה בחוזה האישי שהיא לטובת העובד גוברת על ההסכם הקיבוצי.</w:t>
+        <w:t xml:space="preserve"> אף שסעיף הסמכויות מקנה לקבוצה סמכויות של ארגון עובדים, מטרה ד' מוציאה מראש מתחום הפעולה הקיבוצית את השכר, הבונוסים והאופציות. גם מטרה ב', יציבות החברה והמשך פעילותה בישראל, היא אינטרס של המעסיק. הנימוק שבהודעת הקבוצה אינו מחזיק משפטית. הוראות הסכם קיבוצי הן כללים קוגנטיים, ואילו חוזה אישי הוא דיספוזיטיבי (סעיפים 19-20 לחוק), אך לפי סעיף 22 לחוק תנאי אישי שמיטיב עם העובד גובר על ההסכם הקיבוצי.</w:t>
       </w:r>
     </w:p>
     <w:p>
@@ -591,7 +591,7 @@
           <w:rtl/>
           <w:szCs w:val="24"/>
         </w:rPr>
-        <w:t xml:space="preserve">החוק למניעת הטרדה מינית נועד להגן על כבוד האדם, חירותו ופרטיותו (סעיף 1 לחוק למניעת הטרדה מינית, התשנ"ח–1998). החלופה הרלוונטית היא סעיף 3(א)(4): התייחסויות חוזרות המופנות לאדם, המתמקדות במיניותו, כאשר אותו אדם </w:t>
+        <w:t>החוק למניעת הטרדה מינית נועד להגן על כבוד האדם, חירותו ופרטיותו (סעיף 1 לחוק למניעת הטרדה מינית, התשנ"ח–1998). החלופה הרלוונטית היא סעיף 3(א)(4): אמירות שחוזרות על עצמן ועוסקות במיניותו של אדם, לאחר ש</w:t>
       </w:r>
       <w:r>
         <w:rPr>
@@ -601,7 +601,7 @@
           <w:szCs w:val="24"/>
           <w:bCs/>
         </w:rPr>
-        <w:t>הראה למטריד שאינו מעוניין</w:t>
+        <w:t>הבהיר שאינו מעוניין</w:t>
       </w:r>
       <w:r>
         <w:rPr>
@@ -722,7 +722,7 @@
           <w:rtl/>
           <w:szCs w:val="24"/>
         </w:rPr>
-        <w:t>מעסיק חייב לנקוט אמצעים סבירים למניעת הטרדה מינית ולטפל בכל מקרה (סעיף 7(א) לחוק). Frame מעסיקה כ-70 עובדים, ולכן עליה גם לפרסם תקנון מותאם ולמנות אחראי לבירור תלונות (סעיף 7(ב)) (תקנות 2(ג), 4, 6(ט) ו-8 לתקנות למניעת הטרדה מינית (חובות מעסיק), התשנ"ח–1998). מעסיק שלא עשה כן אחראי בנזיקין למעשי עובדיו (סעיף 7(ג)).</w:t>
+        <w:t>על המעסיק לפעול באופן סביר כדי למנוע הטרדה מינית, ולטפל בכל מקרה שנודע לו (סעיף 7(א) לחוק). Frame מעסיקה כ-70 עובדים, ולכן עליה גם לפרסם תקנון מותאם ולמנות אחראי לבירור תלונות (סעיף 7(ב)) (תקנות 2(ג), 4, 6(ט) ו-8 לתקנות למניעת הטרדה מינית (חובות מעסיק), התשנ"ח–1998). מעסיק שלא עשה כן אחראי בנזיקין למעשי עובדיו (סעיף 7(ג)).</w:t>
       </w:r>
     </w:p>
     <w:p>
@@ -747,7 +747,7 @@
           <w:rtl/>
           <w:szCs w:val="24"/>
         </w:rPr>
-        <w:t xml:space="preserve"> היא פגיעה מכל סוג שמקורה בהטרדה מינית או בתלונה עליה (סעיף 3(ב)), ואינה מותנית בכך שהמוטרד סירב. החוק מרחיב את המושג לפגיעה לפי סעיף 7 לחוק שוויון ההזדמנויות בעבודה, שלעניינה די בהתייחסות אחת לפי סעיף 3(א)(4) (סעיף 7(ו) לחוק; סעיף 7(א) לחוק שוויון ההזדמנויות בעבודה, התשמ"ח–1988). אם יוכרו יחסי מרות, גם השאלה הבודדת על נטייתו של אורי עשויה להספיק. העברתו חודש אחרי שביקש לסיים את השיחות, והשפעתה של דנה על השיבוץ, מעוררות חשד לקשר כזה. השאלה המכרעת היא מי החליט על ההעברה ומדוע: אם דנה המליצה עליה או השפיעה עליה, מדובר בפגיעה שמקורה בהטרדה; אם ההחלטה התקבלה משיקולים ענייניים של צורכי הפרויקטים, אין התנכלות. אם יוכיח אורי שהייתה הטרדה, יעבור למעסיק הנטל להראות שההעברה לא נבעה ממנה (סעיף 6א לחוק), ובית הדין רשאי לפסוק פיצוי של עד 120,000 ש"ח ללא הוכחת נזק (סעיף 6(ב) לחוק). לצד ההליך האזרחי פתוחים בפני אורי גם הליך משמעתי, תלונה פלילית ותביעה נגד המעסיק.</w:t>
+        <w:t xml:space="preserve"> היא כל פגיעה בעובד שנגרמה בשל הטרדה מינית או בשל תלונה עליה (סעיף 3(ב)), והיא אינה מותנית בכך שהמוטרד סירב. החוק מרחיב את המושג לפגיעה לפי סעיף 7 לחוק שוויון ההזדמנויות בעבודה, שלעניינה די בהתייחסות אחת לפי סעיף 3(א)(4) (סעיף 7(ו) לחוק; סעיף 7(א) לחוק שוויון ההזדמנויות בעבודה, התשמ"ח–1988). אם יוכרו יחסי מרות, גם השאלה הבודדת על נטייתו של אורי עשויה להספיק. העברתו חודש אחרי שביקש לסיים את השיחות, והשפעתה של דנה על השיבוץ, מעוררות חשד לקשר כזה. השאלה המכרעת היא מי החליט על ההעברה ומדוע: אם דנה המליצה עליה או השפיעה עליה, מדובר בפגיעה שמקורה בהטרדה; אם ההחלטה התקבלה משיקולים ענייניים של צורכי הפרויקטים, אין התנכלות. אם יוכיח אורי שהייתה הטרדה, יעבור למעסיק הנטל להראות שההעברה לא נבעה ממנה (סעיף 6א לחוק), ובית הדין רשאי לפסוק פיצוי של עד 120,000 ש"ח ללא הוכחת נזק (סעיף 6(ב) לחוק). לצד ההליך האזרחי פתוחים בפני אורי גם הליך משמעתי, תלונה פלילית ותביעה נגד המעסיק.</w:t>
       </w:r>
     </w:p>
     <w:p>
@@ -830,7 +830,7 @@
           <w:rtl/>
           <w:szCs w:val="24"/>
         </w:rPr>
-        <w:t xml:space="preserve">לפי חוק פיצויי פיטורים, התפטרות מחמת </w:t>
+        <w:t xml:space="preserve">לפי חוק פיצויי פיטורים, עובד שהתפטר בשל </w:t>
       </w:r>
       <w:r>
         <w:rPr>
@@ -848,7 +848,7 @@
           <w:rtl/>
           <w:szCs w:val="24"/>
         </w:rPr>
-        <w:t xml:space="preserve"> בתנאי העבודה, או מחמת "נסיבות אחרות שביחסי עבודה" שבהן אין לדרוש מהעובד להמשיך בעבודתו, נחשבת כפיטורים "לעניין חוק זה" (סעיף 11(א) לחוק פיצויי פיטורים, התשכ"ג–1963). הזכאות עצמה מותנית בשנת עבודה אחת ברציפות אצל אותו מעסיק (סעיף 1(א) לחוק), ותקופת העסקתו של אורי אינה ידועה. אילו הוכרה התפטרותו כפיטורים, היה זכאי לשכר חודש אחד לכל שנת עבודה, ולחלק יחסי בעד חלק משנה (סעיף 12(א) לחוק).</w:t>
+        <w:t xml:space="preserve"> בתנאי עבודתו, או בשל נסיבות שבהן אי אפשר לצפות ממנו להמשיך לעבוד, ייחשב כמי שפוטר, אך רק לעניין פיצויי הפיטורים (סעיף 11(א) לחוק פיצויי פיטורים, התשכ"ג–1963). הזכאות עצמה מותנית בשנת עבודה אחת ברציפות אצל אותו מעסיק (סעיף 1(א) לחוק), ותקופת העסקתו של אורי אינה ידועה. אילו הוכרה התפטרותו כפיטורים, היה זכאי לשכר חודש אחד לכל שנת עבודה, ולחלק יחסי בעד חלק משנה (סעיף 12(א) לחוק).</w:t>
       </w:r>
     </w:p>
     <w:p>
@@ -881,7 +881,7 @@
           <w:rtl/>
           <w:szCs w:val="24"/>
         </w:rPr>
-        <w:t xml:space="preserve"> והזדמנות לתקן, לפעול בתום לב ובלי שיהוי, שכן שיהוי עלול להתפרש כהסכמה בהתנהגות. בעניין גולן (תב"ע (ארצי) נד/86-3) הכיר בית הדין בהרעת תנאים, אך קבע שעובד שהמשיך לעבוד שמונה חודשים בתנאים החדשים הסכים להם בהתנהגותו.</w:t>
+        <w:t xml:space="preserve"> והזדמנות לתקן, לפעול בתום לב ובלי שיהוי, שכן עיכוב ממושך עלול ללמד שהעובד השלים עם השינוי. בעניין גולן (תב"ע (ארצי) נד/86-3) הכיר בית הדין בהרעת תנאים, אך קבע שעובד שהמשיך לעבוד שמונה חודשים בתנאים החדשים הסכים להם בהתנהגותו.</w:t>
       </w:r>
     </w:p>
     <w:p>

</xml_diff>

<commit_message>
Polish language register and remove duplicated citations
Co-Authored-By: Claude Opus 5.5 <noreply@anthropic.com>
Claude-Session: https://claude.ai/code/session_01BVH1n3fvCDz4inkznfhZC9
</commit_message>
<xml_diff>
--- a/output/עבודה_היבטים_משפטיים.docx
+++ b/output/עבודה_היבטים_משפטיים.docx
@@ -242,7 +242,7 @@
           <w:rtl/>
           <w:szCs w:val="24"/>
         </w:rPr>
-        <w:t>לחופש ההתארגנות שני פנים: הזכות של עובד להתארגן ולפעול בארגון עובדים, והזכות שלא להתארגן (</w:t>
+        <w:t xml:space="preserve">לחופש ההתארגנות שני פנים: הזכות של עובד להתארגן ולפעול בארגון עובדים, והזכות שלא להתארגן, המכונה </w:t>
       </w:r>
       <w:r>
         <w:rPr>
@@ -260,7 +260,7 @@
           <w:rtl/>
           <w:szCs w:val="24"/>
         </w:rPr>
-        <w:t>) (בן-ישראל, דיני עבודה כרך א, עמ' 48-32). הזכות הראשונה מעוגנת בסעיף 33ח לחוק הסכמים קיבוציים (סעיף 33ח לחוק הסכמים קיבוציים, התשי"ז–1957), וסעיף 33י(א) אוסר על מעסיק לפגוע בעובד בשל חברותו בארגון עובדים, בשל פעילותו להקמתו, וגם בשל הימנעותו מלהיות חבר בו.</w:t>
+        <w:t xml:space="preserve"> (בן-ישראל, דיני עבודה כרך א, עמ' 48-32). הזכות הראשונה מעוגנת בסעיף 33ח לחוק הסכמים קיבוציים, התשי"ז–1957, וסעיף 33י(א) אוסר על מעסיק לפגוע בעובד בשל חברותו בארגון עובדים, בשל פעילותו להקמתו, וגם בשל הימנעותו מלהיות חבר בו.</w:t>
       </w:r>
     </w:p>
     <w:p>
@@ -343,7 +343,7 @@
           <w:rtl/>
           <w:szCs w:val="24"/>
         </w:rPr>
-        <w:t xml:space="preserve">מבחני החברות והתקנון מתקיימים, והקושי בשני האחרים. </w:t>
+        <w:t xml:space="preserve">מבחני החברות והתקנון מתקיימים, והקושי מתעורר בשניים האחרים. </w:t>
       </w:r>
       <w:r>
         <w:rPr>
@@ -361,7 +361,7 @@
           <w:rtl/>
           <w:szCs w:val="24"/>
         </w:rPr>
-        <w:t xml:space="preserve"> אף שסעיף הסמכויות מקנה לקבוצה סמכויות של ארגון עובדים, מטרה ד' מוציאה מראש מתחום הפעולה הקיבוצית את השכר, הבונוסים והאופציות. גם מטרה ב', יציבות החברה והמשך פעילותה בישראל, היא אינטרס של המעסיק. הנימוק שבהודעת הקבוצה אינו מחזיק משפטית. הוראות הסכם קיבוצי הן כללים קוגנטיים, ואילו חוזה אישי הוא דיספוזיטיבי (סעיפים 19-20 לחוק), אך לפי סעיף 22 לחוק תנאי אישי שמיטיב עם העובד גובר על ההסכם הקיבוצי.</w:t>
+        <w:t xml:space="preserve"> אף שסעיף הסמכויות מקנה לקבוצה סמכויות של ארגון עובדים, מטרה ד' מוציאה מראש מתחום הפעולה הקיבוצית את השכר, הבונוסים והאופציות. גם מטרה ב', יציבות החברה והמשך פעילותה בישראל, היא אינטרס של המעסיק. אף הנימוק שבהודעת הקבוצה אין בו ממש מבחינה משפטית. הוראות הסכם קיבוצי הן כללים קוגנטיים, ואילו חוזה אישי הוא דיספוזיטיבי (סעיפים 19-20 לחוק), אך לפי סעיף 22 לחוק תנאי אישי שמיטיב עם העובד גובר על ההסכם הקיבוצי.</w:t>
       </w:r>
     </w:p>
     <w:p>
@@ -411,7 +411,7 @@
           <w:rtl/>
           <w:szCs w:val="24"/>
         </w:rPr>
-        <w:t xml:space="preserve"> בנוקיה הוקם ארגון פנימי כחלופה להסתדרות, שהדגיש "שמירה על החוזה האישי של כל עובד". בית הדין הארצי קבע כי העמידה במבחני עניין עמית נבחנת במועד הכרזת היציגות, וכי אין להקל בהם גם לארגון חדש, ובוודאי לא במבחן המטרה (עס"ק (ארצי) 6298-03-25, 10.6.2025, פס' 6, 41 ו-44). נפסק שמטרתו העיקרית של ארגון עובדים חייבת להיות משא ומתן קיבוצי לשיפור תנאי העבודה, ושהמודל הקיבוצי שבבסיס החוק אינו נסוג מפני התרחבות החוזים האישיים (שם, פס' 50-51). עוד נקבע כי אותנטיות היא תנאי הכרחי אך לא מספיק, ו"התארגנות אותנטית של שני שלישים מעובדי המפעל בארגון שכל תכליתה התנגדות ליחסי עבודה קיבוציים אינה יכולה להפוך את אותה התארגנות לארגון עובדים" (פס' 47). בית הדין הדגיש גם את הטעם לכך: ארגון יציג מקבל כוח לחייב אף עובדים שאינם חברים בו, ולכן רק גוף הכשיר למלא תפקיד זה יוכר (פס' 43). הדמיון לענייננו בולט. בין מטרות הארגון בנוקיה נמנו "שימור קיום האתר בישראל" ו"פעולה בדרכי הידברות וגישור" עם ההנהלה (פס' 9), ואלה כמעט זהות למטרות ב' ו-ג' של הקבוצה. מאחר שהעמידה במבחנים נבחנת במועד ההכרזה, אין בתיקון מאוחר של התקנון כדי להכשיר את הקבוצה, ואין נפקות לכך שעובדים רבים הצטרפו אליה. יתרה מזו, בנוקיה נקבע שהחברה לא תמכה בארגון הפנימי (פס' 18), ואילו כאן המנכ"ל בירך על הקמת הקבוצה ופעל נגד ההסתדרות, כך שגם מבחן העצמאות מהמעסיק אינו מתקיים.</w:t>
+        <w:t xml:space="preserve"> בנוקיה הוקם ארגון פנימי כחלופה להסתדרות, שהדגיש "שמירה על החוזה האישי של כל עובד". בית הדין הארצי קבע כי העמידה במבחני עניין עמית נבחנת במועד הכרזת היציגות, וכי אין להקל בהם גם לארגון חדש, ובוודאי לא במבחן המטרה (עס"ק (ארצי) 6298-03-25, 10.6.2025, פס' 6, 41 ו-44). נפסק שמטרתו העיקרית של ארגון עובדים חייבת להיות משא ומתן קיבוצי לשיפור תנאי העבודה, ושהמודל הקיבוצי שבבסיס החוק אינו נסוג מפני התרחבות החוזים האישיים (שם, פס' 50-51). עוד נקבע כי אותנטיות היא תנאי הכרחי אך אינה תנאי מספיק, ו"התארגנות אותנטית של שני שלישים מעובדי המפעל בארגון שכל תכליתה התנגדות ליחסי עבודה קיבוציים אינה יכולה להפוך את אותה התארגנות לארגון עובדים" (פס' 47). בית הדין הדגיש גם את הטעם לכך: ארגון יציג מקבל כוח לחייב אף עובדים שאינם חברים בו, ולכן רק גוף הכשיר למלא תפקיד זה יוכר (פס' 43). הדמיון לענייננו בולט. בין מטרות הארגון בנוקיה נמנו "שימור קיום האתר בישראל" ו"פעולה בדרכי הידברות וגישור" עם ההנהלה (פס' 9), ואלה כמעט זהות למטרות ב' ו-ג' של הקבוצה. מאחר שהעמידה במבחנים נבחנת במועד ההכרזה, אין בתיקון מאוחר של התקנון כדי להכשיר את הקבוצה, ואין נפקות לכך שעובדים רבים הצטרפו אליה. יתרה מזו, בנוקיה נקבע שהחברה לא תמכה בארגון הפנימי (פס' 18), ואילו כאן המנכ"ל בירך על הקמת הקבוצה ופעל נגד ההסתדרות, כך שגם מבחן העצמאות מהמעסיק אינו מתקיים.</w:t>
       </w:r>
     </w:p>
     <w:p>
@@ -509,7 +509,7 @@
           <w:rtl/>
           <w:szCs w:val="24"/>
         </w:rPr>
-        <w:t>הודעת הדואר האלקטרוני מציגה את ההסתדרות כגורם "חיצוני" שעלול לשנות את התרבות הארגונית וקוראת לעובדים "לשקול היטב". זו הצגת חסרונות ההתארגנות בתכתובת אלקטרונית, כמו ההודעה שנפסלה בעניין פלאפון, אף שהנוסח מתון יותר. הרמז שההסתדרות תפגע ב"תנאי העבודה האישיים" דומה לאזהרה שם מפני נזק לחברה ולעובדים, ובית הדין קבע כי אזהרה כזו אסורה גם כשיש בה אמת. הנחיית מנהלי הצוותים לשוחח עם עובדיהם על "יתרונות המודל האישי" היא מפגש אישי שנאסר במפורש. חומרתה רבה, שכן המנהלים משפיעים על הבונוסים והקידום, וכל שיחה כזו עלולה להיתפס כאיום. אם יתברר שמנהלים קשרו בין הבונוסים או הקידום לבין ההצטרפות להסתדרות, תהיה זו גם הפרה של סעיף 33י(א), שבגינה רשאי בית הדין לפסוק פיצויים לדוגמה של עד 50,000 ש"ח, ובנסיבות חמורות עד 200,000 ש"ח (סעיף 33יא(ב)). הפגישה עם הקבוצה ודברי השבח כלפיה מעבירים בעקיפין את אותו מסר. בעניין פלאפון ניתנו צווים שאסרו על החברה להציג את עמדתה בכל ערוץ ולעקוב אחר העובדים המתארגנים, וצווים דומים מתבקשים גם כאן.</w:t>
+        <w:t>הודעת הדואר האלקטרוני מציגה את ההסתדרות כגורם "חיצוני" שעלול לשנות את התרבות הארגונית וקוראת לעובדים "לשקול היטב". זו הצגת חסרונות ההתארגנות בתכתובת אלקטרונית, כמו ההודעה שנפסלה בעניין פלאפון, אף שהנוסח מתון יותר. הרמז שההסתדרות תפגע ב"תנאי העבודה האישיים" דומה לאזהרה שם מפני נזק לחברה ולעובדים, ובית הדין קבע כי אזהרה כזו אסורה גם כשיש בה אמת. הנחיית מנהלי הצוותים לשוחח עם עובדיהם על "יתרונות המודל האישי" היא מפגש אישי שנאסר במפורש. חומרתה רבה, שכן המנהלים משפיעים על הבונוסים והקידום, וכל שיחה כזו עלולה להיתפס כאיום. אם יתברר שמנהלים קשרו בין הבונוסים או הקידום לבין ההצטרפות להסתדרות, תהיה זו גם הפרה של סעיף 33י(א), שבשלה רשאי בית הדין לפסוק פיצויים לדוגמה של עד 50,000 ש"ח, ובנסיבות חמורות עד 200,000 ש"ח (סעיף 33יא(ב)). הפגישה עם הקבוצה ודברי השבח כלפיה מעבירים בעקיפין את אותו מסר. בעניין פלאפון ניתנו צווים שאסרו על החברה להציג את עמדתה בכל ערוץ ולעקוב אחר העובדים המתארגנים, וצווים דומים מתבקשים גם כאן.</w:t>
       </w:r>
     </w:p>
     <w:p>
@@ -591,7 +591,7 @@
           <w:rtl/>
           <w:szCs w:val="24"/>
         </w:rPr>
-        <w:t>החוק למניעת הטרדה מינית נועד להגן על כבוד האדם, חירותו ופרטיותו (סעיף 1 לחוק למניעת הטרדה מינית, התשנ"ח–1998). החלופה הרלוונטית היא סעיף 3(א)(4): אמירות שחוזרות על עצמן ועוסקות במיניותו של אדם, לאחר ש</w:t>
+        <w:t>החוק למניעת הטרדה מינית, התשנ"ח–1998, נועד להגן על כבוד האדם, על חירותו ועל פרטיותו (סעיף 1 לחוק). החלופה הרלוונטית היא סעיף 3(א)(4): אמירות שחוזרות על עצמן ועוסקות במיניותו של אדם, לאחר ש</w:t>
       </w:r>
       <w:r>
         <w:rPr>
@@ -690,7 +690,7 @@
           <w:rtl/>
           <w:szCs w:val="24"/>
         </w:rPr>
-        <w:t>עם זאת, גם כשקיימים יחסי מרות נדרשות התייחסויות חוזרות המתמקדות במיניותו של המוטרד, ונדרש שנוצלו יחסי המרות. השאלה על נטייתו של אורי נשאלה פעם אחת. לכן יש לבחון שתי אפשרויות. אם לא יוכרו יחסי מרות, אין הטרדה: אורי הראה שאינו מעוניין רק בשלב מאוחר, ומאז לא נאמרה כל התייחסות נוספת. אם יוכרו יחסי מרות, עדיין נדרשות התייחסויות חוזרות למיניותו שלו, ואילו רוב השיחות עסקו במיניותה של דנה, היו הדדיות ולא נקשרו למעמדו בעבודה. בשתי האפשרויות קשה לבסס הטרדה מינית. תחושתה של דנה כי הם "חברים טובים" אינה מכרעת: אילו הוכח ניצול מרות, לא היה צורך שאורי יראה דבר. אין זו גם הטרדה סביבתית, שכן ההתנהגות לא יצרה אווירה כללית במשרד.</w:t>
+        <w:t>עם זאת, גם כשקיימים יחסי מרות נדרשות התייחסויות חוזרות המתמקדות במיניותו של המוטרד, ונדרש שנוצלו יחסי המרות. דנה שאלה את אורי על נטייתו המינית פעם אחת בלבד. לכן יש לבחון שתי אפשרויות. אם לא יוכרו יחסי מרות, אין הטרדה: אורי הראה שאינו מעוניין רק בשלב מאוחר, ומאז לא נאמרה כל התייחסות נוספת. אם יוכרו יחסי מרות, עדיין נדרשות התייחסויות חוזרות למיניותו שלו, ואילו רוב השיחות עסקו במיניותה של דנה, היו הדדיות ולא נקשרו למעמדו בעבודה. בשתי האפשרויות קשה לבסס הטרדה מינית. תחושתה של דנה כי הם "חברים טובים" אינה מכרעת: אילו הוכח ניצול מרות, לא היה צורך שאורי יראה דבר. אין זו גם הטרדה סביבתית, שכן ההתנהגות לא יצרה אווירה כללית במשרד.</w:t>
       </w:r>
     </w:p>
     <w:p>
@@ -722,7 +722,7 @@
           <w:rtl/>
           <w:szCs w:val="24"/>
         </w:rPr>
-        <w:t>על המעסיק לפעול באופן סביר כדי למנוע הטרדה מינית, ולטפל בכל מקרה שנודע לו (סעיף 7(א) לחוק). Frame מעסיקה כ-70 עובדים, ולכן עליה גם לפרסם תקנון מותאם ולמנות אחראי לבירור תלונות (סעיף 7(ב)) (תקנות 2(ג), 4, 6(ט) ו-8 לתקנות למניעת הטרדה מינית (חובות מעסיק), התשנ"ח–1998). מעסיק שלא עשה כן אחראי בנזיקין למעשי עובדיו (סעיף 7(ג)).</w:t>
+        <w:t>על המעסיק לפעול באופן סביר כדי למנוע הטרדה מינית, ולטפל בכל מקרה שנודע לו (סעיף 7(א) לחוק). חברת Frame מעסיקה כ-70 עובדים, ולכן עליה גם לפרסם תקנון מותאם ולמנות אחראי לבירור תלונות (סעיף 7(ב) לחוק; תקנות 2(ג), 4, 6(ט) ו-8 לתקנות למניעת הטרדה מינית (חובות מעסיק), התשנ"ח–1998). מעסיק שלא עשה כן אחראי בנזיקין למעשי עובדיו (סעיף 7(ג)).</w:t>
       </w:r>
     </w:p>
     <w:p>
@@ -830,7 +830,7 @@
           <w:rtl/>
           <w:szCs w:val="24"/>
         </w:rPr>
-        <w:t xml:space="preserve">לפי חוק פיצויי פיטורים, עובד שהתפטר בשל </w:t>
+        <w:t xml:space="preserve">לפי סעיף 11(א) לחוק פיצויי פיטורים, התשכ"ג–1963, עובד שהתפטר בשל </w:t>
       </w:r>
       <w:r>
         <w:rPr>
@@ -848,7 +848,7 @@
           <w:rtl/>
           <w:szCs w:val="24"/>
         </w:rPr>
-        <w:t xml:space="preserve"> בתנאי עבודתו, או בשל נסיבות שבהן אי אפשר לצפות ממנו להמשיך לעבוד, ייחשב כמי שפוטר, אך רק לעניין פיצויי הפיטורים (סעיף 11(א) לחוק פיצויי פיטורים, התשכ"ג–1963). הזכאות עצמה מותנית בשנת עבודה אחת ברציפות אצל אותו מעסיק (סעיף 1(א) לחוק), ותקופת העסקתו של אורי אינה ידועה. אילו הוכרה התפטרותו כפיטורים, היה זכאי לשכר חודש אחד לכל שנת עבודה, ולחלק יחסי בעד חלק משנה (סעיף 12(א) לחוק).</w:t>
+        <w:t xml:space="preserve"> בתנאי עבודתו, או בשל נסיבות שבהן אי אפשר לצפות ממנו להמשיך לעבוד, ייחשב כמי שפוטר, אך רק לעניין פיצויי הפיטורים. הזכאות עצמה מותנית בשנת עבודה אחת ברציפות אצל אותו מעסיק (סעיף 1(א) לחוק), ותקופת העסקתו של אורי אינה ידועה. אילו הוכרה התפטרותו כפיטורים, היה זכאי לשכר חודש אחד לכל שנת עבודה, ולחלק יחסי בעד חלק משנה (סעיף 12(א) לחוק).</w:t>
       </w:r>
     </w:p>
     <w:p>

</xml_diff>

<commit_message>
Mark text as Hebrew and hide proofing marks
Co-Authored-By: Claude Opus 5.5 <noreply@anthropic.com>
Claude-Session: https://claude.ai/code/session_01BVH1n3fvCDz4inkznfhZC9
</commit_message>
<xml_diff>
--- a/output/עבודה_היבטים_משפטיים.docx
+++ b/output/עבודה_היבטים_משפטיים.docx
@@ -51,6 +51,7 @@
         <w:rPr>
           <w:sz w:val="26"/>
           <w:rtl/>
+          <w:lang w:val="he-IL" w:bidi="he-IL"/>
           <w:szCs w:val="26"/>
         </w:rPr>
         <w:t>התכנית לייעוץ ופיתוח ארגוני, תואר שני</w:t>
@@ -67,6 +68,7 @@
           <w:b/>
           <w:sz w:val="32"/>
           <w:rtl/>
+          <w:lang w:val="he-IL" w:bidi="he-IL"/>
           <w:szCs w:val="32"/>
           <w:bCs/>
         </w:rPr>
@@ -84,6 +86,7 @@
           <w:b/>
           <w:sz w:val="32"/>
           <w:rtl/>
+          <w:lang w:val="he-IL" w:bidi="he-IL"/>
           <w:szCs w:val="32"/>
           <w:bCs/>
         </w:rPr>
@@ -100,6 +103,7 @@
         <w:rPr>
           <w:sz w:val="26"/>
           <w:rtl/>
+          <w:lang w:val="he-IL" w:bidi="he-IL"/>
           <w:szCs w:val="26"/>
         </w:rPr>
         <w:t>(קוד הקורס: 3008)</w:t>
@@ -115,6 +119,7 @@
         <w:rPr>
           <w:sz w:val="26"/>
           <w:rtl/>
+          <w:lang w:val="he-IL" w:bidi="he-IL"/>
           <w:szCs w:val="26"/>
         </w:rPr>
         <w:t>מרצה: ד"ר גליה הילדסהימר</w:t>
@@ -130,6 +135,7 @@
         <w:rPr>
           <w:sz w:val="26"/>
           <w:rtl/>
+          <w:lang w:val="he-IL" w:bidi="he-IL"/>
           <w:szCs w:val="26"/>
         </w:rPr>
         <w:t>מתרגל: עו"ד טל מזר</w:t>
@@ -145,6 +151,7 @@
         <w:rPr>
           <w:sz w:val="26"/>
           <w:rtl/>
+          <w:lang w:val="he-IL" w:bidi="he-IL"/>
           <w:szCs w:val="26"/>
         </w:rPr>
         <w:t>מגיש/ה: ____________________</w:t>
@@ -160,6 +167,7 @@
         <w:rPr>
           <w:sz w:val="26"/>
           <w:rtl/>
+          <w:lang w:val="he-IL" w:bidi="he-IL"/>
           <w:szCs w:val="26"/>
         </w:rPr>
         <w:t>ת"ז: ____________________</w:t>
@@ -175,6 +183,7 @@
         <w:rPr>
           <w:sz w:val="26"/>
           <w:rtl/>
+          <w:lang w:val="he-IL" w:bidi="he-IL"/>
           <w:szCs w:val="26"/>
         </w:rPr>
         <w:t>סמסטר קיץ, שנה"ל תשפ"ו</w:t>
@@ -190,6 +199,7 @@
         <w:rPr>
           <w:sz w:val="26"/>
           <w:rtl/>
+          <w:lang w:val="he-IL" w:bidi="he-IL"/>
           <w:szCs w:val="26"/>
         </w:rPr>
         <w:t>אוקטובר 2026</w:t>
@@ -207,6 +217,7 @@
           <w:b/>
           <w:sz w:val="28"/>
           <w:rtl/>
+          <w:lang w:val="he-IL" w:bidi="he-IL"/>
           <w:szCs w:val="28"/>
           <w:bCs/>
         </w:rPr>
@@ -224,6 +235,7 @@
           <w:b/>
           <w:sz w:val="24"/>
           <w:rtl/>
+          <w:lang w:val="he-IL" w:bidi="he-IL"/>
           <w:szCs w:val="24"/>
           <w:bCs/>
         </w:rPr>
@@ -240,6 +252,7 @@
         <w:rPr>
           <w:sz w:val="24"/>
           <w:rtl/>
+          <w:lang w:val="he-IL" w:bidi="he-IL"/>
           <w:szCs w:val="24"/>
         </w:rPr>
         <w:t xml:space="preserve">לחופש ההתארגנות שני פנים: הזכות של עובד להתארגן ולפעול בארגון עובדים, והזכות שלא להתארגן, המכונה </w:t>
@@ -249,6 +262,7 @@
           <w:b/>
           <w:sz w:val="24"/>
           <w:rtl/>
+          <w:lang w:val="he-IL" w:bidi="he-IL"/>
           <w:szCs w:val="24"/>
           <w:bCs/>
         </w:rPr>
@@ -258,6 +272,7 @@
         <w:rPr>
           <w:sz w:val="24"/>
           <w:rtl/>
+          <w:lang w:val="he-IL" w:bidi="he-IL"/>
           <w:szCs w:val="24"/>
         </w:rPr>
         <w:t xml:space="preserve"> (בן-ישראל, דיני עבודה כרך א, עמ' 48-32). הזכות הראשונה מעוגנת בסעיף 33ח לחוק הסכמים קיבוציים, התשי"ז–1957, וסעיף 33י(א) אוסר על מעסיק לפגוע בעובד בשל חברותו בארגון עובדים, בשל פעילותו להקמתו, וגם בשל הימנעותו מלהיות חבר בו.</w:t>
@@ -273,6 +288,7 @@
         <w:rPr>
           <w:sz w:val="24"/>
           <w:rtl/>
+          <w:lang w:val="he-IL" w:bidi="he-IL"/>
           <w:szCs w:val="24"/>
         </w:rPr>
         <w:t xml:space="preserve">ההכרה בגוף כ"ארגון עובדים" היא תנאי סף. רק ארגון עובדים יכול להיות </w:t>
@@ -282,6 +298,7 @@
           <w:b/>
           <w:sz w:val="24"/>
           <w:rtl/>
+          <w:lang w:val="he-IL" w:bidi="he-IL"/>
           <w:szCs w:val="24"/>
           <w:bCs/>
         </w:rPr>
@@ -291,6 +308,7 @@
         <w:rPr>
           <w:sz w:val="24"/>
           <w:rtl/>
+          <w:lang w:val="he-IL" w:bidi="he-IL"/>
           <w:szCs w:val="24"/>
         </w:rPr>
         <w:t>, כלומר הארגון שבו מאורגן המספר הגדול ביותר של העובדים, ובלבד שאינו פחות משליש (סעיף 3 לחוק), ורק הארגון היציג רשאי לחתום על הסכם קיבוצי מיוחד במפעל (סעיף 2(1) לחוק). החוק אינו מגדיר "ארגון עובדים", והמבחנים נקבעו ב</w:t>
@@ -300,6 +318,7 @@
           <w:b/>
           <w:sz w:val="24"/>
           <w:rtl/>
+          <w:lang w:val="he-IL" w:bidi="he-IL"/>
           <w:szCs w:val="24"/>
           <w:bCs/>
         </w:rPr>
@@ -309,6 +328,7 @@
         <w:rPr>
           <w:sz w:val="24"/>
           <w:rtl/>
+          <w:lang w:val="he-IL" w:bidi="he-IL"/>
           <w:szCs w:val="24"/>
         </w:rPr>
         <w:t xml:space="preserve"> (בג"ץ 7029/95, פ"ד נא(2) 63 (1997)). מבחן החברות: החברים הם בעיקר עובדים שכירים והחברות רצונית. מבחן התקנון: לגוף יש מסמך יסוד שקובע את מטרותיו ואת אופן פעולת מוסדותיו. מבחן המטרה: קידום תנאי העבודה בדרך של משא ומתן קיבוצי. מבחן ההתארגנות: ארגון של קבע, עצמאי, המהווה קול נגדי למעסיק.</w:t>
@@ -325,6 +345,7 @@
           <w:b/>
           <w:sz w:val="24"/>
           <w:rtl/>
+          <w:lang w:val="he-IL" w:bidi="he-IL"/>
           <w:szCs w:val="24"/>
           <w:bCs/>
         </w:rPr>
@@ -341,6 +362,7 @@
         <w:rPr>
           <w:sz w:val="24"/>
           <w:rtl/>
+          <w:lang w:val="he-IL" w:bidi="he-IL"/>
           <w:szCs w:val="24"/>
         </w:rPr>
         <w:t xml:space="preserve">מבחני החברות והתקנון מתקיימים, והקושי מתעורר בשניים האחרים. </w:t>
@@ -350,6 +372,7 @@
           <w:b/>
           <w:sz w:val="24"/>
           <w:rtl/>
+          <w:lang w:val="he-IL" w:bidi="he-IL"/>
           <w:szCs w:val="24"/>
           <w:bCs/>
         </w:rPr>
@@ -359,6 +382,7 @@
         <w:rPr>
           <w:sz w:val="24"/>
           <w:rtl/>
+          <w:lang w:val="he-IL" w:bidi="he-IL"/>
           <w:szCs w:val="24"/>
         </w:rPr>
         <w:t xml:space="preserve"> אף שסעיף הסמכויות מקנה לקבוצה סמכויות של ארגון עובדים, מטרה ד' מוציאה מראש מתחום הפעולה הקיבוצית את השכר, הבונוסים והאופציות. גם מטרה ב', יציבות החברה והמשך פעילותה בישראל, היא אינטרס של המעסיק. אף הנימוק שבהודעת הקבוצה אין בו ממש מבחינה משפטית. הוראות הסכם קיבוצי הן כללים קוגנטיים, ואילו חוזה אישי הוא דיספוזיטיבי (סעיפים 19-20 לחוק), אך לפי סעיף 22 לחוק תנאי אישי שמיטיב עם העובד גובר על ההסכם הקיבוצי.</w:t>
@@ -375,6 +399,7 @@
           <w:b/>
           <w:sz w:val="24"/>
           <w:rtl/>
+          <w:lang w:val="he-IL" w:bidi="he-IL"/>
           <w:szCs w:val="24"/>
           <w:bCs/>
         </w:rPr>
@@ -384,6 +409,7 @@
         <w:rPr>
           <w:sz w:val="24"/>
           <w:rtl/>
+          <w:lang w:val="he-IL" w:bidi="he-IL"/>
           <w:szCs w:val="24"/>
         </w:rPr>
         <w:t xml:space="preserve"> הקבוצה הוקמה בתגובה ישירה להצטרפות העובדים להסתדרות ומגדירה את עצמה כמי שפועלת "בשיתוף פעולה ובהידברות" עם ההנהלה. גוף כזה אינו "קול נגדי" למעסיק.</w:t>
@@ -400,6 +426,7 @@
           <w:b/>
           <w:sz w:val="24"/>
           <w:rtl/>
+          <w:lang w:val="he-IL" w:bidi="he-IL"/>
           <w:szCs w:val="24"/>
           <w:bCs/>
         </w:rPr>
@@ -409,6 +436,7 @@
         <w:rPr>
           <w:sz w:val="24"/>
           <w:rtl/>
+          <w:lang w:val="he-IL" w:bidi="he-IL"/>
           <w:szCs w:val="24"/>
         </w:rPr>
         <w:t xml:space="preserve"> בנוקיה הוקם ארגון פנימי כחלופה להסתדרות, שהדגיש "שמירה על החוזה האישי של כל עובד". בית הדין הארצי קבע כי העמידה במבחני עניין עמית נבחנת במועד הכרזת היציגות, וכי אין להקל בהם גם לארגון חדש, ובוודאי לא במבחן המטרה (עס"ק (ארצי) 6298-03-25, 10.6.2025, פס' 6, 41 ו-44). נפסק שמטרתו העיקרית של ארגון עובדים חייבת להיות משא ומתן קיבוצי לשיפור תנאי העבודה, ושהמודל הקיבוצי שבבסיס החוק אינו נסוג מפני התרחבות החוזים האישיים (שם, פס' 50-51). עוד נקבע כי אותנטיות היא תנאי הכרחי אך אינה תנאי מספיק, ו"התארגנות אותנטית של שני שלישים מעובדי המפעל בארגון שכל תכליתה התנגדות ליחסי עבודה קיבוציים אינה יכולה להפוך את אותה התארגנות לארגון עובדים" (פס' 47). בית הדין הדגיש גם את הטעם לכך: ארגון יציג מקבל כוח לחייב אף עובדים שאינם חברים בו, ולכן רק גוף הכשיר למלא תפקיד זה יוכר (פס' 43). הדמיון לענייננו בולט. בין מטרות הארגון בנוקיה נמנו "שימור קיום האתר בישראל" ו"פעולה בדרכי הידברות וגישור" עם ההנהלה (פס' 9), ואלה כמעט זהות למטרות ב' ו-ג' של הקבוצה. מאחר שהעמידה במבחנים נבחנת במועד ההכרזה, אין בתיקון מאוחר של התקנון כדי להכשיר את הקבוצה, ואין נפקות לכך שעובדים רבים הצטרפו אליה. יתרה מזו, בנוקיה נקבע שהחברה לא תמכה בארגון הפנימי (פס' 18), ואילו כאן המנכ"ל בירך על הקמת הקבוצה ופעל נגד ההסתדרות, כך שגם מבחן העצמאות מהמעסיק אינו מתקיים.</w:t>
@@ -424,6 +452,7 @@
         <w:rPr>
           <w:sz w:val="24"/>
           <w:rtl/>
+          <w:lang w:val="he-IL" w:bidi="he-IL"/>
           <w:szCs w:val="24"/>
         </w:rPr>
         <w:t>אין בכך כדי לפגוע בחופש מהתארגנות. עובד רשאי שלא להצטרף להסתדרות, וסעיף 33י(א)(3) מגן עליו מפני פגיעה בשל כך. חברי הקבוצה אינם נספרים לצורך היציגות, והודעתה כי היא הארגון היציג חסרת נפקות. חובת המעסיק לנהל משא ומתן בהתארגנות ראשונית חלה רק כלפי ארגון יציג לפי סעיף 3 (סעיף 33ח1), ואם ההסתדרות תהיה יציגה, עמה יהיה על ההנהלה לנהל משא ומתן. החברה תהפוך אז ל"מפעל מאורגן", וההוראות האישיות שבהסכם הקיבוצי יחולו על כל העובדים מהסוגים הכלולים בו, גם על מי שאינם חברים בהסתדרות (סעיפים 15(3) ו-19 לחוק).</w:t>
@@ -440,6 +469,7 @@
           <w:b/>
           <w:sz w:val="24"/>
           <w:rtl/>
+          <w:lang w:val="he-IL" w:bidi="he-IL"/>
           <w:szCs w:val="24"/>
           <w:bCs/>
         </w:rPr>
@@ -456,6 +486,7 @@
         <w:rPr>
           <w:sz w:val="24"/>
           <w:rtl/>
+          <w:lang w:val="he-IL" w:bidi="he-IL"/>
           <w:szCs w:val="24"/>
         </w:rPr>
         <w:t>ב</w:t>
@@ -465,6 +496,7 @@
           <w:b/>
           <w:sz w:val="24"/>
           <w:rtl/>
+          <w:lang w:val="he-IL" w:bidi="he-IL"/>
           <w:szCs w:val="24"/>
           <w:bCs/>
         </w:rPr>
@@ -474,6 +506,7 @@
         <w:rPr>
           <w:sz w:val="24"/>
           <w:rtl/>
+          <w:lang w:val="he-IL" w:bidi="he-IL"/>
           <w:szCs w:val="24"/>
         </w:rPr>
         <w:t xml:space="preserve"> (עס"ק (ארצי) 25476-09-12, 2.1.2013) איזן בית הדין בין חופש הביטוי של המעסיק לחופש ההתארגנות, והבחין בין </w:t>
@@ -483,6 +516,7 @@
           <w:b/>
           <w:sz w:val="24"/>
           <w:rtl/>
+          <w:lang w:val="he-IL" w:bidi="he-IL"/>
           <w:szCs w:val="24"/>
           <w:bCs/>
         </w:rPr>
@@ -492,6 +526,7 @@
         <w:rPr>
           <w:sz w:val="24"/>
           <w:rtl/>
+          <w:lang w:val="he-IL" w:bidi="he-IL"/>
           <w:szCs w:val="24"/>
         </w:rPr>
         <w:t xml:space="preserve"> לבין שלב שבו כבר קיים ארגון יציג. בשלב הראשון גובר חופש ההתארגנות: המעסיק אינו רשאי להביע עמדה על ההתארגנות בשום ערוץ, לרבות בשיחות אישיות ובדואר אלקטרוני, וגם הצבעה על חסרונותיה לעובדים או לחברה, נכונה ככל שתהיה, אסורה. ההתארגנות ב-NeuroTech נמצאת בשלב הפורץ, ולכן שלוש פעולות ההנהלה אסורות.</w:t>
@@ -507,6 +542,7 @@
         <w:rPr>
           <w:sz w:val="24"/>
           <w:rtl/>
+          <w:lang w:val="he-IL" w:bidi="he-IL"/>
           <w:szCs w:val="24"/>
         </w:rPr>
         <w:t>הודעת הדואר האלקטרוני מציגה את ההסתדרות כגורם "חיצוני" שעלול לשנות את התרבות הארגונית וקוראת לעובדים "לשקול היטב". זו הצגת חסרונות ההתארגנות בתכתובת אלקטרונית, כמו ההודעה שנפסלה בעניין פלאפון, אף שהנוסח מתון יותר. הרמז שההסתדרות תפגע ב"תנאי העבודה האישיים" דומה לאזהרה שם מפני נזק לחברה ולעובדים, ובית הדין קבע כי אזהרה כזו אסורה גם כשיש בה אמת. הנחיית מנהלי הצוותים לשוחח עם עובדיהם על "יתרונות המודל האישי" היא מפגש אישי שנאסר במפורש. חומרתה רבה, שכן המנהלים משפיעים על הבונוסים והקידום, וכל שיחה כזו עלולה להיתפס כאיום. אם יתברר שמנהלים קשרו בין הבונוסים או הקידום לבין ההצטרפות להסתדרות, תהיה זו גם הפרה של סעיף 33י(א), שבשלה רשאי בית הדין לפסוק פיצויים לדוגמה של עד 50,000 ש"ח, ובנסיבות חמורות עד 200,000 ש"ח (סעיף 33יא(ב)). הפגישה עם הקבוצה ודברי השבח כלפיה מעבירים בעקיפין את אותו מסר. בעניין פלאפון ניתנו צווים שאסרו על החברה להציג את עמדתה בכל ערוץ ולעקוב אחר העובדים המתארגנים, וצווים דומים מתבקשים גם כאן.</w:t>
@@ -523,6 +559,7 @@
           <w:b/>
           <w:sz w:val="24"/>
           <w:rtl/>
+          <w:lang w:val="he-IL" w:bidi="he-IL"/>
           <w:szCs w:val="24"/>
           <w:bCs/>
         </w:rPr>
@@ -539,6 +576,7 @@
         <w:rPr>
           <w:sz w:val="24"/>
           <w:rtl/>
+          <w:lang w:val="he-IL" w:bidi="he-IL"/>
           <w:szCs w:val="24"/>
         </w:rPr>
         <w:t>טענות ההסתדרות מוצדקות: הקבוצה אינה ארגון עובדים, כפי שנפסק בעניין נוקיה, ופעולות ההנהלה הפרו את הלכת פלאפון.</w:t>
@@ -556,6 +594,7 @@
           <w:b/>
           <w:sz w:val="28"/>
           <w:rtl/>
+          <w:lang w:val="he-IL" w:bidi="he-IL"/>
           <w:szCs w:val="28"/>
           <w:bCs/>
         </w:rPr>
@@ -573,6 +612,7 @@
           <w:b/>
           <w:sz w:val="24"/>
           <w:rtl/>
+          <w:lang w:val="he-IL" w:bidi="he-IL"/>
           <w:szCs w:val="24"/>
           <w:bCs/>
         </w:rPr>
@@ -589,6 +629,7 @@
         <w:rPr>
           <w:sz w:val="24"/>
           <w:rtl/>
+          <w:lang w:val="he-IL" w:bidi="he-IL"/>
           <w:szCs w:val="24"/>
         </w:rPr>
         <w:t>החוק למניעת הטרדה מינית, התשנ"ח–1998, נועד להגן על כבוד האדם, על חירותו ועל פרטיותו (סעיף 1 לחוק). החלופה הרלוונטית היא סעיף 3(א)(4): אמירות שחוזרות על עצמן ועוסקות במיניותו של אדם, לאחר ש</w:t>
@@ -598,6 +639,7 @@
           <w:b/>
           <w:sz w:val="24"/>
           <w:rtl/>
+          <w:lang w:val="he-IL" w:bidi="he-IL"/>
           <w:szCs w:val="24"/>
           <w:bCs/>
         </w:rPr>
@@ -607,6 +649,7 @@
         <w:rPr>
           <w:sz w:val="24"/>
           <w:rtl/>
+          <w:lang w:val="he-IL" w:bidi="he-IL"/>
           <w:szCs w:val="24"/>
         </w:rPr>
         <w:t xml:space="preserve"> בהן. השיחות התקיימו במשרד, ולכן ב"מסגרת יחסי עבודה". השאלה על נטייתו המינית של אורי אינה "התייחסות מבזה או משפילה" לפי סעיף 3(א)(5), האסורה גם בלי שהמוטרד הביע התנגדות, שכן נשאלה בשיחה הדדית ולא בדרך משפילה. גם סיפוריה של דנה על חייה שלה אינם מופנים כלפי מיניותו של אורי.</w:t>
@@ -622,6 +665,7 @@
         <w:rPr>
           <w:sz w:val="24"/>
           <w:rtl/>
+          <w:lang w:val="he-IL" w:bidi="he-IL"/>
           <w:szCs w:val="24"/>
         </w:rPr>
         <w:t>"הראה" פירושו במילים או בהתנהגות שאין ספק סביר לגבי משמעותה (סעיף 2 לחוק). אורי לא הראה זאת בתחילה: הוא שאל שאלות ושיתף פרטים מחייו, וכשביקש להשאיר את הנושא מחוץ לעבודה, דנה הפסיקה מיד.</w:t>
@@ -637,6 +681,7 @@
         <w:rPr>
           <w:sz w:val="24"/>
           <w:rtl/>
+          <w:lang w:val="he-IL" w:bidi="he-IL"/>
           <w:szCs w:val="24"/>
         </w:rPr>
         <w:t xml:space="preserve">השאלה העיקרית היא </w:t>
@@ -646,6 +691,7 @@
           <w:b/>
           <w:sz w:val="24"/>
           <w:rtl/>
+          <w:lang w:val="he-IL" w:bidi="he-IL"/>
           <w:szCs w:val="24"/>
           <w:bCs/>
         </w:rPr>
@@ -655,6 +701,7 @@
         <w:rPr>
           <w:sz w:val="24"/>
           <w:rtl/>
+          <w:lang w:val="he-IL" w:bidi="he-IL"/>
           <w:szCs w:val="24"/>
         </w:rPr>
         <w:t>. לפי סעיף 3(א)(6)(ג), כאשר ההתייחסויות נעשות תוך ניצול מרות ביחסי עבודה, אין צורך שהמוטרד יראה שאינו מעוניין. ב</w:t>
@@ -664,6 +711,7 @@
           <w:b/>
           <w:sz w:val="24"/>
           <w:rtl/>
+          <w:lang w:val="he-IL" w:bidi="he-IL"/>
           <w:szCs w:val="24"/>
           <w:bCs/>
         </w:rPr>
@@ -673,6 +721,7 @@
         <w:rPr>
           <w:sz w:val="24"/>
           <w:rtl/>
+          <w:lang w:val="he-IL" w:bidi="he-IL"/>
           <w:szCs w:val="24"/>
         </w:rPr>
         <w:t xml:space="preserve"> (עש"ם 2203/05, 21.7.2005) נקבע שיחסי מרות התקיימו אף שהמטריד לא היה הממונה הישיר, ושבקשה עמומה להפסיק, שנבעה מחשש למקום העבודה, אינה שוללת את ההטרדה. לדנה אין סמכות לקבל או לפטר, אך היא משפיעה על שיבוץ וקידום עובדים צעירים כמו אורי. לפי הלכת מדר אלה יחסי מרות, ולכן השתתפותו של אורי בשיחות אינה מעידה בהכרח על הסכמה.</w:t>
@@ -688,6 +737,7 @@
         <w:rPr>
           <w:sz w:val="24"/>
           <w:rtl/>
+          <w:lang w:val="he-IL" w:bidi="he-IL"/>
           <w:szCs w:val="24"/>
         </w:rPr>
         <w:t>עם זאת, גם כשקיימים יחסי מרות נדרשות התייחסויות חוזרות המתמקדות במיניותו של המוטרד, ונדרש שנוצלו יחסי המרות. דנה שאלה את אורי על נטייתו המינית פעם אחת בלבד. לכן יש לבחון שתי אפשרויות. אם לא יוכרו יחסי מרות, אין הטרדה: אורי הראה שאינו מעוניין רק בשלב מאוחר, ומאז לא נאמרה כל התייחסות נוספת. אם יוכרו יחסי מרות, עדיין נדרשות התייחסויות חוזרות למיניותו שלו, ואילו רוב השיחות עסקו במיניותה של דנה, היו הדדיות ולא נקשרו למעמדו בעבודה. בשתי האפשרויות קשה לבסס הטרדה מינית. תחושתה של דנה כי הם "חברים טובים" אינה מכרעת: אילו הוכח ניצול מרות, לא היה צורך שאורי יראה דבר. אין זו גם הטרדה סביבתית, שכן ההתנהגות לא יצרה אווירה כללית במשרד.</w:t>
@@ -704,6 +754,7 @@
           <w:b/>
           <w:sz w:val="24"/>
           <w:rtl/>
+          <w:lang w:val="he-IL" w:bidi="he-IL"/>
           <w:szCs w:val="24"/>
           <w:bCs/>
         </w:rPr>
@@ -720,6 +771,7 @@
         <w:rPr>
           <w:sz w:val="24"/>
           <w:rtl/>
+          <w:lang w:val="he-IL" w:bidi="he-IL"/>
           <w:szCs w:val="24"/>
         </w:rPr>
         <w:t>על המעסיק לפעול באופן סביר כדי למנוע הטרדה מינית, ולטפל בכל מקרה שנודע לו (סעיף 7(א) לחוק). חברת Frame מעסיקה כ-70 עובדים, ולכן עליה גם לפרסם תקנון מותאם ולמנות אחראי לבירור תלונות (סעיף 7(ב) לחוק; תקנות 2(ג), 4, 6(ט) ו-8 לתקנות למניעת הטרדה מינית (חובות מעסיק), התשנ"ח–1998). מעסיק שלא עשה כן אחראי בנזיקין למעשי עובדיו (סעיף 7(ג)).</w:t>
@@ -736,6 +788,7 @@
           <w:b/>
           <w:sz w:val="24"/>
           <w:rtl/>
+          <w:lang w:val="he-IL" w:bidi="he-IL"/>
           <w:szCs w:val="24"/>
           <w:bCs/>
         </w:rPr>
@@ -745,6 +798,7 @@
         <w:rPr>
           <w:sz w:val="24"/>
           <w:rtl/>
+          <w:lang w:val="he-IL" w:bidi="he-IL"/>
           <w:szCs w:val="24"/>
         </w:rPr>
         <w:t xml:space="preserve"> היא כל פגיעה בעובד שנגרמה בשל הטרדה מינית או בשל תלונה עליה (סעיף 3(ב)), והיא אינה מותנית בכך שהמוטרד סירב. החוק מרחיב את המושג לפגיעה לפי סעיף 7 לחוק שוויון ההזדמנויות בעבודה, שלעניינה די בהתייחסות אחת לפי סעיף 3(א)(4) (סעיף 7(ו) לחוק; סעיף 7(א) לחוק שוויון ההזדמנויות בעבודה, התשמ"ח–1988). אם יוכרו יחסי מרות, גם השאלה הבודדת על נטייתו של אורי עשויה להספיק. העברתו חודש אחרי שביקש לסיים את השיחות, והשפעתה של דנה על השיבוץ, מעוררות חשד לקשר כזה. השאלה המכרעת היא מי החליט על ההעברה ומדוע: אם דנה המליצה עליה או השפיעה עליה, מדובר בפגיעה שמקורה בהטרדה; אם ההחלטה התקבלה משיקולים ענייניים של צורכי הפרויקטים, אין התנכלות. אם יוכיח אורי שהייתה הטרדה, יעבור למעסיק הנטל להראות שההעברה לא נבעה ממנה (סעיף 6א לחוק), ובית הדין רשאי לפסוק פיצוי של עד 120,000 ש"ח ללא הוכחת נזק (סעיף 6(ב) לחוק). לצד ההליך האזרחי פתוחים בפני אורי גם הליך משמעתי, תלונה פלילית ותביעה נגד המעסיק.</w:t>
@@ -761,6 +815,7 @@
           <w:b/>
           <w:sz w:val="24"/>
           <w:rtl/>
+          <w:lang w:val="he-IL" w:bidi="he-IL"/>
           <w:szCs w:val="24"/>
           <w:bCs/>
         </w:rPr>
@@ -777,6 +832,7 @@
         <w:rPr>
           <w:sz w:val="24"/>
           <w:rtl/>
+          <w:lang w:val="he-IL" w:bidi="he-IL"/>
           <w:szCs w:val="24"/>
         </w:rPr>
         <w:t xml:space="preserve">לפי </w:t>
@@ -786,6 +842,7 @@
           <w:b/>
           <w:sz w:val="24"/>
           <w:rtl/>
+          <w:lang w:val="he-IL" w:bidi="he-IL"/>
           <w:szCs w:val="24"/>
           <w:bCs/>
         </w:rPr>
@@ -795,6 +852,7 @@
         <w:rPr>
           <w:sz w:val="24"/>
           <w:rtl/>
+          <w:lang w:val="he-IL" w:bidi="he-IL"/>
           <w:szCs w:val="24"/>
         </w:rPr>
         <w:t xml:space="preserve"> מעסיק אינו רשאי לשנות את חוזה העבודה באופן חד-צדדי (בג"ץ 239/83, פ"ד מא(2) 210 (1987)). הפררוגטיבה הניהולית מתירה לו לשנות נהלי עבודה, כמו חובת השתתפות בישיבות, אך שינוי הפוגע במעמד העובד הוא </w:t>
@@ -804,6 +862,7 @@
           <w:b/>
           <w:sz w:val="24"/>
           <w:rtl/>
+          <w:lang w:val="he-IL" w:bidi="he-IL"/>
           <w:szCs w:val="24"/>
           <w:bCs/>
         </w:rPr>
@@ -813,6 +872,7 @@
         <w:rPr>
           <w:sz w:val="24"/>
           <w:rtl/>
+          <w:lang w:val="he-IL" w:bidi="he-IL"/>
           <w:szCs w:val="24"/>
         </w:rPr>
         <w:t>. הוצאתו של אורי מישיבות הקריאטיב לבדה מצויה בתחום הפררוגטיבה, אך העברתו מהפרויקטים המרכזיים לעריכה טכנית, עם פחות אחריות, פגעה במעמדו אף ששכרו לא השתנה. גם הפררוגטיבה כפופה לתום לב, ותזמון ההעברה מעורר ספק בכך. שינוי ב"תיאור עיקרי התפקיד" מחייב הודעה בכתב בתוך 30 יום, ובהיעדרה הנטל עובר למעסיק (סעיפים 2(א)(3), 3 ו-5א לחוק הודעה לעובד ולמועמד לעבודה, התשס"ב–2002).</w:t>
@@ -828,6 +888,7 @@
         <w:rPr>
           <w:sz w:val="24"/>
           <w:rtl/>
+          <w:lang w:val="he-IL" w:bidi="he-IL"/>
           <w:szCs w:val="24"/>
         </w:rPr>
         <w:t xml:space="preserve">לפי סעיף 11(א) לחוק פיצויי פיטורים, התשכ"ג–1963, עובד שהתפטר בשל </w:t>
@@ -837,6 +898,7 @@
           <w:b/>
           <w:sz w:val="24"/>
           <w:rtl/>
+          <w:lang w:val="he-IL" w:bidi="he-IL"/>
           <w:szCs w:val="24"/>
           <w:bCs/>
         </w:rPr>
@@ -846,6 +908,7 @@
         <w:rPr>
           <w:sz w:val="24"/>
           <w:rtl/>
+          <w:lang w:val="he-IL" w:bidi="he-IL"/>
           <w:szCs w:val="24"/>
         </w:rPr>
         <w:t xml:space="preserve"> בתנאי עבודתו, או בשל נסיבות שבהן אי אפשר לצפות ממנו להמשיך לעבוד, ייחשב כמי שפוטר, אך רק לעניין פיצויי הפיטורים. הזכאות עצמה מותנית בשנת עבודה אחת ברציפות אצל אותו מעסיק (סעיף 1(א) לחוק), ותקופת העסקתו של אורי אינה ידועה. אילו הוכרה התפטרותו כפיטורים, היה זכאי לשכר חודש אחד לכל שנת עבודה, ולחלק יחסי בעד חלק משנה (סעיף 12(א) לחוק).</w:t>
@@ -861,6 +924,7 @@
         <w:rPr>
           <w:sz w:val="24"/>
           <w:rtl/>
+          <w:lang w:val="he-IL" w:bidi="he-IL"/>
           <w:szCs w:val="24"/>
         </w:rPr>
         <w:t xml:space="preserve">כדי לממש זכות זו, על העובד לתת למעסיק </w:t>
@@ -870,6 +934,7 @@
           <w:b/>
           <w:sz w:val="24"/>
           <w:rtl/>
+          <w:lang w:val="he-IL" w:bidi="he-IL"/>
           <w:szCs w:val="24"/>
           <w:bCs/>
         </w:rPr>
@@ -879,6 +944,7 @@
         <w:rPr>
           <w:sz w:val="24"/>
           <w:rtl/>
+          <w:lang w:val="he-IL" w:bidi="he-IL"/>
           <w:szCs w:val="24"/>
         </w:rPr>
         <w:t xml:space="preserve"> והזדמנות לתקן, לפעול בתום לב ובלי שיהוי, שכן עיכוב ממושך עלול ללמד שהעובד השלים עם השינוי. בעניין גולן (תב"ע (ארצי) נד/86-3) הכיר בית הדין בהרעת תנאים, אך קבע שעובד שהמשיך לעבוד שמונה חודשים בתנאים החדשים הסכים להם בהתנהגותו.</w:t>
@@ -894,6 +960,7 @@
         <w:rPr>
           <w:sz w:val="24"/>
           <w:rtl/>
+          <w:lang w:val="he-IL" w:bidi="he-IL"/>
           <w:szCs w:val="24"/>
         </w:rPr>
         <w:t>אורי לא מחה ולא התריע, ועבד ארבעה חודשים במתכונת החדשה, בשונה מהעובד בעניין סלמאן, שהועבר לתפקיד אחר ומחה בכתב על הפחתת שכרו לפני שהתפטר (ע"ע (ארצי) 28475-03-20, 7.12.2020, פס' 4-10). שתיקתו מלמדת על השלמה. גם חלופת "הנסיבות האחרות" אינה מסייעת לו: נדרשות נסיבות שלפי אמות מידה אובייקטיביות אין לדרוש מהעובד להישאר בהן, כמו השפלה או פגיעה, ולא די באי־שביעות רצון. השיחות הסתיימו חודשים לפני ההתפטרות.</w:t>
@@ -910,6 +977,7 @@
           <w:b/>
           <w:sz w:val="24"/>
           <w:rtl/>
+          <w:lang w:val="he-IL" w:bidi="he-IL"/>
           <w:szCs w:val="24"/>
           <w:bCs/>
         </w:rPr>
@@ -919,6 +987,7 @@
         <w:rPr>
           <w:sz w:val="24"/>
           <w:rtl/>
+          <w:lang w:val="he-IL" w:bidi="he-IL"/>
           <w:szCs w:val="24"/>
         </w:rPr>
         <w:t>, טענת ההטרדה המינית חלשה, טענת ההתנכלות חזקה יותר, וטענת ההתפטרות בדין מפוטר נכשלת בשל היעדר התראה ושיהוי.</w:t>
@@ -936,6 +1005,7 @@
           <w:b/>
           <w:sz w:val="28"/>
           <w:rtl/>
+          <w:lang w:val="he-IL" w:bidi="he-IL"/>
           <w:szCs w:val="28"/>
           <w:bCs/>
         </w:rPr>
@@ -953,6 +1023,7 @@
           <w:b/>
           <w:sz w:val="24"/>
           <w:rtl/>
+          <w:lang w:val="he-IL" w:bidi="he-IL"/>
           <w:szCs w:val="24"/>
           <w:bCs/>
         </w:rPr>
@@ -969,6 +1040,7 @@
         <w:rPr>
           <w:sz w:val="24"/>
           <w:rtl/>
+          <w:lang w:val="he-IL" w:bidi="he-IL"/>
           <w:szCs w:val="24"/>
         </w:rPr>
         <w:t>חוק הודעה לעובד ולמועמד לעבודה (תנאי עבודה והליכי מיון וקבלה לעבודה), התשס"ב–2002.</w:t>
@@ -984,6 +1056,7 @@
         <w:rPr>
           <w:sz w:val="24"/>
           <w:rtl/>
+          <w:lang w:val="he-IL" w:bidi="he-IL"/>
           <w:szCs w:val="24"/>
         </w:rPr>
         <w:t>חוק הסכמים קיבוציים, התשי"ז–1957.</w:t>
@@ -999,6 +1072,7 @@
         <w:rPr>
           <w:sz w:val="24"/>
           <w:rtl/>
+          <w:lang w:val="he-IL" w:bidi="he-IL"/>
           <w:szCs w:val="24"/>
         </w:rPr>
         <w:t>חוק למניעת הטרדה מינית, התשנ"ח–1998.</w:t>
@@ -1014,6 +1088,7 @@
         <w:rPr>
           <w:sz w:val="24"/>
           <w:rtl/>
+          <w:lang w:val="he-IL" w:bidi="he-IL"/>
           <w:szCs w:val="24"/>
         </w:rPr>
         <w:t>חוק פיצויי פיטורים, התשכ"ג–1963.</w:t>
@@ -1029,6 +1104,7 @@
         <w:rPr>
           <w:sz w:val="24"/>
           <w:rtl/>
+          <w:lang w:val="he-IL" w:bidi="he-IL"/>
           <w:szCs w:val="24"/>
         </w:rPr>
         <w:t>חוק שוויון ההזדמנויות בעבודה, התשמ"ח–1988.</w:t>
@@ -1044,6 +1120,7 @@
         <w:rPr>
           <w:sz w:val="24"/>
           <w:rtl/>
+          <w:lang w:val="he-IL" w:bidi="he-IL"/>
           <w:szCs w:val="24"/>
         </w:rPr>
         <w:t>תקנות למניעת הטרדה מינית (חובות מעסיק), התשנ"ח–1998.</w:t>
@@ -1060,6 +1137,7 @@
           <w:b/>
           <w:sz w:val="24"/>
           <w:rtl/>
+          <w:lang w:val="he-IL" w:bidi="he-IL"/>
           <w:szCs w:val="24"/>
           <w:bCs/>
         </w:rPr>
@@ -1076,6 +1154,7 @@
         <w:rPr>
           <w:sz w:val="24"/>
           <w:rtl/>
+          <w:lang w:val="he-IL" w:bidi="he-IL"/>
           <w:szCs w:val="24"/>
         </w:rPr>
         <w:t>בג"ץ 239/83 מילפלדר נ' בית הדין הארצי לעבודה, פ"ד מא(2) 210 (1987).</w:t>
@@ -1091,6 +1170,7 @@
         <w:rPr>
           <w:sz w:val="24"/>
           <w:rtl/>
+          <w:lang w:val="he-IL" w:bidi="he-IL"/>
           <w:szCs w:val="24"/>
         </w:rPr>
         <w:t>בג"ץ 7029/95 הסתדרות העובדים הכללית החדשה נ' בית הדין הארצי לעבודה, פ"ד נא(2) 63 (1997).</w:t>
@@ -1106,6 +1186,7 @@
         <w:rPr>
           <w:sz w:val="24"/>
           <w:rtl/>
+          <w:lang w:val="he-IL" w:bidi="he-IL"/>
           <w:szCs w:val="24"/>
         </w:rPr>
         <w:t>עס"ק (ארצי) 6298-03-25 הסתדרות העובדים הכללית החדשה – האגף להתאגדות עובדים נ' ארגון עובדי הפיתוח והשיווק בנוקיה ישראל (נבו 10.6.2025).</w:t>
@@ -1121,6 +1202,7 @@
         <w:rPr>
           <w:sz w:val="24"/>
           <w:rtl/>
+          <w:lang w:val="he-IL" w:bidi="he-IL"/>
           <w:szCs w:val="24"/>
         </w:rPr>
         <w:t>עס"ק (ארצי) 25476-09-12 הסתדרות העובדים הכללית החדשה נ' פלאפון תקשורת בע"מ (נבו 2.1.2013).</w:t>
@@ -1136,6 +1218,7 @@
         <w:rPr>
           <w:sz w:val="24"/>
           <w:rtl/>
+          <w:lang w:val="he-IL" w:bidi="he-IL"/>
           <w:szCs w:val="24"/>
         </w:rPr>
         <w:t>עש"ם 2203/05 מדר נ' נציבות שירות המדינה (נבו 21.7.2005).</w:t>
@@ -1151,6 +1234,7 @@
         <w:rPr>
           <w:sz w:val="24"/>
           <w:rtl/>
+          <w:lang w:val="he-IL" w:bidi="he-IL"/>
           <w:szCs w:val="24"/>
         </w:rPr>
         <w:t>תב"ע (ארצי) נד/86-3 יוחנן גולן נ' אי.אל.די. בע"מ.</w:t>
@@ -1166,6 +1250,7 @@
         <w:rPr>
           <w:sz w:val="24"/>
           <w:rtl/>
+          <w:lang w:val="he-IL" w:bidi="he-IL"/>
           <w:szCs w:val="24"/>
         </w:rPr>
         <w:t>ע"ע (ארצי) 28475-03-20 סלמאן נ' אקובג בע"מ (נבו 7.12.2020).</w:t>
@@ -1182,6 +1267,7 @@
           <w:b/>
           <w:sz w:val="24"/>
           <w:rtl/>
+          <w:lang w:val="he-IL" w:bidi="he-IL"/>
           <w:szCs w:val="24"/>
           <w:bCs/>
         </w:rPr>
@@ -1198,6 +1284,7 @@
         <w:rPr>
           <w:sz w:val="24"/>
           <w:rtl/>
+          <w:lang w:val="he-IL" w:bidi="he-IL"/>
           <w:szCs w:val="24"/>
         </w:rPr>
         <w:t>רות בן-ישראל דיני עבודה כרך א 48-32 (2002).</w:t>

</xml_diff>

<commit_message>
Expand both answers to fill two pages in Word
Co-Authored-By: Claude Opus 5.5 <noreply@anthropic.com>
Claude-Session: https://claude.ai/code/session_01BVH1n3fvCDz4inkznfhZC9
</commit_message>
<xml_diff>
--- a/output/עבודה_היבטים_משפטיים.docx
+++ b/output/עבודה_היבטים_משפטיים.docx
@@ -439,7 +439,7 @@
           <w:lang w:val="he-IL" w:bidi="he-IL"/>
           <w:szCs w:val="24"/>
         </w:rPr>
-        <w:t xml:space="preserve"> בנוקיה הוקם ארגון פנימי כחלופה להסתדרות, שהדגיש "שמירה על החוזה האישי של כל עובד". בית הדין הארצי קבע כי העמידה במבחני עניין עמית נבחנת במועד הכרזת היציגות, וכי אין להקל בהם גם לארגון חדש, ובוודאי לא במבחן המטרה (עס"ק (ארצי) 6298-03-25, 10.6.2025, פס' 6, 41 ו-44). נפסק שמטרתו העיקרית של ארגון עובדים חייבת להיות משא ומתן קיבוצי לשיפור תנאי העבודה, ושהמודל הקיבוצי שבבסיס החוק אינו נסוג מפני התרחבות החוזים האישיים (שם, פס' 50-51). עוד נקבע כי אותנטיות היא תנאי הכרחי אך אינה תנאי מספיק, ו"התארגנות אותנטית של שני שלישים מעובדי המפעל בארגון שכל תכליתה התנגדות ליחסי עבודה קיבוציים אינה יכולה להפוך את אותה התארגנות לארגון עובדים" (פס' 47). בית הדין הדגיש גם את הטעם לכך: ארגון יציג מקבל כוח לחייב אף עובדים שאינם חברים בו, ולכן רק גוף הכשיר למלא תפקיד זה יוכר (פס' 43). הדמיון לענייננו בולט. בין מטרות הארגון בנוקיה נמנו "שימור קיום האתר בישראל" ו"פעולה בדרכי הידברות וגישור" עם ההנהלה (פס' 9), ואלה כמעט זהות למטרות ב' ו-ג' של הקבוצה. מאחר שהעמידה במבחנים נבחנת במועד ההכרזה, אין בתיקון מאוחר של התקנון כדי להכשיר את הקבוצה, ואין נפקות לכך שעובדים רבים הצטרפו אליה. יתרה מזו, בנוקיה נקבע שהחברה לא תמכה בארגון הפנימי (פס' 18), ואילו כאן המנכ"ל בירך על הקמת הקבוצה ופעל נגד ההסתדרות, כך שגם מבחן העצמאות מהמעסיק אינו מתקיים.</w:t>
+        <w:t xml:space="preserve"> בנוקיה הוקם ארגון פנימי כחלופה להסתדרות, שהדגיש "שמירה על החוזה האישי של כל עובד". בית הדין הארצי קבע כי העמידה במבחני עניין עמית נבחנת במועד הכרזת היציגות, וכי אין להקל בהם גם לארגון חדש, ובוודאי לא במבחן המטרה (עס"ק (ארצי) 6298-03-25, 10.6.2025, פס' 6, 41 ו-44). נפסק שמטרתו העיקרית של ארגון עובדים חייבת להיות משא ומתן קיבוצי לשיפור תנאי העבודה, ושהמודל הקיבוצי שבבסיס החוק אינו נסוג מפני התרחבות החוזים האישיים (שם, פס' 50-51). עוד נקבע כי אותנטיות היא תנאי הכרחי אך אינה תנאי מספיק, ו"התארגנות אותנטית של שני שלישים מעובדי המפעל בארגון שכל תכליתה התנגדות ליחסי עבודה קיבוציים אינה יכולה להפוך את אותה התארגנות לארגון עובדים" (פס' 47). בית הדין הדגיש גם את הטעם לכך: ארגון יציג מקבל כוח לחייב אף עובדים שאינם חברים בו, ולכן רק גוף הכשיר למלא תפקיד זה יוכר (פס' 43). הדמיון לענייננו בולט. בין מטרות הארגון בנוקיה נמנו "קידום רווחת כלל עובדי החברה", "שימור קיום האתר בישראל" ו"פעולה בדרכי הידברות וגישור" עם ההנהלה (פס' 9). שלוש המטרות הראשונות של הקבוצה, קידום רווחת העובדים, יציבות החברה והמשך פעילותה בישראל, ויצירת ערוץ הידברות עם ההנהלה, הן כמעט העתק שלהן. בנוקיה, כמו כאן, הוקנו לוועד בתקנון סמכויות לאשר הסכמים קיבוציים ולהכריז על סכסוך עבודה, ובכל זאת נקבע שהגוף אינו ארגון עובדים. מכאן שסמכויות פורמליות אינן מרפאות מטרה שאינה קיבוצית, ובית הדין הדגיש כי המבחנים נבחנים באופן ענייני ולפי המהות (פס' 48-49). מאחר שהעמידה במבחנים נבחנת במועד ההכרזה, אין בתיקון מאוחר של התקנון כדי להכשיר את הקבוצה, ואין נפקות לכך שעובדים רבים הצטרפו אליה. יתרה מזו, בנוקיה נקבע שהחברה לא תמכה בארגון הפנימי (פס' 18), ואילו כאן המנכ"ל בירך על הקמת הקבוצה ופעל נגד ההסתדרות, כך שגם מבחן העצמאות מהמעסיק אינו מתקיים.</w:t>
       </w:r>
     </w:p>
     <w:p>
@@ -455,7 +455,7 @@
           <w:lang w:val="he-IL" w:bidi="he-IL"/>
           <w:szCs w:val="24"/>
         </w:rPr>
-        <w:t>אין בכך כדי לפגוע בחופש מהתארגנות. עובד רשאי שלא להצטרף להסתדרות, וסעיף 33י(א)(3) מגן עליו מפני פגיעה בשל כך. חברי הקבוצה אינם נספרים לצורך היציגות, והודעתה כי היא הארגון היציג חסרת נפקות. חובת המעסיק לנהל משא ומתן בהתארגנות ראשונית חלה רק כלפי ארגון יציג לפי סעיף 3 (סעיף 33ח1), ואם ההסתדרות תהיה יציגה, עמה יהיה על ההנהלה לנהל משא ומתן. החברה תהפוך אז ל"מפעל מאורגן", וההוראות האישיות שבהסכם הקיבוצי יחולו על כל העובדים מהסוגים הכלולים בו, גם על מי שאינם חברים בהסתדרות (סעיפים 15(3) ו-19 לחוק).</w:t>
+        <w:t>אין בכך כדי לפגוע בחופש מהתארגנות. עובד רשאי שלא להצטרף להסתדרות, וסעיף 33י(א)(3) מגן עליו מפני פגיעה בשל כך. חברי הקבוצה אינם נספרים לצורך היציגות, והודעתה כי היא הארגון היציג חסרת נפקות. ההסתדרות תהיה יציגה אם חבריה יהיו לפחות שליש מכלל העובדים שההסכם יחול עליהם, ובלבד שזו הקבוצה המאורגנת הגדולה ביותר (סעיף 3 לחוק). כך היה בנוקיה, שבה ההסתדרות הוכרה כיציגה אף שהחברה כבר הכירה בארגון הפנימי, ולכן על ההנהלה להפסיק לנהל משא ומתן עם הקבוצה. חובת המעסיק לנהל משא ומתן בהתארגנות ראשונית חלה רק כלפי ארגון יציג לפי סעיף 3 (סעיף 33ח1), ואם ההסתדרות תהיה יציגה, עמה יהיה על ההנהלה לנהל משא ומתן. מכאן גם שאם תחתום ההנהלה על הסכם עם הקבוצה, לא יהיה זה הסכם קיבוצי, שכן לפי סעיף 1 לחוק צד להסכם קיבוצי חייב להיות ארגון עובדים, ולפי סעיף 2(1) הסכם מיוחד נחתם רק עם הארגון היציג. החברה תהפוך אז ל"מפעל מאורגן", וההוראות האישיות שבהסכם הקיבוצי יחולו על כל העובדים מהסוגים הכלולים בו, גם על מי שאינם חברים בהסתדרות (סעיפים 15(3) ו-19 לחוק).</w:t>
       </w:r>
     </w:p>
     <w:p>
@@ -529,7 +529,7 @@
           <w:lang w:val="he-IL" w:bidi="he-IL"/>
           <w:szCs w:val="24"/>
         </w:rPr>
-        <w:t xml:space="preserve"> לבין שלב שבו כבר קיים ארגון יציג. בשלב הראשון גובר חופש ההתארגנות: המעסיק אינו רשאי להביע עמדה על ההתארגנות בשום ערוץ, לרבות בשיחות אישיות ובדואר אלקטרוני, וגם הצבעה על חסרונותיה לעובדים או לחברה, נכונה ככל שתהיה, אסורה. ההתארגנות ב-NeuroTech נמצאת בשלב הפורץ, ולכן שלוש פעולות ההנהלה אסורות.</w:t>
+        <w:t xml:space="preserve"> לבין שלב שבו כבר קיים ארגון יציג. רק לאחר שקם ארגון יציג מתרחב חופש הביטוי של המעסיק, ואף אז במגבלות. בשלב הראשון גובר חופש ההתארגנות: המעסיק אינו רשאי להביע עמדה על ההתארגנות בשום ערוץ, לרבות בשיחות אישיות ובדואר אלקטרוני, וגם הצבעה על חסרונותיה לעובדים או לחברה, נכונה ככל שתהיה, אסורה. ההתארגנות ב-NeuroTech נמצאת בשלב הפורץ: ההסתדרות טרם הוכרה כיציגה, והעובדים עדיין מחליטים אם להצטרף אליה. לכן שלוש פעולות ההנהלה אסורות. בנוסף, אסור להנהלה למנוע מנציגי ההסתדרות להיכנס למקום העבודה לשם קידום ההתארגנות, בכפוף לצורכי העבודה (סעיף 33ט לחוק).</w:t>
       </w:r>
     </w:p>
     <w:p>
@@ -545,7 +545,7 @@
           <w:lang w:val="he-IL" w:bidi="he-IL"/>
           <w:szCs w:val="24"/>
         </w:rPr>
-        <w:t>הודעת הדואר האלקטרוני מציגה את ההסתדרות כגורם "חיצוני" שעלול לשנות את התרבות הארגונית וקוראת לעובדים "לשקול היטב". זו הצגת חסרונות ההתארגנות בתכתובת אלקטרונית, כמו ההודעה שנפסלה בעניין פלאפון, אף שהנוסח מתון יותר. הרמז שההסתדרות תפגע ב"תנאי העבודה האישיים" דומה לאזהרה שם מפני נזק לחברה ולעובדים, ובית הדין קבע כי אזהרה כזו אסורה גם כשיש בה אמת. הנחיית מנהלי הצוותים לשוחח עם עובדיהם על "יתרונות המודל האישי" היא מפגש אישי שנאסר במפורש. חומרתה רבה, שכן המנהלים משפיעים על הבונוסים והקידום, וכל שיחה כזו עלולה להיתפס כאיום. אם יתברר שמנהלים קשרו בין הבונוסים או הקידום לבין ההצטרפות להסתדרות, תהיה זו גם הפרה של סעיף 33י(א), שבשלה רשאי בית הדין לפסוק פיצויים לדוגמה של עד 50,000 ש"ח, ובנסיבות חמורות עד 200,000 ש"ח (סעיף 33יא(ב)). הפגישה עם הקבוצה ודברי השבח כלפיה מעבירים בעקיפין את אותו מסר. בעניין פלאפון ניתנו צווים שאסרו על החברה להציג את עמדתה בכל ערוץ ולעקוב אחר העובדים המתארגנים, וצווים דומים מתבקשים גם כאן.</w:t>
+        <w:t>הודעת הדואר האלקטרוני מציגה את ההסתדרות כגורם "חיצוני" שעלול לשנות את התרבות הארגונית וקוראת לעובדים "לשקול היטב". ההודעה אף מטעה: היא רומזת שהצטרפות להסתדרות תשלול מהעובדים את המשא ומתן האישי על שכרם, בעוד שלפי סעיף 22 לחוק תנאי אישי שמיטיב עם העובד ממשיך לחול גם לצד הסכם קיבוצי. זו הצגת חסרונות ההתארגנות בתכתובת אלקטרונית, כמו ההודעה שנפסלה בעניין פלאפון, אף שהנוסח מתון יותר. הרמז שההסתדרות תפגע ב"תנאי העבודה האישיים" דומה לאזהרה שם מפני נזק לחברה ולעובדים, ובית הדין קבע כי אזהרה כזו אסורה גם כשיש בה אמת. הנחיית מנהלי הצוותים לשוחח עם עובדיהם על "יתרונות המודל האישי" היא מפגש אישי שנאסר במפורש. שיחות כאלה נערכות ביחידות, בלי נוכחות נציג ההסתדרות, ובדיוק בהן פער הכוחות בין המעסיק לעובד הוא הגדול ביותר. חומרתה רבה, שכן המנהלים משפיעים על הבונוסים והקידום, וכל שיחה כזו עלולה להיתפס כאיום. אם יתברר שמנהלים קשרו בין הבונוסים או הקידום לבין ההצטרפות להסתדרות, תהיה זו גם הפרה של סעיף 33י(א), שבשלה רשאי בית הדין לפסוק פיצויים לדוגמה של עד 50,000 ש"ח, ובנסיבות חמורות עד 200,000 ש"ח (סעיף 33יא(ב)). הפגישה עם הקבוצה ודברי השבח כלפיה מעבירים בעקיפין את אותו מסר. בעניין פלאפון ניתנו צווים שאסרו על החברה להציג את עמדתה בכל ערוץ ולעקוב אחר העובדים המתארגנים, וצווים דומים מתבקשים גם כאן.</w:t>
       </w:r>
     </w:p>
     <w:p>
@@ -579,7 +579,7 @@
           <w:lang w:val="he-IL" w:bidi="he-IL"/>
           <w:szCs w:val="24"/>
         </w:rPr>
-        <w:t>טענות ההסתדרות מוצדקות: הקבוצה אינה ארגון עובדים, כפי שנפסק בעניין נוקיה, ופעולות ההנהלה הפרו את הלכת פלאפון.</w:t>
+        <w:t>טענות ההסתדרות מוצדקות. הקבוצה אינה ארגון עובדים, משום שמטרותיה אינן קיבוציות ומשום שאינה עצמאית מהמעסיק, כפי שנפסק בנסיבות כמעט זהות בעניין נוקיה. פעולות ההנהלה הפרו את הלכת פלאפון, ובית הדין מוסמך להורות לה לחדול מהן ולנהל משא ומתן עם ההסתדרות אם תוכח יציגותה.</w:t>
       </w:r>
     </w:p>
     <w:p>
@@ -668,7 +668,7 @@
           <w:lang w:val="he-IL" w:bidi="he-IL"/>
           <w:szCs w:val="24"/>
         </w:rPr>
-        <w:t>"הראה" פירושו במילים או בהתנהגות שאין ספק סביר לגבי משמעותה (סעיף 2 לחוק). אורי לא הראה זאת בתחילה: הוא שאל שאלות ושיתף פרטים מחייו, וכשביקש להשאיר את הנושא מחוץ לעבודה, דנה הפסיקה מיד.</w:t>
+        <w:t>"הראה" פירושו במילים או בהתנהגות שאין ספק סביר לגבי משמעותה (סעיף 2 לחוק). אורי לא הראה זאת בתחילה: הוא שאל שאלות ושיתף פרטים מחייו. רק כשאמר שהוא מעדיף "להשאיר את הדברים האלה מחוץ לעבודה" הבהיר לראשונה, באופן שאינו מותיר ספק, שאינו מעוניין, ודנה הפסיקה מיד. מכאן שלא היו התייחסויות חוזרות לאחר שהביע את עמדתו.</w:t>
       </w:r>
     </w:p>
     <w:p>
@@ -724,7 +724,7 @@
           <w:lang w:val="he-IL" w:bidi="he-IL"/>
           <w:szCs w:val="24"/>
         </w:rPr>
-        <w:t xml:space="preserve"> (עש"ם 2203/05, 21.7.2005) נקבע שיחסי מרות התקיימו אף שהמטריד לא היה הממונה הישיר, ושבקשה עמומה להפסיק, שנבעה מחשש למקום העבודה, אינה שוללת את ההטרדה. לדנה אין סמכות לקבל או לפטר, אך היא משפיעה על שיבוץ וקידום עובדים צעירים כמו אורי. לפי הלכת מדר אלה יחסי מרות, ולכן השתתפותו של אורי בשיחות אינה מעידה בהכרח על הסכמה.</w:t>
+        <w:t xml:space="preserve"> (עש"ם 2203/05, 21.7.2005) נקבע שיחסי מרות התקיימו אף שהמטריד לא היה הממונה הישיר, ושבקשה עמומה להפסיק, שנבעה מחשש למקום העבודה, אינה שוללת את ההטרדה. עם זאת, שם העיר המטריד שוב ושוב על מראה המוטרדת, על לבושה ועל הבושם שלה, כלומר על מיניותה שלה, ואילו דנה סיפרה בעיקר על חייה שלה. לדנה אין סמכות לקבל או לפטר, אך היא משפיעה על שיבוץ וקידום עובדים צעירים כמו אורי. לפי הלכת מדר אלה יחסי מרות, ולכן השתתפותו של אורי בשיחות אינה מעידה בהכרח על הסכמה.</w:t>
       </w:r>
     </w:p>
     <w:p>
@@ -774,7 +774,7 @@
           <w:lang w:val="he-IL" w:bidi="he-IL"/>
           <w:szCs w:val="24"/>
         </w:rPr>
-        <w:t>על המעסיק לפעול באופן סביר כדי למנוע הטרדה מינית, ולטפל בכל מקרה שנודע לו (סעיף 7(א) לחוק). חברת Frame מעסיקה כ-70 עובדים, ולכן עליה גם לפרסם תקנון מותאם ולמנות אחראי לבירור תלונות (סעיף 7(ב) לחוק; תקנות 2(ג), 4, 6(ט) ו-8 לתקנות למניעת הטרדה מינית (חובות מעסיק), התשנ"ח–1998). מעסיק שלא עשה כן אחראי בנזיקין למעשי עובדיו (סעיף 7(ג)).</w:t>
+        <w:t>על המעסיק לפעול באופן סביר כדי למנוע הטרדה מינית, ולטפל בכל מקרה שנודע לו (סעיף 7(א) לחוק). חברת Frame מעסיקה כ-70 עובדים, ולכן עליה גם לפרסם תקנון מותאם ולמנות אחראי לבירור תלונות (סעיף 7(ב) לחוק; תקנות 2(ג), 4, 6(ט) ו-8 לתקנות למניעת הטרדה מינית (חובות מעסיק), התשנ"ח–1998). מעסיק שלא עשה כן אחראי בנזיקין למעשי עובדיו (סעיף 7(ג)). אורי לא התלונן, אך אם נודע לממונים על השיחות, היה על החברה להעביר את המקרה לבירור האחראי גם בלי תלונה (תקנה 6(ט)). אם לא היה בחברה תקנון או אחראי, תוכל אחריותה להתבסס על כך בלבד, בלי קשר לשאלה אם דנה עצמה הטרידה.</w:t>
       </w:r>
     </w:p>
     <w:p>
@@ -801,7 +801,7 @@
           <w:lang w:val="he-IL" w:bidi="he-IL"/>
           <w:szCs w:val="24"/>
         </w:rPr>
-        <w:t xml:space="preserve"> היא כל פגיעה בעובד שנגרמה בשל הטרדה מינית או בשל תלונה עליה (סעיף 3(ב)), והיא אינה מותנית בכך שהמוטרד סירב. החוק מרחיב את המושג לפגיעה לפי סעיף 7 לחוק שוויון ההזדמנויות בעבודה, שלעניינה די בהתייחסות אחת לפי סעיף 3(א)(4) (סעיף 7(ו) לחוק; סעיף 7(א) לחוק שוויון ההזדמנויות בעבודה, התשמ"ח–1988). אם יוכרו יחסי מרות, גם השאלה הבודדת על נטייתו של אורי עשויה להספיק. העברתו חודש אחרי שביקש לסיים את השיחות, והשפעתה של דנה על השיבוץ, מעוררות חשד לקשר כזה. השאלה המכרעת היא מי החליט על ההעברה ומדוע: אם דנה המליצה עליה או השפיעה עליה, מדובר בפגיעה שמקורה בהטרדה; אם ההחלטה התקבלה משיקולים ענייניים של צורכי הפרויקטים, אין התנכלות. אם יוכיח אורי שהייתה הטרדה, יעבור למעסיק הנטל להראות שההעברה לא נבעה ממנה (סעיף 6א לחוק), ובית הדין רשאי לפסוק פיצוי של עד 120,000 ש"ח ללא הוכחת נזק (סעיף 6(ב) לחוק). לצד ההליך האזרחי פתוחים בפני אורי גם הליך משמעתי, תלונה פלילית ותביעה נגד המעסיק.</w:t>
+        <w:t xml:space="preserve"> היא כל פגיעה בעובד שנגרמה בשל הטרדה מינית או בשל תלונה עליה (סעיף 3(ב)), והיא אינה מותנית בכך שהמוטרד סירב. החוק מרחיב את המושג לפגיעה לפי סעיף 7 לחוק שוויון ההזדמנויות בעבודה, שלעניינה די בהתייחסות אחת לפי סעיף 3(א)(4) (סעיף 7(ו) לחוק; סעיף 7(א) לחוק שוויון ההזדמנויות בעבודה, התשמ"ח–1988). אם יוכרו יחסי מרות, גם השאלה הבודדת על נטייתו של אורי עשויה להספיק. העברתו חודש אחרי שביקש לסיים את השיחות, והשפעתה של דנה על השיבוץ, מעוררות חשד לקשר כזה. השאלה המכרעת היא מי החליט על ההעברה ומדוע: אם דנה המליצה עליה או השפיעה עליה, מדובר בפגיעה שמקורה בהטרדה; אם ההחלטה התקבלה משיקולים ענייניים של צורכי הפרויקטים, אין התנכלות. אם יוכיח אורי שהייתה הטרדה, יעבור למעסיק הנטל להראות שההעברה לא נבעה ממנה (סעיף 6א לחוק), ובית הדין רשאי לפסוק פיצוי של עד 120,000 ש"ח ללא הוכחת נזק (סעיף 6(ב) לחוק). לצד ההליך האזרחי פתוחים בפני אורי גם הליך משמעתי, תלונה פלילית ותביעה נגד המעסיק. אם תוכח הטרדה, תישא דנה עצמה באחריות אישית, הן בנזיקין והן בפלילים (סעיפים 5 ו-6 לחוק). ואם יימצא שאין בהתנהגותה הטרדה, עדיין רשאית החברה להורות לה על כללי התנהגות ראויים במקום העבודה (תקנה 7(א)(1)).</w:t>
       </w:r>
     </w:p>
     <w:p>
@@ -875,7 +875,7 @@
           <w:lang w:val="he-IL" w:bidi="he-IL"/>
           <w:szCs w:val="24"/>
         </w:rPr>
-        <w:t>. הוצאתו של אורי מישיבות הקריאטיב לבדה מצויה בתחום הפררוגטיבה, אך העברתו מהפרויקטים המרכזיים לעריכה טכנית, עם פחות אחריות, פגעה במעמדו אף ששכרו לא השתנה. גם הפררוגטיבה כפופה לתום לב, ותזמון ההעברה מעורר ספק בכך. שינוי ב"תיאור עיקרי התפקיד" מחייב הודעה בכתב בתוך 30 יום, ובהיעדרה הנטל עובר למעסיק (סעיפים 2(א)(3), 3 ו-5א לחוק הודעה לעובד ולמועמד לעבודה, התשס"ב–2002).</w:t>
+        <w:t>. הוצאתו של אורי מישיבות הקריאטיב לבדה מצויה בתחום הפררוגטיבה, אך העברתו מהפרויקטים המרכזיים לעריכה טכנית, עם פחות אחריות, פגעה במעמדו אף ששכרו לא השתנה. גם הפררוגטיבה כפופה לתום לב, ותזמון ההעברה מעורר ספק בכך. אם ההעברה נעשתה בשל סיום השיחות או בהשפעת דנה, היא חורגת מהפררוגטיבה ומהווה גם התנכלות; אם נעשתה מטעמים מקצועיים של צורכי הפרויקטים, היא מצויה בתחומה. שינוי ב"תיאור עיקרי התפקיד" מחייב הודעה בכתב בתוך 30 יום, ובהיעדרה הנטל עובר למעסיק (סעיפים 2(א)(3), 3 ו-5א לחוק הודעה לעובד ולמועמד לעבודה, התשס"ב–2002).</w:t>
       </w:r>
     </w:p>
     <w:p>
@@ -963,7 +963,7 @@
           <w:lang w:val="he-IL" w:bidi="he-IL"/>
           <w:szCs w:val="24"/>
         </w:rPr>
-        <w:t>אורי לא מחה ולא התריע, ועבד ארבעה חודשים במתכונת החדשה, בשונה מהעובד בעניין סלמאן, שהועבר לתפקיד אחר ומחה בכתב על הפחתת שכרו לפני שהתפטר (ע"ע (ארצי) 28475-03-20, 7.12.2020, פס' 4-10). שתיקתו מלמדת על השלמה. גם חלופת "הנסיבות האחרות" אינה מסייעת לו: נדרשות נסיבות שלפי אמות מידה אובייקטיביות אין לדרוש מהעובד להישאר בהן, כמו השפלה או פגיעה, ולא די באי־שביעות רצון. השיחות הסתיימו חודשים לפני ההתפטרות.</w:t>
+        <w:t>אורי לא מחה ולא התריע, ועבד ארבעה חודשים במתכונת החדשה, בשונה מהעובד בעניין סלמאן, שהועבר לתפקיד אחר ומחה בכתב על הפחתת שכרו לפני שהתפטר (ע"ע (ארצי) 28475-03-20, 7.12.2020, פס' 4-10). שתיקתו מלמדת על השלמה. יתרה מכך, בעניין סלמאן נפגע שכרו של העובד, ואילו שכרו והיקף משרתו של אורי לא השתנו, כך שהפגיעה בו מצומצמת יותר ומתמקדת במעמדו בלבד. גם חלופת "הנסיבות האחרות" אינה מסייעת לו: נדרשות נסיבות שלפי אמות מידה אובייקטיביות אין לדרוש מהעובד להישאר בהן, כמו השפלה או פגיעה, ולא די באי־שביעות רצון. השיחות הסתיימו חודשים לפני ההתפטרות. זאת ועוד, נדרש קשר סיבתי בין ההרעה לבין ההתפטרות, ואורי התפטר ארבעה חודשים אחרי ההעברה, בלי שהוכח מה הביא אותו להחליט דווקא אז. גם הזכות להתפטר בדין מפוטר כפופה לחובת תום הלב, ולכן טענה שמועלית לראשונה אחרי ההתפטרות, כשהמעסיק לא קיבל הזדמנות לתקן, תתקבל בקושי.</w:t>
       </w:r>
     </w:p>
     <w:p>
@@ -990,7 +990,7 @@
           <w:lang w:val="he-IL" w:bidi="he-IL"/>
           <w:szCs w:val="24"/>
         </w:rPr>
-        <w:t>, טענת ההטרדה המינית חלשה, טענת ההתנכלות חזקה יותר, וטענת ההתפטרות בדין מפוטר נכשלת בשל היעדר התראה ושיהוי.</w:t>
+        <w:t>, טענת ההטרדה המינית חלשה, שכן גם אם יוכרו יחסי מרות לא הוכחו התייחסויות חוזרות למיניותו של אורי. טענת ההתנכלות חזקה יותר, והיא תלויה בשאלה מי החליט על ההעברה ומדוע. טענת ההתפטרות בדין מפוטר נכשלת בשל היעדר התראה, השיהוי והקושי להוכיח קשר סיבתי. מנגד, החברה עצמה חשופה לטענות אם לא מילאה את חובותיה לפי סעיף 7 לחוק.</w:t>
       </w:r>
     </w:p>
     <w:p>

</xml_diff>